<commit_message>
Add redesigned Fig. 3 architecture diagram and embed it in V18
Co-authored-by: tuffy1026 <tuffy1026@users.noreply.github.com>
</commit_message>
<xml_diff>
--- a/manuscripts/V18_CroplandGPT_EA_pzm_edit_0927.docx
+++ b/manuscripts/V18_CroplandGPT_EA_pzm_edit_0927.docx
@@ -180,10 +180,10 @@
         <w:spacing w:after="60"/>
         <w:jc w:val="both"/>
         <w:rPr>
-          <w:ins w:id="1896" w:author="Language Editor" w:date="2026-09-27T12:00:00Z"/>
+          <w:ins w:id="1881" w:author="Language Editor" w:date="2026-09-27T12:00:00Z"/>
         </w:rPr>
       </w:pPr>
-      <w:ins w:id="1897" w:author="Language Editor" w:date="2026-09-27T12:00:00Z">
+      <w:ins w:id="1882" w:author="Language Editor" w:date="2026-09-27T12:00:00Z">
         <w:r>
           <w:rPr>
             <w:b/>
@@ -198,10 +198,10 @@
         <w:spacing w:after="60"/>
         <w:jc w:val="both"/>
         <w:rPr>
-          <w:ins w:id="1898" w:author="Language Editor" w:date="2026-09-27T12:00:00Z"/>
+          <w:ins w:id="1883" w:author="Language Editor" w:date="2026-09-27T12:00:00Z"/>
         </w:rPr>
       </w:pPr>
-      <w:ins w:id="1899" w:author="Language Editor" w:date="2026-09-27T12:00:00Z">
+      <w:ins w:id="1884" w:author="Language Editor" w:date="2026-09-27T12:00:00Z">
         <w:r>
           <w:t xml:space="preserve">• CroplandGPT links cropland mapping, assessment and management support.</w:t>
         </w:r>
@@ -212,10 +212,10 @@
         <w:spacing w:after="60"/>
         <w:jc w:val="both"/>
         <w:rPr>
-          <w:ins w:id="1900" w:author="Language Editor" w:date="2026-09-27T12:00:00Z"/>
+          <w:ins w:id="1885" w:author="Language Editor" w:date="2026-09-27T12:00:00Z"/>
         </w:rPr>
       </w:pPr>
-      <w:ins w:id="1901" w:author="Language Editor" w:date="2026-09-27T12:00:00Z">
+      <w:ins w:id="1886" w:author="Language Editor" w:date="2026-09-27T12:00:00Z">
         <w:r>
           <w:t xml:space="preserve">• A shared geospatial encoder feeds mapping heads and a vision-language branch.</w:t>
         </w:r>
@@ -226,10 +226,10 @@
         <w:spacing w:after="60"/>
         <w:jc w:val="both"/>
         <w:rPr>
-          <w:ins w:id="1902" w:author="Language Editor" w:date="2026-09-27T12:00:00Z"/>
+          <w:ins w:id="1887" w:author="Language Editor" w:date="2026-09-27T12:00:00Z"/>
         </w:rPr>
       </w:pPr>
-      <w:ins w:id="1903" w:author="Language Editor" w:date="2026-09-27T12:00:00Z">
+      <w:ins w:id="1888" w:author="Language Editor" w:date="2026-09-27T12:00:00Z">
         <w:r>
           <w:t xml:space="preserve">• Explicit evidence records keep values, dates and sources traceable.</w:t>
         </w:r>
@@ -240,10 +240,10 @@
         <w:spacing w:after="60"/>
         <w:jc w:val="both"/>
         <w:rPr>
-          <w:ins w:id="1904" w:author="Language Editor" w:date="2026-09-27T12:00:00Z"/>
+          <w:ins w:id="1889" w:author="Language Editor" w:date="2026-09-27T12:00:00Z"/>
         </w:rPr>
       </w:pPr>
-      <w:ins w:id="1905" w:author="Language Editor" w:date="2026-09-27T12:00:00Z">
+      <w:ins w:id="1890" w:author="Language Editor" w:date="2026-09-27T12:00:00Z">
         <w:r>
           <w:t xml:space="preserve">• Six dimensions and three reasoning levels standardize annotation and output.</w:t>
         </w:r>
@@ -254,10 +254,10 @@
         <w:spacing w:after="60"/>
         <w:jc w:val="both"/>
         <w:rPr>
-          <w:ins w:id="1906" w:author="Language Editor" w:date="2026-09-27T12:00:00Z"/>
+          <w:ins w:id="1891" w:author="Language Editor" w:date="2026-09-27T12:00:00Z"/>
         </w:rPr>
       </w:pPr>
-      <w:ins w:id="1907" w:author="Language Editor" w:date="2026-09-27T12:00:00Z">
+      <w:ins w:id="1892" w:author="Language Editor" w:date="2026-09-27T12:00:00Z">
         <w:r>
           <w:t xml:space="preserve">• Qiyang and Quzhou cases show adaptation to contrasting cropland questions.</w:t>
         </w:r>
@@ -3791,129 +3791,60 @@
         <w:spacing w:before="200" w:after="60"/>
         <w:jc w:val="center"/>
       </w:pPr>
+      <w:ins w:id="1880" w:author="Language Editor" w:date="2026-09-27T12:00:00Z">
+        <w:r>
+          <w:drawing xmlns:a="http://schemas.openxmlformats.org/drawingml/2006/main" xmlns:pic="http://schemas.openxmlformats.org/drawingml/2006/picture">
+            <wp:inline distT="0" distB="0" distL="0" distR="0">
+              <wp:extent cx="5724000" cy="6283956"/>
+              <wp:docPr id="101" name="Figure 101"/>
+              <wp:cNvGraphicFramePr>
+                <a:graphicFrameLocks noChangeAspect="1"/>
+              </wp:cNvGraphicFramePr>
+              <a:graphic>
+                <a:graphicData uri="http://schemas.openxmlformats.org/drawingml/2006/picture">
+                  <pic:pic>
+                    <pic:nvPicPr>
+                      <pic:cNvPr id="101" name="media/figure1.png"/>
+                      <pic:cNvPicPr/>
+                    </pic:nvPicPr>
+                    <pic:blipFill>
+                      <a:blip r:embed="rIdFig1"/>
+                      <a:stretch>
+                        <a:fillRect/>
+                      </a:stretch>
+                    </pic:blipFill>
+                    <pic:spPr>
+                      <a:xfrm>
+                        <a:off x="0" y="0"/>
+                        <a:ext cx="5724000" cy="6283956"/>
+                      </a:xfrm>
+                      <a:prstGeom prst="rect">
+                        <a:avLst/>
+                      </a:prstGeom>
+                    </pic:spPr>
+                  </pic:pic>
+                </a:graphicData>
+              </a:graphic>
+            </wp:inline>
+          </w:drawing>
+        </w:r>
+      </w:ins>
     </w:p>
     <w:p>
       <w:pPr>
         <w:spacing w:before="120" w:after="240"/>
       </w:pPr>
       <w:r>
-        <w:t xml:space="preserve">Fig. 3 Proposed CroplandGPT network architecture. (a) Modality-specific encoders and spatial fusion produce shared features for mapping, parcel-level prediction and language input</w:t>
+        <w:t xml:space="preserve">Fig. 3 Proposed CroplandGPT network architecture. (a) </w:t>
       </w:r>
       <w:del w:id="1343" w:author="Language Editor" w:date="2026-09-27T12:00:00Z">
         <w:r>
-          <w:delText xml:space="preserve">. The</w:delText>
+          <w:delText xml:space="preserve">Modality-specific encoders and spatial fusion produce shared features for mapping, parcel-level prediction and language input. The GFM-inspired front end is shared, without a duplicate RGB encoder. (b) Pre-normalized cross-attention, spatial self-attention and feed-forward sublayers preserve the spatial-token grid through residual connections; validity and spatial or temporal support constrain auxiliary attention. (c) Query resampling and projection convey continuous features to a pretrained language decoder, alongside explicit evidence, questions, criteria and retrieved knowledge. The resulting branch forms the proposed vision-language interface. Dimensions omit the batch axis. Backbones, widths and training settings remain to be selected; no learned capability is implied by the diagram alone</w:delText>
         </w:r>
       </w:del>
       <w:ins w:id="1344" w:author="Language Editor" w:date="2026-09-27T12:00:00Z">
         <w:r>
-          <w:t xml:space="preserve">; because the</w:t>
-        </w:r>
-      </w:ins>
-      <w:r>
-        <w:t xml:space="preserve"> GFM-inspired front end is shared, </w:t>
-      </w:r>
-      <w:del w:id="1345" w:author="Language Editor" w:date="2026-09-27T12:00:00Z">
-        <w:r>
-          <w:delText xml:space="preserve">without a</w:delText>
-        </w:r>
-      </w:del>
-      <w:ins w:id="1346" w:author="Language Editor" w:date="2026-09-27T12:00:00Z">
-        <w:r>
-          <w:t xml:space="preserve">no</w:t>
-        </w:r>
-      </w:ins>
-      <w:r>
-        <w:t xml:space="preserve"> duplicate RGB encoder</w:t>
-      </w:r>
-      <w:ins w:id="1347" w:author="Language Editor" w:date="2026-09-27T12:00:00Z">
-        <w:r>
-          <w:t xml:space="preserve"> is needed</w:t>
-        </w:r>
-      </w:ins>
-      <w:r>
-        <w:t xml:space="preserve">. (b) Pre-normalized cross-attention, spatial self-attention and feed-forward sublayers preserve the spatial</w:t>
-      </w:r>
-      <w:del w:id="1348" w:author="Language Editor" w:date="2026-09-27T12:00:00Z">
-        <w:r>
-          <w:delText xml:space="preserve">-</w:delText>
-        </w:r>
-      </w:del>
-      <w:ins w:id="1349" w:author="Language Editor" w:date="2026-09-27T12:00:00Z">
-        <w:r>
-          <w:t xml:space="preserve"> </w:t>
-        </w:r>
-      </w:ins>
-      <w:r>
-        <w:t xml:space="preserve">token grid through residual connections</w:t>
-      </w:r>
-      <w:del w:id="1350" w:author="Language Editor" w:date="2026-09-27T12:00:00Z">
-        <w:r>
-          <w:delText xml:space="preserve">;</w:delText>
-        </w:r>
-      </w:del>
-      <w:ins w:id="1351" w:author="Language Editor" w:date="2026-09-27T12:00:00Z">
-        <w:r>
-          <w:t xml:space="preserve">, and</w:t>
-        </w:r>
-      </w:ins>
-      <w:r>
-        <w:t xml:space="preserve"> validity and spatial or temporal support constrain auxiliary attention. (c) Query resampling and projection </w:t>
-      </w:r>
-      <w:del w:id="1352" w:author="Language Editor" w:date="2026-09-27T12:00:00Z">
-        <w:r>
-          <w:delText xml:space="preserve">convey</w:delText>
-        </w:r>
-      </w:del>
-      <w:ins w:id="1353" w:author="Language Editor" w:date="2026-09-27T12:00:00Z">
-        <w:r>
-          <w:t xml:space="preserve">pass</w:t>
-        </w:r>
-      </w:ins>
-      <w:r>
-        <w:t xml:space="preserve"> continuous features to a pretrained language decoder, </w:t>
-      </w:r>
-      <w:del w:id="1354" w:author="Language Editor" w:date="2026-09-27T12:00:00Z">
-        <w:r>
-          <w:delText xml:space="preserve">alongside</w:delText>
-        </w:r>
-      </w:del>
-      <w:ins w:id="1355" w:author="Language Editor" w:date="2026-09-27T12:00:00Z">
-        <w:r>
-          <w:t xml:space="preserve">together with</w:t>
-        </w:r>
-      </w:ins>
-      <w:r>
-        <w:t xml:space="preserve"> explicit evidence, questions, criteria and retrieved knowledge</w:t>
-      </w:r>
-      <w:del w:id="1356" w:author="Language Editor" w:date="2026-09-27T12:00:00Z">
-        <w:r>
-          <w:delText xml:space="preserve">. The resulting</w:delText>
-        </w:r>
-      </w:del>
-      <w:ins w:id="1357" w:author="Language Editor" w:date="2026-09-27T12:00:00Z">
-        <w:r>
-          <w:t xml:space="preserve">; this</w:t>
-        </w:r>
-      </w:ins>
-      <w:r>
-        <w:t xml:space="preserve"> branch forms the</w:t>
-      </w:r>
-      <w:del w:id="1358" w:author="Language Editor" w:date="2026-09-27T12:00:00Z">
-        <w:r>
-          <w:delText xml:space="preserve"> proposed</w:delText>
-        </w:r>
-      </w:del>
-      <w:r>
-        <w:t xml:space="preserve"> vision-language interface. Dimensions omit the batch axis. Backbones, widths and training settings </w:t>
-      </w:r>
-      <w:del w:id="1359" w:author="Language Editor" w:date="2026-09-27T12:00:00Z">
-        <w:r>
-          <w:delText xml:space="preserve">remain to be selected; no learned capability is implied by the diagram alone</w:delText>
-        </w:r>
-      </w:del>
-      <w:ins w:id="1360" w:author="Language Editor" w:date="2026-09-27T12:00:00Z">
-        <w:r>
-          <w:t xml:space="preserve">are configurable</w:t>
+          <w:t xml:space="preserve">A GFM-inspired geospatial encoder and modality encoders feed a spatial fusion block. The resulting shared features H drive the spatial decoder, parcel pooling and the vision-language branch, so no duplicate RGB encoder is needed; observed and predicted values are kept as evidence records E. (b) Each of the L_f fusion blocks applies pre-normalized cross-attention, spatial self-attention and feed-forward sublayers with residual connections, preserving the spatial token grid; support masks restrict which auxiliary records inform each spatial position. (c) A query resampler and MLP projector compress H into K visual tokens, which are concatenated with serialized questions, criteria, evidence and retrieved knowledge to form the prefix of a pretrained language decoder. Generated statements are checked against E and indexed by D1–D6 × L1–L3. Dimensions omit the batch axis</w:t>
         </w:r>
       </w:ins>
       <w:r>
@@ -3952,12 +3883,12 @@
       <w:r>
         <w:t xml:space="preserve"> tokens when </w:t>
       </w:r>
-      <w:del w:id="1361" w:author="Language Editor" w:date="2026-09-27T12:00:00Z">
+      <w:del w:id="1345" w:author="Language Editor" w:date="2026-09-27T12:00:00Z">
         <w:r>
           <w:delText xml:space="preserve">the</w:delText>
         </w:r>
       </w:del>
-      <w:ins w:id="1362" w:author="Language Editor" w:date="2026-09-27T12:00:00Z">
+      <w:ins w:id="1346" w:author="Language Editor" w:date="2026-09-27T12:00:00Z">
         <w:r>
           <w:t xml:space="preserve">both</w:t>
         </w:r>
@@ -4019,12 +3950,12 @@
       <w:r>
         <w:t xml:space="preserve">. </w:t>
       </w:r>
-      <w:del w:id="1363" w:author="Language Editor" w:date="2026-09-27T12:00:00Z">
+      <w:del w:id="1347" w:author="Language Editor" w:date="2026-09-27T12:00:00Z">
         <w:r>
           <w:delText xml:space="preserve">Thus</w:delText>
         </w:r>
       </w:del>
-      <w:ins w:id="1364" w:author="Language Editor" w:date="2026-09-27T12:00:00Z">
+      <w:ins w:id="1348" w:author="Language Editor" w:date="2026-09-27T12:00:00Z">
         <w:r>
           <w:t xml:space="preserve">For example</w:t>
         </w:r>
@@ -4032,12 +3963,12 @@
       <w:r>
         <w:t xml:space="preserve">, a 32 × 32 three-channel image </w:t>
       </w:r>
-      <w:del w:id="1365" w:author="Language Editor" w:date="2026-09-27T12:00:00Z">
+      <w:del w:id="1349" w:author="Language Editor" w:date="2026-09-27T12:00:00Z">
         <w:r>
           <w:delText xml:space="preserve">partitioned</w:delText>
         </w:r>
       </w:del>
-      <w:ins w:id="1366" w:author="Language Editor" w:date="2026-09-27T12:00:00Z">
+      <w:ins w:id="1350" w:author="Language Editor" w:date="2026-09-27T12:00:00Z">
         <w:r>
           <w:t xml:space="preserve">divided</w:t>
         </w:r>
@@ -4045,12 +3976,12 @@
       <w:r>
         <w:t xml:space="preserve"> into 16 × 16 patches yields four vectors of 768 values</w:t>
       </w:r>
-      <w:del w:id="1367" w:author="Language Editor" w:date="2026-09-27T12:00:00Z">
+      <w:del w:id="1351" w:author="Language Editor" w:date="2026-09-27T12:00:00Z">
         <w:r>
           <w:delText xml:space="preserve">. A projection to eight components is an arithmetic illustration, not a selected CroplandGPT setting. Patch footprints remain</w:delText>
         </w:r>
       </w:del>
-      <w:ins w:id="1368" w:author="Language Editor" w:date="2026-09-27T12:00:00Z">
+      <w:ins w:id="1352" w:author="Language Editor" w:date="2026-09-27T12:00:00Z">
         <w:r>
           <w:t xml:space="preserve"> each. Patch footprints stay</w:t>
         </w:r>
@@ -4058,12 +3989,12 @@
       <w:r>
         <w:t xml:space="preserve"> associated with spatial objects, and </w:t>
       </w:r>
-      <w:del w:id="1369" w:author="Language Editor" w:date="2026-09-27T12:00:00Z">
+      <w:del w:id="1353" w:author="Language Editor" w:date="2026-09-27T12:00:00Z">
         <w:r>
           <w:delText xml:space="preserve">padding is excluded through</w:delText>
         </w:r>
       </w:del>
-      <w:ins w:id="1370" w:author="Language Editor" w:date="2026-09-27T12:00:00Z">
+      <w:ins w:id="1354" w:author="Language Editor" w:date="2026-09-27T12:00:00Z">
         <w:r>
           <w:t xml:space="preserve">padded areas are excluded by</w:t>
         </w:r>
@@ -4170,12 +4101,12 @@
       <w:r>
         <w:t xml:space="preserve">Temporal sequences. </w:t>
       </w:r>
-      <w:del w:id="1371" w:author="Language Editor" w:date="2026-09-27T12:00:00Z">
+      <w:del w:id="1355" w:author="Language Editor" w:date="2026-09-27T12:00:00Z">
         <w:r>
           <w:delText xml:space="preserve">Dates, observation quality and missingness accompany each sequence</w:delText>
         </w:r>
       </w:del>
-      <w:ins w:id="1372" w:author="Language Editor" w:date="2026-09-27T12:00:00Z">
+      <w:ins w:id="1356" w:author="Language Editor" w:date="2026-09-27T12:00:00Z">
         <w:r>
           <w:t xml:space="preserve">Each sequence is accompanied by observation dates, quality flags and missingness indicators</w:t>
         </w:r>
@@ -4183,12 +4114,12 @@
       <w:r>
         <w:t xml:space="preserve">. For example, 12 NDVI observations can be </w:t>
       </w:r>
-      <w:del w:id="1373" w:author="Language Editor" w:date="2026-09-27T12:00:00Z">
+      <w:del w:id="1357" w:author="Language Editor" w:date="2026-09-27T12:00:00Z">
         <w:r>
           <w:delText xml:space="preserve">partitioned</w:delText>
         </w:r>
       </w:del>
-      <w:ins w:id="1374" w:author="Language Editor" w:date="2026-09-27T12:00:00Z">
+      <w:ins w:id="1358" w:author="Language Editor" w:date="2026-09-27T12:00:00Z">
         <w:r>
           <w:t xml:space="preserve">divided</w:t>
         </w:r>
@@ -4488,12 +4419,12 @@
       <w:r>
         <w:t xml:space="preserve">. These </w:t>
       </w:r>
-      <w:del w:id="1375" w:author="Language Editor" w:date="2026-09-27T12:00:00Z">
+      <w:del w:id="1359" w:author="Language Editor" w:date="2026-09-27T12:00:00Z">
         <w:r>
           <w:delText xml:space="preserve">become named</w:delText>
         </w:r>
       </w:del>
-      <w:ins w:id="1376" w:author="Language Editor" w:date="2026-09-27T12:00:00Z">
+      <w:ins w:id="1360" w:author="Language Editor" w:date="2026-09-27T12:00:00Z">
         <w:r>
           <w:t xml:space="preserve">segments are labeled as</w:t>
         </w:r>
@@ -4501,12 +4432,12 @@
       <w:r>
         <w:t xml:space="preserve"> phenological stages only when crop</w:t>
       </w:r>
-      <w:del w:id="1377" w:author="Language Editor" w:date="2026-09-27T12:00:00Z">
+      <w:del w:id="1361" w:author="Language Editor" w:date="2026-09-27T12:00:00Z">
         <w:r>
           <w:delText xml:space="preserve">-calendar or field evidence supports those</w:delText>
         </w:r>
       </w:del>
-      <w:ins w:id="1378" w:author="Language Editor" w:date="2026-09-27T12:00:00Z">
+      <w:ins w:id="1362" w:author="Language Editor" w:date="2026-09-27T12:00:00Z">
         <w:r>
           <w:t xml:space="preserve"> calendars or field records support the</w:t>
         </w:r>
@@ -4514,12 +4445,12 @@
       <w:r>
         <w:t xml:space="preserve"> labels. Irregular sampling </w:t>
       </w:r>
-      <w:del w:id="1379" w:author="Language Editor" w:date="2026-09-27T12:00:00Z">
+      <w:del w:id="1363" w:author="Language Editor" w:date="2026-09-27T12:00:00Z">
         <w:r>
           <w:delText xml:space="preserve">requires</w:delText>
         </w:r>
       </w:del>
-      <w:ins w:id="1380" w:author="Language Editor" w:date="2026-09-27T12:00:00Z">
+      <w:ins w:id="1364" w:author="Language Editor" w:date="2026-09-27T12:00:00Z">
         <w:r>
           <w:t xml:space="preserve">is handled with</w:t>
         </w:r>
@@ -4527,7 +4458,7 @@
       <w:r>
         <w:t xml:space="preserve"> explicit time gaps and masks. Temporal encoders can learn from such </w:t>
       </w:r>
-      <w:del w:id="1381" w:author="Language Editor" w:date="2026-09-27T12:00:00Z">
+      <w:del w:id="1365" w:author="Language Editor" w:date="2026-09-27T12:00:00Z">
         <w:r>
           <w:delText xml:space="preserve">observations </w:delText>
         </w:r>
@@ -4550,7 +4481,7 @@
           <w:delText xml:space="preserve">;</w:delText>
         </w:r>
       </w:del>
-      <w:ins w:id="1382" w:author="Language Editor" w:date="2026-09-27T12:00:00Z">
+      <w:ins w:id="1366" w:author="Language Editor" w:date="2026-09-27T12:00:00Z">
         <w:r>
           <w:t xml:space="preserve">sequences [25], and the</w:t>
         </w:r>
@@ -4558,12 +4489,12 @@
       <w:r>
         <w:t xml:space="preserve"> segmentation and interpolation rules </w:t>
       </w:r>
-      <w:del w:id="1383" w:author="Language Editor" w:date="2026-09-27T12:00:00Z">
+      <w:del w:id="1367" w:author="Language Editor" w:date="2026-09-27T12:00:00Z">
         <w:r>
           <w:delText xml:space="preserve">must remain documented</w:delText>
         </w:r>
       </w:del>
-      <w:ins w:id="1384" w:author="Language Editor" w:date="2026-09-27T12:00:00Z">
+      <w:ins w:id="1368" w:author="Language Editor" w:date="2026-09-27T12:00:00Z">
         <w:r>
           <w:t xml:space="preserve">are documented with the data</w:t>
         </w:r>
@@ -4626,12 +4557,12 @@
       <w:r>
         <w:t xml:space="preserve">A linear </w:t>
       </w:r>
-      <w:del w:id="1385" w:author="Language Editor" w:date="2026-09-27T12:00:00Z">
+      <w:del w:id="1369" w:author="Language Editor" w:date="2026-09-27T12:00:00Z">
         <w:r>
           <w:delText xml:space="preserve">illustration for one segment is </w:delText>
         </w:r>
       </w:del>
-      <w:ins w:id="1386" w:author="Language Editor" w:date="2026-09-27T12:00:00Z">
+      <w:ins w:id="1370" w:author="Language Editor" w:date="2026-09-27T12:00:00Z">
         <w:r>
           <w:t xml:space="preserve">projection of one segment can be written as </w:t>
         </w:r>
@@ -4753,12 +4684,12 @@
       <w:r>
         <w:t xml:space="preserve">. </w:t>
       </w:r>
-      <w:del w:id="1387" w:author="Language Editor" w:date="2026-09-27T12:00:00Z">
+      <w:del w:id="1371" w:author="Language Editor" w:date="2026-09-27T12:00:00Z">
         <w:r>
           <w:delText xml:space="preserve">Three NDVI values projected</w:delText>
         </w:r>
       </w:del>
-      <w:ins w:id="1388" w:author="Language Editor" w:date="2026-09-27T12:00:00Z">
+      <w:ins w:id="1372" w:author="Language Editor" w:date="2026-09-27T12:00:00Z">
         <w:r>
           <w:t xml:space="preserve">Projecting three NDVI values</w:t>
         </w:r>
@@ -4766,12 +4697,12 @@
       <w:r>
         <w:t xml:space="preserve"> to eight components </w:t>
       </w:r>
-      <w:del w:id="1389" w:author="Language Editor" w:date="2026-09-27T12:00:00Z">
+      <w:del w:id="1373" w:author="Language Editor" w:date="2026-09-27T12:00:00Z">
         <w:r>
           <w:delText xml:space="preserve">require</w:delText>
         </w:r>
       </w:del>
-      <w:ins w:id="1390" w:author="Language Editor" w:date="2026-09-27T12:00:00Z">
+      <w:ins w:id="1374" w:author="Language Editor" w:date="2026-09-27T12:00:00Z">
         <w:r>
           <w:t xml:space="preserve">requires</w:t>
         </w:r>
@@ -4779,12 +4710,12 @@
       <w:r>
         <w:t xml:space="preserve"> an 8 × 3 weight matrix and an eight-component bias. </w:t>
       </w:r>
-      <w:del w:id="1391" w:author="Language Editor" w:date="2026-09-27T12:00:00Z">
+      <w:del w:id="1375" w:author="Language Editor" w:date="2026-09-27T12:00:00Z">
         <w:r>
           <w:delText xml:space="preserve">Values</w:delText>
         </w:r>
       </w:del>
-      <w:ins w:id="1392" w:author="Language Editor" w:date="2026-09-27T12:00:00Z">
+      <w:ins w:id="1376" w:author="Language Editor" w:date="2026-09-27T12:00:00Z">
         <w:r>
           <w:t xml:space="preserve">With values</w:t>
         </w:r>
@@ -4792,12 +4723,12 @@
       <w:r>
         <w:t xml:space="preserve"> [0.20, 0.40, 0.60], weights [0.5, 0.3, 0.2] and zero bias</w:t>
       </w:r>
-      <w:del w:id="1393" w:author="Language Editor" w:date="2026-09-27T12:00:00Z">
+      <w:del w:id="1377" w:author="Language Editor" w:date="2026-09-27T12:00:00Z">
         <w:r>
           <w:delText xml:space="preserve"> yield 0.34 for one component. Operational encoders must also</w:delText>
         </w:r>
       </w:del>
-      <w:ins w:id="1394" w:author="Language Editor" w:date="2026-09-27T12:00:00Z">
+      <w:ins w:id="1378" w:author="Language Editor" w:date="2026-09-27T12:00:00Z">
         <w:r>
           <w:t xml:space="preserve">, one component equals 0.34. Operational encoders additionally</w:t>
         </w:r>
@@ -4805,12 +4736,12 @@
       <w:r>
         <w:t xml:space="preserve"> account for timing and quality</w:t>
       </w:r>
-      <w:del w:id="1395" w:author="Language Editor" w:date="2026-09-27T12:00:00Z">
+      <w:del w:id="1379" w:author="Language Editor" w:date="2026-09-27T12:00:00Z">
         <w:r>
           <w:delText xml:space="preserve"> and learn parameters</w:delText>
         </w:r>
       </w:del>
-      <w:ins w:id="1396" w:author="Language Editor" w:date="2026-09-27T12:00:00Z">
+      <w:ins w:id="1380" w:author="Language Editor" w:date="2026-09-27T12:00:00Z">
         <w:r>
           <w:t xml:space="preserve">, and their parameters are learned</w:t>
         </w:r>
@@ -4818,12 +4749,12 @@
       <w:r>
         <w:t xml:space="preserve"> under specified objectives. </w:t>
       </w:r>
-      <w:del w:id="1397" w:author="Language Editor" w:date="2026-09-27T12:00:00Z">
+      <w:del w:id="1381" w:author="Language Editor" w:date="2026-09-27T12:00:00Z">
         <w:r>
           <w:delText xml:space="preserve">Such</w:delText>
         </w:r>
       </w:del>
-      <w:ins w:id="1398" w:author="Language Editor" w:date="2026-09-27T12:00:00Z">
+      <w:ins w:id="1382" w:author="Language Editor" w:date="2026-09-27T12:00:00Z">
         <w:r>
           <w:t xml:space="preserve">The resulting</w:t>
         </w:r>
@@ -4831,12 +4762,12 @@
       <w:r>
         <w:t xml:space="preserve"> components are latent features</w:t>
       </w:r>
-      <w:del w:id="1399" w:author="Language Editor" w:date="2026-09-27T12:00:00Z">
+      <w:del w:id="1383" w:author="Language Editor" w:date="2026-09-27T12:00:00Z">
         <w:r>
           <w:delText xml:space="preserve">, not named physical quantities</w:delText>
         </w:r>
       </w:del>
-      <w:ins w:id="1400" w:author="Language Editor" w:date="2026-09-27T12:00:00Z">
+      <w:ins w:id="1384" w:author="Language Editor" w:date="2026-09-27T12:00:00Z">
         <w:r>
           <w:t xml:space="preserve"> without direct physical meaning</w:t>
         </w:r>
@@ -4853,12 +4784,12 @@
       <w:r>
         <w:t xml:space="preserve">Soil and management records. Soil measurements retain sampling depth, date, location, analytical method and units. Numerical variables are standardized </w:t>
       </w:r>
-      <w:del w:id="1401" w:author="Language Editor" w:date="2026-09-27T12:00:00Z">
+      <w:del w:id="1385" w:author="Language Editor" w:date="2026-09-27T12:00:00Z">
         <w:r>
           <w:delText xml:space="preserve">using</w:delText>
         </w:r>
       </w:del>
-      <w:ins w:id="1402" w:author="Language Editor" w:date="2026-09-27T12:00:00Z">
+      <w:ins w:id="1386" w:author="Language Editor" w:date="2026-09-27T12:00:00Z">
         <w:r>
           <w:t xml:space="preserve">with</w:t>
         </w:r>
@@ -4866,12 +4797,12 @@
       <w:r>
         <w:t xml:space="preserve"> training-set statistics, paired with missingness indicators and </w:t>
       </w:r>
-      <w:del w:id="1403" w:author="Language Editor" w:date="2026-09-27T12:00:00Z">
+      <w:del w:id="1387" w:author="Language Editor" w:date="2026-09-27T12:00:00Z">
         <w:r>
           <w:delText xml:space="preserve">encoded by an appropriate numerical module</w:delText>
         </w:r>
       </w:del>
-      <w:ins w:id="1404" w:author="Language Editor" w:date="2026-09-27T12:00:00Z">
+      <w:ins w:id="1388" w:author="Language Editor" w:date="2026-09-27T12:00:00Z">
         <w:r>
           <w:t xml:space="preserve">passed to a numerical encoder</w:t>
         </w:r>
@@ -4879,12 +4810,12 @@
       <w:r>
         <w:t xml:space="preserve">. Management records describe dated events </w:t>
       </w:r>
-      <w:del w:id="1405" w:author="Language Editor" w:date="2026-09-27T12:00:00Z">
+      <w:del w:id="1389" w:author="Language Editor" w:date="2026-09-27T12:00:00Z">
         <w:r>
           <w:delText xml:space="preserve">with the</w:delText>
         </w:r>
       </w:del>
-      <w:ins w:id="1406" w:author="Language Editor" w:date="2026-09-27T12:00:00Z">
+      <w:ins w:id="1390" w:author="Language Editor" w:date="2026-09-27T12:00:00Z">
         <w:r>
           <w:t xml:space="preserve">by</w:t>
         </w:r>
@@ -4892,12 +4823,12 @@
       <w:r>
         <w:t xml:space="preserve"> action, material or practice, amount, unit and affected object. Categorical embeddings and numerical features </w:t>
       </w:r>
-      <w:del w:id="1407" w:author="Language Editor" w:date="2026-09-27T12:00:00Z">
+      <w:del w:id="1391" w:author="Language Editor" w:date="2026-09-27T12:00:00Z">
         <w:r>
           <w:delText xml:space="preserve">can be</w:delText>
         </w:r>
       </w:del>
-      <w:ins w:id="1408" w:author="Language Editor" w:date="2026-09-27T12:00:00Z">
+      <w:ins w:id="1392" w:author="Language Editor" w:date="2026-09-27T12:00:00Z">
         <w:r>
           <w:t xml:space="preserve">are</w:t>
         </w:r>
@@ -4905,12 +4836,12 @@
       <w:r>
         <w:t xml:space="preserve"> combined for each event, preserving the timing of repeated applications. </w:t>
       </w:r>
-      <w:del w:id="1409" w:author="Language Editor" w:date="2026-09-27T12:00:00Z">
+      <w:del w:id="1393" w:author="Language Editor" w:date="2026-09-27T12:00:00Z">
         <w:r>
           <w:delText xml:space="preserve">Encoding does not fill unmeasured nutrient concentrations with invented</w:delText>
         </w:r>
       </w:del>
-      <w:ins w:id="1410" w:author="Language Editor" w:date="2026-09-27T12:00:00Z">
+      <w:ins w:id="1394" w:author="Language Editor" w:date="2026-09-27T12:00:00Z">
         <w:r>
           <w:t xml:space="preserve">Unmeasured nutrient concentrations are flagged as missing and never imputed as</w:t>
         </w:r>
@@ -4927,7 +4858,7 @@
       <w:r>
         <w:t xml:space="preserve">Geospatial context and knowledge. Terrain, field geometry and spatial relationships provide </w:t>
       </w:r>
-      <w:ins w:id="1411" w:author="Language Editor" w:date="2026-09-27T12:00:00Z">
+      <w:ins w:id="1395" w:author="Language Editor" w:date="2026-09-27T12:00:00Z">
         <w:r>
           <w:t xml:space="preserve">the </w:t>
         </w:r>
@@ -4935,12 +4866,12 @@
       <w:r>
         <w:t xml:space="preserve">context for linking imagery and observations. An agricultural knowledge record </w:t>
       </w:r>
-      <w:del w:id="1412" w:author="Language Editor" w:date="2026-09-27T12:00:00Z">
+      <w:del w:id="1396" w:author="Language Editor" w:date="2026-09-27T12:00:00Z">
         <w:r>
           <w:delText xml:space="preserve">additionally</w:delText>
         </w:r>
       </w:del>
-      <w:ins w:id="1413" w:author="Language Editor" w:date="2026-09-27T12:00:00Z">
+      <w:ins w:id="1397" w:author="Language Editor" w:date="2026-09-27T12:00:00Z">
         <w:r>
           <w:t xml:space="preserve">also</w:t>
         </w:r>
@@ -4948,7 +4879,7 @@
       <w:r>
         <w:t xml:space="preserve"> specifies its source,</w:t>
       </w:r>
-      <w:ins w:id="1414" w:author="Language Editor" w:date="2026-09-27T12:00:00Z">
+      <w:ins w:id="1398" w:author="Language Editor" w:date="2026-09-27T12:00:00Z">
         <w:r>
           <w:t xml:space="preserve"> the</w:t>
         </w:r>
@@ -4956,12 +4887,12 @@
       <w:r>
         <w:t xml:space="preserve"> relevant crop or land use, applicable conditions and exceptions. It can be retrieved as text or represented as a structured relation</w:t>
       </w:r>
-      <w:del w:id="1415" w:author="Language Editor" w:date="2026-09-27T12:00:00Z">
+      <w:del w:id="1399" w:author="Language Editor" w:date="2026-09-27T12:00:00Z">
         <w:r>
           <w:delText xml:space="preserve">. Its</w:delText>
         </w:r>
       </w:del>
-      <w:ins w:id="1416" w:author="Language Editor" w:date="2026-09-27T12:00:00Z">
+      <w:ins w:id="1400" w:author="Language Editor" w:date="2026-09-27T12:00:00Z">
         <w:r>
           <w:t xml:space="preserve">, and its</w:t>
         </w:r>
@@ -4969,12 +4900,12 @@
       <w:r>
         <w:t xml:space="preserve"> segmentation determines the token count</w:t>
       </w:r>
-      <w:del w:id="1417" w:author="Language Editor" w:date="2026-09-27T12:00:00Z">
+      <w:del w:id="1401" w:author="Language Editor" w:date="2026-09-27T12:00:00Z">
         <w:r>
           <w:delText xml:space="preserve">;</w:delText>
         </w:r>
       </w:del>
-      <w:ins w:id="1418" w:author="Language Editor" w:date="2026-09-27T12:00:00Z">
+      <w:ins w:id="1402" w:author="Language Editor" w:date="2026-09-27T12:00:00Z">
         <w:r>
           <w:t xml:space="preserve">, so</w:t>
         </w:r>
@@ -4982,12 +4913,12 @@
       <w:r>
         <w:t xml:space="preserve"> one statement need not equal one token. </w:t>
       </w:r>
-      <w:del w:id="1419" w:author="Language Editor" w:date="2026-09-27T12:00:00Z">
+      <w:del w:id="1403" w:author="Language Editor" w:date="2026-09-27T12:00:00Z">
         <w:r>
           <w:delText xml:space="preserve">Multiple representations of</w:delText>
         </w:r>
       </w:del>
-      <w:ins w:id="1420" w:author="Language Editor" w:date="2026-09-27T12:00:00Z">
+      <w:ins w:id="1404" w:author="Language Editor" w:date="2026-09-27T12:00:00Z">
         <w:r>
           <w:t xml:space="preserve">When</w:t>
         </w:r>
@@ -4995,12 +4926,12 @@
       <w:r>
         <w:t xml:space="preserve"> the same observation </w:t>
       </w:r>
-      <w:del w:id="1421" w:author="Language Editor" w:date="2026-09-27T12:00:00Z">
+      <w:del w:id="1405" w:author="Language Editor" w:date="2026-09-27T12:00:00Z">
         <w:r>
           <w:delText xml:space="preserve">retain a common</w:delText>
         </w:r>
       </w:del>
-      <w:ins w:id="1422" w:author="Language Editor" w:date="2026-09-27T12:00:00Z">
+      <w:ins w:id="1406" w:author="Language Editor" w:date="2026-09-27T12:00:00Z">
         <w:r>
           <w:t xml:space="preserve">appears in several representations, all copies share one</w:t>
         </w:r>
@@ -5008,12 +4939,12 @@
       <w:r>
         <w:t xml:space="preserve"> source identifier so that </w:t>
       </w:r>
-      <w:del w:id="1423" w:author="Language Editor" w:date="2026-09-27T12:00:00Z">
+      <w:del w:id="1407" w:author="Language Editor" w:date="2026-09-27T12:00:00Z">
         <w:r>
           <w:delText xml:space="preserve">duplication is</w:delText>
         </w:r>
       </w:del>
-      <w:ins w:id="1424" w:author="Language Editor" w:date="2026-09-27T12:00:00Z">
+      <w:ins w:id="1408" w:author="Language Editor" w:date="2026-09-27T12:00:00Z">
         <w:r>
           <w:t xml:space="preserve">duplicates are</w:t>
         </w:r>
@@ -5039,176 +4970,176 @@
       <w:r>
         <w:t xml:space="preserve">Six dimensions organize expert annotations and </w:t>
       </w:r>
+      <w:del w:id="1409" w:author="Language Editor" w:date="2026-09-27T12:00:00Z">
+        <w:r>
+          <w:delText xml:space="preserve">intended outputs. D1 concerns</w:delText>
+        </w:r>
+      </w:del>
+      <w:ins w:id="1410" w:author="Language Editor" w:date="2026-09-27T12:00:00Z">
+        <w:r>
+          <w:t xml:space="preserve">model outputs. D1 covers</w:t>
+        </w:r>
+      </w:ins>
+      <w:r>
+        <w:t xml:space="preserve"> natural resources and soil constraints; D2</w:t>
+      </w:r>
+      <w:del w:id="1411" w:author="Language Editor" w:date="2026-09-27T12:00:00Z">
+        <w:r>
+          <w:delText xml:space="preserve"> concerns</w:delText>
+        </w:r>
+      </w:del>
+      <w:ins w:id="1412" w:author="Language Editor" w:date="2026-09-27T12:00:00Z">
+        <w:r>
+          <w:t xml:space="preserve">,</w:t>
+        </w:r>
+      </w:ins>
+      <w:r>
+        <w:t xml:space="preserve"> field morphology and infrastructure; D3</w:t>
+      </w:r>
+      <w:del w:id="1413" w:author="Language Editor" w:date="2026-09-27T12:00:00Z">
+        <w:r>
+          <w:delText xml:space="preserve"> concerns</w:delText>
+        </w:r>
+      </w:del>
+      <w:ins w:id="1414" w:author="Language Editor" w:date="2026-09-27T12:00:00Z">
+        <w:r>
+          <w:t xml:space="preserve">,</w:t>
+        </w:r>
+      </w:ins>
+      <w:r>
+        <w:t xml:space="preserve"> crop choice and management; D4</w:t>
+      </w:r>
+      <w:del w:id="1415" w:author="Language Editor" w:date="2026-09-27T12:00:00Z">
+        <w:r>
+          <w:delText xml:space="preserve"> concerns</w:delText>
+        </w:r>
+      </w:del>
+      <w:ins w:id="1416" w:author="Language Editor" w:date="2026-09-27T12:00:00Z">
+        <w:r>
+          <w:t xml:space="preserve">,</w:t>
+        </w:r>
+      </w:ins>
+      <w:r>
+        <w:t xml:space="preserve"> crop growth; D5</w:t>
+      </w:r>
+      <w:del w:id="1417" w:author="Language Editor" w:date="2026-09-27T12:00:00Z">
+        <w:r>
+          <w:delText xml:space="preserve"> concerns</w:delText>
+        </w:r>
+      </w:del>
+      <w:ins w:id="1418" w:author="Language Editor" w:date="2026-09-27T12:00:00Z">
+        <w:r>
+          <w:t xml:space="preserve">,</w:t>
+        </w:r>
+      </w:ins>
+      <w:r>
+        <w:t xml:space="preserve"> realized yield and its stability across comparable seasons; and D6</w:t>
+      </w:r>
+      <w:del w:id="1419" w:author="Language Editor" w:date="2026-09-27T12:00:00Z">
+        <w:r>
+          <w:delText xml:space="preserve"> concerns</w:delText>
+        </w:r>
+      </w:del>
+      <w:ins w:id="1420" w:author="Language Editor" w:date="2026-09-27T12:00:00Z">
+        <w:r>
+          <w:t xml:space="preserve">,</w:t>
+        </w:r>
+      </w:ins>
+      <w:r>
+        <w:t xml:space="preserve"> production capacity and improvement potential. </w:t>
+      </w:r>
+      <w:del w:id="1421" w:author="Language Editor" w:date="2026-09-27T12:00:00Z">
+        <w:r>
+          <w:delText xml:space="preserve">These</w:delText>
+        </w:r>
+      </w:del>
+      <w:ins w:id="1422" w:author="Language Editor" w:date="2026-09-27T12:00:00Z">
+        <w:r>
+          <w:t xml:space="preserve">The</w:t>
+        </w:r>
+      </w:ins>
+      <w:r>
+        <w:t xml:space="preserve"> dimensions describe interacting aspects of </w:t>
+      </w:r>
+      <w:del w:id="1423" w:author="Language Editor" w:date="2026-09-27T12:00:00Z">
+        <w:r>
+          <w:delText xml:space="preserve">the</w:delText>
+        </w:r>
+      </w:del>
+      <w:ins w:id="1424" w:author="Language Editor" w:date="2026-09-27T12:00:00Z">
+        <w:r>
+          <w:t xml:space="preserve">one</w:t>
+        </w:r>
+      </w:ins>
+      <w:r>
+        <w:t xml:space="preserve"> agricultural system. They are </w:t>
+      </w:r>
       <w:del w:id="1425" w:author="Language Editor" w:date="2026-09-27T12:00:00Z">
         <w:r>
-          <w:delText xml:space="preserve">intended outputs. D1 concerns</w:delText>
+          <w:delText xml:space="preserve">not</w:delText>
         </w:r>
       </w:del>
       <w:ins w:id="1426" w:author="Language Editor" w:date="2026-09-27T12:00:00Z">
         <w:r>
-          <w:t xml:space="preserve">model outputs. D1 covers</w:t>
-        </w:r>
-      </w:ins>
-      <w:r>
-        <w:t xml:space="preserve"> natural resources and soil constraints; D2</w:t>
+          <w:t xml:space="preserve">neither</w:t>
+        </w:r>
+      </w:ins>
+      <w:r>
+        <w:t xml:space="preserve"> six independent predictions </w:t>
       </w:r>
       <w:del w:id="1427" w:author="Language Editor" w:date="2026-09-27T12:00:00Z">
         <w:r>
-          <w:delText xml:space="preserve"> concerns</w:delText>
+          <w:delText xml:space="preserve">or</w:delText>
         </w:r>
       </w:del>
       <w:ins w:id="1428" w:author="Language Editor" w:date="2026-09-27T12:00:00Z">
         <w:r>
-          <w:t xml:space="preserve">,</w:t>
-        </w:r>
-      </w:ins>
-      <w:r>
-        <w:t xml:space="preserve"> field morphology and infrastructure; D3</w:t>
+          <w:t xml:space="preserve">nor</w:t>
+        </w:r>
+      </w:ins>
+      <w:r>
+        <w:t xml:space="preserve"> a fixed causal chain. D6 </w:t>
       </w:r>
       <w:del w:id="1429" w:author="Language Editor" w:date="2026-09-27T12:00:00Z">
         <w:r>
-          <w:delText xml:space="preserve"> concerns</w:delText>
+          <w:delText xml:space="preserve">concerns production that could</w:delText>
         </w:r>
       </w:del>
       <w:ins w:id="1430" w:author="Language Editor" w:date="2026-09-27T12:00:00Z">
         <w:r>
-          <w:t xml:space="preserve">,</w:t>
-        </w:r>
-      </w:ins>
-      <w:r>
-        <w:t xml:space="preserve"> crop choice and management; D4</w:t>
+          <w:t xml:space="preserve">refers to production that can</w:t>
+        </w:r>
+      </w:ins>
+      <w:r>
+        <w:t xml:space="preserve"> be sustained under a stated cropping system, period, resource setting and management regime. Improvement potential </w:t>
       </w:r>
       <w:del w:id="1431" w:author="Language Editor" w:date="2026-09-27T12:00:00Z">
         <w:r>
-          <w:delText xml:space="preserve"> concerns</w:delText>
+          <w:delText xml:space="preserve">requires</w:delText>
         </w:r>
       </w:del>
       <w:ins w:id="1432" w:author="Language Editor" w:date="2026-09-27T12:00:00Z">
         <w:r>
-          <w:t xml:space="preserve">,</w:t>
-        </w:r>
-      </w:ins>
-      <w:r>
-        <w:t xml:space="preserve"> crop growth; D5</w:t>
+          <w:t xml:space="preserve">is judged against</w:t>
+        </w:r>
+      </w:ins>
+      <w:r>
+        <w:t xml:space="preserve"> an explicit reference and feasible changes, </w:t>
       </w:r>
       <w:del w:id="1433" w:author="Language Editor" w:date="2026-09-27T12:00:00Z">
         <w:r>
-          <w:delText xml:space="preserve"> concerns</w:delText>
+          <w:delText xml:space="preserve">rather than inference from one</w:delText>
         </w:r>
       </w:del>
       <w:ins w:id="1434" w:author="Language Editor" w:date="2026-09-27T12:00:00Z">
         <w:r>
-          <w:t xml:space="preserve">,</w:t>
-        </w:r>
-      </w:ins>
-      <w:r>
-        <w:t xml:space="preserve"> realized yield and its stability across comparable seasons; and D6</w:t>
-      </w:r>
-      <w:del w:id="1435" w:author="Language Editor" w:date="2026-09-27T12:00:00Z">
-        <w:r>
-          <w:delText xml:space="preserve"> concerns</w:delText>
-        </w:r>
-      </w:del>
-      <w:ins w:id="1436" w:author="Language Editor" w:date="2026-09-27T12:00:00Z">
-        <w:r>
-          <w:t xml:space="preserve">,</w:t>
-        </w:r>
-      </w:ins>
-      <w:r>
-        <w:t xml:space="preserve"> production capacity and improvement potential. </w:t>
-      </w:r>
-      <w:del w:id="1437" w:author="Language Editor" w:date="2026-09-27T12:00:00Z">
-        <w:r>
-          <w:delText xml:space="preserve">These</w:delText>
-        </w:r>
-      </w:del>
-      <w:ins w:id="1438" w:author="Language Editor" w:date="2026-09-27T12:00:00Z">
-        <w:r>
-          <w:t xml:space="preserve">The</w:t>
-        </w:r>
-      </w:ins>
-      <w:r>
-        <w:t xml:space="preserve"> dimensions describe interacting aspects of </w:t>
-      </w:r>
-      <w:del w:id="1439" w:author="Language Editor" w:date="2026-09-27T12:00:00Z">
-        <w:r>
-          <w:delText xml:space="preserve">the</w:delText>
-        </w:r>
-      </w:del>
-      <w:ins w:id="1440" w:author="Language Editor" w:date="2026-09-27T12:00:00Z">
-        <w:r>
-          <w:t xml:space="preserve">one</w:t>
-        </w:r>
-      </w:ins>
-      <w:r>
-        <w:t xml:space="preserve"> agricultural system. They are </w:t>
-      </w:r>
-      <w:del w:id="1441" w:author="Language Editor" w:date="2026-09-27T12:00:00Z">
-        <w:r>
-          <w:delText xml:space="preserve">not</w:delText>
-        </w:r>
-      </w:del>
-      <w:ins w:id="1442" w:author="Language Editor" w:date="2026-09-27T12:00:00Z">
-        <w:r>
-          <w:t xml:space="preserve">neither</w:t>
-        </w:r>
-      </w:ins>
-      <w:r>
-        <w:t xml:space="preserve"> six independent predictions </w:t>
-      </w:r>
-      <w:del w:id="1443" w:author="Language Editor" w:date="2026-09-27T12:00:00Z">
-        <w:r>
-          <w:delText xml:space="preserve">or</w:delText>
-        </w:r>
-      </w:del>
-      <w:ins w:id="1444" w:author="Language Editor" w:date="2026-09-27T12:00:00Z">
-        <w:r>
-          <w:t xml:space="preserve">nor</w:t>
-        </w:r>
-      </w:ins>
-      <w:r>
-        <w:t xml:space="preserve"> a fixed causal chain. D6 </w:t>
-      </w:r>
-      <w:del w:id="1445" w:author="Language Editor" w:date="2026-09-27T12:00:00Z">
-        <w:r>
-          <w:delText xml:space="preserve">concerns production that could</w:delText>
-        </w:r>
-      </w:del>
-      <w:ins w:id="1446" w:author="Language Editor" w:date="2026-09-27T12:00:00Z">
-        <w:r>
-          <w:t xml:space="preserve">refers to production that can</w:t>
-        </w:r>
-      </w:ins>
-      <w:r>
-        <w:t xml:space="preserve"> be sustained under a stated cropping system, period, resource setting and management regime. Improvement potential </w:t>
-      </w:r>
-      <w:del w:id="1447" w:author="Language Editor" w:date="2026-09-27T12:00:00Z">
-        <w:r>
-          <w:delText xml:space="preserve">requires</w:delText>
-        </w:r>
-      </w:del>
-      <w:ins w:id="1448" w:author="Language Editor" w:date="2026-09-27T12:00:00Z">
-        <w:r>
-          <w:t xml:space="preserve">is judged against</w:t>
-        </w:r>
-      </w:ins>
-      <w:r>
-        <w:t xml:space="preserve"> an explicit reference and feasible changes, </w:t>
-      </w:r>
-      <w:del w:id="1449" w:author="Language Editor" w:date="2026-09-27T12:00:00Z">
-        <w:r>
-          <w:delText xml:space="preserve">rather than inference from one</w:delText>
-        </w:r>
-      </w:del>
-      <w:ins w:id="1450" w:author="Language Editor" w:date="2026-09-27T12:00:00Z">
-        <w:r>
           <w:t xml:space="preserve">so a single</w:t>
         </w:r>
       </w:ins>
       <w:r>
         <w:t xml:space="preserve"> high-yield season</w:t>
       </w:r>
-      <w:ins w:id="1451" w:author="Language Editor" w:date="2026-09-27T12:00:00Z">
+      <w:ins w:id="1435" w:author="Language Editor" w:date="2026-09-27T12:00:00Z">
         <w:r>
           <w:t xml:space="preserve"> is insufficient evidence</w:t>
         </w:r>
@@ -5225,12 +5156,12 @@
       <w:r>
         <w:t xml:space="preserve">Three reasoning levels </w:t>
       </w:r>
-      <w:del w:id="1452" w:author="Language Editor" w:date="2026-09-27T12:00:00Z">
+      <w:del w:id="1436" w:author="Language Editor" w:date="2026-09-27T12:00:00Z">
         <w:r>
           <w:delText xml:space="preserve">specify</w:delText>
         </w:r>
       </w:del>
-      <w:ins w:id="1453" w:author="Language Editor" w:date="2026-09-27T12:00:00Z">
+      <w:ins w:id="1437" w:author="Language Editor" w:date="2026-09-27T12:00:00Z">
         <w:r>
           <w:t xml:space="preserve">define</w:t>
         </w:r>
@@ -5238,12 +5169,12 @@
       <w:r>
         <w:t xml:space="preserve"> the scope of a judgment. L1</w:t>
       </w:r>
-      <w:del w:id="1454" w:author="Language Editor" w:date="2026-09-27T12:00:00Z">
+      <w:del w:id="1438" w:author="Language Editor" w:date="2026-09-27T12:00:00Z">
         <w:r>
           <w:delText xml:space="preserve">, state description,</w:delText>
         </w:r>
       </w:del>
-      <w:ins w:id="1455" w:author="Language Editor" w:date="2026-09-27T12:00:00Z">
+      <w:ins w:id="1439" w:author="Language Editor" w:date="2026-09-27T12:00:00Z">
         <w:r>
           <w:t xml:space="preserve"> (state description)</w:t>
         </w:r>
@@ -5251,7 +5182,7 @@
       <w:r>
         <w:t xml:space="preserve"> reports observations or estimates</w:t>
       </w:r>
-      <w:ins w:id="1456" w:author="Language Editor" w:date="2026-09-27T12:00:00Z">
+      <w:ins w:id="1440" w:author="Language Editor" w:date="2026-09-27T12:00:00Z">
         <w:r>
           <w:t xml:space="preserve"> together</w:t>
         </w:r>
@@ -5259,12 +5190,12 @@
       <w:r>
         <w:t xml:space="preserve"> with their validation status. L2</w:t>
       </w:r>
-      <w:del w:id="1457" w:author="Language Editor" w:date="2026-09-27T12:00:00Z">
+      <w:del w:id="1441" w:author="Language Editor" w:date="2026-09-27T12:00:00Z">
         <w:r>
           <w:delText xml:space="preserve">, </w:delText>
         </w:r>
       </w:del>
-      <w:ins w:id="1458" w:author="Language Editor" w:date="2026-09-27T12:00:00Z">
+      <w:ins w:id="1442" w:author="Language Editor" w:date="2026-09-27T12:00:00Z">
         <w:r>
           <w:t xml:space="preserve"> (</w:t>
         </w:r>
@@ -5272,12 +5203,12 @@
       <w:r>
         <w:t xml:space="preserve">cross-dimensional interpretation</w:t>
       </w:r>
-      <w:del w:id="1459" w:author="Language Editor" w:date="2026-09-27T12:00:00Z">
+      <w:del w:id="1443" w:author="Language Editor" w:date="2026-09-27T12:00:00Z">
         <w:r>
           <w:delText xml:space="preserve">,</w:delText>
         </w:r>
       </w:del>
-      <w:ins w:id="1460" w:author="Language Editor" w:date="2026-09-27T12:00:00Z">
+      <w:ins w:id="1444" w:author="Language Editor" w:date="2026-09-27T12:00:00Z">
         <w:r>
           <w:t xml:space="preserve">)</w:t>
         </w:r>
@@ -5285,12 +5216,12 @@
       <w:r>
         <w:t xml:space="preserve"> examines associations and plausible explanations while </w:t>
       </w:r>
-      <w:del w:id="1461" w:author="Language Editor" w:date="2026-09-27T12:00:00Z">
+      <w:del w:id="1445" w:author="Language Editor" w:date="2026-09-27T12:00:00Z">
         <w:r>
           <w:delText xml:space="preserve">retaining alternatives. L3, </w:delText>
         </w:r>
       </w:del>
-      <w:ins w:id="1462" w:author="Language Editor" w:date="2026-09-27T12:00:00Z">
+      <w:ins w:id="1446" w:author="Language Editor" w:date="2026-09-27T12:00:00Z">
         <w:r>
           <w:t xml:space="preserve">keeping alternatives open. L3 (</w:t>
         </w:r>
@@ -5298,12 +5229,12 @@
       <w:r>
         <w:t xml:space="preserve">conditional scenario assessment</w:t>
       </w:r>
-      <w:del w:id="1463" w:author="Language Editor" w:date="2026-09-27T12:00:00Z">
+      <w:del w:id="1447" w:author="Language Editor" w:date="2026-09-27T12:00:00Z">
         <w:r>
           <w:delText xml:space="preserve">, considers</w:delText>
         </w:r>
       </w:del>
-      <w:ins w:id="1464" w:author="Language Editor" w:date="2026-09-27T12:00:00Z">
+      <w:ins w:id="1448" w:author="Language Editor" w:date="2026-09-27T12:00:00Z">
         <w:r>
           <w:t xml:space="preserve">) weighs</w:t>
         </w:r>
@@ -5311,12 +5242,12 @@
       <w:r>
         <w:t xml:space="preserve"> management options against a stated reference, constraints and uncertainty</w:t>
       </w:r>
-      <w:del w:id="1465" w:author="Language Editor" w:date="2026-09-27T12:00:00Z">
+      <w:del w:id="1449" w:author="Language Editor" w:date="2026-09-27T12:00:00Z">
         <w:r>
           <w:delText xml:space="preserve">. Quantified</w:delText>
         </w:r>
       </w:del>
-      <w:ins w:id="1466" w:author="Language Editor" w:date="2026-09-27T12:00:00Z">
+      <w:ins w:id="1450" w:author="Language Editor" w:date="2026-09-27T12:00:00Z">
         <w:r>
           <w:t xml:space="preserve">; quantified</w:t>
         </w:r>
@@ -5324,12 +5255,12 @@
       <w:r>
         <w:t xml:space="preserve"> effects require relevant intervention evidence or a response model validated for </w:t>
       </w:r>
-      <w:del w:id="1467" w:author="Language Editor" w:date="2026-09-27T12:00:00Z">
+      <w:del w:id="1451" w:author="Language Editor" w:date="2026-09-27T12:00:00Z">
         <w:r>
           <w:delText xml:space="preserve">those conditions. These</w:delText>
         </w:r>
       </w:del>
-      <w:ins w:id="1468" w:author="Language Editor" w:date="2026-09-27T12:00:00Z">
+      <w:ins w:id="1452" w:author="Language Editor" w:date="2026-09-27T12:00:00Z">
         <w:r>
           <w:t xml:space="preserve">the conditions concerned. The</w:t>
         </w:r>
@@ -5337,12 +5268,12 @@
       <w:r>
         <w:t xml:space="preserve"> levels structure annotations and responses</w:t>
       </w:r>
-      <w:del w:id="1469" w:author="Language Editor" w:date="2026-09-27T12:00:00Z">
+      <w:del w:id="1453" w:author="Language Editor" w:date="2026-09-27T12:00:00Z">
         <w:r>
           <w:delText xml:space="preserve">; they</w:delText>
         </w:r>
       </w:del>
-      <w:ins w:id="1470" w:author="Language Editor" w:date="2026-09-27T12:00:00Z">
+      <w:ins w:id="1454" w:author="Language Editor" w:date="2026-09-27T12:00:00Z">
         <w:r>
           <w:t xml:space="preserve"> and</w:t>
         </w:r>
@@ -5350,7 +5281,7 @@
       <w:r>
         <w:t xml:space="preserve"> do not prescribe a three-stage neural computation</w:t>
       </w:r>
-      <w:del w:id="1471" w:author="Language Editor" w:date="2026-09-27T12:00:00Z">
+      <w:del w:id="1455" w:author="Language Editor" w:date="2026-09-27T12:00:00Z">
         <w:r>
           <w:delText xml:space="preserve"> or guarantee causal diagnosis</w:delText>
         </w:r>
@@ -5367,12 +5298,12 @@
       <w:r>
         <w:t xml:space="preserve">The case materials describe parent material and location, land use and cropping, and field management. These </w:t>
       </w:r>
-      <w:del w:id="1472" w:author="Language Editor" w:date="2026-09-27T12:00:00Z">
+      <w:del w:id="1456" w:author="Language Editor" w:date="2026-09-27T12:00:00Z">
         <w:r>
           <w:delText xml:space="preserve">are explanatory factors,</w:delText>
         </w:r>
       </w:del>
-      <w:ins w:id="1473" w:author="Language Editor" w:date="2026-09-27T12:00:00Z">
+      <w:ins w:id="1457" w:author="Language Editor" w:date="2026-09-27T12:00:00Z">
         <w:r>
           <w:t xml:space="preserve">explanatory factors are</w:t>
         </w:r>
@@ -5380,12 +5311,12 @@
       <w:r>
         <w:t xml:space="preserve"> distinct from L1–L3. Parent material mainly informs D1</w:t>
       </w:r>
-      <w:del w:id="1474" w:author="Language Editor" w:date="2026-09-27T12:00:00Z">
+      <w:del w:id="1458" w:author="Language Editor" w:date="2026-09-27T12:00:00Z">
         <w:r>
           <w:delText xml:space="preserve">; land</w:delText>
         </w:r>
       </w:del>
-      <w:ins w:id="1475" w:author="Language Editor" w:date="2026-09-27T12:00:00Z">
+      <w:ins w:id="1459" w:author="Language Editor" w:date="2026-09-27T12:00:00Z">
         <w:r>
           <w:t xml:space="preserve">. Land</w:t>
         </w:r>
@@ -5393,12 +5324,12 @@
       <w:r>
         <w:t xml:space="preserve"> use and cropping inform D3 and condition </w:t>
       </w:r>
-      <w:del w:id="1476" w:author="Language Editor" w:date="2026-09-27T12:00:00Z">
+      <w:del w:id="1460" w:author="Language Editor" w:date="2026-09-27T12:00:00Z">
         <w:r>
           <w:delText xml:space="preserve">other dimensions;</w:delText>
         </w:r>
       </w:del>
-      <w:ins w:id="1477" w:author="Language Editor" w:date="2026-09-27T12:00:00Z">
+      <w:ins w:id="1461" w:author="Language Editor" w:date="2026-09-27T12:00:00Z">
         <w:r>
           <w:t xml:space="preserve">the other dimensions, and</w:t>
         </w:r>
@@ -5406,12 +5337,12 @@
       <w:r>
         <w:t xml:space="preserve"> management events enter D3 and </w:t>
       </w:r>
-      <w:del w:id="1478" w:author="Language Editor" w:date="2026-09-27T12:00:00Z">
+      <w:del w:id="1462" w:author="Language Editor" w:date="2026-09-27T12:00:00Z">
         <w:r>
           <w:delText xml:space="preserve">may relate</w:delText>
         </w:r>
       </w:del>
-      <w:ins w:id="1479" w:author="Language Editor" w:date="2026-09-27T12:00:00Z">
+      <w:ins w:id="1463" w:author="Language Editor" w:date="2026-09-27T12:00:00Z">
         <w:r>
           <w:t xml:space="preserve">connect</w:t>
         </w:r>
@@ -5419,12 +5350,12 @@
       <w:r>
         <w:t xml:space="preserve"> to other dimensions </w:t>
       </w:r>
-      <w:del w:id="1480" w:author="Language Editor" w:date="2026-09-27T12:00:00Z">
+      <w:del w:id="1464" w:author="Language Editor" w:date="2026-09-27T12:00:00Z">
         <w:r>
           <w:delText xml:space="preserve">when</w:delText>
         </w:r>
       </w:del>
-      <w:ins w:id="1481" w:author="Language Editor" w:date="2026-09-27T12:00:00Z">
+      <w:ins w:id="1465" w:author="Language Editor" w:date="2026-09-27T12:00:00Z">
         <w:r>
           <w:t xml:space="preserve">where</w:t>
         </w:r>
@@ -5432,12 +5363,12 @@
       <w:r>
         <w:t xml:space="preserve"> evidence supports the </w:t>
       </w:r>
-      <w:del w:id="1482" w:author="Language Editor" w:date="2026-09-27T12:00:00Z">
+      <w:del w:id="1466" w:author="Language Editor" w:date="2026-09-27T12:00:00Z">
         <w:r>
           <w:delText xml:space="preserve">connection</w:delText>
         </w:r>
       </w:del>
-      <w:ins w:id="1483" w:author="Language Editor" w:date="2026-09-27T12:00:00Z">
+      <w:ins w:id="1467" w:author="Language Editor" w:date="2026-09-27T12:00:00Z">
         <w:r>
           <w:t xml:space="preserve">link</w:t>
         </w:r>
@@ -5445,12 +5376,12 @@
       <w:r>
         <w:t xml:space="preserve">. Each factor can be described, interpreted or used to constrain a scenario. Table 1 cross-indexes dimensions and levels</w:t>
       </w:r>
-      <w:del w:id="1484" w:author="Language Editor" w:date="2026-09-27T12:00:00Z">
+      <w:del w:id="1468" w:author="Language Editor" w:date="2026-09-27T12:00:00Z">
         <w:r>
           <w:delText xml:space="preserve">;</w:delText>
         </w:r>
       </w:del>
-      <w:ins w:id="1485" w:author="Language Editor" w:date="2026-09-27T12:00:00Z">
+      <w:ins w:id="1469" w:author="Language Editor" w:date="2026-09-27T12:00:00Z">
         <w:r>
           <w:t xml:space="preserve">, and</w:t>
         </w:r>
@@ -5458,12 +5389,12 @@
       <w:r>
         <w:t xml:space="preserve"> Table 2 relates the case factors to </w:t>
       </w:r>
-      <w:del w:id="1486" w:author="Language Editor" w:date="2026-09-27T12:00:00Z">
+      <w:del w:id="1470" w:author="Language Editor" w:date="2026-09-27T12:00:00Z">
         <w:r>
           <w:delText xml:space="preserve">that</w:delText>
         </w:r>
       </w:del>
-      <w:ins w:id="1487" w:author="Language Editor" w:date="2026-09-27T12:00:00Z">
+      <w:ins w:id="1471" w:author="Language Editor" w:date="2026-09-27T12:00:00Z">
         <w:r>
           <w:t xml:space="preserve">this</w:t>
         </w:r>
@@ -5480,12 +5411,12 @@
       <w:r>
         <w:t xml:space="preserve">Each statement records its object, period, dimension labels, reasoning level, source identifiers, statement type and evidence status. Statement </w:t>
       </w:r>
-      <w:del w:id="1488" w:author="Language Editor" w:date="2026-09-27T12:00:00Z">
+      <w:del w:id="1472" w:author="Language Editor" w:date="2026-09-27T12:00:00Z">
         <w:r>
           <w:delText xml:space="preserve">type distinguishes</w:delText>
         </w:r>
       </w:del>
-      <w:ins w:id="1489" w:author="Language Editor" w:date="2026-09-27T12:00:00Z">
+      <w:ins w:id="1473" w:author="Language Editor" w:date="2026-09-27T12:00:00Z">
         <w:r>
           <w:t xml:space="preserve">types are</w:t>
         </w:r>
@@ -5493,12 +5424,12 @@
       <w:r>
         <w:t xml:space="preserve"> observation, model estimate, expert interpretation and hypothesis. Evidence status </w:t>
       </w:r>
-      <w:del w:id="1490" w:author="Language Editor" w:date="2026-09-27T12:00:00Z">
+      <w:del w:id="1474" w:author="Language Editor" w:date="2026-09-27T12:00:00Z">
         <w:r>
           <w:delText xml:space="preserve">describes</w:delText>
         </w:r>
       </w:del>
-      <w:ins w:id="1491" w:author="Language Editor" w:date="2026-09-27T12:00:00Z">
+      <w:ins w:id="1475" w:author="Language Editor" w:date="2026-09-27T12:00:00Z">
         <w:r>
           <w:t xml:space="preserve">grades</w:t>
         </w:r>
@@ -5506,12 +5437,12 @@
       <w:r>
         <w:t xml:space="preserve"> support within the stated scope</w:t>
       </w:r>
-      <w:del w:id="1492" w:author="Language Editor" w:date="2026-09-27T12:00:00Z">
+      <w:del w:id="1476" w:author="Language Editor" w:date="2026-09-27T12:00:00Z">
         <w:r>
           <w:delText xml:space="preserve">:</w:delText>
         </w:r>
       </w:del>
-      <w:ins w:id="1493" w:author="Language Editor" w:date="2026-09-27T12:00:00Z">
+      <w:ins w:id="1477" w:author="Language Editor" w:date="2026-09-27T12:00:00Z">
         <w:r>
           <w:t xml:space="preserve"> as</w:t>
         </w:r>
@@ -5519,12 +5450,12 @@
       <w:r>
         <w:t xml:space="preserve"> supported, partially supported, conflicting or insufficient</w:t>
       </w:r>
-      <w:del w:id="1494" w:author="Language Editor" w:date="2026-09-27T12:00:00Z">
+      <w:del w:id="1478" w:author="Language Editor" w:date="2026-09-27T12:00:00Z">
         <w:r>
           <w:delText xml:space="preserve">. These categories</w:delText>
         </w:r>
       </w:del>
-      <w:ins w:id="1495" w:author="Language Editor" w:date="2026-09-27T12:00:00Z">
+      <w:ins w:id="1479" w:author="Language Editor" w:date="2026-09-27T12:00:00Z">
         <w:r>
           <w:t xml:space="preserve">; these</w:t>
         </w:r>
@@ -5532,12 +5463,12 @@
       <w:r>
         <w:t xml:space="preserve"> are reporting labels</w:t>
       </w:r>
-      <w:del w:id="1496" w:author="Language Editor" w:date="2026-09-27T12:00:00Z">
+      <w:del w:id="1480" w:author="Language Editor" w:date="2026-09-27T12:00:00Z">
         <w:r>
           <w:delText xml:space="preserve"> rather than</w:delText>
         </w:r>
       </w:del>
-      <w:ins w:id="1497" w:author="Language Editor" w:date="2026-09-27T12:00:00Z">
+      <w:ins w:id="1481" w:author="Language Editor" w:date="2026-09-27T12:00:00Z">
         <w:r>
           <w:t xml:space="preserve">, not</w:t>
         </w:r>
@@ -5545,12 +5476,12 @@
       <w:r>
         <w:t xml:space="preserve"> calibrated confidence scores. </w:t>
       </w:r>
-      <w:del w:id="1498" w:author="Language Editor" w:date="2026-09-27T12:00:00Z">
+      <w:del w:id="1482" w:author="Language Editor" w:date="2026-09-27T12:00:00Z">
         <w:r>
           <w:delText xml:space="preserve">Table 1 does not require 18 outputs for every query</w:delText>
         </w:r>
       </w:del>
-      <w:ins w:id="1499" w:author="Language Editor" w:date="2026-09-27T12:00:00Z">
+      <w:ins w:id="1483" w:author="Language Editor" w:date="2026-09-27T12:00:00Z">
         <w:r>
           <w:t xml:space="preserve">A query need not fill all 18 cells of Table 1</w:t>
         </w:r>
@@ -5558,12 +5489,12 @@
       <w:r>
         <w:t xml:space="preserve">. At L1, D6 summarizes capacity-related evidence</w:t>
       </w:r>
-      <w:del w:id="1500" w:author="Language Editor" w:date="2026-09-27T12:00:00Z">
+      <w:del w:id="1484" w:author="Language Editor" w:date="2026-09-27T12:00:00Z">
         <w:r>
           <w:delText xml:space="preserve">; judging</w:delText>
         </w:r>
       </w:del>
-      <w:ins w:id="1501" w:author="Language Editor" w:date="2026-09-27T12:00:00Z">
+      <w:ins w:id="1485" w:author="Language Editor" w:date="2026-09-27T12:00:00Z">
         <w:r>
           <w:t xml:space="preserve">, whereas a judgment of</w:t>
         </w:r>
@@ -5571,12 +5502,12 @@
       <w:r>
         <w:t xml:space="preserve"> capacity requires further synthesis </w:t>
       </w:r>
-      <w:del w:id="1502" w:author="Language Editor" w:date="2026-09-27T12:00:00Z">
+      <w:del w:id="1486" w:author="Language Editor" w:date="2026-09-27T12:00:00Z">
         <w:r>
           <w:delText xml:space="preserve">and</w:delText>
         </w:r>
       </w:del>
-      <w:ins w:id="1503" w:author="Language Editor" w:date="2026-09-27T12:00:00Z">
+      <w:ins w:id="1487" w:author="Language Editor" w:date="2026-09-27T12:00:00Z">
         <w:r>
           <w:t xml:space="preserve">against</w:t>
         </w:r>
@@ -5600,7 +5531,7 @@
         </w:rPr>
         <w:t xml:space="preserve">Table 1 Assessment dimensions and </w:t>
       </w:r>
-      <w:del w:id="1504" w:author="Language Editor" w:date="2026-09-27T12:00:00Z">
+      <w:del w:id="1488" w:author="Language Editor" w:date="2026-09-27T12:00:00Z">
         <w:r>
           <w:rPr>
             <w:b/>
@@ -5611,7 +5542,7 @@
           <w:delText xml:space="preserve">intended reasoning scope</w:delText>
         </w:r>
       </w:del>
-      <w:ins w:id="1505" w:author="Language Editor" w:date="2026-09-27T12:00:00Z">
+      <w:ins w:id="1489" w:author="Language Editor" w:date="2026-09-27T12:00:00Z">
         <w:r>
           <w:rPr>
             <w:b/>
@@ -5781,12 +5712,12 @@
             <w:r>
               <w:t xml:space="preserve">Compare improvement options </w:t>
             </w:r>
-            <w:del w:id="1506" w:author="Language Editor" w:date="2026-09-27T12:00:00Z">
+            <w:del w:id="1490" w:author="Language Editor" w:date="2026-09-27T12:00:00Z">
               <w:r>
                 <w:delText xml:space="preserve">within supported response conditions</w:delText>
               </w:r>
             </w:del>
-            <w:ins w:id="1507" w:author="Language Editor" w:date="2026-09-27T12:00:00Z">
+            <w:ins w:id="1491" w:author="Language Editor" w:date="2026-09-27T12:00:00Z">
               <w:r>
                 <w:t xml:space="preserve">where response evidence exists</w:t>
               </w:r>
@@ -5969,7 +5900,7 @@
             <w:r>
               <w:t xml:space="preserve">Describe observed</w:t>
             </w:r>
-            <w:ins w:id="1508" w:author="Language Editor" w:date="2026-09-27T12:00:00Z">
+            <w:ins w:id="1492" w:author="Language Editor" w:date="2026-09-27T12:00:00Z">
               <w:r>
                 <w:t xml:space="preserve"> growth</w:t>
               </w:r>
@@ -6009,12 +5940,12 @@
             <w:r>
               <w:t xml:space="preserve">Assess</w:t>
             </w:r>
-            <w:del w:id="1509" w:author="Language Editor" w:date="2026-09-27T12:00:00Z">
+            <w:del w:id="1493" w:author="Language Editor" w:date="2026-09-27T12:00:00Z">
               <w:r>
                 <w:delText xml:space="preserve"> responses only with</w:delText>
               </w:r>
             </w:del>
-            <w:ins w:id="1510" w:author="Language Editor" w:date="2026-09-27T12:00:00Z">
+            <w:ins w:id="1494" w:author="Language Editor" w:date="2026-09-27T12:00:00Z">
               <w:r>
                 <w:t xml:space="preserve"> growth responses using</w:t>
               </w:r>
@@ -6059,12 +5990,12 @@
             <w:r>
               <w:t xml:space="preserve">Report yields and </w:t>
             </w:r>
-            <w:del w:id="1511" w:author="Language Editor" w:date="2026-09-27T12:00:00Z">
+            <w:del w:id="1495" w:author="Language Editor" w:date="2026-09-27T12:00:00Z">
               <w:r>
                 <w:delText xml:space="preserve">comparable multi-season variability</w:delText>
               </w:r>
             </w:del>
-            <w:ins w:id="1512" w:author="Language Editor" w:date="2026-09-27T12:00:00Z">
+            <w:ins w:id="1496" w:author="Language Editor" w:date="2026-09-27T12:00:00Z">
               <w:r>
                 <w:t xml:space="preserve">variability across comparable seasons</w:t>
               </w:r>
@@ -6141,7 +6072,7 @@
             <w:r>
               <w:t xml:space="preserve">Summarize</w:t>
             </w:r>
-            <w:ins w:id="1513" w:author="Language Editor" w:date="2026-09-27T12:00:00Z">
+            <w:ins w:id="1497" w:author="Language Editor" w:date="2026-09-27T12:00:00Z">
               <w:r>
                 <w:t xml:space="preserve"> capacity-related</w:t>
               </w:r>
@@ -6202,12 +6133,12 @@
       <w:r>
         <w:t xml:space="preserve">Agricultural knowledge connects observations to assessment criteria and </w:t>
       </w:r>
-      <w:del w:id="1514" w:author="Language Editor" w:date="2026-09-27T12:00:00Z">
+      <w:del w:id="1498" w:author="Language Editor" w:date="2026-09-27T12:00:00Z">
         <w:r>
           <w:delText xml:space="preserve">possible interpretations. Each record retains</w:delText>
         </w:r>
       </w:del>
-      <w:ins w:id="1515" w:author="Language Editor" w:date="2026-09-27T12:00:00Z">
+      <w:ins w:id="1499" w:author="Language Editor" w:date="2026-09-27T12:00:00Z">
         <w:r>
           <w:t xml:space="preserve">candidate interpretations. Each knowledge record keeps</w:t>
         </w:r>
@@ -6215,12 +6146,12 @@
       <w:r>
         <w:t xml:space="preserve"> its source, relevant crop or region, applicability conditions and exceptions. </w:t>
       </w:r>
-      <w:del w:id="1516" w:author="Language Editor" w:date="2026-09-27T12:00:00Z">
+      <w:del w:id="1500" w:author="Language Editor" w:date="2026-09-27T12:00:00Z">
         <w:r>
           <w:delText xml:space="preserve">For example, a statement about soil acidity</w:delText>
         </w:r>
       </w:del>
-      <w:ins w:id="1517" w:author="Language Editor" w:date="2026-09-27T12:00:00Z">
+      <w:ins w:id="1501" w:author="Language Editor" w:date="2026-09-27T12:00:00Z">
         <w:r>
           <w:t xml:space="preserve">A statement on soil acidity, for instance,</w:t>
         </w:r>
@@ -6228,7 +6159,7 @@
       <w:r>
         <w:t xml:space="preserve"> may depend on crop requirements, soil properties and</w:t>
       </w:r>
-      <w:del w:id="1518" w:author="Language Editor" w:date="2026-09-27T12:00:00Z">
+      <w:del w:id="1502" w:author="Language Editor" w:date="2026-09-27T12:00:00Z">
         <w:r>
           <w:delText xml:space="preserve"> the</w:delText>
         </w:r>
@@ -6251,12 +6182,12 @@
         </w:rPr>
         <w:t xml:space="preserve">]</w:t>
       </w:r>
-      <w:del w:id="1519" w:author="Language Editor" w:date="2026-09-27T12:00:00Z">
+      <w:del w:id="1503" w:author="Language Editor" w:date="2026-09-27T12:00:00Z">
         <w:r>
           <w:delText xml:space="preserve">;</w:delText>
         </w:r>
       </w:del>
-      <w:ins w:id="1520" w:author="Language Editor" w:date="2026-09-27T12:00:00Z">
+      <w:ins w:id="1504" w:author="Language Editor" w:date="2026-09-27T12:00:00Z">
         <w:r>
           <w:t xml:space="preserve">, and</w:t>
         </w:r>
@@ -6264,12 +6195,12 @@
       <w:r>
         <w:t xml:space="preserve"> an agricultural knowledge graph </w:t>
       </w:r>
-      <w:del w:id="1521" w:author="Language Editor" w:date="2026-09-27T12:00:00Z">
+      <w:del w:id="1505" w:author="Language Editor" w:date="2026-09-27T12:00:00Z">
         <w:r>
           <w:delText xml:space="preserve">is an optional organization method</w:delText>
         </w:r>
       </w:del>
-      <w:ins w:id="1522" w:author="Language Editor" w:date="2026-09-27T12:00:00Z">
+      <w:ins w:id="1506" w:author="Language Editor" w:date="2026-09-27T12:00:00Z">
         <w:r>
           <w:t xml:space="preserve">offers one way to organize them</w:t>
         </w:r>
@@ -6277,12 +6208,12 @@
       <w:r>
         <w:t xml:space="preserve">. Source relevance and applicability </w:t>
       </w:r>
-      <w:del w:id="1523" w:author="Language Editor" w:date="2026-09-27T12:00:00Z">
+      <w:del w:id="1507" w:author="Language Editor" w:date="2026-09-27T12:00:00Z">
         <w:r>
           <w:delText xml:space="preserve">must be</w:delText>
         </w:r>
       </w:del>
-      <w:ins w:id="1524" w:author="Language Editor" w:date="2026-09-27T12:00:00Z">
+      <w:ins w:id="1508" w:author="Language Editor" w:date="2026-09-27T12:00:00Z">
         <w:r>
           <w:t xml:space="preserve">are</w:t>
         </w:r>
@@ -6290,12 +6221,12 @@
       <w:r>
         <w:t xml:space="preserve"> checked separately. Knowledge retrieved for the language branch provides evaluation context</w:t>
       </w:r>
-      <w:del w:id="1525" w:author="Language Editor" w:date="2026-09-27T12:00:00Z">
+      <w:del w:id="1509" w:author="Language Editor" w:date="2026-09-27T12:00:00Z">
         <w:r>
           <w:delText xml:space="preserve">, while knowledge used as front-end supervision</w:delText>
         </w:r>
       </w:del>
-      <w:ins w:id="1526" w:author="Language Editor" w:date="2026-09-27T12:00:00Z">
+      <w:ins w:id="1510" w:author="Language Editor" w:date="2026-09-27T12:00:00Z">
         <w:r>
           <w:t xml:space="preserve">; using knowledge to supervise the front end</w:t>
         </w:r>
@@ -6303,12 +6234,12 @@
       <w:r>
         <w:t xml:space="preserve"> would require a </w:t>
       </w:r>
-      <w:del w:id="1527" w:author="Language Editor" w:date="2026-09-27T12:00:00Z">
+      <w:del w:id="1511" w:author="Language Editor" w:date="2026-09-27T12:00:00Z">
         <w:r>
           <w:delText xml:space="preserve">distinct</w:delText>
         </w:r>
       </w:del>
-      <w:ins w:id="1528" w:author="Language Editor" w:date="2026-09-27T12:00:00Z">
+      <w:ins w:id="1512" w:author="Language Editor" w:date="2026-09-27T12:00:00Z">
         <w:r>
           <w:t xml:space="preserve">separate</w:t>
         </w:r>
@@ -6325,7 +6256,7 @@
       <w:r>
         <w:t xml:space="preserve">Reviewed annotations</w:t>
       </w:r>
-      <w:del w:id="1529" w:author="Language Editor" w:date="2026-09-27T12:00:00Z">
+      <w:del w:id="1513" w:author="Language Editor" w:date="2026-09-27T12:00:00Z">
         <w:r>
           <w:delText xml:space="preserve"> can</w:delText>
         </w:r>
@@ -6333,7 +6264,7 @@
       <w:r>
         <w:t xml:space="preserve"> supervise training, whereas retrieved records supply</w:t>
       </w:r>
-      <w:ins w:id="1530" w:author="Language Editor" w:date="2026-09-27T12:00:00Z">
+      <w:ins w:id="1514" w:author="Language Editor" w:date="2026-09-27T12:00:00Z">
         <w:r>
           <w:t xml:space="preserve"> the</w:t>
         </w:r>
@@ -6341,12 +6272,12 @@
       <w:r>
         <w:t xml:space="preserve"> information available at inference. A case-specific explanation or target yield </w:t>
       </w:r>
-      <w:del w:id="1531" w:author="Language Editor" w:date="2026-09-27T12:00:00Z">
+      <w:del w:id="1515" w:author="Language Editor" w:date="2026-09-27T12:00:00Z">
         <w:r>
           <w:delText xml:space="preserve">used</w:delText>
         </w:r>
       </w:del>
-      <w:ins w:id="1532" w:author="Language Editor" w:date="2026-09-27T12:00:00Z">
+      <w:ins w:id="1516" w:author="Language Editor" w:date="2026-09-27T12:00:00Z">
         <w:r>
           <w:t xml:space="preserve">supplied</w:t>
         </w:r>
@@ -6354,12 +6285,12 @@
       <w:r>
         <w:t xml:space="preserve"> as input cannot also serve as an independent test answer</w:t>
       </w:r>
-      <w:del w:id="1533" w:author="Language Editor" w:date="2026-09-27T12:00:00Z">
+      <w:del w:id="1517" w:author="Language Editor" w:date="2026-09-27T12:00:00Z">
         <w:r>
           <w:delText xml:space="preserve">. Evaluation therefore</w:delText>
         </w:r>
       </w:del>
-      <w:ins w:id="1534" w:author="Language Editor" w:date="2026-09-27T12:00:00Z">
+      <w:ins w:id="1518" w:author="Language Editor" w:date="2026-09-27T12:00:00Z">
         <w:r>
           <w:t xml:space="preserve">, so evaluation</w:t>
         </w:r>
@@ -6367,7 +6298,7 @@
       <w:r>
         <w:t xml:space="preserve"> excludes target-bearing records</w:t>
       </w:r>
-      <w:ins w:id="1535" w:author="Language Editor" w:date="2026-09-27T12:00:00Z">
+      <w:ins w:id="1519" w:author="Language Editor" w:date="2026-09-27T12:00:00Z">
         <w:r>
           <w:t xml:space="preserve"> that would be</w:t>
         </w:r>
@@ -6375,12 +6306,12 @@
       <w:r>
         <w:t xml:space="preserve"> unavailable in the intended application. Expert knowledge may support a hypothesis or reveal an inconsistency, </w:t>
       </w:r>
-      <w:del w:id="1536" w:author="Language Editor" w:date="2026-09-27T12:00:00Z">
+      <w:del w:id="1520" w:author="Language Editor" w:date="2026-09-27T12:00:00Z">
         <w:r>
           <w:delText xml:space="preserve">but</w:delText>
         </w:r>
       </w:del>
-      <w:ins w:id="1537" w:author="Language Editor" w:date="2026-09-27T12:00:00Z">
+      <w:ins w:id="1521" w:author="Language Editor" w:date="2026-09-27T12:00:00Z">
         <w:r>
           <w:t xml:space="preserve">yet</w:t>
         </w:r>
@@ -6388,12 +6319,12 @@
       <w:r>
         <w:t xml:space="preserve"> a general relationship does not </w:t>
       </w:r>
-      <w:del w:id="1538" w:author="Language Editor" w:date="2026-09-27T12:00:00Z">
+      <w:del w:id="1522" w:author="Language Editor" w:date="2026-09-27T12:00:00Z">
         <w:r>
           <w:delText xml:space="preserve">establish</w:delText>
         </w:r>
       </w:del>
-      <w:ins w:id="1539" w:author="Language Editor" w:date="2026-09-27T12:00:00Z">
+      <w:ins w:id="1523" w:author="Language Editor" w:date="2026-09-27T12:00:00Z">
         <w:r>
           <w:t xml:space="preserve">identify</w:t>
         </w:r>
@@ -6423,7 +6354,7 @@
       <w:r>
         <w:t xml:space="preserve">The</w:t>
       </w:r>
-      <w:del w:id="1540" w:author="Language Editor" w:date="2026-09-27T12:00:00Z">
+      <w:del w:id="1524" w:author="Language Editor" w:date="2026-09-27T12:00:00Z">
         <w:r>
           <w:delText xml:space="preserve"> proposed</w:delText>
         </w:r>
@@ -6449,12 +6380,12 @@
       <w:r>
         <w:t xml:space="preserve">. Shared spatial features are </w:t>
       </w:r>
-      <w:del w:id="1541" w:author="Language Editor" w:date="2026-09-27T12:00:00Z">
+      <w:del w:id="1525" w:author="Language Editor" w:date="2026-09-27T12:00:00Z">
         <w:r>
           <w:delText xml:space="preserve">written</w:delText>
         </w:r>
       </w:del>
-      <w:ins w:id="1542" w:author="Language Editor" w:date="2026-09-27T12:00:00Z">
+      <w:ins w:id="1526" w:author="Language Editor" w:date="2026-09-27T12:00:00Z">
         <w:r>
           <w:t xml:space="preserve">denoted</w:t>
         </w:r>
@@ -6501,12 +6432,12 @@
       <w:r>
         <w:t xml:space="preserve">, where N = h × w indexes the retained spatial grid and d = d_g is </w:t>
       </w:r>
-      <w:del w:id="1543" w:author="Language Editor" w:date="2026-09-27T12:00:00Z">
+      <w:del w:id="1527" w:author="Language Editor" w:date="2026-09-27T12:00:00Z">
         <w:r>
           <w:delText xml:space="preserve">its</w:delText>
         </w:r>
       </w:del>
-      <w:ins w:id="1544" w:author="Language Editor" w:date="2026-09-27T12:00:00Z">
+      <w:ins w:id="1528" w:author="Language Editor" w:date="2026-09-27T12:00:00Z">
         <w:r>
           <w:t xml:space="preserve">the</w:t>
         </w:r>
@@ -6514,114 +6445,114 @@
       <w:r>
         <w:t xml:space="preserve"> feature width. Auxiliary tokens have their own count N_m and are projected to </w:t>
       </w:r>
+      <w:ins w:id="1529" w:author="Language Editor" w:date="2026-09-27T12:00:00Z">
+        <w:r>
+          <w:t xml:space="preserve">width </w:t>
+        </w:r>
+      </w:ins>
+      <w:r>
+        <w:t xml:space="preserve">d before fusion</w:t>
+      </w:r>
+      <w:del w:id="1530" w:author="Language Editor" w:date="2026-09-27T12:00:00Z">
+        <w:r>
+          <w:delText xml:space="preserve">. Position</w:delText>
+        </w:r>
+      </w:del>
+      <w:ins w:id="1531" w:author="Language Editor" w:date="2026-09-27T12:00:00Z">
+        <w:r>
+          <w:t xml:space="preserve">, carrying position</w:t>
+        </w:r>
+      </w:ins>
+      <w:r>
+        <w:t xml:space="preserve">, observation time, scale and input type</w:t>
+      </w:r>
+      <w:del w:id="1532" w:author="Language Editor" w:date="2026-09-27T12:00:00Z">
+        <w:r>
+          <w:delText xml:space="preserve"> accompany the features</w:delText>
+        </w:r>
+      </w:del>
+      <w:r>
+        <w:t xml:space="preserve">. Validity and support constraints determine which auxiliary records may inform each spatial position; region-wide weather</w:t>
+      </w:r>
+      <w:del w:id="1533" w:author="Language Editor" w:date="2026-09-27T12:00:00Z">
+        <w:r>
+          <w:delText xml:space="preserve"> can legitimately support</w:delText>
+        </w:r>
+      </w:del>
+      <w:ins w:id="1534" w:author="Language Editor" w:date="2026-09-27T12:00:00Z">
+        <w:r>
+          <w:t xml:space="preserve">, for example, can legitimately inform</w:t>
+        </w:r>
+      </w:ins>
+      <w:r>
+        <w:t xml:space="preserve"> several positions. A pre-normalized block applies cross-attention, spatial self-attention and a feed-forward sublayer, each </w:t>
+      </w:r>
+      <w:del w:id="1535" w:author="Language Editor" w:date="2026-09-27T12:00:00Z">
+        <w:r>
+          <w:delText xml:space="preserve">with</w:delText>
+        </w:r>
+      </w:del>
+      <w:ins w:id="1536" w:author="Language Editor" w:date="2026-09-27T12:00:00Z">
+        <w:r>
+          <w:t xml:space="preserve">wrapped in</w:t>
+        </w:r>
+      </w:ins>
+      <w:r>
+        <w:t xml:space="preserve"> a residual connection</w:t>
+      </w:r>
+      <w:del w:id="1537" w:author="Language Editor" w:date="2026-09-27T12:00:00Z">
+        <w:r>
+          <w:delText xml:space="preserve"> from its own input</w:delText>
+        </w:r>
+      </w:del>
+      <w:r>
+        <w:t xml:space="preserve"> (Fig. 3b). Fusion preserves </w:t>
+      </w:r>
+      <w:del w:id="1538" w:author="Language Editor" w:date="2026-09-27T12:00:00Z">
+        <w:r>
+          <w:delText xml:space="preserve">N × d; an all-</w:delText>
+        </w:r>
+      </w:del>
+      <w:ins w:id="1539" w:author="Language Editor" w:date="2026-09-27T12:00:00Z">
+        <w:r>
+          <w:t xml:space="preserve">the N × d shape, and an entirely </w:t>
+        </w:r>
+      </w:ins>
+      <w:r>
+        <w:t xml:space="preserve">missing auxiliary input </w:t>
+      </w:r>
+      <w:del w:id="1540" w:author="Language Editor" w:date="2026-09-27T12:00:00Z">
+        <w:r>
+          <w:delText xml:space="preserve">produces</w:delText>
+        </w:r>
+      </w:del>
+      <w:ins w:id="1541" w:author="Language Editor" w:date="2026-09-27T12:00:00Z">
+        <w:r>
+          <w:t xml:space="preserve">yields</w:t>
+        </w:r>
+      </w:ins>
+      <w:r>
+        <w:t xml:space="preserve"> a zero attention update </w:t>
+      </w:r>
+      <w:del w:id="1542" w:author="Language Editor" w:date="2026-09-27T12:00:00Z">
+        <w:r>
+          <w:delText xml:space="preserve">rather than</w:delText>
+        </w:r>
+      </w:del>
+      <w:ins w:id="1543" w:author="Language Editor" w:date="2026-09-27T12:00:00Z">
+        <w:r>
+          <w:t xml:space="preserve">instead of</w:t>
+        </w:r>
+      </w:ins>
+      <w:r>
+        <w:t xml:space="preserve"> an undefined softmax. Attention weights are not </w:t>
+      </w:r>
+      <w:del w:id="1544" w:author="Language Editor" w:date="2026-09-27T12:00:00Z">
+        <w:r>
+          <w:delText xml:space="preserve">treated</w:delText>
+        </w:r>
+      </w:del>
       <w:ins w:id="1545" w:author="Language Editor" w:date="2026-09-27T12:00:00Z">
-        <w:r>
-          <w:t xml:space="preserve">width </w:t>
-        </w:r>
-      </w:ins>
-      <w:r>
-        <w:t xml:space="preserve">d before fusion</w:t>
-      </w:r>
-      <w:del w:id="1546" w:author="Language Editor" w:date="2026-09-27T12:00:00Z">
-        <w:r>
-          <w:delText xml:space="preserve">. Position</w:delText>
-        </w:r>
-      </w:del>
-      <w:ins w:id="1547" w:author="Language Editor" w:date="2026-09-27T12:00:00Z">
-        <w:r>
-          <w:t xml:space="preserve">, carrying position</w:t>
-        </w:r>
-      </w:ins>
-      <w:r>
-        <w:t xml:space="preserve">, observation time, scale and input type</w:t>
-      </w:r>
-      <w:del w:id="1548" w:author="Language Editor" w:date="2026-09-27T12:00:00Z">
-        <w:r>
-          <w:delText xml:space="preserve"> accompany the features</w:delText>
-        </w:r>
-      </w:del>
-      <w:r>
-        <w:t xml:space="preserve">. Validity and support constraints determine which auxiliary records may inform each spatial position; region-wide weather</w:t>
-      </w:r>
-      <w:del w:id="1549" w:author="Language Editor" w:date="2026-09-27T12:00:00Z">
-        <w:r>
-          <w:delText xml:space="preserve"> can legitimately support</w:delText>
-        </w:r>
-      </w:del>
-      <w:ins w:id="1550" w:author="Language Editor" w:date="2026-09-27T12:00:00Z">
-        <w:r>
-          <w:t xml:space="preserve">, for example, can legitimately inform</w:t>
-        </w:r>
-      </w:ins>
-      <w:r>
-        <w:t xml:space="preserve"> several positions. A pre-normalized block applies cross-attention, spatial self-attention and a feed-forward sublayer, each </w:t>
-      </w:r>
-      <w:del w:id="1551" w:author="Language Editor" w:date="2026-09-27T12:00:00Z">
-        <w:r>
-          <w:delText xml:space="preserve">with</w:delText>
-        </w:r>
-      </w:del>
-      <w:ins w:id="1552" w:author="Language Editor" w:date="2026-09-27T12:00:00Z">
-        <w:r>
-          <w:t xml:space="preserve">wrapped in</w:t>
-        </w:r>
-      </w:ins>
-      <w:r>
-        <w:t xml:space="preserve"> a residual connection</w:t>
-      </w:r>
-      <w:del w:id="1553" w:author="Language Editor" w:date="2026-09-27T12:00:00Z">
-        <w:r>
-          <w:delText xml:space="preserve"> from its own input</w:delText>
-        </w:r>
-      </w:del>
-      <w:r>
-        <w:t xml:space="preserve"> (Fig. 3b). Fusion preserves </w:t>
-      </w:r>
-      <w:del w:id="1554" w:author="Language Editor" w:date="2026-09-27T12:00:00Z">
-        <w:r>
-          <w:delText xml:space="preserve">N × d; an all-</w:delText>
-        </w:r>
-      </w:del>
-      <w:ins w:id="1555" w:author="Language Editor" w:date="2026-09-27T12:00:00Z">
-        <w:r>
-          <w:t xml:space="preserve">the N × d shape, and an entirely </w:t>
-        </w:r>
-      </w:ins>
-      <w:r>
-        <w:t xml:space="preserve">missing auxiliary input </w:t>
-      </w:r>
-      <w:del w:id="1556" w:author="Language Editor" w:date="2026-09-27T12:00:00Z">
-        <w:r>
-          <w:delText xml:space="preserve">produces</w:delText>
-        </w:r>
-      </w:del>
-      <w:ins w:id="1557" w:author="Language Editor" w:date="2026-09-27T12:00:00Z">
-        <w:r>
-          <w:t xml:space="preserve">yields</w:t>
-        </w:r>
-      </w:ins>
-      <w:r>
-        <w:t xml:space="preserve"> a zero attention update </w:t>
-      </w:r>
-      <w:del w:id="1558" w:author="Language Editor" w:date="2026-09-27T12:00:00Z">
-        <w:r>
-          <w:delText xml:space="preserve">rather than</w:delText>
-        </w:r>
-      </w:del>
-      <w:ins w:id="1559" w:author="Language Editor" w:date="2026-09-27T12:00:00Z">
-        <w:r>
-          <w:t xml:space="preserve">instead of</w:t>
-        </w:r>
-      </w:ins>
-      <w:r>
-        <w:t xml:space="preserve"> an undefined softmax. Attention weights are not </w:t>
-      </w:r>
-      <w:del w:id="1560" w:author="Language Editor" w:date="2026-09-27T12:00:00Z">
-        <w:r>
-          <w:delText xml:space="preserve">treated</w:delText>
-        </w:r>
-      </w:del>
-      <w:ins w:id="1561" w:author="Language Editor" w:date="2026-09-27T12:00:00Z">
         <w:r>
           <w:t xml:space="preserve">interpreted</w:t>
         </w:r>
@@ -6638,12 +6569,12 @@
       <w:r>
         <w:t xml:space="preserve">The uncompressed spatial features feed two prediction routes. A spatial decoder combines them with multiscale skip features to recover </w:t>
       </w:r>
-      <w:del w:id="1562" w:author="Language Editor" w:date="2026-09-27T12:00:00Z">
+      <w:del w:id="1546" w:author="Language Editor" w:date="2026-09-27T12:00:00Z">
         <w:r>
           <w:delText xml:space="preserve">supported map outputs</w:delText>
         </w:r>
       </w:del>
-      <w:ins w:id="1563" w:author="Language Editor" w:date="2026-09-27T12:00:00Z">
+      <w:ins w:id="1547" w:author="Language Editor" w:date="2026-09-27T12:00:00Z">
         <w:r>
           <w:t xml:space="preserve">map outputs at supported resolutions</w:t>
         </w:r>
@@ -6651,12 +6582,12 @@
       <w:r>
         <w:t xml:space="preserve">. For parcel-level tasks, nonnegative overlap weights pool the features within each parcel</w:t>
       </w:r>
-      <w:del w:id="1564" w:author="Language Editor" w:date="2026-09-27T12:00:00Z">
+      <w:del w:id="1548" w:author="Language Editor" w:date="2026-09-27T12:00:00Z">
         <w:r>
           <w:delText xml:space="preserve"> before</w:delText>
         </w:r>
       </w:del>
-      <w:ins w:id="1565" w:author="Language Editor" w:date="2026-09-27T12:00:00Z">
+      <w:ins w:id="1549" w:author="Language Editor" w:date="2026-09-27T12:00:00Z">
         <w:r>
           <w:t xml:space="preserve">, and</w:t>
         </w:r>
@@ -6664,7 +6595,7 @@
       <w:r>
         <w:t xml:space="preserve"> a prediction head</w:t>
       </w:r>
-      <w:ins w:id="1566" w:author="Language Editor" w:date="2026-09-27T12:00:00Z">
+      <w:ins w:id="1550" w:author="Language Editor" w:date="2026-09-27T12:00:00Z">
         <w:r>
           <w:t xml:space="preserve"> then</w:t>
         </w:r>
@@ -6672,12 +6603,12 @@
       <w:r>
         <w:t xml:space="preserve"> estimates the target attributes. </w:t>
       </w:r>
-      <w:del w:id="1567" w:author="Language Editor" w:date="2026-09-27T12:00:00Z">
+      <w:del w:id="1551" w:author="Language Editor" w:date="2026-09-27T12:00:00Z">
         <w:r>
           <w:delText xml:space="preserve">Empty</w:delText>
         </w:r>
       </w:del>
-      <w:ins w:id="1568" w:author="Language Editor" w:date="2026-09-27T12:00:00Z">
+      <w:ins w:id="1552" w:author="Language Editor" w:date="2026-09-27T12:00:00Z">
         <w:r>
           <w:t xml:space="preserve">Parcels with empty</w:t>
         </w:r>
@@ -6685,12 +6616,12 @@
       <w:r>
         <w:t xml:space="preserve"> or invalid spatial support </w:t>
       </w:r>
-      <w:del w:id="1569" w:author="Language Editor" w:date="2026-09-27T12:00:00Z">
+      <w:del w:id="1553" w:author="Language Editor" w:date="2026-09-27T12:00:00Z">
         <w:r>
           <w:delText xml:space="preserve">is flagged rather than converted to a numerical prediction. Coarse</w:delText>
         </w:r>
       </w:del>
-      <w:ins w:id="1570" w:author="Language Editor" w:date="2026-09-27T12:00:00Z">
+      <w:ins w:id="1554" w:author="Language Editor" w:date="2026-09-27T12:00:00Z">
         <w:r>
           <w:t xml:space="preserve">are flagged and receive no numerical prediction. Because coarse</w:t>
         </w:r>
@@ -6698,12 +6629,12 @@
       <w:r>
         <w:t xml:space="preserve"> features can mix small parcels, </w:t>
       </w:r>
-      <w:del w:id="1571" w:author="Language Editor" w:date="2026-09-27T12:00:00Z">
+      <w:del w:id="1555" w:author="Language Editor" w:date="2026-09-27T12:00:00Z">
         <w:r>
           <w:delText xml:space="preserve">so pooling does not by itself establish fine-scale localization</w:delText>
         </w:r>
       </w:del>
-      <w:ins w:id="1572" w:author="Language Editor" w:date="2026-09-27T12:00:00Z">
+      <w:ins w:id="1556" w:author="Language Editor" w:date="2026-09-27T12:00:00Z">
         <w:r>
           <w:t xml:space="preserve">pooled predictions are interpreted at the resolution that the features support</w:t>
         </w:r>
@@ -6711,12 +6642,12 @@
       <w:r>
         <w:t xml:space="preserve">. Predicted boundaries and attributes </w:t>
       </w:r>
-      <w:del w:id="1573" w:author="Language Editor" w:date="2026-09-27T12:00:00Z">
+      <w:del w:id="1557" w:author="Language Editor" w:date="2026-09-27T12:00:00Z">
         <w:r>
           <w:delText xml:space="preserve">retain their</w:delText>
         </w:r>
       </w:del>
-      <w:ins w:id="1574" w:author="Language Editor" w:date="2026-09-27T12:00:00Z">
+      <w:ins w:id="1558" w:author="Language Editor" w:date="2026-09-27T12:00:00Z">
         <w:r>
           <w:t xml:space="preserve">carry</w:t>
         </w:r>
@@ -6724,12 +6655,12 @@
       <w:r>
         <w:t xml:space="preserve"> model provenance and </w:t>
       </w:r>
-      <w:del w:id="1575" w:author="Language Editor" w:date="2026-09-27T12:00:00Z">
+      <w:del w:id="1559" w:author="Language Editor" w:date="2026-09-27T12:00:00Z">
         <w:r>
           <w:delText xml:space="preserve">must be distinguished</w:delText>
         </w:r>
       </w:del>
-      <w:ins w:id="1576" w:author="Language Editor" w:date="2026-09-27T12:00:00Z">
+      <w:ins w:id="1560" w:author="Language Editor" w:date="2026-09-27T12:00:00Z">
         <w:r>
           <w:t xml:space="preserve">are kept distinct</w:t>
         </w:r>
@@ -6764,7 +6695,7 @@
         </w:rPr>
         <w:t xml:space="preserve">The vision-language branch reuses the shared geospatial front end</w:t>
       </w:r>
-      <w:del w:id="1577" w:author="Language Editor" w:date="2026-09-27T12:00:00Z">
+      <w:del w:id="1561" w:author="Language Editor" w:date="2026-09-27T12:00:00Z">
         <w:r>
           <w:rPr>
             <w:b w:val="0"/>
@@ -6773,7 +6704,7 @@
           <w:delText xml:space="preserve">. It does not introduce an additional</w:delText>
         </w:r>
       </w:del>
-      <w:ins w:id="1578" w:author="Language Editor" w:date="2026-09-27T12:00:00Z">
+      <w:ins w:id="1562" w:author="Language Editor" w:date="2026-09-27T12:00:00Z">
         <w:r>
           <w:rPr>
             <w:b w:val="0"/>
@@ -6789,7 +6720,7 @@
         </w:rPr>
         <w:t xml:space="preserve"> RGB encoder. A set of K learned queries attends to H </w:t>
       </w:r>
-      <w:del w:id="1579" w:author="Language Editor" w:date="2026-09-27T12:00:00Z">
+      <w:del w:id="1563" w:author="Language Editor" w:date="2026-09-27T12:00:00Z">
         <w:r>
           <w:rPr>
             <w:b w:val="0"/>
@@ -6798,7 +6729,7 @@
           <w:delText xml:space="preserve">to produce</w:delText>
         </w:r>
       </w:del>
-      <w:ins w:id="1580" w:author="Language Editor" w:date="2026-09-27T12:00:00Z">
+      <w:ins w:id="1564" w:author="Language Editor" w:date="2026-09-27T12:00:00Z">
         <w:r>
           <w:rPr>
             <w:b w:val="0"/>
@@ -6814,7 +6745,7 @@
         </w:rPr>
         <w:t xml:space="preserve"> K feature vectors of width d_g</w:t>
       </w:r>
-      <w:del w:id="1581" w:author="Language Editor" w:date="2026-09-27T12:00:00Z">
+      <w:del w:id="1565" w:author="Language Editor" w:date="2026-09-27T12:00:00Z">
         <w:r>
           <w:rPr>
             <w:b w:val="0"/>
@@ -6823,7 +6754,7 @@
           <w:delText xml:space="preserve">. A</w:delText>
         </w:r>
       </w:del>
-      <w:ins w:id="1582" w:author="Language Editor" w:date="2026-09-27T12:00:00Z">
+      <w:ins w:id="1566" w:author="Language Editor" w:date="2026-09-27T12:00:00Z">
         <w:r>
           <w:rPr>
             <w:b w:val="0"/>
@@ -6839,7 +6770,7 @@
         </w:rPr>
         <w:t xml:space="preserve"> trainable projector maps </w:t>
       </w:r>
-      <w:del w:id="1583" w:author="Language Editor" w:date="2026-09-27T12:00:00Z">
+      <w:del w:id="1567" w:author="Language Editor" w:date="2026-09-27T12:00:00Z">
         <w:r>
           <w:rPr>
             <w:b w:val="0"/>
@@ -6848,7 +6779,7 @@
           <w:delText xml:space="preserve">these vectors to</w:delText>
         </w:r>
       </w:del>
-      <w:ins w:id="1584" w:author="Language Editor" w:date="2026-09-27T12:00:00Z">
+      <w:ins w:id="1568" w:author="Language Editor" w:date="2026-09-27T12:00:00Z">
         <w:r>
           <w:rPr>
             <w:b w:val="0"/>
@@ -6864,7 +6795,7 @@
         </w:rPr>
         <w:t xml:space="preserve"> language-model width d_l, following </w:t>
       </w:r>
-      <w:del w:id="1585" w:author="Language Editor" w:date="2026-09-27T12:00:00Z">
+      <w:del w:id="1569" w:author="Language Editor" w:date="2026-09-27T12:00:00Z">
         <w:r>
           <w:rPr>
             <w:b w:val="0"/>
@@ -6873,7 +6804,7 @@
           <w:delText xml:space="preserve">the general principle of query-based visual</w:delText>
         </w:r>
       </w:del>
-      <w:ins w:id="1586" w:author="Language Editor" w:date="2026-09-27T12:00:00Z">
+      <w:ins w:id="1570" w:author="Language Editor" w:date="2026-09-27T12:00:00Z">
         <w:r>
           <w:rPr>
             <w:b w:val="0"/>
@@ -6919,7 +6850,7 @@
         </w:rPr>
         <w:t xml:space="preserve">. The </w:t>
       </w:r>
-      <w:del w:id="1587" w:author="Language Editor" w:date="2026-09-27T12:00:00Z">
+      <w:del w:id="1571" w:author="Language Editor" w:date="2026-09-27T12:00:00Z">
         <w:r>
           <w:rPr>
             <w:b w:val="0"/>
@@ -6928,7 +6859,7 @@
           <w:delText xml:space="preserve">proposed interface is therefore</w:delText>
         </w:r>
       </w:del>
-      <w:ins w:id="1588" w:author="Language Editor" w:date="2026-09-27T12:00:00Z">
+      <w:ins w:id="1572" w:author="Language Editor" w:date="2026-09-27T12:00:00Z">
         <w:r>
           <w:rPr>
             <w:b w:val="0"/>
@@ -6944,7 +6875,7 @@
         </w:rPr>
         <w:t xml:space="preserve"> H: N × d_g → Z: K × d_g → V: K × d_l</w:t>
       </w:r>
-      <w:del w:id="1589" w:author="Language Editor" w:date="2026-09-27T12:00:00Z">
+      <w:del w:id="1573" w:author="Language Editor" w:date="2026-09-27T12:00:00Z">
         <w:r>
           <w:rPr>
             <w:b w:val="0"/>
@@ -6953,7 +6884,7 @@
           <w:delText xml:space="preserve">, with the </w:delText>
         </w:r>
       </w:del>
-      <w:ins w:id="1590" w:author="Language Editor" w:date="2026-09-27T12:00:00Z">
+      <w:ins w:id="1574" w:author="Language Editor" w:date="2026-09-27T12:00:00Z">
         <w:r>
           <w:rPr>
             <w:b w:val="0"/>
@@ -6969,7 +6900,7 @@
         </w:rPr>
         <w:t xml:space="preserve">batch axis omitted</w:t>
       </w:r>
-      <w:del w:id="1591" w:author="Language Editor" w:date="2026-09-27T12:00:00Z">
+      <w:del w:id="1575" w:author="Language Editor" w:date="2026-09-27T12:00:00Z">
         <w:r>
           <w:rPr>
             <w:b w:val="0"/>
@@ -6978,7 +6909,7 @@
           <w:delText xml:space="preserve">. K is</w:delText>
         </w:r>
       </w:del>
-      <w:ins w:id="1592" w:author="Language Editor" w:date="2026-09-27T12:00:00Z">
+      <w:ins w:id="1576" w:author="Language Editor" w:date="2026-09-27T12:00:00Z">
         <w:r>
           <w:rPr>
             <w:b w:val="0"/>
@@ -6994,7 +6925,7 @@
         </w:rPr>
         <w:t xml:space="preserve"> a compression budget</w:t>
       </w:r>
-      <w:del w:id="1593" w:author="Language Editor" w:date="2026-09-27T12:00:00Z">
+      <w:del w:id="1577" w:author="Language Editor" w:date="2026-09-27T12:00:00Z">
         <w:r>
           <w:rPr>
             <w:b w:val="0"/>
@@ -7003,7 +6934,7 @@
           <w:delText xml:space="preserve">, not a count</w:delText>
         </w:r>
       </w:del>
-      <w:ins w:id="1594" w:author="Language Editor" w:date="2026-09-27T12:00:00Z">
+      <w:ins w:id="1578" w:author="Language Editor" w:date="2026-09-27T12:00:00Z">
         <w:r>
           <w:rPr>
             <w:b w:val="0"/>
@@ -7019,7 +6950,7 @@
         </w:rPr>
         <w:t xml:space="preserve"> of parcels or agricultural variables. Dense mapping continues to </w:t>
       </w:r>
-      <w:del w:id="1595" w:author="Language Editor" w:date="2026-09-27T12:00:00Z">
+      <w:del w:id="1579" w:author="Language Editor" w:date="2026-09-27T12:00:00Z">
         <w:r>
           <w:rPr>
             <w:b w:val="0"/>
@@ -7028,7 +6959,7 @@
           <w:delText xml:space="preserve">use</w:delText>
         </w:r>
       </w:del>
-      <w:ins w:id="1596" w:author="Language Editor" w:date="2026-09-27T12:00:00Z">
+      <w:ins w:id="1580" w:author="Language Editor" w:date="2026-09-27T12:00:00Z">
         <w:r>
           <w:rPr>
             <w:b w:val="0"/>
@@ -7055,7 +6986,7 @@
           <w:bCs w:val="0"/>
         </w:rPr>
       </w:pPr>
-      <w:del w:id="1597" w:author="Language Editor" w:date="2026-09-27T12:00:00Z">
+      <w:del w:id="1581" w:author="Language Editor" w:date="2026-09-27T12:00:00Z">
         <w:r>
           <w:rPr>
             <w:b w:val="0"/>
@@ -7064,7 +6995,7 @@
           <w:delText xml:space="preserve">Projected features provide continuous spatial context to</w:delText>
         </w:r>
       </w:del>
-      <w:ins w:id="1598" w:author="Language Editor" w:date="2026-09-27T12:00:00Z">
+      <w:ins w:id="1582" w:author="Language Editor" w:date="2026-09-27T12:00:00Z">
         <w:r>
           <w:rPr>
             <w:b w:val="0"/>
@@ -7080,7 +7011,7 @@
         </w:rPr>
         <w:t xml:space="preserve"> a pretrained language decoder</w:t>
       </w:r>
-      <w:ins w:id="1599" w:author="Language Editor" w:date="2026-09-27T12:00:00Z">
+      <w:ins w:id="1583" w:author="Language Editor" w:date="2026-09-27T12:00:00Z">
         <w:r>
           <w:rPr>
             <w:b w:val="0"/>
@@ -7096,7 +7027,7 @@
         </w:rPr>
         <w:t xml:space="preserve">. A separate text path </w:t>
       </w:r>
-      <w:del w:id="1600" w:author="Language Editor" w:date="2026-09-27T12:00:00Z">
+      <w:del w:id="1584" w:author="Language Editor" w:date="2026-09-27T12:00:00Z">
         <w:r>
           <w:rPr>
             <w:b w:val="0"/>
@@ -7105,7 +7036,7 @@
           <w:delText xml:space="preserve">contains</w:delText>
         </w:r>
       </w:del>
-      <w:ins w:id="1601" w:author="Language Editor" w:date="2026-09-27T12:00:00Z">
+      <w:ins w:id="1585" w:author="Language Editor" w:date="2026-09-27T12:00:00Z">
         <w:r>
           <w:rPr>
             <w:b w:val="0"/>
@@ -7121,7 +7052,7 @@
         </w:rPr>
         <w:t xml:space="preserve"> the question, assessment criteria, applicable knowledge and serialized evidence records. After text embedding, its U vectors have width d_l</w:t>
       </w:r>
-      <w:del w:id="1602" w:author="Language Editor" w:date="2026-09-27T12:00:00Z">
+      <w:del w:id="1586" w:author="Language Editor" w:date="2026-09-27T12:00:00Z">
         <w:r>
           <w:rPr>
             <w:b w:val="0"/>
@@ -7130,7 +7061,7 @@
           <w:delText xml:space="preserve">; the proposed prefix has</w:delText>
         </w:r>
       </w:del>
-      <w:ins w:id="1603" w:author="Language Editor" w:date="2026-09-27T12:00:00Z">
+      <w:ins w:id="1587" w:author="Language Editor" w:date="2026-09-27T12:00:00Z">
         <w:r>
           <w:rPr>
             <w:b w:val="0"/>
@@ -7146,7 +7077,7 @@
         </w:rPr>
         <w:t xml:space="preserve"> (K + U) × d_l components before generated tokens are appended. </w:t>
       </w:r>
-      <w:del w:id="1604" w:author="Language Editor" w:date="2026-09-27T12:00:00Z">
+      <w:del w:id="1588" w:author="Language Editor" w:date="2026-09-27T12:00:00Z">
         <w:r>
           <w:rPr>
             <w:b w:val="0"/>
@@ -7155,7 +7086,7 @@
           <w:delText xml:space="preserve">Records preserve</w:delText>
         </w:r>
       </w:del>
-      <w:ins w:id="1605" w:author="Language Editor" w:date="2026-09-27T12:00:00Z">
+      <w:ins w:id="1589" w:author="Language Editor" w:date="2026-09-27T12:00:00Z">
         <w:r>
           <w:rPr>
             <w:b w:val="0"/>
@@ -7171,7 +7102,7 @@
         </w:rPr>
         <w:t xml:space="preserve"> object and time identifiers, values, units, sources, quality and </w:t>
       </w:r>
-      <w:del w:id="1606" w:author="Language Editor" w:date="2026-09-27T12:00:00Z">
+      <w:del w:id="1590" w:author="Language Editor" w:date="2026-09-27T12:00:00Z">
         <w:r>
           <w:rPr>
             <w:b w:val="0"/>
@@ -7180,7 +7111,7 @@
           <w:delText xml:space="preserve">an observed/predicted distinction. The</w:delText>
         </w:r>
       </w:del>
-      <w:ins w:id="1607" w:author="Language Editor" w:date="2026-09-27T12:00:00Z">
+      <w:ins w:id="1591" w:author="Language Editor" w:date="2026-09-27T12:00:00Z">
         <w:r>
           <w:rPr>
             <w:b w:val="0"/>
@@ -7196,7 +7127,7 @@
         </w:rPr>
         <w:t xml:space="preserve"> decoder and adapter </w:t>
       </w:r>
-      <w:del w:id="1608" w:author="Language Editor" w:date="2026-09-27T12:00:00Z">
+      <w:del w:id="1592" w:author="Language Editor" w:date="2026-09-27T12:00:00Z">
         <w:r>
           <w:rPr>
             <w:b w:val="0"/>
@@ -7205,7 +7136,7 @@
           <w:delText xml:space="preserve">require cross-modal training</w:delText>
         </w:r>
       </w:del>
-      <w:ins w:id="1609" w:author="Language Editor" w:date="2026-09-27T12:00:00Z">
+      <w:ins w:id="1593" w:author="Language Editor" w:date="2026-09-27T12:00:00Z">
         <w:r>
           <w:rPr>
             <w:b w:val="0"/>
@@ -7221,7 +7152,7 @@
         </w:rPr>
         <w:t xml:space="preserve"> to use this information</w:t>
       </w:r>
-      <w:del w:id="1610" w:author="Language Editor" w:date="2026-09-27T12:00:00Z">
+      <w:del w:id="1594" w:author="Language Editor" w:date="2026-09-27T12:00:00Z">
         <w:r>
           <w:rPr>
             <w:b w:val="0"/>
@@ -7230,7 +7161,7 @@
           <w:delText xml:space="preserve">. This</w:delText>
         </w:r>
       </w:del>
-      <w:ins w:id="1611" w:author="Language Editor" w:date="2026-09-27T12:00:00Z">
+      <w:ins w:id="1595" w:author="Language Editor" w:date="2026-09-27T12:00:00Z">
         <w:r>
           <w:rPr>
             <w:b w:val="0"/>
@@ -7246,7 +7177,7 @@
         </w:rPr>
         <w:t xml:space="preserve"> shared-encoder arrangement defines the </w:t>
       </w:r>
-      <w:del w:id="1612" w:author="Language Editor" w:date="2026-09-27T12:00:00Z">
+      <w:del w:id="1596" w:author="Language Editor" w:date="2026-09-27T12:00:00Z">
         <w:r>
           <w:rPr>
             <w:b w:val="0"/>
@@ -7255,7 +7186,7 @@
           <w:delText xml:space="preserve">proposed VLM functionality without asserting that an untrained connector already provides agricultural reasoning</w:delText>
         </w:r>
       </w:del>
-      <w:ins w:id="1613" w:author="Language Editor" w:date="2026-09-27T12:00:00Z">
+      <w:ins w:id="1597" w:author="Language Editor" w:date="2026-09-27T12:00:00Z">
         <w:r>
           <w:rPr>
             <w:b w:val="0"/>
@@ -7280,12 +7211,12 @@
       <w:r>
         <w:t xml:space="preserve">A query </w:t>
       </w:r>
-      <w:del w:id="1614" w:author="Language Editor" w:date="2026-09-27T12:00:00Z">
+      <w:del w:id="1598" w:author="Language Editor" w:date="2026-09-27T12:00:00Z">
         <w:r>
           <w:delText xml:space="preserve">defines</w:delText>
         </w:r>
       </w:del>
-      <w:ins w:id="1615" w:author="Language Editor" w:date="2026-09-27T12:00:00Z">
+      <w:ins w:id="1599" w:author="Language Editor" w:date="2026-09-27T12:00:00Z">
         <w:r>
           <w:t xml:space="preserve">specifies</w:t>
         </w:r>
@@ -7293,12 +7224,12 @@
       <w:r>
         <w:t xml:space="preserve"> the object, period, agricultural objective and requested judgment. Spatial decoding produces </w:t>
       </w:r>
-      <w:del w:id="1616" w:author="Language Editor" w:date="2026-09-27T12:00:00Z">
+      <w:del w:id="1600" w:author="Language Editor" w:date="2026-09-27T12:00:00Z">
         <w:r>
           <w:delText xml:space="preserve">supported element maps, while</w:delText>
         </w:r>
       </w:del>
-      <w:ins w:id="1617" w:author="Language Editor" w:date="2026-09-27T12:00:00Z">
+      <w:ins w:id="1601" w:author="Language Editor" w:date="2026-09-27T12:00:00Z">
         <w:r>
           <w:t xml:space="preserve">element maps at supported resolutions, and</w:t>
         </w:r>
@@ -7306,12 +7237,12 @@
       <w:r>
         <w:t xml:space="preserve"> masked parcel pooling </w:t>
       </w:r>
-      <w:del w:id="1618" w:author="Language Editor" w:date="2026-09-27T12:00:00Z">
+      <w:del w:id="1602" w:author="Language Editor" w:date="2026-09-27T12:00:00Z">
         <w:r>
           <w:delText xml:space="preserve">and task heads produce</w:delText>
         </w:r>
       </w:del>
-      <w:ins w:id="1619" w:author="Language Editor" w:date="2026-09-27T12:00:00Z">
+      <w:ins w:id="1603" w:author="Language Editor" w:date="2026-09-27T12:00:00Z">
         <w:r>
           <w:t xml:space="preserve">with task heads produces</w:t>
         </w:r>
@@ -7319,12 +7250,12 @@
       <w:r>
         <w:t xml:space="preserve"> field attributes or numerical estimates</w:t>
       </w:r>
-      <w:del w:id="1620" w:author="Language Editor" w:date="2026-09-27T12:00:00Z">
+      <w:del w:id="1604" w:author="Language Editor" w:date="2026-09-27T12:00:00Z">
         <w:r>
           <w:delText xml:space="preserve">. These outputs</w:delText>
         </w:r>
       </w:del>
-      <w:ins w:id="1621" w:author="Language Editor" w:date="2026-09-27T12:00:00Z">
+      <w:ins w:id="1605" w:author="Language Editor" w:date="2026-09-27T12:00:00Z">
         <w:r>
           <w:t xml:space="preserve">, which</w:t>
         </w:r>
@@ -7332,7 +7263,7 @@
       <w:r>
         <w:t xml:space="preserve"> remain distinct from observations. Assessment combines</w:t>
       </w:r>
-      <w:del w:id="1622" w:author="Language Editor" w:date="2026-09-27T12:00:00Z">
+      <w:del w:id="1606" w:author="Language Editor" w:date="2026-09-27T12:00:00Z">
         <w:r>
           <w:delText xml:space="preserve"> the</w:delText>
         </w:r>
@@ -7340,12 +7271,12 @@
       <w:r>
         <w:t xml:space="preserve"> spatial context with explicit evidence and applicable criteria</w:t>
       </w:r>
-      <w:del w:id="1623" w:author="Language Editor" w:date="2026-09-27T12:00:00Z">
+      <w:del w:id="1607" w:author="Language Editor" w:date="2026-09-27T12:00:00Z">
         <w:r>
           <w:delText xml:space="preserve">;</w:delText>
         </w:r>
       </w:del>
-      <w:ins w:id="1624" w:author="Language Editor" w:date="2026-09-27T12:00:00Z">
+      <w:ins w:id="1608" w:author="Language Editor" w:date="2026-09-27T12:00:00Z">
         <w:r>
           <w:t xml:space="preserve">, and</w:t>
         </w:r>
@@ -7353,12 +7284,12 @@
       <w:r>
         <w:t xml:space="preserve"> management support additionally considers available resources and action constraints. Responses contain structured variables, explanations and</w:t>
       </w:r>
-      <w:del w:id="1625" w:author="Language Editor" w:date="2026-09-27T12:00:00Z">
+      <w:del w:id="1609" w:author="Language Editor" w:date="2026-09-27T12:00:00Z">
         <w:r>
           <w:delText xml:space="preserve"> spatial outputs where justified. Each statement retains</w:delText>
         </w:r>
       </w:del>
-      <w:ins w:id="1626" w:author="Language Editor" w:date="2026-09-27T12:00:00Z">
+      <w:ins w:id="1610" w:author="Language Editor" w:date="2026-09-27T12:00:00Z">
         <w:r>
           <w:t xml:space="preserve">, where justified, spatial outputs, and each statement carries</w:t>
         </w:r>
@@ -7366,12 +7297,12 @@
       <w:r>
         <w:t xml:space="preserve"> its scope and sources. Value, unit and date checks test internal consistency, </w:t>
       </w:r>
-      <w:del w:id="1627" w:author="Language Editor" w:date="2026-09-27T12:00:00Z">
+      <w:del w:id="1611" w:author="Language Editor" w:date="2026-09-27T12:00:00Z">
         <w:r>
           <w:delText xml:space="preserve">while</w:delText>
         </w:r>
       </w:del>
-      <w:ins w:id="1628" w:author="Language Editor" w:date="2026-09-27T12:00:00Z">
+      <w:ins w:id="1612" w:author="Language Editor" w:date="2026-09-27T12:00:00Z">
         <w:r>
           <w:t xml:space="preserve">and</w:t>
         </w:r>
@@ -7379,12 +7310,12 @@
       <w:r>
         <w:t xml:space="preserve"> a separate support check examines whether the cited evidence justifies </w:t>
       </w:r>
-      <w:del w:id="1629" w:author="Language Editor" w:date="2026-09-27T12:00:00Z">
+      <w:del w:id="1613" w:author="Language Editor" w:date="2026-09-27T12:00:00Z">
         <w:r>
           <w:delText xml:space="preserve">the claim. Missing or contradictory evidence leads to a scoped, unassessed judgment and a request for</w:delText>
         </w:r>
       </w:del>
-      <w:ins w:id="1630" w:author="Language Editor" w:date="2026-09-27T12:00:00Z">
+      <w:ins w:id="1614" w:author="Language Editor" w:date="2026-09-27T12:00:00Z">
         <w:r>
           <w:t xml:space="preserve">each claim. When evidence is missing or contradictory, the response marks the judgment as unassessed within its scope and requests</w:t>
         </w:r>
@@ -7401,12 +7332,12 @@
       <w:r>
         <w:t xml:space="preserve">3 Case </w:t>
       </w:r>
-      <w:del w:id="1631" w:author="Language Editor" w:date="2026-09-27T12:00:00Z">
+      <w:del w:id="1615" w:author="Language Editor" w:date="2026-09-27T12:00:00Z">
         <w:r>
           <w:delText xml:space="preserve">designs and illustrative assessments</w:delText>
         </w:r>
       </w:del>
-      <w:ins w:id="1632" w:author="Language Editor" w:date="2026-09-27T12:00:00Z">
+      <w:ins w:id="1616" w:author="Language Editor" w:date="2026-09-27T12:00:00Z">
         <w:r>
           <w:t xml:space="preserve">applications</w:t>
         </w:r>
@@ -7420,7 +7351,7 @@
       <w:r>
         <w:t xml:space="preserve">3.1 Case settings</w:t>
       </w:r>
-      <w:del w:id="1633" w:author="Language Editor" w:date="2026-09-27T12:00:00Z">
+      <w:del w:id="1617" w:author="Language Editor" w:date="2026-09-27T12:00:00Z">
         <w:r>
           <w:delText xml:space="preserve"> and spatial presentation</w:delText>
         </w:r>
@@ -7434,12 +7365,12 @@
       <w:r>
         <w:t xml:space="preserve">Two </w:t>
       </w:r>
-      <w:del w:id="1634" w:author="Language Editor" w:date="2026-09-27T12:00:00Z">
+      <w:del w:id="1618" w:author="Language Editor" w:date="2026-09-27T12:00:00Z">
         <w:r>
           <w:delText xml:space="preserve">case designs illustrate the proposed workflow: soil-</w:delText>
         </w:r>
       </w:del>
-      <w:ins w:id="1635" w:author="Language Editor" w:date="2026-09-27T12:00:00Z">
+      <w:ins w:id="1619" w:author="Language Editor" w:date="2026-09-27T12:00:00Z">
         <w:r>
           <w:t xml:space="preserve">cases show how the workflow applies in practice: soil </w:t>
         </w:r>
@@ -7447,12 +7378,12 @@
       <w:r>
         <w:t xml:space="preserve">acidity assessment in Qiyang</w:t>
       </w:r>
-      <w:del w:id="1636" w:author="Language Editor" w:date="2026-09-27T12:00:00Z">
+      <w:del w:id="1620" w:author="Language Editor" w:date="2026-09-27T12:00:00Z">
         <w:r>
           <w:delText xml:space="preserve">, Hunan, and production-</w:delText>
         </w:r>
       </w:del>
-      <w:ins w:id="1637" w:author="Language Editor" w:date="2026-09-27T12:00:00Z">
+      <w:ins w:id="1621" w:author="Language Editor" w:date="2026-09-27T12:00:00Z">
         <w:r>
           <w:t xml:space="preserve"> County, Hunan Province, and production </w:t>
         </w:r>
@@ -7460,12 +7391,12 @@
       <w:r>
         <w:t xml:space="preserve">capacity assessment in Quzhou</w:t>
       </w:r>
-      <w:del w:id="1638" w:author="Language Editor" w:date="2026-09-27T12:00:00Z">
+      <w:del w:id="1622" w:author="Language Editor" w:date="2026-09-27T12:00:00Z">
         <w:r>
           <w:delText xml:space="preserve">, Hebei</w:delText>
         </w:r>
       </w:del>
-      <w:ins w:id="1639" w:author="Language Editor" w:date="2026-09-27T12:00:00Z">
+      <w:ins w:id="1623" w:author="Language Editor" w:date="2026-09-27T12:00:00Z">
         <w:r>
           <w:t xml:space="preserve"> County, Hebei Province. Qiyang lies in the red-soil region of southern China, where soil acidity constrains crop production, whereas Quzhou lies in the North China Plain, where integrated water and fertilizer management is being used to raise production capacity</w:t>
         </w:r>
@@ -7473,12 +7404,12 @@
       <w:r>
         <w:t xml:space="preserve">. The Qiyang material comprises a regional image, three site images and descriptions of two double-season rice sites and one predominantly maize site. The Quzhou material specifies </w:t>
       </w:r>
-      <w:del w:id="1640" w:author="Language Editor" w:date="2026-09-27T12:00:00Z">
+      <w:del w:id="1624" w:author="Language Editor" w:date="2026-09-27T12:00:00Z">
         <w:r>
           <w:delText xml:space="preserve">an intended</w:delText>
         </w:r>
       </w:del>
-      <w:ins w:id="1641" w:author="Language Editor" w:date="2026-09-27T12:00:00Z">
+      <w:ins w:id="1625" w:author="Language Editor" w:date="2026-09-27T12:00:00Z">
         <w:r>
           <w:t xml:space="preserve">the</w:t>
         </w:r>
@@ -7486,12 +7417,12 @@
       <w:r>
         <w:t xml:space="preserve"> analysis-unit and annotation layout. </w:t>
       </w:r>
-      <w:del w:id="1642" w:author="Language Editor" w:date="2026-09-27T12:00:00Z">
+      <w:del w:id="1626" w:author="Language Editor" w:date="2026-09-27T12:00:00Z">
         <w:r>
           <w:delText xml:space="preserve">The examples</w:delText>
         </w:r>
       </w:del>
-      <w:ins w:id="1643" w:author="Language Editor" w:date="2026-09-27T12:00:00Z">
+      <w:ins w:id="1627" w:author="Language Editor" w:date="2026-09-27T12:00:00Z">
         <w:r>
           <w:t xml:space="preserve">Together, the cases</w:t>
         </w:r>
@@ -7499,12 +7430,12 @@
       <w:r>
         <w:t xml:space="preserve"> show how agricultural questions determine input requirements, assessment scope and evidence </w:t>
       </w:r>
-      <w:del w:id="1644" w:author="Language Editor" w:date="2026-09-27T12:00:00Z">
+      <w:del w:id="1628" w:author="Language Editor" w:date="2026-09-27T12:00:00Z">
         <w:r>
           <w:delText xml:space="preserve">gaps. They are author-developed illustrations rather than outputs from an executed model.</w:delText>
         </w:r>
       </w:del>
-      <w:ins w:id="1645" w:author="Language Editor" w:date="2026-09-27T12:00:00Z">
+      <w:ins w:id="1629" w:author="Language Editor" w:date="2026-09-27T12:00:00Z">
         <w:r>
           <w:t xml:space="preserve">needs.</w:t>
         </w:r>
@@ -7518,12 +7449,12 @@
       <w:r>
         <w:t xml:space="preserve">Figure 4 summarizes the case </w:t>
       </w:r>
-      <w:del w:id="1646" w:author="Language Editor" w:date="2026-09-27T12:00:00Z">
+      <w:del w:id="1630" w:author="Language Editor" w:date="2026-09-27T12:00:00Z">
         <w:r>
           <w:delText xml:space="preserve">designs and available information</w:delText>
         </w:r>
       </w:del>
-      <w:ins w:id="1647" w:author="Language Editor" w:date="2026-09-27T12:00:00Z">
+      <w:ins w:id="1631" w:author="Language Editor" w:date="2026-09-27T12:00:00Z">
         <w:r>
           <w:t xml:space="preserve">locations and analysis-unit layout</w:t>
         </w:r>
@@ -7531,12 +7462,12 @@
       <w:r>
         <w:t xml:space="preserve">. Figure 5 presents the Qiyang site material, and Fig. 6 sets out the </w:t>
       </w:r>
-      <w:del w:id="1648" w:author="Language Editor" w:date="2026-09-27T12:00:00Z">
+      <w:del w:id="1632" w:author="Language Editor" w:date="2026-09-27T12:00:00Z">
         <w:r>
           <w:delText xml:space="preserve">Quzhou assessment logic. The design proposes three</w:delText>
         </w:r>
       </w:del>
-      <w:ins w:id="1649" w:author="Language Editor" w:date="2026-09-27T12:00:00Z">
+      <w:ins w:id="1633" w:author="Language Editor" w:date="2026-09-27T12:00:00Z">
         <w:r>
           <w:t xml:space="preserve">assessment logic for Quzhou. Three</w:t>
         </w:r>
@@ -7544,12 +7475,12 @@
       <w:r>
         <w:t xml:space="preserve"> 500 m × 500 m analysis units </w:t>
       </w:r>
-      <w:del w:id="1650" w:author="Language Editor" w:date="2026-09-27T12:00:00Z">
+      <w:del w:id="1634" w:author="Language Editor" w:date="2026-09-27T12:00:00Z">
         <w:r>
           <w:delText xml:space="preserve">per region. Verified coordinates, acquisition dates and matched observations are required before these can become evaluation samples</w:delText>
         </w:r>
       </w:del>
-      <w:ins w:id="1651" w:author="Language Editor" w:date="2026-09-27T12:00:00Z">
+      <w:ins w:id="1635" w:author="Language Editor" w:date="2026-09-27T12:00:00Z">
         <w:r>
           <w:t xml:space="preserve">are defined in each region</w:t>
         </w:r>
@@ -7557,12 +7488,12 @@
       <w:r>
         <w:t xml:space="preserve">. Section 3.5 </w:t>
       </w:r>
-      <w:del w:id="1652" w:author="Language Editor" w:date="2026-09-27T12:00:00Z">
+      <w:del w:id="1636" w:author="Language Editor" w:date="2026-09-27T12:00:00Z">
         <w:r>
           <w:delText xml:space="preserve">consolidates the limitations of the illustrative evidence</w:delText>
         </w:r>
       </w:del>
-      <w:ins w:id="1653" w:author="Language Editor" w:date="2026-09-27T12:00:00Z">
+      <w:ins w:id="1637" w:author="Language Editor" w:date="2026-09-27T12:00:00Z">
         <w:r>
           <w:t xml:space="preserve">summarizes what the two cases reveal about the framework</w:t>
         </w:r>
@@ -7587,12 +7518,12 @@
       <w:r>
         <w:t xml:space="preserve">Fig. 4</w:t>
       </w:r>
-      <w:del w:id="1654" w:author="Language Editor" w:date="2026-09-27T12:00:00Z">
+      <w:del w:id="1638" w:author="Language Editor" w:date="2026-09-27T12:00:00Z">
         <w:r>
           <w:delText xml:space="preserve">  Case-location and window layout for</w:delText>
         </w:r>
       </w:del>
-      <w:ins w:id="1655" w:author="Language Editor" w:date="2026-09-27T12:00:00Z">
+      <w:ins w:id="1639" w:author="Language Editor" w:date="2026-09-27T12:00:00Z">
         <w:r>
           <w:t xml:space="preserve"> Case locations and analysis-unit layout in</w:t>
         </w:r>
@@ -7618,12 +7549,12 @@
       <w:r>
         <w:t xml:space="preserve">Table 2 organizes the case descriptions by parent material and location, land use and cropping, and field management. </w:t>
       </w:r>
-      <w:del w:id="1656" w:author="Language Editor" w:date="2026-09-27T12:00:00Z">
+      <w:del w:id="1640" w:author="Language Editor" w:date="2026-09-27T12:00:00Z">
         <w:r>
           <w:delText xml:space="preserve">An</w:delText>
         </w:r>
       </w:del>
-      <w:ins w:id="1657" w:author="Language Editor" w:date="2026-09-27T12:00:00Z">
+      <w:ins w:id="1641" w:author="Language Editor" w:date="2026-09-27T12:00:00Z">
         <w:r>
           <w:t xml:space="preserve">Each</w:t>
         </w:r>
@@ -7631,12 +7562,12 @@
       <w:r>
         <w:t xml:space="preserve"> annotation links a statement to the dimensions and reasoning level it addresses</w:t>
       </w:r>
-      <w:del w:id="1658" w:author="Language Editor" w:date="2026-09-27T12:00:00Z">
+      <w:del w:id="1642" w:author="Language Editor" w:date="2026-09-27T12:00:00Z">
         <w:r>
           <w:delText xml:space="preserve">, then</w:delText>
         </w:r>
       </w:del>
-      <w:ins w:id="1659" w:author="Language Editor" w:date="2026-09-27T12:00:00Z">
+      <w:ins w:id="1643" w:author="Language Editor" w:date="2026-09-27T12:00:00Z">
         <w:r>
           <w:t xml:space="preserve"> and</w:t>
         </w:r>
@@ -7644,12 +7575,12 @@
       <w:r>
         <w:t xml:space="preserve"> records its object, period, sources, statement type and evidence status. </w:t>
       </w:r>
-      <w:del w:id="1660" w:author="Language Editor" w:date="2026-09-27T12:00:00Z">
+      <w:del w:id="1644" w:author="Language Editor" w:date="2026-09-27T12:00:00Z">
         <w:r>
           <w:delText xml:space="preserve">This illustrates the intended annotation structure. A complete annotation protocol would additionally specify</w:delText>
         </w:r>
       </w:del>
-      <w:ins w:id="1661" w:author="Language Editor" w:date="2026-09-27T12:00:00Z">
+      <w:ins w:id="1645" w:author="Language Editor" w:date="2026-09-27T12:00:00Z">
         <w:r>
           <w:t xml:space="preserve">A full annotation protocol further specifies</w:t>
         </w:r>
@@ -7657,12 +7588,12 @@
       <w:r>
         <w:t xml:space="preserve"> annotator expertise, independent review, </w:t>
       </w:r>
-      <w:del w:id="1662" w:author="Language Editor" w:date="2026-09-27T12:00:00Z">
+      <w:del w:id="1646" w:author="Language Editor" w:date="2026-09-27T12:00:00Z">
         <w:r>
           <w:delText xml:space="preserve">disagreement handling</w:delText>
         </w:r>
       </w:del>
-      <w:ins w:id="1663" w:author="Language Editor" w:date="2026-09-27T12:00:00Z">
+      <w:ins w:id="1647" w:author="Language Editor" w:date="2026-09-27T12:00:00Z">
         <w:r>
           <w:t xml:space="preserve">handling of disagreement</w:t>
         </w:r>
@@ -7686,7 +7617,7 @@
         </w:rPr>
         <w:t xml:space="preserve">Table 2 Expert reasoning factors and their roles in the two </w:t>
       </w:r>
-      <w:del w:id="1664" w:author="Language Editor" w:date="2026-09-27T12:00:00Z">
+      <w:del w:id="1648" w:author="Language Editor" w:date="2026-09-27T12:00:00Z">
         <w:r>
           <w:rPr>
             <w:b/>
@@ -7697,7 +7628,7 @@
           <w:delText xml:space="preserve">case designs</w:delText>
         </w:r>
       </w:del>
-      <w:ins w:id="1665" w:author="Language Editor" w:date="2026-09-27T12:00:00Z">
+      <w:ins w:id="1649" w:author="Language Editor" w:date="2026-09-27T12:00:00Z">
         <w:r>
           <w:rPr>
             <w:b/>
@@ -8164,12 +8095,12 @@
       <w:r>
         <w:t xml:space="preserve">The</w:t>
       </w:r>
-      <w:del w:id="1666" w:author="Language Editor" w:date="2026-09-27T12:00:00Z">
+      <w:del w:id="1650" w:author="Language Editor" w:date="2026-09-27T12:00:00Z">
         <w:r>
           <w:delText xml:space="preserve"> following assessments illustrate</w:delText>
         </w:r>
       </w:del>
-      <w:ins w:id="1667" w:author="Language Editor" w:date="2026-09-27T12:00:00Z">
+      <w:ins w:id="1651" w:author="Language Editor" w:date="2026-09-27T12:00:00Z">
         <w:r>
           <w:t xml:space="preserve"> assessments below show</w:t>
         </w:r>
@@ -8177,12 +8108,12 @@
       <w:r>
         <w:t xml:space="preserve"> how the case information </w:t>
       </w:r>
-      <w:del w:id="1668" w:author="Language Editor" w:date="2026-09-27T12:00:00Z">
+      <w:del w:id="1652" w:author="Language Editor" w:date="2026-09-27T12:00:00Z">
         <w:r>
           <w:delText xml:space="preserve">would be used. They distinguish</w:delText>
         </w:r>
       </w:del>
-      <w:ins w:id="1669" w:author="Language Editor" w:date="2026-09-27T12:00:00Z">
+      <w:ins w:id="1653" w:author="Language Editor" w:date="2026-09-27T12:00:00Z">
         <w:r>
           <w:t xml:space="preserve">is used within the framework, separating</w:t>
         </w:r>
@@ -8190,12 +8121,12 @@
       <w:r>
         <w:t xml:space="preserve"> descriptive labels from explanations and </w:t>
       </w:r>
-      <w:del w:id="1670" w:author="Language Editor" w:date="2026-09-27T12:00:00Z">
+      <w:del w:id="1654" w:author="Language Editor" w:date="2026-09-27T12:00:00Z">
         <w:r>
           <w:delText xml:space="preserve">scenarios requiring further evidence. Record-level source identifiers and verified spatial and temporal links are not yet available for complete evaluation references.</w:delText>
         </w:r>
       </w:del>
-      <w:ins w:id="1671" w:author="Language Editor" w:date="2026-09-27T12:00:00Z">
+      <w:ins w:id="1655" w:author="Language Editor" w:date="2026-09-27T12:00:00Z">
         <w:r>
           <w:t xml:space="preserve">from scenarios that need further evidence.</w:t>
         </w:r>
@@ -8218,12 +8149,12 @@
       <w:r>
         <w:t xml:space="preserve">The Qiyang descriptions relate land use and fertilizer or amendment practices to soil acidity. Figure 5 </w:t>
       </w:r>
-      <w:del w:id="1672" w:author="Language Editor" w:date="2026-09-27T12:00:00Z">
+      <w:del w:id="1656" w:author="Language Editor" w:date="2026-09-27T12:00:00Z">
         <w:r>
           <w:delText xml:space="preserve">identifies</w:delText>
         </w:r>
       </w:del>
-      <w:ins w:id="1673" w:author="Language Editor" w:date="2026-09-27T12:00:00Z">
+      <w:ins w:id="1657" w:author="Language Editor" w:date="2026-09-27T12:00:00Z">
         <w:r>
           <w:t xml:space="preserve">shows</w:t>
         </w:r>
@@ -8231,12 +8162,12 @@
       <w:r>
         <w:t xml:space="preserve"> paddy use at Shangbaili and Tianlong and a paddy-to-upland </w:t>
       </w:r>
-      <w:del w:id="1674" w:author="Language Editor" w:date="2026-09-27T12:00:00Z">
+      <w:del w:id="1658" w:author="Language Editor" w:date="2026-09-27T12:00:00Z">
         <w:r>
           <w:delText xml:space="preserve">transition with predominantly maize at Simutang. Its labels also describe sandy-</w:delText>
         </w:r>
       </w:del>
-      <w:ins w:id="1675" w:author="Language Editor" w:date="2026-09-27T12:00:00Z">
+      <w:ins w:id="1659" w:author="Language Editor" w:date="2026-09-27T12:00:00Z">
         <w:r>
           <w:t xml:space="preserve">conversion, now mainly under maize, at Simutang. The labels also record sandy </w:t>
         </w:r>
@@ -8244,12 +8175,12 @@
       <w:r>
         <w:t xml:space="preserve">shale parent material and amendment practices. </w:t>
       </w:r>
-      <w:del w:id="1676" w:author="Language Editor" w:date="2026-09-27T12:00:00Z">
+      <w:del w:id="1660" w:author="Language Editor" w:date="2026-09-27T12:00:00Z">
         <w:r>
           <w:delText xml:space="preserve">These observations inform</w:delText>
         </w:r>
       </w:del>
-      <w:ins w:id="1677" w:author="Language Editor" w:date="2026-09-27T12:00:00Z">
+      <w:ins w:id="1661" w:author="Language Editor" w:date="2026-09-27T12:00:00Z">
         <w:r>
           <w:t xml:space="preserve">This information informs</w:t>
         </w:r>
@@ -8257,12 +8188,12 @@
       <w:r>
         <w:t xml:space="preserve"> D1 and D3</w:t>
       </w:r>
-      <w:del w:id="1678" w:author="Language Editor" w:date="2026-09-27T12:00:00Z">
+      <w:del w:id="1662" w:author="Language Editor" w:date="2026-09-27T12:00:00Z">
         <w:r>
           <w:delText xml:space="preserve">. Field</w:delText>
         </w:r>
       </w:del>
-      <w:ins w:id="1679" w:author="Language Editor" w:date="2026-09-27T12:00:00Z">
+      <w:ins w:id="1663" w:author="Language Editor" w:date="2026-09-27T12:00:00Z">
         <w:r>
           <w:t xml:space="preserve">, while field</w:t>
         </w:r>
@@ -8270,12 +8201,12 @@
       <w:r>
         <w:t xml:space="preserve"> infrastructure, crop condition, </w:t>
       </w:r>
-      <w:del w:id="1680" w:author="Language Editor" w:date="2026-09-27T12:00:00Z">
+      <w:del w:id="1664" w:author="Language Editor" w:date="2026-09-27T12:00:00Z">
         <w:r>
           <w:delText xml:space="preserve">yields and capacity require separate</w:delText>
         </w:r>
       </w:del>
-      <w:ins w:id="1681" w:author="Language Editor" w:date="2026-09-27T12:00:00Z">
+      <w:ins w:id="1665" w:author="Language Editor" w:date="2026-09-27T12:00:00Z">
         <w:r>
           <w:t xml:space="preserve">yield and capacity draw on</w:t>
         </w:r>
@@ -8283,12 +8214,12 @@
       <w:r>
         <w:t xml:space="preserve"> evidence under the other dimensions. The stated purpose of an amendment </w:t>
       </w:r>
-      <w:del w:id="1682" w:author="Language Editor" w:date="2026-09-27T12:00:00Z">
+      <w:del w:id="1666" w:author="Language Editor" w:date="2026-09-27T12:00:00Z">
         <w:r>
           <w:delText xml:space="preserve">does not establish its measured effect</w:delText>
         </w:r>
       </w:del>
-      <w:ins w:id="1683" w:author="Language Editor" w:date="2026-09-27T12:00:00Z">
+      <w:ins w:id="1667" w:author="Language Editor" w:date="2026-09-27T12:00:00Z">
         <w:r>
           <w:t xml:space="preserve">is recorded as intent; its effect has to be measured</w:t>
         </w:r>
@@ -8305,12 +8236,12 @@
       <w:r>
         <w:t xml:space="preserve">Illustrative assessment. At L1, the descriptions distinguish two double-season rice sites </w:t>
       </w:r>
-      <w:del w:id="1684" w:author="Language Editor" w:date="2026-09-27T12:00:00Z">
+      <w:del w:id="1668" w:author="Language Editor" w:date="2026-09-27T12:00:00Z">
         <w:r>
           <w:delText xml:space="preserve">and</w:delText>
         </w:r>
       </w:del>
-      <w:ins w:id="1685" w:author="Language Editor" w:date="2026-09-27T12:00:00Z">
+      <w:ins w:id="1669" w:author="Language Editor" w:date="2026-09-27T12:00:00Z">
         <w:r>
           <w:t xml:space="preserve">from</w:t>
         </w:r>
@@ -8318,12 +8249,12 @@
       <w:r>
         <w:t xml:space="preserve"> one predominantly maize site. </w:t>
       </w:r>
-      <w:del w:id="1686" w:author="Language Editor" w:date="2026-09-27T12:00:00Z">
+      <w:del w:id="1670" w:author="Language Editor" w:date="2026-09-27T12:00:00Z">
         <w:r>
           <w:delText xml:space="preserve">They do not include matched pH measurements, sampling depths or dates. A valid pH measurement could describe current acidity;</w:delText>
         </w:r>
       </w:del>
-      <w:ins w:id="1687" w:author="Language Editor" w:date="2026-09-27T12:00:00Z">
+      <w:ins w:id="1671" w:author="Language Editor" w:date="2026-09-27T12:00:00Z">
         <w:r>
           <w:t xml:space="preserve">A pH measurement with known depth and date describes current acidity, whereas an acidification trend requires</w:t>
         </w:r>
@@ -8331,7 +8262,7 @@
       <w:r>
         <w:t xml:space="preserve"> comparable repeated measurements</w:t>
       </w:r>
-      <w:del w:id="1688" w:author="Language Editor" w:date="2026-09-27T12:00:00Z">
+      <w:del w:id="1672" w:author="Language Editor" w:date="2026-09-27T12:00:00Z">
         <w:r>
           <w:delText xml:space="preserve"> would be needed to assess an acidification trend</w:delText>
         </w:r>
@@ -8339,12 +8270,12 @@
       <w:r>
         <w:t xml:space="preserve">. At L2, matched soil, crop and management observations </w:t>
       </w:r>
-      <w:del w:id="1689" w:author="Language Editor" w:date="2026-09-27T12:00:00Z">
+      <w:del w:id="1673" w:author="Language Editor" w:date="2026-09-27T12:00:00Z">
         <w:r>
           <w:delText xml:space="preserve">could support examination of competing explanations</w:delText>
         </w:r>
       </w:del>
-      <w:ins w:id="1690" w:author="Language Editor" w:date="2026-09-27T12:00:00Z">
+      <w:ins w:id="1674" w:author="Language Editor" w:date="2026-09-27T12:00:00Z">
         <w:r>
           <w:t xml:space="preserve">allow competing explanations to be examined</w:t>
         </w:r>
@@ -8352,12 +8283,12 @@
       <w:r>
         <w:t xml:space="preserve">. At L3, management options </w:t>
       </w:r>
-      <w:del w:id="1691" w:author="Language Editor" w:date="2026-09-27T12:00:00Z">
+      <w:del w:id="1675" w:author="Language Editor" w:date="2026-09-27T12:00:00Z">
         <w:r>
           <w:delText xml:space="preserve">would be considered</w:delText>
         </w:r>
       </w:del>
-      <w:ins w:id="1692" w:author="Language Editor" w:date="2026-09-27T12:00:00Z">
+      <w:ins w:id="1676" w:author="Language Editor" w:date="2026-09-27T12:00:00Z">
         <w:r>
           <w:t xml:space="preserve">are weighed</w:t>
         </w:r>
@@ -8365,12 +8296,12 @@
       <w:r>
         <w:t xml:space="preserve"> against crop requirements, site conditions and relevant response evidence. </w:t>
       </w:r>
-      <w:del w:id="1693" w:author="Language Editor" w:date="2026-09-27T12:00:00Z">
+      <w:del w:id="1677" w:author="Language Editor" w:date="2026-09-27T12:00:00Z">
         <w:r>
           <w:delText xml:space="preserve">On the current information, the appropriate response leaves</w:delText>
         </w:r>
       </w:del>
-      <w:ins w:id="1694" w:author="Language Editor" w:date="2026-09-27T12:00:00Z">
+      <w:ins w:id="1678" w:author="Language Editor" w:date="2026-09-27T12:00:00Z">
         <w:r>
           <w:t xml:space="preserve">When matched pH records are absent, CroplandGPT reports</w:t>
         </w:r>
@@ -8378,12 +8309,12 @@
       <w:r>
         <w:t xml:space="preserve"> acidification risk, amendment rates and yield effects </w:t>
       </w:r>
-      <w:del w:id="1695" w:author="Language Editor" w:date="2026-09-27T12:00:00Z">
+      <w:del w:id="1679" w:author="Language Editor" w:date="2026-09-27T12:00:00Z">
         <w:r>
           <w:delText xml:space="preserve">unassessed</w:delText>
         </w:r>
       </w:del>
-      <w:ins w:id="1696" w:author="Language Editor" w:date="2026-09-27T12:00:00Z">
+      <w:ins w:id="1680" w:author="Language Editor" w:date="2026-09-27T12:00:00Z">
         <w:r>
           <w:t xml:space="preserve">as unassessed and lists the observations required to assess them</w:t>
         </w:r>
@@ -8400,12 +8331,12 @@
       <w:r>
         <w:t xml:space="preserve">Fig. 5 </w:t>
       </w:r>
-      <w:del w:id="1697" w:author="Language Editor" w:date="2026-09-27T12:00:00Z">
+      <w:del w:id="1681" w:author="Language Editor" w:date="2026-09-27T12:00:00Z">
         <w:r>
           <w:delText xml:space="preserve">Qiyang overview</w:delText>
         </w:r>
       </w:del>
-      <w:ins w:id="1698" w:author="Language Editor" w:date="2026-09-27T12:00:00Z">
+      <w:ins w:id="1682" w:author="Language Editor" w:date="2026-09-27T12:00:00Z">
         <w:r>
           <w:t xml:space="preserve">Overview of Qiyang</w:t>
         </w:r>
@@ -8413,12 +8344,12 @@
       <w:r>
         <w:t xml:space="preserve"> and site descriptions in Babao Town. </w:t>
       </w:r>
-      <w:del w:id="1699" w:author="Language Editor" w:date="2026-09-27T12:00:00Z">
+      <w:del w:id="1683" w:author="Language Editor" w:date="2026-09-27T12:00:00Z">
         <w:r>
           <w:delText xml:space="preserve">The supplied imagery</w:delText>
         </w:r>
       </w:del>
-      <w:ins w:id="1700" w:author="Language Editor" w:date="2026-09-27T12:00:00Z">
+      <w:ins w:id="1684" w:author="Language Editor" w:date="2026-09-27T12:00:00Z">
         <w:r>
           <w:t xml:space="preserve">Imagery</w:t>
         </w:r>
@@ -8426,12 +8357,12 @@
       <w:r>
         <w:t xml:space="preserve"> and labels describe land use, crops, parent material and management practices</w:t>
       </w:r>
-      <w:del w:id="1701" w:author="Language Editor" w:date="2026-09-27T12:00:00Z">
+      <w:del w:id="1685" w:author="Language Editor" w:date="2026-09-27T12:00:00Z">
         <w:r>
           <w:delText xml:space="preserve">. Amendment descriptions state an intended purpose. Image provenance, acquisition dates, coordinates and correspondence to the proposed analysis units require verification.</w:delText>
         </w:r>
       </w:del>
-      <w:ins w:id="1702" w:author="Language Editor" w:date="2026-09-27T12:00:00Z">
+      <w:ins w:id="1686" w:author="Language Editor" w:date="2026-09-27T12:00:00Z">
         <w:r>
           <w:t xml:space="preserve">; amendment descriptions state the intended purpose of each practice.</w:t>
         </w:r>
@@ -8454,12 +8385,12 @@
       <w:r>
         <w:t xml:space="preserve">The Quzhou case </w:t>
       </w:r>
-      <w:del w:id="1703" w:author="Language Editor" w:date="2026-09-27T12:00:00Z">
+      <w:del w:id="1687" w:author="Language Editor" w:date="2026-09-27T12:00:00Z">
         <w:r>
           <w:delText xml:space="preserve">concerns</w:delText>
         </w:r>
       </w:del>
-      <w:ins w:id="1704" w:author="Language Editor" w:date="2026-09-27T12:00:00Z">
+      <w:ins w:id="1688" w:author="Language Editor" w:date="2026-09-27T12:00:00Z">
         <w:r>
           <w:t xml:space="preserve">examines</w:t>
         </w:r>
@@ -8467,7 +8398,7 @@
       <w:r>
         <w:t xml:space="preserve"> how resource, infrastructure and management conditions relate to production performance and its persistence. D1–D3 describe background conditions and practices, D4 describes crop growth, D5 describes realized yield and </w:t>
       </w:r>
-      <w:ins w:id="1705" w:author="Language Editor" w:date="2026-09-27T12:00:00Z">
+      <w:ins w:id="1689" w:author="Language Editor" w:date="2026-09-27T12:00:00Z">
         <w:r>
           <w:t xml:space="preserve">its </w:t>
         </w:r>
@@ -8475,12 +8406,12 @@
       <w:r>
         <w:t xml:space="preserve">variability, and D6 integrates this evidence </w:t>
       </w:r>
-      <w:del w:id="1706" w:author="Language Editor" w:date="2026-09-27T12:00:00Z">
+      <w:del w:id="1690" w:author="Language Editor" w:date="2026-09-27T12:00:00Z">
         <w:r>
           <w:delText xml:space="preserve">under</w:delText>
         </w:r>
       </w:del>
-      <w:ins w:id="1707" w:author="Language Editor" w:date="2026-09-27T12:00:00Z">
+      <w:ins w:id="1691" w:author="Language Editor" w:date="2026-09-27T12:00:00Z">
         <w:r>
           <w:t xml:space="preserve">for</w:t>
         </w:r>
@@ -8488,12 +8419,12 @@
       <w:r>
         <w:t xml:space="preserve"> a specified cropping system and period. The winter wheat–summer maize </w:t>
       </w:r>
-      <w:del w:id="1708" w:author="Language Editor" w:date="2026-09-27T12:00:00Z">
+      <w:del w:id="1692" w:author="Language Editor" w:date="2026-09-27T12:00:00Z">
         <w:r>
           <w:delText xml:space="preserve">context in the case descriptions must be</w:delText>
         </w:r>
       </w:del>
-      <w:ins w:id="1709" w:author="Language Editor" w:date="2026-09-27T12:00:00Z">
+      <w:ins w:id="1693" w:author="Language Editor" w:date="2026-09-27T12:00:00Z">
         <w:r>
           <w:t xml:space="preserve">rotation is</w:t>
         </w:r>
@@ -8501,12 +8432,12 @@
       <w:r>
         <w:t xml:space="preserve"> confirmed for each analysis object</w:t>
       </w:r>
-      <w:del w:id="1710" w:author="Language Editor" w:date="2026-09-27T12:00:00Z">
+      <w:del w:id="1694" w:author="Language Editor" w:date="2026-09-27T12:00:00Z">
         <w:r>
           <w:delText xml:space="preserve">. Water</w:delText>
         </w:r>
       </w:del>
-      <w:ins w:id="1711" w:author="Language Editor" w:date="2026-09-27T12:00:00Z">
+      <w:ins w:id="1695" w:author="Language Editor" w:date="2026-09-27T12:00:00Z">
         <w:r>
           <w:t xml:space="preserve">, and water</w:t>
         </w:r>
@@ -8514,12 +8445,12 @@
       <w:r>
         <w:t xml:space="preserve"> and fertilizer management </w:t>
       </w:r>
-      <w:del w:id="1712" w:author="Language Editor" w:date="2026-09-27T12:00:00Z">
+      <w:del w:id="1696" w:author="Language Editor" w:date="2026-09-27T12:00:00Z">
         <w:r>
           <w:delText xml:space="preserve">provide</w:delText>
         </w:r>
       </w:del>
-      <w:ins w:id="1713" w:author="Language Editor" w:date="2026-09-27T12:00:00Z">
+      <w:ins w:id="1697" w:author="Language Editor" w:date="2026-09-27T12:00:00Z">
         <w:r>
           <w:t xml:space="preserve">are treated as</w:t>
         </w:r>
@@ -8536,12 +8467,12 @@
       <w:r>
         <w:t xml:space="preserve">Illustrative assessment. L1 organizes field boundaries, cropping systems, facilities, dated management records, crop condition and realized yields. L2 examines their associations </w:t>
       </w:r>
-      <w:del w:id="1714" w:author="Language Editor" w:date="2026-09-27T12:00:00Z">
+      <w:del w:id="1698" w:author="Language Editor" w:date="2026-09-27T12:00:00Z">
         <w:r>
           <w:delText xml:space="preserve">using</w:delText>
         </w:r>
       </w:del>
-      <w:ins w:id="1715" w:author="Language Editor" w:date="2026-09-27T12:00:00Z">
+      <w:ins w:id="1699" w:author="Language Editor" w:date="2026-09-27T12:00:00Z">
         <w:r>
           <w:t xml:space="preserve">across</w:t>
         </w:r>
@@ -8549,12 +8480,12 @@
       <w:r>
         <w:t xml:space="preserve"> comparable seasons and fields</w:t>
       </w:r>
-      <w:del w:id="1716" w:author="Language Editor" w:date="2026-09-27T12:00:00Z">
+      <w:del w:id="1700" w:author="Language Editor" w:date="2026-09-27T12:00:00Z">
         <w:r>
           <w:delText xml:space="preserve">; sustained capacity requires more than</w:delText>
         </w:r>
       </w:del>
-      <w:ins w:id="1717" w:author="Language Editor" w:date="2026-09-27T12:00:00Z">
+      <w:ins w:id="1701" w:author="Language Editor" w:date="2026-09-27T12:00:00Z">
         <w:r>
           <w:t xml:space="preserve">, since sustained capacity cannot be inferred from</w:t>
         </w:r>
@@ -8562,12 +8493,12 @@
       <w:r>
         <w:t xml:space="preserve"> a single high-yield observation. L3 compares feasible options with a specified reference under water, nutrient and other resource constraints. Without matched records or validated response estimates, the </w:t>
       </w:r>
-      <w:del w:id="1718" w:author="Language Editor" w:date="2026-09-27T12:00:00Z">
+      <w:del w:id="1702" w:author="Language Editor" w:date="2026-09-27T12:00:00Z">
         <w:r>
           <w:delText xml:space="preserve">case can identify</w:delText>
         </w:r>
       </w:del>
-      <w:ins w:id="1719" w:author="Language Editor" w:date="2026-09-27T12:00:00Z">
+      <w:ins w:id="1703" w:author="Language Editor" w:date="2026-09-27T12:00:00Z">
         <w:r>
           <w:t xml:space="preserve">framework identifies the</w:t>
         </w:r>
@@ -8575,12 +8506,12 @@
       <w:r>
         <w:t xml:space="preserve"> relevant questions and </w:t>
       </w:r>
-      <w:del w:id="1720" w:author="Language Editor" w:date="2026-09-27T12:00:00Z">
+      <w:del w:id="1704" w:author="Language Editor" w:date="2026-09-27T12:00:00Z">
         <w:r>
           <w:delText xml:space="preserve">missing evidence but cannot quantify a management benefit</w:delText>
         </w:r>
       </w:del>
-      <w:ins w:id="1721" w:author="Language Editor" w:date="2026-09-27T12:00:00Z">
+      <w:ins w:id="1705" w:author="Language Editor" w:date="2026-09-27T12:00:00Z">
         <w:r>
           <w:t xml:space="preserve">the missing evidence and refrains from quantifying management benefits</w:t>
         </w:r>
@@ -8604,12 +8535,12 @@
       <w:r>
         <w:t xml:space="preserve">Fig. 6 </w:t>
       </w:r>
-      <w:del w:id="1722" w:author="Language Editor" w:date="2026-09-27T12:00:00Z">
+      <w:del w:id="1706" w:author="Language Editor" w:date="2026-09-27T12:00:00Z">
         <w:r>
           <w:delText xml:space="preserve">Quzhou assessment</w:delText>
         </w:r>
       </w:del>
-      <w:ins w:id="1723" w:author="Language Editor" w:date="2026-09-27T12:00:00Z">
+      <w:ins w:id="1707" w:author="Language Editor" w:date="2026-09-27T12:00:00Z">
         <w:r>
           <w:t xml:space="preserve">Assessment of production capacity in Quzhou</w:t>
         </w:r>
@@ -8617,12 +8548,12 @@
       <w:r>
         <w:t xml:space="preserve"> across three reasoning levels. State description, cross-dimensional interpretation and conditional scenarios require progressively different evidence. The diagram </w:t>
       </w:r>
-      <w:del w:id="1724" w:author="Language Editor" w:date="2026-09-27T12:00:00Z">
+      <w:del w:id="1708" w:author="Language Editor" w:date="2026-09-27T12:00:00Z">
         <w:r>
           <w:delText xml:space="preserve">specifies</w:delText>
         </w:r>
       </w:del>
-      <w:ins w:id="1725" w:author="Language Editor" w:date="2026-09-27T12:00:00Z">
+      <w:ins w:id="1709" w:author="Language Editor" w:date="2026-09-27T12:00:00Z">
         <w:r>
           <w:t xml:space="preserve">shows</w:t>
         </w:r>
@@ -8630,12 +8561,12 @@
       <w:r>
         <w:t xml:space="preserve"> how production-capacity questions </w:t>
       </w:r>
-      <w:del w:id="1726" w:author="Language Editor" w:date="2026-09-27T12:00:00Z">
+      <w:del w:id="1710" w:author="Language Editor" w:date="2026-09-27T12:00:00Z">
         <w:r>
           <w:delText xml:space="preserve">would be assessed, rather than reporting validated yields or intervention effects</w:delText>
         </w:r>
       </w:del>
-      <w:ins w:id="1727" w:author="Language Editor" w:date="2026-09-27T12:00:00Z">
+      <w:ins w:id="1711" w:author="Language Editor" w:date="2026-09-27T12:00:00Z">
         <w:r>
           <w:t xml:space="preserve">are assessed within the framework</w:t>
         </w:r>
@@ -8652,12 +8583,12 @@
       <w:r>
         <w:t xml:space="preserve">3.5 </w:t>
       </w:r>
-      <w:del w:id="1728" w:author="Language Editor" w:date="2026-09-27T12:00:00Z">
+      <w:del w:id="1712" w:author="Language Editor" w:date="2026-09-27T12:00:00Z">
         <w:r>
           <w:delText xml:space="preserve">Scope of the case illustrations</w:delText>
         </w:r>
       </w:del>
-      <w:ins w:id="1729" w:author="Language Editor" w:date="2026-09-27T12:00:00Z">
+      <w:ins w:id="1713" w:author="Language Editor" w:date="2026-09-27T12:00:00Z">
         <w:r>
           <w:t xml:space="preserve">Transferability across contrasting settings</w:t>
         </w:r>
@@ -8671,12 +8602,12 @@
       <w:r>
         <w:t xml:space="preserve">The </w:t>
       </w:r>
-      <w:del w:id="1730" w:author="Language Editor" w:date="2026-09-27T12:00:00Z">
+      <w:del w:id="1714" w:author="Language Editor" w:date="2026-09-27T12:00:00Z">
         <w:r>
           <w:delText xml:space="preserve">cases demonstrate the organization of contrasting agricultural questions under a common spatial and assessment specification. Neither is accompanied by a complete georeferenced dataset, reviewed annotation corpus, implemented system and independent reference outputs. They therefore support a methodological illustration rather than validation of predictive accuracy, causal attribution, management effectiveness or transfer between regions. The missing source links, sampling metadata and evaluation evidence define the next requirements for empirical work</w:delText>
         </w:r>
       </w:del>
-      <w:ins w:id="1731" w:author="Language Editor" w:date="2026-09-27T12:00:00Z">
+      <w:ins w:id="1715" w:author="Language Editor" w:date="2026-09-27T12:00:00Z">
         <w:r>
           <w:t xml:space="preserve">two cases differ in their dominant constraint, cropping system and assessment objective, yet both fit the same spatial and assessment specification. In Qiyang, the question centers on D1 and D3 and on the distinction between current acidity and acidification. In Quzhou, it centers on D5 and D6 and on the distinction between realized yield and sustained capacity. In both cases, the framework makes explicit which georeferenced observations, sampling metadata and reference outputs an assessment needs, and these requirements define the data program for training and evaluating CroplandGPT</w:t>
         </w:r>
@@ -8711,12 +8642,12 @@
       <w:r>
         <w:t xml:space="preserve">CroplandGPT connects spatial representation, interpretable task outputs and language-based assessment within </w:t>
       </w:r>
-      <w:del w:id="1732" w:author="Language Editor" w:date="2026-09-27T12:00:00Z">
+      <w:del w:id="1716" w:author="Language Editor" w:date="2026-09-27T12:00:00Z">
         <w:r>
           <w:delText xml:space="preserve">one proposed workflow. Its architecture shares the</w:delText>
         </w:r>
       </w:del>
-      <w:ins w:id="1733" w:author="Language Editor" w:date="2026-09-27T12:00:00Z">
+      <w:ins w:id="1717" w:author="Language Editor" w:date="2026-09-27T12:00:00Z">
         <w:r>
           <w:t xml:space="preserve">a single workflow. Its mapping and language branches share one</w:t>
         </w:r>
@@ -8724,12 +8655,12 @@
       <w:r>
         <w:t xml:space="preserve"> geospatial encoding front end</w:t>
       </w:r>
-      <w:del w:id="1734" w:author="Language Editor" w:date="2026-09-27T12:00:00Z">
+      <w:del w:id="1718" w:author="Language Editor" w:date="2026-09-27T12:00:00Z">
         <w:r>
           <w:delText xml:space="preserve"> across mapping and language branches, rather than duplicating</w:delText>
         </w:r>
       </w:del>
-      <w:ins w:id="1735" w:author="Language Editor" w:date="2026-09-27T12:00:00Z">
+      <w:ins w:id="1719" w:author="Language Editor" w:date="2026-09-27T12:00:00Z">
         <w:r>
           <w:t xml:space="preserve">, which avoids duplicated</w:t>
         </w:r>
@@ -8737,12 +8668,12 @@
       <w:r>
         <w:t xml:space="preserve"> image encoding. The continuous path preserves spatial context</w:t>
       </w:r>
-      <w:del w:id="1736" w:author="Language Editor" w:date="2026-09-27T12:00:00Z">
+      <w:del w:id="1720" w:author="Language Editor" w:date="2026-09-27T12:00:00Z">
         <w:r>
           <w:delText xml:space="preserve">;</w:delText>
         </w:r>
       </w:del>
-      <w:ins w:id="1737" w:author="Language Editor" w:date="2026-09-27T12:00:00Z">
+      <w:ins w:id="1721" w:author="Language Editor" w:date="2026-09-27T12:00:00Z">
         <w:r>
           <w:t xml:space="preserve">, and</w:t>
         </w:r>
@@ -8750,12 +8681,12 @@
       <w:r>
         <w:t xml:space="preserve"> the explicit path retains the values and sources needed </w:t>
       </w:r>
-      <w:del w:id="1738" w:author="Language Editor" w:date="2026-09-27T12:00:00Z">
+      <w:del w:id="1722" w:author="Language Editor" w:date="2026-09-27T12:00:00Z">
         <w:r>
           <w:delText xml:space="preserve">for checking</w:delText>
         </w:r>
       </w:del>
-      <w:ins w:id="1739" w:author="Language Editor" w:date="2026-09-27T12:00:00Z">
+      <w:ins w:id="1723" w:author="Language Editor" w:date="2026-09-27T12:00:00Z">
         <w:r>
           <w:t xml:space="preserve">to check</w:t>
         </w:r>
@@ -8763,12 +8694,12 @@
       <w:r>
         <w:t xml:space="preserve"> statements. Query-based </w:t>
       </w:r>
-      <w:del w:id="1740" w:author="Language Editor" w:date="2026-09-27T12:00:00Z">
+      <w:del w:id="1724" w:author="Language Editor" w:date="2026-09-27T12:00:00Z">
         <w:r>
           <w:delText xml:space="preserve">visual-language bridging has established precedents</w:delText>
         </w:r>
       </w:del>
-      <w:ins w:id="1741" w:author="Language Editor" w:date="2026-09-27T12:00:00Z">
+      <w:ins w:id="1725" w:author="Language Editor" w:date="2026-09-27T12:00:00Z">
         <w:r>
           <w:t xml:space="preserve">vision-language bridging is well established</w:t>
         </w:r>
@@ -8794,7 +8725,7 @@
       <w:r>
         <w:t xml:space="preserve">, and existing agricultural agents and embedding-language systems </w:t>
       </w:r>
-      <w:del w:id="1742" w:author="Language Editor" w:date="2026-09-27T12:00:00Z">
+      <w:del w:id="1726" w:author="Language Editor" w:date="2026-09-27T12:00:00Z">
         <w:r>
           <w:delText xml:space="preserve">already </w:delText>
         </w:r>
@@ -8820,12 +8751,12 @@
       <w:r>
         <w:t xml:space="preserve">. </w:t>
       </w:r>
-      <w:del w:id="1743" w:author="Language Editor" w:date="2026-09-27T12:00:00Z">
+      <w:del w:id="1727" w:author="Language Editor" w:date="2026-09-27T12:00:00Z">
         <w:r>
           <w:delText xml:space="preserve">The proposed contribution is their organization</w:delText>
         </w:r>
       </w:del>
-      <w:ins w:id="1744" w:author="Language Editor" w:date="2026-09-27T12:00:00Z">
+      <w:ins w:id="1728" w:author="Language Editor" w:date="2026-09-27T12:00:00Z">
         <w:r>
           <w:t xml:space="preserve">CroplandGPT organizes these elements</w:t>
         </w:r>
@@ -8842,116 +8773,116 @@
       <w:r>
         <w:t xml:space="preserve">The </w:t>
       </w:r>
+      <w:del w:id="1729" w:author="Language Editor" w:date="2026-09-27T12:00:00Z">
+        <w:r>
+          <w:delText xml:space="preserve">expected benefits are testable. Shared features may improve consistency across</w:delText>
+        </w:r>
+      </w:del>
+      <w:ins w:id="1730" w:author="Language Editor" w:date="2026-09-27T12:00:00Z">
+        <w:r>
+          <w:t xml:space="preserve">framework leads to testable expectations. Shared features should improve consistency between</w:t>
+        </w:r>
+      </w:ins>
+      <w:r>
+        <w:t xml:space="preserve"> spatial and language outputs</w:t>
+      </w:r>
+      <w:del w:id="1731" w:author="Language Editor" w:date="2026-09-27T12:00:00Z">
+        <w:r>
+          <w:delText xml:space="preserve">;</w:delText>
+        </w:r>
+      </w:del>
+      <w:ins w:id="1732" w:author="Language Editor" w:date="2026-09-27T12:00:00Z">
+        <w:r>
+          <w:t xml:space="preserve">,</w:t>
+        </w:r>
+      </w:ins>
+      <w:r>
+        <w:t xml:space="preserve"> object and period links </w:t>
+      </w:r>
+      <w:del w:id="1733" w:author="Language Editor" w:date="2026-09-27T12:00:00Z">
+        <w:r>
+          <w:delText xml:space="preserve">may</w:delText>
+        </w:r>
+      </w:del>
+      <w:ins w:id="1734" w:author="Language Editor" w:date="2026-09-27T12:00:00Z">
+        <w:r>
+          <w:t xml:space="preserve">should</w:t>
+        </w:r>
+      </w:ins>
+      <w:r>
+        <w:t xml:space="preserve"> reduce evidence mismatch</w:t>
+      </w:r>
+      <w:del w:id="1735" w:author="Language Editor" w:date="2026-09-27T12:00:00Z">
+        <w:r>
+          <w:delText xml:space="preserve">;</w:delText>
+        </w:r>
+      </w:del>
+      <w:ins w:id="1736" w:author="Language Editor" w:date="2026-09-27T12:00:00Z">
+        <w:r>
+          <w:t xml:space="preserve">,</w:t>
+        </w:r>
+      </w:ins>
+      <w:r>
+        <w:t xml:space="preserve"> and explicit criteria </w:t>
+      </w:r>
+      <w:del w:id="1737" w:author="Language Editor" w:date="2026-09-27T12:00:00Z">
+        <w:r>
+          <w:delText xml:space="preserve">may improve</w:delText>
+        </w:r>
+      </w:del>
+      <w:ins w:id="1738" w:author="Language Editor" w:date="2026-09-27T12:00:00Z">
+        <w:r>
+          <w:t xml:space="preserve">should sharpen</w:t>
+        </w:r>
+      </w:ins>
+      <w:r>
+        <w:t xml:space="preserve"> the scope of agricultural judgments. </w:t>
+      </w:r>
+      <w:del w:id="1739" w:author="Language Editor" w:date="2026-09-27T12:00:00Z">
+        <w:r>
+          <w:delText xml:space="preserve">These effects cannot be inferred from</w:delText>
+        </w:r>
+      </w:del>
+      <w:ins w:id="1740" w:author="Language Editor" w:date="2026-09-27T12:00:00Z">
+        <w:r>
+          <w:t xml:space="preserve">Testing these expectations requires controlling for</w:t>
+        </w:r>
+      </w:ins>
+      <w:r>
+        <w:t xml:space="preserve"> model size, tokenization </w:t>
+      </w:r>
+      <w:del w:id="1741" w:author="Language Editor" w:date="2026-09-27T12:00:00Z">
+        <w:r>
+          <w:delText xml:space="preserve">or the</w:delText>
+        </w:r>
+      </w:del>
+      <w:ins w:id="1742" w:author="Language Editor" w:date="2026-09-27T12:00:00Z">
+        <w:r>
+          <w:t xml:space="preserve">and the mere</w:t>
+        </w:r>
+      </w:ins>
+      <w:r>
+        <w:t xml:space="preserve"> presence of an adapter. Comparisons </w:t>
+      </w:r>
+      <w:del w:id="1743" w:author="Language Editor" w:date="2026-09-27T12:00:00Z">
+        <w:r>
+          <w:delText xml:space="preserve">must establish whether the proposed mechanisms add value beyond</w:delText>
+        </w:r>
+      </w:del>
+      <w:ins w:id="1744" w:author="Language Editor" w:date="2026-09-27T12:00:00Z">
+        <w:r>
+          <w:t xml:space="preserve">with</w:t>
+        </w:r>
+      </w:ins>
+      <w:r>
+        <w:t xml:space="preserve"> task-specific predictors, structured retrieval and rule-based assessment </w:t>
+      </w:r>
       <w:del w:id="1745" w:author="Language Editor" w:date="2026-09-27T12:00:00Z">
         <w:r>
-          <w:delText xml:space="preserve">expected benefits are testable. Shared features may improve consistency across</w:delText>
+          <w:delText xml:space="preserve">using equivalent observations</w:delText>
         </w:r>
       </w:del>
       <w:ins w:id="1746" w:author="Language Editor" w:date="2026-09-27T12:00:00Z">
-        <w:r>
-          <w:t xml:space="preserve">framework leads to testable expectations. Shared features should improve consistency between</w:t>
-        </w:r>
-      </w:ins>
-      <w:r>
-        <w:t xml:space="preserve"> spatial and language outputs</w:t>
-      </w:r>
-      <w:del w:id="1747" w:author="Language Editor" w:date="2026-09-27T12:00:00Z">
-        <w:r>
-          <w:delText xml:space="preserve">;</w:delText>
-        </w:r>
-      </w:del>
-      <w:ins w:id="1748" w:author="Language Editor" w:date="2026-09-27T12:00:00Z">
-        <w:r>
-          <w:t xml:space="preserve">,</w:t>
-        </w:r>
-      </w:ins>
-      <w:r>
-        <w:t xml:space="preserve"> object and period links </w:t>
-      </w:r>
-      <w:del w:id="1749" w:author="Language Editor" w:date="2026-09-27T12:00:00Z">
-        <w:r>
-          <w:delText xml:space="preserve">may</w:delText>
-        </w:r>
-      </w:del>
-      <w:ins w:id="1750" w:author="Language Editor" w:date="2026-09-27T12:00:00Z">
-        <w:r>
-          <w:t xml:space="preserve">should</w:t>
-        </w:r>
-      </w:ins>
-      <w:r>
-        <w:t xml:space="preserve"> reduce evidence mismatch</w:t>
-      </w:r>
-      <w:del w:id="1751" w:author="Language Editor" w:date="2026-09-27T12:00:00Z">
-        <w:r>
-          <w:delText xml:space="preserve">;</w:delText>
-        </w:r>
-      </w:del>
-      <w:ins w:id="1752" w:author="Language Editor" w:date="2026-09-27T12:00:00Z">
-        <w:r>
-          <w:t xml:space="preserve">,</w:t>
-        </w:r>
-      </w:ins>
-      <w:r>
-        <w:t xml:space="preserve"> and explicit criteria </w:t>
-      </w:r>
-      <w:del w:id="1753" w:author="Language Editor" w:date="2026-09-27T12:00:00Z">
-        <w:r>
-          <w:delText xml:space="preserve">may improve</w:delText>
-        </w:r>
-      </w:del>
-      <w:ins w:id="1754" w:author="Language Editor" w:date="2026-09-27T12:00:00Z">
-        <w:r>
-          <w:t xml:space="preserve">should sharpen</w:t>
-        </w:r>
-      </w:ins>
-      <w:r>
-        <w:t xml:space="preserve"> the scope of agricultural judgments. </w:t>
-      </w:r>
-      <w:del w:id="1755" w:author="Language Editor" w:date="2026-09-27T12:00:00Z">
-        <w:r>
-          <w:delText xml:space="preserve">These effects cannot be inferred from</w:delText>
-        </w:r>
-      </w:del>
-      <w:ins w:id="1756" w:author="Language Editor" w:date="2026-09-27T12:00:00Z">
-        <w:r>
-          <w:t xml:space="preserve">Testing these expectations requires controlling for</w:t>
-        </w:r>
-      </w:ins>
-      <w:r>
-        <w:t xml:space="preserve"> model size, tokenization </w:t>
-      </w:r>
-      <w:del w:id="1757" w:author="Language Editor" w:date="2026-09-27T12:00:00Z">
-        <w:r>
-          <w:delText xml:space="preserve">or the</w:delText>
-        </w:r>
-      </w:del>
-      <w:ins w:id="1758" w:author="Language Editor" w:date="2026-09-27T12:00:00Z">
-        <w:r>
-          <w:t xml:space="preserve">and the mere</w:t>
-        </w:r>
-      </w:ins>
-      <w:r>
-        <w:t xml:space="preserve"> presence of an adapter. Comparisons </w:t>
-      </w:r>
-      <w:del w:id="1759" w:author="Language Editor" w:date="2026-09-27T12:00:00Z">
-        <w:r>
-          <w:delText xml:space="preserve">must establish whether the proposed mechanisms add value beyond</w:delText>
-        </w:r>
-      </w:del>
-      <w:ins w:id="1760" w:author="Language Editor" w:date="2026-09-27T12:00:00Z">
-        <w:r>
-          <w:t xml:space="preserve">with</w:t>
-        </w:r>
-      </w:ins>
-      <w:r>
-        <w:t xml:space="preserve"> task-specific predictors, structured retrieval and rule-based assessment </w:t>
-      </w:r>
-      <w:del w:id="1761" w:author="Language Editor" w:date="2026-09-27T12:00:00Z">
-        <w:r>
-          <w:delText xml:space="preserve">using equivalent observations</w:delText>
-        </w:r>
-      </w:del>
-      <w:ins w:id="1762" w:author="Language Editor" w:date="2026-09-27T12:00:00Z">
         <w:r>
           <w:t xml:space="preserve">on the same observations will quantify the added value of each mechanism</w:t>
         </w:r>
@@ -8977,12 +8908,12 @@
       <w:r>
         <w:t xml:space="preserve">D1–D6 define what is assessed, </w:t>
       </w:r>
-      <w:del w:id="1763" w:author="Language Editor" w:date="2026-09-27T12:00:00Z">
+      <w:del w:id="1747" w:author="Language Editor" w:date="2026-09-27T12:00:00Z">
         <w:r>
           <w:delText xml:space="preserve">while</w:delText>
         </w:r>
       </w:del>
-      <w:ins w:id="1764" w:author="Language Editor" w:date="2026-09-27T12:00:00Z">
+      <w:ins w:id="1748" w:author="Language Editor" w:date="2026-09-27T12:00:00Z">
         <w:r>
           <w:t xml:space="preserve">and</w:t>
         </w:r>
@@ -8990,12 +8921,12 @@
       <w:r>
         <w:t xml:space="preserve"> L1–L3 define the scope and evidence requirements of </w:t>
       </w:r>
-      <w:del w:id="1765" w:author="Language Editor" w:date="2026-09-27T12:00:00Z">
+      <w:del w:id="1749" w:author="Language Editor" w:date="2026-09-27T12:00:00Z">
         <w:r>
           <w:delText xml:space="preserve">the judgment. This distinction</w:delText>
         </w:r>
       </w:del>
-      <w:ins w:id="1766" w:author="Language Editor" w:date="2026-09-27T12:00:00Z">
+      <w:ins w:id="1750" w:author="Language Editor" w:date="2026-09-27T12:00:00Z">
         <w:r>
           <w:t xml:space="preserve">each judgment. Separating the two</w:t>
         </w:r>
@@ -9003,12 +8934,12 @@
       <w:r>
         <w:t xml:space="preserve"> supports consistent annotation without </w:t>
       </w:r>
-      <w:del w:id="1767" w:author="Language Editor" w:date="2026-09-27T12:00:00Z">
+      <w:del w:id="1751" w:author="Language Editor" w:date="2026-09-27T12:00:00Z">
         <w:r>
           <w:delText xml:space="preserve">requiring</w:delText>
         </w:r>
       </w:del>
-      <w:ins w:id="1768" w:author="Language Editor" w:date="2026-09-27T12:00:00Z">
+      <w:ins w:id="1752" w:author="Language Editor" w:date="2026-09-27T12:00:00Z">
         <w:r>
           <w:t xml:space="preserve">imposing</w:t>
         </w:r>
@@ -9016,12 +8947,12 @@
       <w:r>
         <w:t xml:space="preserve"> a fixed reasoning order. Parent material, cropping and management </w:t>
       </w:r>
-      <w:del w:id="1769" w:author="Language Editor" w:date="2026-09-27T12:00:00Z">
+      <w:del w:id="1753" w:author="Language Editor" w:date="2026-09-27T12:00:00Z">
         <w:r>
           <w:delText xml:space="preserve">provide</w:delText>
         </w:r>
       </w:del>
-      <w:ins w:id="1770" w:author="Language Editor" w:date="2026-09-27T12:00:00Z">
+      <w:ins w:id="1754" w:author="Language Editor" w:date="2026-09-27T12:00:00Z">
         <w:r>
           <w:t xml:space="preserve">supply</w:t>
         </w:r>
@@ -9029,12 +8960,12 @@
       <w:r>
         <w:t xml:space="preserve"> explanatory context across the dimensions. The structure </w:t>
       </w:r>
-      <w:del w:id="1771" w:author="Language Editor" w:date="2026-09-27T12:00:00Z">
+      <w:del w:id="1755" w:author="Language Editor" w:date="2026-09-27T12:00:00Z">
         <w:r>
           <w:delText xml:space="preserve">should help an assessor</w:delText>
         </w:r>
       </w:del>
-      <w:ins w:id="1772" w:author="Language Editor" w:date="2026-09-27T12:00:00Z">
+      <w:ins w:id="1756" w:author="Language Editor" w:date="2026-09-27T12:00:00Z">
         <w:r>
           <w:t xml:space="preserve">helps assessors</w:t>
         </w:r>
@@ -9042,12 +8973,12 @@
       <w:r>
         <w:t xml:space="preserve"> distinguish a reported condition from a plausible explanation </w:t>
       </w:r>
-      <w:del w:id="1773" w:author="Language Editor" w:date="2026-09-27T12:00:00Z">
+      <w:del w:id="1757" w:author="Language Editor" w:date="2026-09-27T12:00:00Z">
         <w:r>
           <w:delText xml:space="preserve">or</w:delText>
         </w:r>
       </w:del>
-      <w:ins w:id="1774" w:author="Language Editor" w:date="2026-09-27T12:00:00Z">
+      <w:ins w:id="1758" w:author="Language Editor" w:date="2026-09-27T12:00:00Z">
         <w:r>
           <w:t xml:space="preserve">and from</w:t>
         </w:r>
@@ -9055,12 +8986,12 @@
       <w:r>
         <w:t xml:space="preserve"> a conditional option</w:t>
       </w:r>
-      <w:del w:id="1775" w:author="Language Editor" w:date="2026-09-27T12:00:00Z">
+      <w:del w:id="1759" w:author="Language Editor" w:date="2026-09-27T12:00:00Z">
         <w:r>
           <w:delText xml:space="preserve">. Its usefulness and reproducibility need to</w:delText>
         </w:r>
       </w:del>
-      <w:ins w:id="1776" w:author="Language Editor" w:date="2026-09-27T12:00:00Z">
+      <w:ins w:id="1760" w:author="Language Editor" w:date="2026-09-27T12:00:00Z">
         <w:r>
           <w:t xml:space="preserve">, and its usability and reproducibility can</w:t>
         </w:r>
@@ -9068,12 +8999,12 @@
       <w:r>
         <w:t xml:space="preserve"> be evaluated with annotators and </w:t>
       </w:r>
-      <w:del w:id="1777" w:author="Language Editor" w:date="2026-09-27T12:00:00Z">
+      <w:del w:id="1761" w:author="Language Editor" w:date="2026-09-27T12:00:00Z">
         <w:r>
           <w:delText xml:space="preserve">intended</w:delText>
         </w:r>
       </w:del>
-      <w:ins w:id="1778" w:author="Language Editor" w:date="2026-09-27T12:00:00Z">
+      <w:ins w:id="1762" w:author="Language Editor" w:date="2026-09-27T12:00:00Z">
         <w:r>
           <w:t xml:space="preserve">end</w:t>
         </w:r>
@@ -9090,12 +9021,12 @@
       <w:r>
         <w:t xml:space="preserve">Expert relationships </w:t>
       </w:r>
-      <w:del w:id="1779" w:author="Language Editor" w:date="2026-09-27T12:00:00Z">
+      <w:del w:id="1763" w:author="Language Editor" w:date="2026-09-27T12:00:00Z">
         <w:r>
           <w:delText xml:space="preserve">have limits across</w:delText>
         </w:r>
       </w:del>
-      <w:ins w:id="1780" w:author="Language Editor" w:date="2026-09-27T12:00:00Z">
+      <w:ins w:id="1764" w:author="Language Editor" w:date="2026-09-27T12:00:00Z">
         <w:r>
           <w:t xml:space="preserve">hold only within certain</w:t>
         </w:r>
@@ -9103,12 +9034,12 @@
       <w:r>
         <w:t xml:space="preserve"> crops, soils and management regimes. Annotation protocols should </w:t>
       </w:r>
-      <w:del w:id="1781" w:author="Language Editor" w:date="2026-09-27T12:00:00Z">
+      <w:del w:id="1765" w:author="Language Editor" w:date="2026-09-27T12:00:00Z">
         <w:r>
           <w:delText xml:space="preserve">record relevant</w:delText>
         </w:r>
       </w:del>
-      <w:ins w:id="1782" w:author="Language Editor" w:date="2026-09-27T12:00:00Z">
+      <w:ins w:id="1766" w:author="Language Editor" w:date="2026-09-27T12:00:00Z">
         <w:r>
           <w:t xml:space="preserve">therefore record</w:t>
         </w:r>
@@ -9116,12 +9047,12 @@
       <w:r>
         <w:t xml:space="preserve"> expertise, source material, applicability, alternatives and review decisions. Independent annotation and adjudication </w:t>
       </w:r>
-      <w:del w:id="1783" w:author="Language Editor" w:date="2026-09-27T12:00:00Z">
+      <w:del w:id="1767" w:author="Language Editor" w:date="2026-09-27T12:00:00Z">
         <w:r>
           <w:delText xml:space="preserve">can reveal disagreement, but agreement</w:delText>
         </w:r>
       </w:del>
-      <w:ins w:id="1784" w:author="Language Editor" w:date="2026-09-27T12:00:00Z">
+      <w:ins w:id="1768" w:author="Language Editor" w:date="2026-09-27T12:00:00Z">
         <w:r>
           <w:t xml:space="preserve">expose disagreement, although agreement alone</w:t>
         </w:r>
@@ -9129,12 +9060,12 @@
       <w:r>
         <w:t xml:space="preserve"> does not establish causal validity. </w:t>
       </w:r>
-      <w:del w:id="1785" w:author="Language Editor" w:date="2026-09-27T12:00:00Z">
+      <w:del w:id="1769" w:author="Language Editor" w:date="2026-09-27T12:00:00Z">
         <w:r>
           <w:delText xml:space="preserve">Agricultural decision-support research also emphasizes</w:delText>
         </w:r>
       </w:del>
-      <w:ins w:id="1786" w:author="Language Editor" w:date="2026-09-27T12:00:00Z">
+      <w:ins w:id="1770" w:author="Language Editor" w:date="2026-09-27T12:00:00Z">
         <w:r>
           <w:t xml:space="preserve">Research on agricultural decision support also stresses</w:t>
         </w:r>
@@ -9142,7 +9073,7 @@
       <w:r>
         <w:t xml:space="preserve"> fit with users and</w:t>
       </w:r>
-      <w:ins w:id="1787" w:author="Language Editor" w:date="2026-09-27T12:00:00Z">
+      <w:ins w:id="1771" w:author="Language Editor" w:date="2026-09-27T12:00:00Z">
         <w:r>
           <w:t xml:space="preserve"> their</w:t>
         </w:r>
@@ -9168,12 +9099,12 @@
       <w:r>
         <w:t xml:space="preserve">. Evaluation should </w:t>
       </w:r>
-      <w:del w:id="1788" w:author="Language Editor" w:date="2026-09-27T12:00:00Z">
+      <w:del w:id="1772" w:author="Language Editor" w:date="2026-09-27T12:00:00Z">
         <w:r>
           <w:delText xml:space="preserve">therefore consider</w:delText>
         </w:r>
       </w:del>
-      <w:ins w:id="1789" w:author="Language Editor" w:date="2026-09-27T12:00:00Z">
+      <w:ins w:id="1773" w:author="Language Editor" w:date="2026-09-27T12:00:00Z">
         <w:r>
           <w:t xml:space="preserve">thus ask</w:t>
         </w:r>
@@ -9181,12 +9112,12 @@
       <w:r>
         <w:t xml:space="preserve"> whether an output supports a real assessment question, </w:t>
       </w:r>
-      <w:del w:id="1790" w:author="Language Editor" w:date="2026-09-27T12:00:00Z">
+      <w:del w:id="1774" w:author="Language Editor" w:date="2026-09-27T12:00:00Z">
         <w:r>
           <w:delText xml:space="preserve">in addition to</w:delText>
         </w:r>
       </w:del>
-      <w:ins w:id="1791" w:author="Language Editor" w:date="2026-09-27T12:00:00Z">
+      <w:ins w:id="1775" w:author="Language Editor" w:date="2026-09-27T12:00:00Z">
         <w:r>
           <w:t xml:space="preserve">and not only</w:t>
         </w:r>
@@ -9212,12 +9143,12 @@
       <w:r>
         <w:t xml:space="preserve">Integrated assessment </w:t>
       </w:r>
-      <w:del w:id="1792" w:author="Language Editor" w:date="2026-09-27T12:00:00Z">
+      <w:del w:id="1776" w:author="Language Editor" w:date="2026-09-27T12:00:00Z">
         <w:r>
           <w:delText xml:space="preserve">requires</w:delText>
         </w:r>
       </w:del>
-      <w:ins w:id="1793" w:author="Language Editor" w:date="2026-09-27T12:00:00Z">
+      <w:ins w:id="1777" w:author="Language Editor" w:date="2026-09-27T12:00:00Z">
         <w:r>
           <w:t xml:space="preserve">depends on</w:t>
         </w:r>
@@ -9225,12 +9156,12 @@
       <w:r>
         <w:t xml:space="preserve"> defensible associations between image patches, fields, samples and infrastructure, </w:t>
       </w:r>
-      <w:del w:id="1794" w:author="Language Editor" w:date="2026-09-27T12:00:00Z">
+      <w:del w:id="1778" w:author="Language Editor" w:date="2026-09-27T12:00:00Z">
         <w:r>
           <w:delText xml:space="preserve">as well as</w:delText>
         </w:r>
       </w:del>
-      <w:ins w:id="1795" w:author="Language Editor" w:date="2026-09-27T12:00:00Z">
+      <w:ins w:id="1779" w:author="Language Editor" w:date="2026-09-27T12:00:00Z">
         <w:r>
           <w:t xml:space="preserve">and</w:t>
         </w:r>
@@ -9238,12 +9169,12 @@
       <w:r>
         <w:t xml:space="preserve"> between observations and management periods. It also </w:t>
       </w:r>
-      <w:del w:id="1796" w:author="Language Editor" w:date="2026-09-27T12:00:00Z">
+      <w:del w:id="1780" w:author="Language Editor" w:date="2026-09-27T12:00:00Z">
         <w:r>
           <w:delText xml:space="preserve">requires</w:delText>
         </w:r>
       </w:del>
-      <w:ins w:id="1797" w:author="Language Editor" w:date="2026-09-27T12:00:00Z">
+      <w:ins w:id="1781" w:author="Language Editor" w:date="2026-09-27T12:00:00Z">
         <w:r>
           <w:t xml:space="preserve">depends on clear</w:t>
         </w:r>
@@ -9251,12 +9182,12 @@
       <w:r>
         <w:t xml:space="preserve"> measurement definitions, including units, depth and spatial support. </w:t>
       </w:r>
-      <w:del w:id="1798" w:author="Language Editor" w:date="2026-09-27T12:00:00Z">
+      <w:del w:id="1782" w:author="Language Editor" w:date="2026-09-27T12:00:00Z">
         <w:r>
           <w:delText xml:space="preserve">These associations can be retained alongside learned features instead of being hidden in an embedding. Resampling does not improve the intrinsic information content of</w:delText>
         </w:r>
       </w:del>
-      <w:ins w:id="1799" w:author="Language Editor" w:date="2026-09-27T12:00:00Z">
+      <w:ins w:id="1783" w:author="Language Editor" w:date="2026-09-27T12:00:00Z">
         <w:r>
           <w:t xml:space="preserve">CroplandGPT keeps these associations alongside the learned features so that they remain inspectable. Resampling cannot add information to</w:t>
         </w:r>
@@ -9264,12 +9195,12 @@
       <w:r>
         <w:t xml:space="preserve"> a raster, and extending a point measurement </w:t>
       </w:r>
-      <w:del w:id="1800" w:author="Language Editor" w:date="2026-09-27T12:00:00Z">
+      <w:del w:id="1784" w:author="Language Editor" w:date="2026-09-27T12:00:00Z">
         <w:r>
           <w:delText xml:space="preserve">over</w:delText>
         </w:r>
       </w:del>
-      <w:ins w:id="1801" w:author="Language Editor" w:date="2026-09-27T12:00:00Z">
+      <w:ins w:id="1785" w:author="Language Editor" w:date="2026-09-27T12:00:00Z">
         <w:r>
           <w:t xml:space="preserve">to</w:t>
         </w:r>
@@ -9286,12 +9217,12 @@
       <w:r>
         <w:t xml:space="preserve">Uncertainty in a crop label, temporal association, soil observation or yield reference </w:t>
       </w:r>
-      <w:del w:id="1802" w:author="Language Editor" w:date="2026-09-27T12:00:00Z">
+      <w:del w:id="1786" w:author="Language Editor" w:date="2026-09-27T12:00:00Z">
         <w:r>
           <w:delText xml:space="preserve">can affect subsequent</w:delText>
         </w:r>
       </w:del>
-      <w:ins w:id="1803" w:author="Language Editor" w:date="2026-09-27T12:00:00Z">
+      <w:ins w:id="1787" w:author="Language Editor" w:date="2026-09-27T12:00:00Z">
         <w:r>
           <w:t xml:space="preserve">propagates into later</w:t>
         </w:r>
@@ -9299,12 +9230,12 @@
       <w:r>
         <w:t xml:space="preserve"> interpretation. An implementation should </w:t>
       </w:r>
-      <w:del w:id="1804" w:author="Language Editor" w:date="2026-09-27T12:00:00Z">
+      <w:del w:id="1788" w:author="Language Editor" w:date="2026-09-27T12:00:00Z">
         <w:r>
           <w:delText xml:space="preserve">retain the relevant quality information, identify</w:delText>
         </w:r>
       </w:del>
-      <w:ins w:id="1805" w:author="Language Editor" w:date="2026-09-27T12:00:00Z">
+      <w:ins w:id="1789" w:author="Language Editor" w:date="2026-09-27T12:00:00Z">
         <w:r>
           <w:t xml:space="preserve">therefore carry quality information forward, flag</w:t>
         </w:r>
@@ -9312,12 +9243,12 @@
       <w:r>
         <w:t xml:space="preserve"> unassessed dimensions and test how upstream errors affect generated statements. </w:t>
       </w:r>
-      <w:del w:id="1806" w:author="Language Editor" w:date="2026-09-27T12:00:00Z">
+      <w:del w:id="1790" w:author="Language Editor" w:date="2026-09-27T12:00:00Z">
         <w:r>
           <w:delText xml:space="preserve">The agreement of a map, table and explanation is useful for consistency checking</w:delText>
         </w:r>
       </w:del>
-      <w:ins w:id="1807" w:author="Language Editor" w:date="2026-09-27T12:00:00Z">
+      <w:ins w:id="1791" w:author="Language Editor" w:date="2026-09-27T12:00:00Z">
         <w:r>
           <w:t xml:space="preserve">Agreement among a map, a table and an explanation helps check consistency</w:t>
         </w:r>
@@ -9325,12 +9256,12 @@
       <w:r>
         <w:t xml:space="preserve">, but all three </w:t>
       </w:r>
-      <w:del w:id="1808" w:author="Language Editor" w:date="2026-09-27T12:00:00Z">
+      <w:del w:id="1792" w:author="Language Editor" w:date="2026-09-27T12:00:00Z">
         <w:r>
           <w:delText xml:space="preserve">can</w:delText>
         </w:r>
       </w:del>
-      <w:ins w:id="1809" w:author="Language Editor" w:date="2026-09-27T12:00:00Z">
+      <w:ins w:id="1793" w:author="Language Editor" w:date="2026-09-27T12:00:00Z">
         <w:r>
           <w:t xml:space="preserve">may</w:t>
         </w:r>
@@ -9338,12 +9269,12 @@
       <w:r>
         <w:t xml:space="preserve"> share the same </w:t>
       </w:r>
-      <w:del w:id="1810" w:author="Language Editor" w:date="2026-09-27T12:00:00Z">
+      <w:del w:id="1794" w:author="Language Editor" w:date="2026-09-27T12:00:00Z">
         <w:r>
           <w:delText xml:space="preserve">mistaken input. Independent evidence remains necessary for accuracy assessment</w:delText>
         </w:r>
       </w:del>
-      <w:ins w:id="1811" w:author="Language Editor" w:date="2026-09-27T12:00:00Z">
+      <w:ins w:id="1795" w:author="Language Editor" w:date="2026-09-27T12:00:00Z">
         <w:r>
           <w:t xml:space="preserve">faulty input, so accuracy assessment requires independent evidence</w:t>
         </w:r>
@@ -9360,12 +9291,12 @@
       <w:r>
         <w:t xml:space="preserve">4.4 Implementation </w:t>
       </w:r>
-      <w:del w:id="1812" w:author="Language Editor" w:date="2026-09-27T12:00:00Z">
+      <w:del w:id="1796" w:author="Language Editor" w:date="2026-09-27T12:00:00Z">
         <w:r>
           <w:delText xml:space="preserve">and evaluation requirements</w:delText>
         </w:r>
       </w:del>
-      <w:ins w:id="1813" w:author="Language Editor" w:date="2026-09-27T12:00:00Z">
+      <w:ins w:id="1797" w:author="Language Editor" w:date="2026-09-27T12:00:00Z">
         <w:r>
           <w:t xml:space="preserve">roadmap and evaluation protocol</w:t>
         </w:r>
@@ -9379,135 +9310,135 @@
       <w:r>
         <w:t xml:space="preserve">Implementation </w:t>
       </w:r>
-      <w:del w:id="1814" w:author="Language Editor" w:date="2026-09-27T12:00:00Z">
+      <w:del w:id="1798" w:author="Language Editor" w:date="2026-09-27T12:00:00Z">
         <w:r>
           <w:delText xml:space="preserve">should begin with explicit</w:delText>
         </w:r>
       </w:del>
+      <w:ins w:id="1799" w:author="Language Editor" w:date="2026-09-27T12:00:00Z">
+        <w:r>
+          <w:t xml:space="preserve">begins by fixing</w:t>
+        </w:r>
+      </w:ins>
+      <w:r>
+        <w:t xml:space="preserve"> input support, token budgets, backbones, prediction targets and adaptation objectives. The </w:t>
+      </w:r>
+      <w:del w:id="1800" w:author="Language Editor" w:date="2026-09-27T12:00:00Z">
+        <w:r>
+          <w:delText xml:space="preserve">proposed </w:delText>
+        </w:r>
+      </w:del>
+      <w:r>
+        <w:t xml:space="preserve">query-resampling interface in Section 2.7 </w:t>
+      </w:r>
+      <w:del w:id="1801" w:author="Language Editor" w:date="2026-09-27T12:00:00Z">
+        <w:r>
+          <w:delText xml:space="preserve">fixes</w:delText>
+        </w:r>
+      </w:del>
+      <w:ins w:id="1802" w:author="Language Editor" w:date="2026-09-27T12:00:00Z">
+        <w:r>
+          <w:t xml:space="preserve">defines</w:t>
+        </w:r>
+      </w:ins>
+      <w:r>
+        <w:t xml:space="preserve"> the route from spatial features to language input, </w:t>
+      </w:r>
+      <w:del w:id="1803" w:author="Language Editor" w:date="2026-09-27T12:00:00Z">
+        <w:r>
+          <w:delText xml:space="preserve">but not</w:delText>
+        </w:r>
+      </w:del>
+      <w:ins w:id="1804" w:author="Language Editor" w:date="2026-09-27T12:00:00Z">
+        <w:r>
+          <w:t xml:space="preserve">while</w:t>
+        </w:r>
+      </w:ins>
+      <w:r>
+        <w:t xml:space="preserve"> the final widths, number of queries </w:t>
+      </w:r>
+      <w:del w:id="1805" w:author="Language Editor" w:date="2026-09-27T12:00:00Z">
+        <w:r>
+          <w:delText xml:space="preserve">or training schedule</w:delText>
+        </w:r>
+      </w:del>
+      <w:ins w:id="1806" w:author="Language Editor" w:date="2026-09-27T12:00:00Z">
+        <w:r>
+          <w:t xml:space="preserve">and training schedule are set for each dataset</w:t>
+        </w:r>
+      </w:ins>
+      <w:r>
+        <w:t xml:space="preserve">. A practical sequence </w:t>
+      </w:r>
+      <w:del w:id="1807" w:author="Language Editor" w:date="2026-09-27T12:00:00Z">
+        <w:r>
+          <w:delText xml:space="preserve">would</w:delText>
+        </w:r>
+      </w:del>
+      <w:ins w:id="1808" w:author="Language Editor" w:date="2026-09-27T12:00:00Z">
+        <w:r>
+          <w:t xml:space="preserve">is to</w:t>
+        </w:r>
+      </w:ins>
+      <w:r>
+        <w:t xml:space="preserve"> establish data associations and structured evidence reporting</w:t>
+      </w:r>
+      <w:ins w:id="1809" w:author="Language Editor" w:date="2026-09-27T12:00:00Z">
+        <w:r>
+          <w:t xml:space="preserve"> first</w:t>
+        </w:r>
+      </w:ins>
+      <w:r>
+        <w:t xml:space="preserve">, then train the fusion </w:t>
+      </w:r>
+      <w:ins w:id="1810" w:author="Language Editor" w:date="2026-09-27T12:00:00Z">
+        <w:r>
+          <w:t xml:space="preserve">module </w:t>
+        </w:r>
+      </w:ins>
+      <w:r>
+        <w:t xml:space="preserve">and language adapter </w:t>
+      </w:r>
+      <w:del w:id="1811" w:author="Language Editor" w:date="2026-09-27T12:00:00Z">
+        <w:r>
+          <w:delText xml:space="preserve">with</w:delText>
+        </w:r>
+      </w:del>
+      <w:ins w:id="1812" w:author="Language Editor" w:date="2026-09-27T12:00:00Z">
+        <w:r>
+          <w:t xml:space="preserve">on</w:t>
+        </w:r>
+      </w:ins>
+      <w:r>
+        <w:t xml:space="preserve"> paired spatial observations and reviewed text, and </w:t>
+      </w:r>
+      <w:del w:id="1813" w:author="Language Editor" w:date="2026-09-27T12:00:00Z">
+        <w:r>
+          <w:delText xml:space="preserve">subsequently evaluate any language-model adaptation</w:delText>
+        </w:r>
+      </w:del>
+      <w:ins w:id="1814" w:author="Language Editor" w:date="2026-09-27T12:00:00Z">
+        <w:r>
+          <w:t xml:space="preserve">finally evaluate further adaptation of the language model</w:t>
+        </w:r>
+      </w:ins>
+      <w:r>
+        <w:t xml:space="preserve">. Candidate losses include supervised mapping or regression</w:t>
+      </w:r>
       <w:ins w:id="1815" w:author="Language Editor" w:date="2026-09-27T12:00:00Z">
         <w:r>
-          <w:t xml:space="preserve">begins by fixing</w:t>
-        </w:r>
-      </w:ins>
-      <w:r>
-        <w:t xml:space="preserve"> input support, token budgets, backbones, prediction targets and adaptation objectives. The </w:t>
+          <w:t xml:space="preserve"> losses</w:t>
+        </w:r>
+      </w:ins>
+      <w:r>
+        <w:t xml:space="preserve"> and evidence-grounded text generation, with masks for unavailable targets</w:t>
       </w:r>
       <w:del w:id="1816" w:author="Language Editor" w:date="2026-09-27T12:00:00Z">
         <w:r>
-          <w:delText xml:space="preserve">proposed </w:delText>
-        </w:r>
-      </w:del>
-      <w:r>
-        <w:t xml:space="preserve">query-resampling interface in Section 2.7 </w:t>
-      </w:r>
-      <w:del w:id="1817" w:author="Language Editor" w:date="2026-09-27T12:00:00Z">
-        <w:r>
-          <w:delText xml:space="preserve">fixes</w:delText>
-        </w:r>
-      </w:del>
-      <w:ins w:id="1818" w:author="Language Editor" w:date="2026-09-27T12:00:00Z">
-        <w:r>
-          <w:t xml:space="preserve">defines</w:t>
-        </w:r>
-      </w:ins>
-      <w:r>
-        <w:t xml:space="preserve"> the route from spatial features to language input, </w:t>
-      </w:r>
-      <w:del w:id="1819" w:author="Language Editor" w:date="2026-09-27T12:00:00Z">
-        <w:r>
-          <w:delText xml:space="preserve">but not</w:delText>
-        </w:r>
-      </w:del>
-      <w:ins w:id="1820" w:author="Language Editor" w:date="2026-09-27T12:00:00Z">
-        <w:r>
-          <w:t xml:space="preserve">while</w:t>
-        </w:r>
-      </w:ins>
-      <w:r>
-        <w:t xml:space="preserve"> the final widths, number of queries </w:t>
-      </w:r>
-      <w:del w:id="1821" w:author="Language Editor" w:date="2026-09-27T12:00:00Z">
-        <w:r>
-          <w:delText xml:space="preserve">or training schedule</w:delText>
-        </w:r>
-      </w:del>
-      <w:ins w:id="1822" w:author="Language Editor" w:date="2026-09-27T12:00:00Z">
-        <w:r>
-          <w:t xml:space="preserve">and training schedule are set for each dataset</w:t>
-        </w:r>
-      </w:ins>
-      <w:r>
-        <w:t xml:space="preserve">. A practical sequence </w:t>
-      </w:r>
-      <w:del w:id="1823" w:author="Language Editor" w:date="2026-09-27T12:00:00Z">
-        <w:r>
-          <w:delText xml:space="preserve">would</w:delText>
-        </w:r>
-      </w:del>
-      <w:ins w:id="1824" w:author="Language Editor" w:date="2026-09-27T12:00:00Z">
-        <w:r>
-          <w:t xml:space="preserve">is to</w:t>
-        </w:r>
-      </w:ins>
-      <w:r>
-        <w:t xml:space="preserve"> establish data associations and structured evidence reporting</w:t>
-      </w:r>
-      <w:ins w:id="1825" w:author="Language Editor" w:date="2026-09-27T12:00:00Z">
-        <w:r>
-          <w:t xml:space="preserve"> first</w:t>
-        </w:r>
-      </w:ins>
-      <w:r>
-        <w:t xml:space="preserve">, then train the fusion </w:t>
-      </w:r>
-      <w:ins w:id="1826" w:author="Language Editor" w:date="2026-09-27T12:00:00Z">
-        <w:r>
-          <w:t xml:space="preserve">module </w:t>
-        </w:r>
-      </w:ins>
-      <w:r>
-        <w:t xml:space="preserve">and language adapter </w:t>
-      </w:r>
-      <w:del w:id="1827" w:author="Language Editor" w:date="2026-09-27T12:00:00Z">
-        <w:r>
-          <w:delText xml:space="preserve">with</w:delText>
-        </w:r>
-      </w:del>
-      <w:ins w:id="1828" w:author="Language Editor" w:date="2026-09-27T12:00:00Z">
-        <w:r>
-          <w:t xml:space="preserve">on</w:t>
-        </w:r>
-      </w:ins>
-      <w:r>
-        <w:t xml:space="preserve"> paired spatial observations and reviewed text, and </w:t>
-      </w:r>
-      <w:del w:id="1829" w:author="Language Editor" w:date="2026-09-27T12:00:00Z">
-        <w:r>
-          <w:delText xml:space="preserve">subsequently evaluate any language-model adaptation</w:delText>
-        </w:r>
-      </w:del>
-      <w:ins w:id="1830" w:author="Language Editor" w:date="2026-09-27T12:00:00Z">
-        <w:r>
-          <w:t xml:space="preserve">finally evaluate further adaptation of the language model</w:t>
-        </w:r>
-      </w:ins>
-      <w:r>
-        <w:t xml:space="preserve">. Candidate losses include supervised mapping or regression</w:t>
-      </w:r>
-      <w:ins w:id="1831" w:author="Language Editor" w:date="2026-09-27T12:00:00Z">
-        <w:r>
-          <w:t xml:space="preserve"> losses</w:t>
-        </w:r>
-      </w:ins>
-      <w:r>
-        <w:t xml:space="preserve"> and evidence-grounded text generation, with masks for unavailable targets</w:t>
-      </w:r>
-      <w:del w:id="1832" w:author="Language Editor" w:date="2026-09-27T12:00:00Z">
-        <w:r>
           <w:delText xml:space="preserve">. Their selection and relative weights require a concrete</w:delText>
         </w:r>
       </w:del>
-      <w:ins w:id="1833" w:author="Language Editor" w:date="2026-09-27T12:00:00Z">
+      <w:ins w:id="1817" w:author="Language Editor" w:date="2026-09-27T12:00:00Z">
         <w:r>
           <w:t xml:space="preserve">; their selection and weighting depend on the</w:t>
         </w:r>
@@ -9515,12 +9446,12 @@
       <w:r>
         <w:t xml:space="preserve"> dataset and validation </w:t>
       </w:r>
-      <w:del w:id="1834" w:author="Language Editor" w:date="2026-09-27T12:00:00Z">
+      <w:del w:id="1818" w:author="Language Editor" w:date="2026-09-27T12:00:00Z">
         <w:r>
           <w:delText xml:space="preserve">procedure</w:delText>
         </w:r>
       </w:del>
-      <w:ins w:id="1835" w:author="Language Editor" w:date="2026-09-27T12:00:00Z">
+      <w:ins w:id="1819" w:author="Language Editor" w:date="2026-09-27T12:00:00Z">
         <w:r>
           <w:t xml:space="preserve">design</w:t>
         </w:r>
@@ -9537,12 +9468,12 @@
       <w:r>
         <w:t xml:space="preserve">Evaluation </w:t>
       </w:r>
-      <w:del w:id="1836" w:author="Language Editor" w:date="2026-09-27T12:00:00Z">
+      <w:del w:id="1820" w:author="Language Editor" w:date="2026-09-27T12:00:00Z">
         <w:r>
           <w:delText xml:space="preserve">should separate</w:delText>
         </w:r>
       </w:del>
-      <w:ins w:id="1837" w:author="Language Editor" w:date="2026-09-27T12:00:00Z">
+      <w:ins w:id="1821" w:author="Language Editor" w:date="2026-09-27T12:00:00Z">
         <w:r>
           <w:t xml:space="preserve">treats</w:t>
         </w:r>
@@ -9550,12 +9481,12 @@
       <w:r>
         <w:t xml:space="preserve"> element prediction, integrated interpretation and management support</w:t>
       </w:r>
-      <w:del w:id="1838" w:author="Language Editor" w:date="2026-09-27T12:00:00Z">
+      <w:del w:id="1822" w:author="Language Editor" w:date="2026-09-27T12:00:00Z">
         <w:r>
           <w:delText xml:space="preserve">. Mapping requires independent labels and target-specific measures</w:delText>
         </w:r>
       </w:del>
-      <w:ins w:id="1839" w:author="Language Editor" w:date="2026-09-27T12:00:00Z">
+      <w:ins w:id="1823" w:author="Language Editor" w:date="2026-09-27T12:00:00Z">
         <w:r>
           <w:t xml:space="preserve"> separately. Mapping is evaluated against independent labels with target-specific metrics</w:t>
         </w:r>
@@ -9563,7 +9494,7 @@
       <w:r>
         <w:t xml:space="preserve"> such as class-wise F1 </w:t>
       </w:r>
-      <w:ins w:id="1840" w:author="Language Editor" w:date="2026-09-27T12:00:00Z">
+      <w:ins w:id="1824" w:author="Language Editor" w:date="2026-09-27T12:00:00Z">
         <w:r>
           <w:t xml:space="preserve">score </w:t>
         </w:r>
@@ -9571,12 +9502,12 @@
       <w:r>
         <w:t xml:space="preserve">or intersection over union</w:t>
       </w:r>
-      <w:del w:id="1841" w:author="Language Editor" w:date="2026-09-27T12:00:00Z">
+      <w:del w:id="1825" w:author="Language Editor" w:date="2026-09-27T12:00:00Z">
         <w:r>
           <w:delText xml:space="preserve">; numerical estimates require MAE or RMSE with units. Interpretation requires tests of</w:delText>
         </w:r>
       </w:del>
-      <w:ins w:id="1842" w:author="Language Editor" w:date="2026-09-27T12:00:00Z">
+      <w:ins w:id="1826" w:author="Language Editor" w:date="2026-09-27T12:00:00Z">
         <w:r>
           <w:t xml:space="preserve">, and numerical estimates with mean absolute error (MAE) or root mean square error (RMSE) in physical units. Interpretation is tested for</w:t>
         </w:r>
@@ -9584,12 +9515,12 @@
       <w:r>
         <w:t xml:space="preserve"> evidence support, object and period binding, and treatment of alternative explanations. Management support </w:t>
       </w:r>
-      <w:del w:id="1843" w:author="Language Editor" w:date="2026-09-27T12:00:00Z">
+      <w:del w:id="1827" w:author="Language Editor" w:date="2026-09-27T12:00:00Z">
         <w:r>
           <w:delText xml:space="preserve">requires</w:delText>
         </w:r>
       </w:del>
-      <w:ins w:id="1844" w:author="Language Editor" w:date="2026-09-27T12:00:00Z">
+      <w:ins w:id="1828" w:author="Language Editor" w:date="2026-09-27T12:00:00Z">
         <w:r>
           <w:t xml:space="preserve">is evaluated against</w:t>
         </w:r>
@@ -9597,7 +9528,7 @@
       <w:r>
         <w:t xml:space="preserve"> applicable constraints and, for numerical intervention effects, </w:t>
       </w:r>
-      <w:ins w:id="1845" w:author="Language Editor" w:date="2026-09-27T12:00:00Z">
+      <w:ins w:id="1829" w:author="Language Editor" w:date="2026-09-27T12:00:00Z">
         <w:r>
           <w:t xml:space="preserve">against </w:t>
         </w:r>
@@ -9605,12 +9536,12 @@
       <w:r>
         <w:t xml:space="preserve">experimental evidence or independently evaluated response models. </w:t>
       </w:r>
-      <w:del w:id="1846" w:author="Language Editor" w:date="2026-09-27T12:00:00Z">
+      <w:del w:id="1830" w:author="Language Editor" w:date="2026-09-27T12:00:00Z">
         <w:r>
           <w:delText xml:space="preserve">Report both</w:delText>
         </w:r>
       </w:del>
-      <w:ins w:id="1847" w:author="Language Editor" w:date="2026-09-27T12:00:00Z">
+      <w:ins w:id="1831" w:author="Language Editor" w:date="2026-09-27T12:00:00Z">
         <w:r>
           <w:t xml:space="preserve">Both</w:t>
         </w:r>
@@ -9618,12 +9549,12 @@
       <w:r>
         <w:t xml:space="preserve"> unsupported recommendations and unnecessary </w:t>
       </w:r>
-      <w:del w:id="1848" w:author="Language Editor" w:date="2026-09-27T12:00:00Z">
+      <w:del w:id="1832" w:author="Language Editor" w:date="2026-09-27T12:00:00Z">
         <w:r>
           <w:delText xml:space="preserve">abstention. A numerical capacity target additionally requires a</w:delText>
         </w:r>
       </w:del>
-      <w:ins w:id="1849" w:author="Language Editor" w:date="2026-09-27T12:00:00Z">
+      <w:ins w:id="1833" w:author="Language Editor" w:date="2026-09-27T12:00:00Z">
         <w:r>
           <w:t xml:space="preserve">abstentions are reported. Numerical capacity targets further require a defined</w:t>
         </w:r>
@@ -9640,12 +9571,12 @@
       <w:r>
         <w:t xml:space="preserve">Comparisons </w:t>
       </w:r>
-      <w:del w:id="1850" w:author="Language Editor" w:date="2026-09-27T12:00:00Z">
+      <w:del w:id="1834" w:author="Language Editor" w:date="2026-09-27T12:00:00Z">
         <w:r>
           <w:delText xml:space="preserve">should separate integration effects from</w:delText>
         </w:r>
       </w:del>
-      <w:ins w:id="1851" w:author="Language Editor" w:date="2026-09-27T12:00:00Z">
+      <w:ins w:id="1835" w:author="Language Editor" w:date="2026-09-27T12:00:00Z">
         <w:r>
           <w:t xml:space="preserve">must separate the effect of integration from that of</w:t>
         </w:r>
@@ -9653,7 +9584,7 @@
       <w:r>
         <w:t xml:space="preserve"> better inputs or larger backbones. Baselines </w:t>
       </w:r>
-      <w:del w:id="1852" w:author="Language Editor" w:date="2026-09-27T12:00:00Z">
+      <w:del w:id="1836" w:author="Language Editor" w:date="2026-09-27T12:00:00Z">
         <w:r>
           <w:delText xml:space="preserve">should </w:delText>
         </w:r>
@@ -9661,12 +9592,12 @@
       <w:r>
         <w:t xml:space="preserve">include task-specific models </w:t>
       </w:r>
-      <w:del w:id="1853" w:author="Language Editor" w:date="2026-09-27T12:00:00Z">
+      <w:del w:id="1837" w:author="Language Editor" w:date="2026-09-27T12:00:00Z">
         <w:r>
           <w:delText xml:space="preserve">using</w:delText>
         </w:r>
       </w:del>
-      <w:ins w:id="1854" w:author="Language Editor" w:date="2026-09-27T12:00:00Z">
+      <w:ins w:id="1838" w:author="Language Editor" w:date="2026-09-27T12:00:00Z">
         <w:r>
           <w:t xml:space="preserve">trained on</w:t>
         </w:r>
@@ -9674,12 +9605,12 @@
       <w:r>
         <w:t xml:space="preserve"> the same observations and a shared retrieval workflow with explicit assessment rules. A feature-path ablation </w:t>
       </w:r>
-      <w:del w:id="1855" w:author="Language Editor" w:date="2026-09-27T12:00:00Z">
+      <w:del w:id="1839" w:author="Language Editor" w:date="2026-09-27T12:00:00Z">
         <w:r>
           <w:delText xml:space="preserve">should preserve the same</w:delText>
         </w:r>
       </w:del>
-      <w:ins w:id="1856" w:author="Language Editor" w:date="2026-09-27T12:00:00Z">
+      <w:ins w:id="1840" w:author="Language Editor" w:date="2026-09-27T12:00:00Z">
         <w:r>
           <w:t xml:space="preserve">keeps the</w:t>
         </w:r>
@@ -9687,12 +9618,12 @@
       <w:r>
         <w:t xml:space="preserve"> explicit records and retrieved knowledge</w:t>
       </w:r>
-      <w:del w:id="1857" w:author="Language Editor" w:date="2026-09-27T12:00:00Z">
+      <w:del w:id="1841" w:author="Language Editor" w:date="2026-09-27T12:00:00Z">
         <w:r>
           <w:delText xml:space="preserve">. Further ablations should</w:delText>
         </w:r>
       </w:del>
-      <w:ins w:id="1858" w:author="Language Editor" w:date="2026-09-27T12:00:00Z">
+      <w:ins w:id="1842" w:author="Language Editor" w:date="2026-09-27T12:00:00Z">
         <w:r>
           <w:t xml:space="preserve"> unchanged, and further ablations</w:t>
         </w:r>
@@ -9700,7 +9631,7 @@
       <w:r>
         <w:t xml:space="preserve"> remove object or temporal links, support masks</w:t>
       </w:r>
-      <w:del w:id="1859" w:author="Language Editor" w:date="2026-09-27T12:00:00Z">
+      <w:del w:id="1843" w:author="Language Editor" w:date="2026-09-27T12:00:00Z">
         <w:r>
           <w:delText xml:space="preserve">,</w:delText>
         </w:r>
@@ -9708,12 +9639,12 @@
       <w:r>
         <w:t xml:space="preserve"> or retrieved knowledge one at a time. </w:t>
       </w:r>
-      <w:del w:id="1860" w:author="Language Editor" w:date="2026-09-27T12:00:00Z">
+      <w:del w:id="1844" w:author="Language Editor" w:date="2026-09-27T12:00:00Z">
         <w:r>
           <w:delText xml:space="preserve">Use</w:delText>
         </w:r>
       </w:del>
-      <w:ins w:id="1861" w:author="Language Editor" w:date="2026-09-27T12:00:00Z">
+      <w:ins w:id="1845" w:author="Language Editor" w:date="2026-09-27T12:00:00Z">
         <w:r>
           <w:t xml:space="preserve">Test data consist of</w:t>
         </w:r>
@@ -9745,12 +9676,12 @@
         <w:spacing w:after="160" w:line="300" w:lineRule="auto"/>
         <w:jc w:val="both"/>
       </w:pPr>
-      <w:del w:id="1862" w:author="Language Editor" w:date="2026-09-27T12:00:00Z">
+      <w:del w:id="1846" w:author="Language Editor" w:date="2026-09-27T12:00:00Z">
         <w:r>
           <w:delText xml:space="preserve">Report</w:delText>
         </w:r>
       </w:del>
-      <w:ins w:id="1863" w:author="Language Editor" w:date="2026-09-27T12:00:00Z">
+      <w:ins w:id="1847" w:author="Language Editor" w:date="2026-09-27T12:00:00Z">
         <w:r>
           <w:t xml:space="preserve">Reports should include</w:t>
         </w:r>
@@ -9758,12 +9689,12 @@
       <w:r>
         <w:t xml:space="preserve"> the number of independent sampling units, label coverage, split rules, annotation agreement, uncertainty, computational cost and failure or abstention rates</w:t>
       </w:r>
-      <w:del w:id="1864" w:author="Language Editor" w:date="2026-09-27T12:00:00Z">
+      <w:del w:id="1848" w:author="Language Editor" w:date="2026-09-27T12:00:00Z">
         <w:r>
           <w:delText xml:space="preserve">. Confidence intervals should</w:delText>
         </w:r>
       </w:del>
-      <w:ins w:id="1865" w:author="Language Editor" w:date="2026-09-27T12:00:00Z">
+      <w:ins w:id="1849" w:author="Language Editor" w:date="2026-09-27T12:00:00Z">
         <w:r>
           <w:t xml:space="preserve">, with confidence intervals that</w:t>
         </w:r>
@@ -9771,12 +9702,12 @@
       <w:r>
         <w:t xml:space="preserve"> reflect field or regional clustering. Missing-modality tests, inconsistent-record tests and deliberately mismatched object identifiers can </w:t>
       </w:r>
-      <w:del w:id="1866" w:author="Language Editor" w:date="2026-09-27T12:00:00Z">
+      <w:del w:id="1850" w:author="Language Editor" w:date="2026-09-27T12:00:00Z">
         <w:r>
           <w:delText xml:space="preserve">examine whether</w:delText>
         </w:r>
       </w:del>
-      <w:ins w:id="1867" w:author="Language Editor" w:date="2026-09-27T12:00:00Z">
+      <w:ins w:id="1851" w:author="Language Editor" w:date="2026-09-27T12:00:00Z">
         <w:r>
           <w:t xml:space="preserve">verify that</w:t>
         </w:r>
@@ -9784,12 +9715,12 @@
       <w:r>
         <w:t xml:space="preserve"> the system preserves uncertainty and uses the intended associations. A </w:t>
       </w:r>
-      <w:del w:id="1868" w:author="Language Editor" w:date="2026-09-27T12:00:00Z">
+      <w:del w:id="1852" w:author="Language Editor" w:date="2026-09-27T12:00:00Z">
         <w:r>
           <w:delText xml:space="preserve">proposed six-unit case layout provides neither an adequate foundation-model benchmark nor evidence of cross-region performance</w:delText>
         </w:r>
       </w:del>
-      <w:ins w:id="1869" w:author="Language Editor" w:date="2026-09-27T12:00:00Z">
+      <w:ins w:id="1853" w:author="Language Editor" w:date="2026-09-27T12:00:00Z">
         <w:r>
           <w:t xml:space="preserve">multi-region benchmark built on this protocol, extending well beyond the six case units, is the next step toward training CroplandGPT and assessing its transferability</w:t>
         </w:r>
@@ -9815,12 +9746,12 @@
       <w:r>
         <w:t xml:space="preserve">CroplandGPT </w:t>
       </w:r>
-      <w:del w:id="1870" w:author="Language Editor" w:date="2026-09-27T12:00:00Z">
+      <w:del w:id="1854" w:author="Language Editor" w:date="2026-09-27T12:00:00Z">
         <w:r>
           <w:delText xml:space="preserve">proposes a shared geospatial architecture for</w:delText>
         </w:r>
       </w:del>
-      <w:ins w:id="1871" w:author="Language Editor" w:date="2026-09-27T12:00:00Z">
+      <w:ins w:id="1855" w:author="Language Editor" w:date="2026-09-27T12:00:00Z">
         <w:r>
           <w:t xml:space="preserve">is a multimodal agro-geospatial framework that links</w:t>
         </w:r>
@@ -9828,12 +9759,12 @@
       <w:r>
         <w:t xml:space="preserve"> agricultural feature representation and mapping, integrated cropland assessment and management decision support</w:t>
       </w:r>
-      <w:del w:id="1872" w:author="Language Editor" w:date="2026-09-27T12:00:00Z">
+      <w:del w:id="1856" w:author="Language Editor" w:date="2026-09-27T12:00:00Z">
         <w:r>
           <w:delText xml:space="preserve">. Spatial features feed</w:delText>
         </w:r>
       </w:del>
-      <w:ins w:id="1873" w:author="Language Editor" w:date="2026-09-27T12:00:00Z">
+      <w:ins w:id="1857" w:author="Language Editor" w:date="2026-09-27T12:00:00Z">
         <w:r>
           <w:t xml:space="preserve"> through a shared geospatial architecture. Its spatial features drive</w:t>
         </w:r>
@@ -9841,12 +9772,12 @@
       <w:r>
         <w:t xml:space="preserve"> mapping and parcel-level prediction as well as a trainable vision-language interface</w:t>
       </w:r>
-      <w:del w:id="1874" w:author="Language Editor" w:date="2026-09-27T12:00:00Z">
+      <w:del w:id="1858" w:author="Language Editor" w:date="2026-09-27T12:00:00Z">
         <w:r>
           <w:delText xml:space="preserve">. Explicit</w:delText>
         </w:r>
       </w:del>
-      <w:ins w:id="1875" w:author="Language Editor" w:date="2026-09-27T12:00:00Z">
+      <w:ins w:id="1859" w:author="Language Editor" w:date="2026-09-27T12:00:00Z">
         <w:r>
           <w:t xml:space="preserve">, while explicit</w:t>
         </w:r>
@@ -9854,12 +9785,12 @@
       <w:r>
         <w:t xml:space="preserve"> observations, predictions and applicable knowledge provide the evidence and criteria for the language branch. Cropland analysis units define the common spatial context </w:t>
       </w:r>
-      <w:del w:id="1876" w:author="Language Editor" w:date="2026-09-27T12:00:00Z">
+      <w:del w:id="1860" w:author="Language Editor" w:date="2026-09-27T12:00:00Z">
         <w:r>
           <w:delText xml:space="preserve">while retaining internal fields</w:delText>
         </w:r>
       </w:del>
-      <w:ins w:id="1877" w:author="Language Editor" w:date="2026-09-27T12:00:00Z">
+      <w:ins w:id="1861" w:author="Language Editor" w:date="2026-09-27T12:00:00Z">
         <w:r>
           <w:t xml:space="preserve">and retain the fields within them</w:t>
         </w:r>
@@ -9873,12 +9804,12 @@
         <w:spacing w:after="160" w:line="300" w:lineRule="auto"/>
         <w:jc w:val="both"/>
       </w:pPr>
-      <w:del w:id="1878" w:author="Language Editor" w:date="2026-09-27T12:00:00Z">
+      <w:del w:id="1862" w:author="Language Editor" w:date="2026-09-27T12:00:00Z">
         <w:r>
           <w:delText xml:space="preserve">The six</w:delText>
         </w:r>
       </w:del>
-      <w:ins w:id="1879" w:author="Language Editor" w:date="2026-09-27T12:00:00Z">
+      <w:ins w:id="1863" w:author="Language Editor" w:date="2026-09-27T12:00:00Z">
         <w:r>
           <w:t xml:space="preserve">Six</w:t>
         </w:r>
@@ -9886,12 +9817,12 @@
       <w:r>
         <w:t xml:space="preserve"> assessment dimensions and three reasoning levels </w:t>
       </w:r>
-      <w:del w:id="1880" w:author="Language Editor" w:date="2026-09-27T12:00:00Z">
+      <w:del w:id="1864" w:author="Language Editor" w:date="2026-09-27T12:00:00Z">
         <w:r>
           <w:delText xml:space="preserve">organize annotations and intended outputs.</w:delText>
         </w:r>
       </w:del>
-      <w:ins w:id="1881" w:author="Language Editor" w:date="2026-09-27T12:00:00Z">
+      <w:ins w:id="1865" w:author="Language Editor" w:date="2026-09-27T12:00:00Z">
         <w:r>
           <w:t xml:space="preserve">give annotations and outputs a common structure. The</w:t>
         </w:r>
@@ -9899,12 +9830,12 @@
       <w:r>
         <w:t xml:space="preserve"> Qiyang and Quzhou </w:t>
       </w:r>
-      <w:del w:id="1882" w:author="Language Editor" w:date="2026-09-27T12:00:00Z">
+      <w:del w:id="1866" w:author="Language Editor" w:date="2026-09-27T12:00:00Z">
         <w:r>
           <w:delText xml:space="preserve">illustrate how different agricultural questions require</w:delText>
         </w:r>
       </w:del>
-      <w:ins w:id="1883" w:author="Language Editor" w:date="2026-09-27T12:00:00Z">
+      <w:ins w:id="1867" w:author="Language Editor" w:date="2026-09-27T12:00:00Z">
         <w:r>
           <w:t xml:space="preserve">cases show how contrasting agricultural questions call for</w:t>
         </w:r>
@@ -9912,12 +9843,12 @@
       <w:r>
         <w:t xml:space="preserve"> different evidence within this </w:t>
       </w:r>
-      <w:del w:id="1884" w:author="Language Editor" w:date="2026-09-27T12:00:00Z">
+      <w:del w:id="1868" w:author="Language Editor" w:date="2026-09-27T12:00:00Z">
         <w:r>
           <w:delText xml:space="preserve">common structure. The present contribution is a methodological framework and interface specification; the examples do not establish model accuracy or intervention benefits</w:delText>
         </w:r>
       </w:del>
-      <w:ins w:id="1885" w:author="Language Editor" w:date="2026-09-27T12:00:00Z">
+      <w:ins w:id="1869" w:author="Language Editor" w:date="2026-09-27T12:00:00Z">
         <w:r>
           <w:t xml:space="preserve">structure. The framework thus provides both an architecture and an interface specification for moving from single-task remote sensing products to system-level cropland assessment</w:t>
         </w:r>
@@ -9931,12 +9862,12 @@
         <w:spacing w:after="160" w:line="300" w:lineRule="auto"/>
         <w:jc w:val="both"/>
       </w:pPr>
-      <w:del w:id="1886" w:author="Language Editor" w:date="2026-09-27T12:00:00Z">
+      <w:del w:id="1870" w:author="Language Editor" w:date="2026-09-27T12:00:00Z">
         <w:r>
           <w:delText xml:space="preserve">Implementation and independent evaluation must determine</w:delText>
         </w:r>
       </w:del>
-      <w:ins w:id="1887" w:author="Language Editor" w:date="2026-09-27T12:00:00Z">
+      <w:ins w:id="1871" w:author="Language Editor" w:date="2026-09-27T12:00:00Z">
         <w:r>
           <w:t xml:space="preserve">Future work will build paired multimodal datasets, train the fusion module and language adapter, and test</w:t>
         </w:r>
@@ -9944,12 +9875,12 @@
       <w:r>
         <w:t xml:space="preserve"> whether shared spatial features and explicit evidence improve agricultural assessment </w:t>
       </w:r>
-      <w:del w:id="1888" w:author="Language Editor" w:date="2026-09-27T12:00:00Z">
+      <w:del w:id="1872" w:author="Language Editor" w:date="2026-09-27T12:00:00Z">
         <w:r>
           <w:delText xml:space="preserve">beyond simpler workflows. Evaluation should retain the distinctions between current acidity and</w:delText>
         </w:r>
       </w:del>
-      <w:ins w:id="1889" w:author="Language Editor" w:date="2026-09-27T12:00:00Z">
+      <w:ins w:id="1873" w:author="Language Editor" w:date="2026-09-27T12:00:00Z">
         <w:r>
           <w:t xml:space="preserve">over simpler workflows. Throughout, the framework keeps key agronomic distinctions explicit: current acidity versus</w:t>
         </w:r>
@@ -9957,12 +9888,12 @@
       <w:r>
         <w:t xml:space="preserve"> acidification, realized yield </w:t>
       </w:r>
-      <w:del w:id="1890" w:author="Language Editor" w:date="2026-09-27T12:00:00Z">
+      <w:del w:id="1874" w:author="Language Editor" w:date="2026-09-27T12:00:00Z">
         <w:r>
           <w:delText xml:space="preserve">and</w:delText>
         </w:r>
       </w:del>
-      <w:ins w:id="1891" w:author="Language Editor" w:date="2026-09-27T12:00:00Z">
+      <w:ins w:id="1875" w:author="Language Editor" w:date="2026-09-27T12:00:00Z">
         <w:r>
           <w:t xml:space="preserve">versus</w:t>
         </w:r>
@@ -9970,12 +9901,12 @@
       <w:r>
         <w:t xml:space="preserve"> sustained capacity, and a plausible management option </w:t>
       </w:r>
-      <w:del w:id="1892" w:author="Language Editor" w:date="2026-09-27T12:00:00Z">
+      <w:del w:id="1876" w:author="Language Editor" w:date="2026-09-27T12:00:00Z">
         <w:r>
           <w:delText xml:space="preserve">and</w:delText>
         </w:r>
       </w:del>
-      <w:ins w:id="1893" w:author="Language Editor" w:date="2026-09-27T12:00:00Z">
+      <w:ins w:id="1877" w:author="Language Editor" w:date="2026-09-27T12:00:00Z">
         <w:r>
           <w:t xml:space="preserve">versus</w:t>
         </w:r>
@@ -9983,12 +9914,12 @@
       <w:r>
         <w:t xml:space="preserve"> a quantified response. These distinctions </w:t>
       </w:r>
-      <w:del w:id="1894" w:author="Language Editor" w:date="2026-09-27T12:00:00Z">
+      <w:del w:id="1878" w:author="Language Editor" w:date="2026-09-27T12:00:00Z">
         <w:r>
           <w:delText xml:space="preserve">make the proposed integration assessable without extending its claims beyond the available evidence</w:delText>
         </w:r>
       </w:del>
-      <w:ins w:id="1895" w:author="Language Editor" w:date="2026-09-27T12:00:00Z">
+      <w:ins w:id="1879" w:author="Language Editor" w:date="2026-09-27T12:00:00Z">
         <w:r>
           <w:t xml:space="preserve">keep assessments traceable to evidence as CroplandGPT moves from concept to operational use</w:t>
         </w:r>

</xml_diff>

<commit_message>
Add redrawn Figs. 1, 2 and 6 and embed them in V18
Co-authored-by: tuffy1026 <tuffy1026@users.noreply.github.com>
</commit_message>
<xml_diff>
--- a/manuscripts/V18_CroplandGPT_EA_pzm_edit_0927.docx
+++ b/manuscripts/V18_CroplandGPT_EA_pzm_edit_0927.docx
@@ -180,10 +180,10 @@
         <w:spacing w:after="60"/>
         <w:jc w:val="both"/>
         <w:rPr>
-          <w:ins w:id="1881" w:author="Language Editor" w:date="2026-09-27T12:00:00Z"/>
+          <w:ins w:id="1884" w:author="Language Editor" w:date="2026-09-27T12:00:00Z"/>
         </w:rPr>
       </w:pPr>
-      <w:ins w:id="1882" w:author="Language Editor" w:date="2026-09-27T12:00:00Z">
+      <w:ins w:id="1885" w:author="Language Editor" w:date="2026-09-27T12:00:00Z">
         <w:r>
           <w:rPr>
             <w:b/>
@@ -198,10 +198,10 @@
         <w:spacing w:after="60"/>
         <w:jc w:val="both"/>
         <w:rPr>
-          <w:ins w:id="1883" w:author="Language Editor" w:date="2026-09-27T12:00:00Z"/>
+          <w:ins w:id="1886" w:author="Language Editor" w:date="2026-09-27T12:00:00Z"/>
         </w:rPr>
       </w:pPr>
-      <w:ins w:id="1884" w:author="Language Editor" w:date="2026-09-27T12:00:00Z">
+      <w:ins w:id="1887" w:author="Language Editor" w:date="2026-09-27T12:00:00Z">
         <w:r>
           <w:t xml:space="preserve">• CroplandGPT links cropland mapping, assessment and management support.</w:t>
         </w:r>
@@ -212,10 +212,10 @@
         <w:spacing w:after="60"/>
         <w:jc w:val="both"/>
         <w:rPr>
-          <w:ins w:id="1885" w:author="Language Editor" w:date="2026-09-27T12:00:00Z"/>
+          <w:ins w:id="1888" w:author="Language Editor" w:date="2026-09-27T12:00:00Z"/>
         </w:rPr>
       </w:pPr>
-      <w:ins w:id="1886" w:author="Language Editor" w:date="2026-09-27T12:00:00Z">
+      <w:ins w:id="1889" w:author="Language Editor" w:date="2026-09-27T12:00:00Z">
         <w:r>
           <w:t xml:space="preserve">• A shared geospatial encoder feeds mapping heads and a vision-language branch.</w:t>
         </w:r>
@@ -226,10 +226,10 @@
         <w:spacing w:after="60"/>
         <w:jc w:val="both"/>
         <w:rPr>
-          <w:ins w:id="1887" w:author="Language Editor" w:date="2026-09-27T12:00:00Z"/>
+          <w:ins w:id="1890" w:author="Language Editor" w:date="2026-09-27T12:00:00Z"/>
         </w:rPr>
       </w:pPr>
-      <w:ins w:id="1888" w:author="Language Editor" w:date="2026-09-27T12:00:00Z">
+      <w:ins w:id="1891" w:author="Language Editor" w:date="2026-09-27T12:00:00Z">
         <w:r>
           <w:t xml:space="preserve">• Explicit evidence records keep values, dates and sources traceable.</w:t>
         </w:r>
@@ -240,10 +240,10 @@
         <w:spacing w:after="60"/>
         <w:jc w:val="both"/>
         <w:rPr>
-          <w:ins w:id="1889" w:author="Language Editor" w:date="2026-09-27T12:00:00Z"/>
+          <w:ins w:id="1892" w:author="Language Editor" w:date="2026-09-27T12:00:00Z"/>
         </w:rPr>
       </w:pPr>
-      <w:ins w:id="1890" w:author="Language Editor" w:date="2026-09-27T12:00:00Z">
+      <w:ins w:id="1893" w:author="Language Editor" w:date="2026-09-27T12:00:00Z">
         <w:r>
           <w:t xml:space="preserve">• Six dimensions and three reasoning levels standardize annotation and output.</w:t>
         </w:r>
@@ -254,10 +254,10 @@
         <w:spacing w:after="60"/>
         <w:jc w:val="both"/>
         <w:rPr>
-          <w:ins w:id="1891" w:author="Language Editor" w:date="2026-09-27T12:00:00Z"/>
+          <w:ins w:id="1894" w:author="Language Editor" w:date="2026-09-27T12:00:00Z"/>
         </w:rPr>
       </w:pPr>
-      <w:ins w:id="1892" w:author="Language Editor" w:date="2026-09-27T12:00:00Z">
+      <w:ins w:id="1895" w:author="Language Editor" w:date="2026-09-27T12:00:00Z">
         <w:r>
           <w:t xml:space="preserve">• Qiyang and Quzhou cases show adaptation to contrasting cropland questions.</w:t>
         </w:r>
@@ -2079,6 +2079,44 @@
         <w:spacing w:before="200" w:after="60"/>
         <w:jc w:val="center"/>
       </w:pPr>
+      <w:ins w:id="1880" w:author="Language Editor" w:date="2026-09-27T12:00:00Z">
+        <w:r>
+          <w:drawing xmlns:a="http://schemas.openxmlformats.org/drawingml/2006/main" xmlns:pic="http://schemas.openxmlformats.org/drawingml/2006/picture">
+            <wp:inline distT="0" distB="0" distL="0" distR="0">
+              <wp:extent cx="5724000" cy="4666304"/>
+              <wp:docPr id="101" name="Figure 101"/>
+              <wp:cNvGraphicFramePr>
+                <a:graphicFrameLocks noChangeAspect="1"/>
+              </wp:cNvGraphicFramePr>
+              <a:graphic>
+                <a:graphicData uri="http://schemas.openxmlformats.org/drawingml/2006/picture">
+                  <pic:pic>
+                    <pic:nvPicPr>
+                      <pic:cNvPr id="101" name="media/figure1.png"/>
+                      <pic:cNvPicPr/>
+                    </pic:nvPicPr>
+                    <pic:blipFill>
+                      <a:blip r:embed="rIdFig1"/>
+                      <a:stretch>
+                        <a:fillRect/>
+                      </a:stretch>
+                    </pic:blipFill>
+                    <pic:spPr>
+                      <a:xfrm>
+                        <a:off x="0" y="0"/>
+                        <a:ext cx="5724000" cy="4666304"/>
+                      </a:xfrm>
+                      <a:prstGeom prst="rect">
+                        <a:avLst/>
+                      </a:prstGeom>
+                    </pic:spPr>
+                  </pic:pic>
+                </a:graphicData>
+              </a:graphic>
+            </wp:inline>
+          </w:drawing>
+        </w:r>
+      </w:ins>
     </w:p>
     <w:p>
       <w:pPr>
@@ -2871,6 +2909,44 @@
         <w:spacing w:before="200" w:after="60"/>
         <w:jc w:val="center"/>
       </w:pPr>
+      <w:ins w:id="1881" w:author="Language Editor" w:date="2026-09-27T12:00:00Z">
+        <w:r>
+          <w:drawing xmlns:a="http://schemas.openxmlformats.org/drawingml/2006/main" xmlns:pic="http://schemas.openxmlformats.org/drawingml/2006/picture">
+            <wp:inline distT="0" distB="0" distL="0" distR="0">
+              <wp:extent cx="5724000" cy="3670826"/>
+              <wp:docPr id="102" name="Figure 102"/>
+              <wp:cNvGraphicFramePr>
+                <a:graphicFrameLocks noChangeAspect="1"/>
+              </wp:cNvGraphicFramePr>
+              <a:graphic>
+                <a:graphicData uri="http://schemas.openxmlformats.org/drawingml/2006/picture">
+                  <pic:pic>
+                    <pic:nvPicPr>
+                      <pic:cNvPr id="102" name="media/figure2.png"/>
+                      <pic:cNvPicPr/>
+                    </pic:nvPicPr>
+                    <pic:blipFill>
+                      <a:blip r:embed="rIdFig2"/>
+                      <a:stretch>
+                        <a:fillRect/>
+                      </a:stretch>
+                    </pic:blipFill>
+                    <pic:spPr>
+                      <a:xfrm>
+                        <a:off x="0" y="0"/>
+                        <a:ext cx="5724000" cy="3670826"/>
+                      </a:xfrm>
+                      <a:prstGeom prst="rect">
+                        <a:avLst/>
+                      </a:prstGeom>
+                    </pic:spPr>
+                  </pic:pic>
+                </a:graphicData>
+              </a:graphic>
+            </wp:inline>
+          </w:drawing>
+        </w:r>
+      </w:ins>
     </w:p>
     <w:p>
       <w:pPr>
@@ -3791,12 +3867,12 @@
         <w:spacing w:before="200" w:after="60"/>
         <w:jc w:val="center"/>
       </w:pPr>
-      <w:ins w:id="1880" w:author="Language Editor" w:date="2026-09-27T12:00:00Z">
+      <w:ins w:id="1882" w:author="Language Editor" w:date="2026-09-27T12:00:00Z">
         <w:r>
           <w:drawing xmlns:a="http://schemas.openxmlformats.org/drawingml/2006/main" xmlns:pic="http://schemas.openxmlformats.org/drawingml/2006/picture">
             <wp:inline distT="0" distB="0" distL="0" distR="0">
               <wp:extent cx="5724000" cy="6283956"/>
-              <wp:docPr id="101" name="Figure 101"/>
+              <wp:docPr id="103" name="Figure 103"/>
               <wp:cNvGraphicFramePr>
                 <a:graphicFrameLocks noChangeAspect="1"/>
               </wp:cNvGraphicFramePr>
@@ -3804,11 +3880,11 @@
                 <a:graphicData uri="http://schemas.openxmlformats.org/drawingml/2006/picture">
                   <pic:pic>
                     <pic:nvPicPr>
-                      <pic:cNvPr id="101" name="media/figure1.png"/>
+                      <pic:cNvPr id="103" name="media/figure3.png"/>
                       <pic:cNvPicPr/>
                     </pic:nvPicPr>
                     <pic:blipFill>
-                      <a:blip r:embed="rIdFig1"/>
+                      <a:blip r:embed="rIdFig3"/>
                       <a:stretch>
                         <a:fillRect/>
                       </a:stretch>
@@ -8526,6 +8602,44 @@
         <w:spacing w:before="200" w:after="60"/>
         <w:jc w:val="center"/>
       </w:pPr>
+      <w:ins w:id="1883" w:author="Language Editor" w:date="2026-09-27T12:00:00Z">
+        <w:r>
+          <w:drawing xmlns:a="http://schemas.openxmlformats.org/drawingml/2006/main" xmlns:pic="http://schemas.openxmlformats.org/drawingml/2006/picture">
+            <wp:inline distT="0" distB="0" distL="0" distR="0">
+              <wp:extent cx="5724000" cy="3795260"/>
+              <wp:docPr id="104" name="Figure 104"/>
+              <wp:cNvGraphicFramePr>
+                <a:graphicFrameLocks noChangeAspect="1"/>
+              </wp:cNvGraphicFramePr>
+              <a:graphic>
+                <a:graphicData uri="http://schemas.openxmlformats.org/drawingml/2006/picture">
+                  <pic:pic>
+                    <pic:nvPicPr>
+                      <pic:cNvPr id="104" name="media/figure4.png"/>
+                      <pic:cNvPicPr/>
+                    </pic:nvPicPr>
+                    <pic:blipFill>
+                      <a:blip r:embed="rIdFig4"/>
+                      <a:stretch>
+                        <a:fillRect/>
+                      </a:stretch>
+                    </pic:blipFill>
+                    <pic:spPr>
+                      <a:xfrm>
+                        <a:off x="0" y="0"/>
+                        <a:ext cx="5724000" cy="3795260"/>
+                      </a:xfrm>
+                      <a:prstGeom prst="rect">
+                        <a:avLst/>
+                      </a:prstGeom>
+                    </pic:spPr>
+                  </pic:pic>
+                </a:graphicData>
+              </a:graphic>
+            </wp:inline>
+          </w:drawing>
+        </w:r>
+      </w:ins>
     </w:p>
     <w:p>
       <w:pPr>

</xml_diff>

<commit_message>
Replace Fig. 3 with simplified architecture diagram; keep detailed version as Fig. S1
Co-authored-by: tuffy1026 <tuffy1026@users.noreply.github.com>
</commit_message>
<xml_diff>
--- a/manuscripts/V18_CroplandGPT_EA_pzm_edit_0927.docx
+++ b/manuscripts/V18_CroplandGPT_EA_pzm_edit_0927.docx
@@ -180,10 +180,10 @@
         <w:spacing w:after="60"/>
         <w:jc w:val="both"/>
         <w:rPr>
-          <w:ins w:id="1884" w:author="Language Editor" w:date="2026-09-27T12:00:00Z"/>
+          <w:ins w:id="1883" w:author="Language Editor" w:date="2026-09-27T12:00:00Z"/>
         </w:rPr>
       </w:pPr>
-      <w:ins w:id="1885" w:author="Language Editor" w:date="2026-09-27T12:00:00Z">
+      <w:ins w:id="1884" w:author="Language Editor" w:date="2026-09-27T12:00:00Z">
         <w:r>
           <w:rPr>
             <w:b/>
@@ -198,10 +198,10 @@
         <w:spacing w:after="60"/>
         <w:jc w:val="both"/>
         <w:rPr>
-          <w:ins w:id="1886" w:author="Language Editor" w:date="2026-09-27T12:00:00Z"/>
+          <w:ins w:id="1885" w:author="Language Editor" w:date="2026-09-27T12:00:00Z"/>
         </w:rPr>
       </w:pPr>
-      <w:ins w:id="1887" w:author="Language Editor" w:date="2026-09-27T12:00:00Z">
+      <w:ins w:id="1886" w:author="Language Editor" w:date="2026-09-27T12:00:00Z">
         <w:r>
           <w:t xml:space="preserve">• CroplandGPT links cropland mapping, assessment and management support.</w:t>
         </w:r>
@@ -212,10 +212,10 @@
         <w:spacing w:after="60"/>
         <w:jc w:val="both"/>
         <w:rPr>
-          <w:ins w:id="1888" w:author="Language Editor" w:date="2026-09-27T12:00:00Z"/>
+          <w:ins w:id="1887" w:author="Language Editor" w:date="2026-09-27T12:00:00Z"/>
         </w:rPr>
       </w:pPr>
-      <w:ins w:id="1889" w:author="Language Editor" w:date="2026-09-27T12:00:00Z">
+      <w:ins w:id="1888" w:author="Language Editor" w:date="2026-09-27T12:00:00Z">
         <w:r>
           <w:t xml:space="preserve">• A shared geospatial encoder feeds mapping heads and a vision-language branch.</w:t>
         </w:r>
@@ -226,10 +226,10 @@
         <w:spacing w:after="60"/>
         <w:jc w:val="both"/>
         <w:rPr>
-          <w:ins w:id="1890" w:author="Language Editor" w:date="2026-09-27T12:00:00Z"/>
+          <w:ins w:id="1889" w:author="Language Editor" w:date="2026-09-27T12:00:00Z"/>
         </w:rPr>
       </w:pPr>
-      <w:ins w:id="1891" w:author="Language Editor" w:date="2026-09-27T12:00:00Z">
+      <w:ins w:id="1890" w:author="Language Editor" w:date="2026-09-27T12:00:00Z">
         <w:r>
           <w:t xml:space="preserve">• Explicit evidence records keep values, dates and sources traceable.</w:t>
         </w:r>
@@ -240,10 +240,10 @@
         <w:spacing w:after="60"/>
         <w:jc w:val="both"/>
         <w:rPr>
-          <w:ins w:id="1892" w:author="Language Editor" w:date="2026-09-27T12:00:00Z"/>
+          <w:ins w:id="1891" w:author="Language Editor" w:date="2026-09-27T12:00:00Z"/>
         </w:rPr>
       </w:pPr>
-      <w:ins w:id="1893" w:author="Language Editor" w:date="2026-09-27T12:00:00Z">
+      <w:ins w:id="1892" w:author="Language Editor" w:date="2026-09-27T12:00:00Z">
         <w:r>
           <w:t xml:space="preserve">• Six dimensions and three reasoning levels standardize annotation and output.</w:t>
         </w:r>
@@ -254,10 +254,10 @@
         <w:spacing w:after="60"/>
         <w:jc w:val="both"/>
         <w:rPr>
-          <w:ins w:id="1894" w:author="Language Editor" w:date="2026-09-27T12:00:00Z"/>
+          <w:ins w:id="1893" w:author="Language Editor" w:date="2026-09-27T12:00:00Z"/>
         </w:rPr>
       </w:pPr>
-      <w:ins w:id="1895" w:author="Language Editor" w:date="2026-09-27T12:00:00Z">
+      <w:ins w:id="1894" w:author="Language Editor" w:date="2026-09-27T12:00:00Z">
         <w:r>
           <w:t xml:space="preserve">• Qiyang and Quzhou cases show adaptation to contrasting cropland questions.</w:t>
         </w:r>
@@ -2079,7 +2079,7 @@
         <w:spacing w:before="200" w:after="60"/>
         <w:jc w:val="center"/>
       </w:pPr>
-      <w:ins w:id="1880" w:author="Language Editor" w:date="2026-09-27T12:00:00Z">
+      <w:ins w:id="1879" w:author="Language Editor" w:date="2026-09-27T12:00:00Z">
         <w:r>
           <w:drawing xmlns:a="http://schemas.openxmlformats.org/drawingml/2006/main" xmlns:pic="http://schemas.openxmlformats.org/drawingml/2006/picture">
             <wp:inline distT="0" distB="0" distL="0" distR="0">
@@ -2909,7 +2909,7 @@
         <w:spacing w:before="200" w:after="60"/>
         <w:jc w:val="center"/>
       </w:pPr>
-      <w:ins w:id="1881" w:author="Language Editor" w:date="2026-09-27T12:00:00Z">
+      <w:ins w:id="1880" w:author="Language Editor" w:date="2026-09-27T12:00:00Z">
         <w:r>
           <w:drawing xmlns:a="http://schemas.openxmlformats.org/drawingml/2006/main" xmlns:pic="http://schemas.openxmlformats.org/drawingml/2006/picture">
             <wp:inline distT="0" distB="0" distL="0" distR="0">
@@ -3807,15 +3807,12 @@
       </w:r>
       <w:del w:id="1335" w:author="Language Editor" w:date="2026-09-27T12:00:00Z">
         <w:r>
-          <w:delText xml:space="preserve">equivalently </w:delText>
-        </w:r>
-      </w:del>
-      <w:r>
-        <w:t xml:space="preserve">d_g in Fig. 3), and</w:t>
-      </w:r>
+          <w:delText xml:space="preserve">equivalently d_g in Fig. 3), and</w:delText>
+        </w:r>
+      </w:del>
       <w:ins w:id="1336" w:author="Language Editor" w:date="2026-09-27T12:00:00Z">
         <w:r>
-          <w:t xml:space="preserve"> the</w:t>
+          <w:t xml:space="preserve">written d_g where needed), and the</w:t>
         </w:r>
       </w:ins>
       <w:r>
@@ -3867,11 +3864,11 @@
         <w:spacing w:before="200" w:after="60"/>
         <w:jc w:val="center"/>
       </w:pPr>
-      <w:ins w:id="1882" w:author="Language Editor" w:date="2026-09-27T12:00:00Z">
+      <w:ins w:id="1881" w:author="Language Editor" w:date="2026-09-27T12:00:00Z">
         <w:r>
           <w:drawing xmlns:a="http://schemas.openxmlformats.org/drawingml/2006/main" xmlns:pic="http://schemas.openxmlformats.org/drawingml/2006/picture">
             <wp:inline distT="0" distB="0" distL="0" distR="0">
-              <wp:extent cx="5724000" cy="6283956"/>
+              <wp:extent cx="5724000" cy="3110869"/>
               <wp:docPr id="103" name="Figure 103"/>
               <wp:cNvGraphicFramePr>
                 <a:graphicFrameLocks noChangeAspect="1"/>
@@ -3892,7 +3889,7 @@
                     <pic:spPr>
                       <a:xfrm>
                         <a:off x="0" y="0"/>
-                        <a:ext cx="5724000" cy="6283956"/>
+                        <a:ext cx="5724000" cy="3110869"/>
                       </a:xfrm>
                       <a:prstGeom prst="rect">
                         <a:avLst/>
@@ -3911,16 +3908,16 @@
         <w:spacing w:before="120" w:after="240"/>
       </w:pPr>
       <w:r>
-        <w:t xml:space="preserve">Fig. 3 Proposed CroplandGPT network architecture. (a) </w:t>
+        <w:t xml:space="preserve">Fig. 3 Proposed CroplandGPT network architecture. </w:t>
       </w:r>
       <w:del w:id="1343" w:author="Language Editor" w:date="2026-09-27T12:00:00Z">
         <w:r>
-          <w:delText xml:space="preserve">Modality-specific encoders and spatial fusion produce shared features for mapping, parcel-level prediction and language input. The GFM-inspired front end is shared, without a duplicate RGB encoder. (b) Pre-normalized cross-attention, spatial self-attention and feed-forward sublayers preserve the spatial-token grid through residual connections; validity and spatial or temporal support constrain auxiliary attention. (c) Query resampling and projection convey continuous features to a pretrained language decoder, alongside explicit evidence, questions, criteria and retrieved knowledge. The resulting branch forms the proposed vision-language interface. Dimensions omit the batch axis. Backbones, widths and training settings remain to be selected; no learned capability is implied by the diagram alone</w:delText>
+          <w:delText xml:space="preserve">(a) Modality-specific encoders and spatial fusion produce shared features for mapping, parcel-level prediction and language input. The GFM-inspired front end is shared, without a duplicate RGB encoder. (b) Pre-normalized cross-attention, spatial self-attention and feed-forward sublayers preserve the spatial-token grid through residual connections; validity and spatial or temporal support constrain auxiliary attention. (c) Query resampling and projection convey continuous features to a pretrained language decoder, alongside explicit evidence, questions, criteria and retrieved knowledge. The resulting branch forms the proposed vision-language interface. Dimensions omit the batch axis. Backbones, widths and training settings remain to be selected; no learned capability is implied by the diagram alone</w:delText>
         </w:r>
       </w:del>
       <w:ins w:id="1344" w:author="Language Editor" w:date="2026-09-27T12:00:00Z">
         <w:r>
-          <w:t xml:space="preserve">A GFM-inspired geospatial encoder and modality encoders feed a spatial fusion block. The resulting shared features H drive the spatial decoder, parcel pooling and the vision-language branch, so no duplicate RGB encoder is needed; observed and predicted values are kept as evidence records E. (b) Each of the L_f fusion blocks applies pre-normalized cross-attention, spatial self-attention and feed-forward sublayers with residual connections, preserving the spatial token grid; support masks restrict which auxiliary records inform each spatial position. (c) A query resampler and MLP projector compress H into K visual tokens, which are concatenated with serialized questions, criteria, evidence and retrieved knowledge to form the prefix of a pretrained language decoder. Generated statements are checked against E and indexed by D1–D6 × L1–L3. Dimensions omit the batch axis</w:t>
+          <w:t xml:space="preserve">Remote sensing imagery (S) and auxiliary records (M) are encoded and fused into shared spatial features H by stacked cross-attention, self-attention and feed-forward layers. H feeds a mapping branch that predicts element maps and parcel attributes, and a query adapter that compresses H into visual tokens V for a pretrained language decoder. Observed and predicted values are kept as evidence records and, together with retrieved knowledge, are serialized as text tokens T, so the decoder receives continuous spatial context and explicit evidence in parallel. Outputs are checked against the evidence records and indexed by D1–D6 × L1–L3</w:t>
         </w:r>
       </w:ins>
       <w:r>
@@ -6574,35 +6571,27 @@
         </w:r>
       </w:ins>
       <w:r>
-        <w:t xml:space="preserve"> a residual connection</w:t>
+        <w:t xml:space="preserve"> a residual connection </w:t>
       </w:r>
       <w:del w:id="1537" w:author="Language Editor" w:date="2026-09-27T12:00:00Z">
         <w:r>
-          <w:delText xml:space="preserve"> from its own input</w:delText>
-        </w:r>
-      </w:del>
-      <w:r>
-        <w:t xml:space="preserve"> (Fig. 3b). Fusion preserves </w:t>
-      </w:r>
-      <w:del w:id="1538" w:author="Language Editor" w:date="2026-09-27T12:00:00Z">
-        <w:r>
-          <w:delText xml:space="preserve">N × d; an all-</w:delText>
-        </w:r>
-      </w:del>
-      <w:ins w:id="1539" w:author="Language Editor" w:date="2026-09-27T12:00:00Z">
-        <w:r>
-          <w:t xml:space="preserve">the N × d shape, and an entirely </w:t>
+          <w:delText xml:space="preserve">from its own input (Fig. 3b). Fusion preserves N × d; an all-</w:delText>
+        </w:r>
+      </w:del>
+      <w:ins w:id="1538" w:author="Language Editor" w:date="2026-09-27T12:00:00Z">
+        <w:r>
+          <w:t xml:space="preserve">(Fig. 3; Supplementary Fig. S1). Fusion preserves the N × d shape, and an entirely </w:t>
         </w:r>
       </w:ins>
       <w:r>
         <w:t xml:space="preserve">missing auxiliary input </w:t>
       </w:r>
-      <w:del w:id="1540" w:author="Language Editor" w:date="2026-09-27T12:00:00Z">
+      <w:del w:id="1539" w:author="Language Editor" w:date="2026-09-27T12:00:00Z">
         <w:r>
           <w:delText xml:space="preserve">produces</w:delText>
         </w:r>
       </w:del>
-      <w:ins w:id="1541" w:author="Language Editor" w:date="2026-09-27T12:00:00Z">
+      <w:ins w:id="1540" w:author="Language Editor" w:date="2026-09-27T12:00:00Z">
         <w:r>
           <w:t xml:space="preserve">yields</w:t>
         </w:r>
@@ -6610,12 +6599,12 @@
       <w:r>
         <w:t xml:space="preserve"> a zero attention update </w:t>
       </w:r>
-      <w:del w:id="1542" w:author="Language Editor" w:date="2026-09-27T12:00:00Z">
+      <w:del w:id="1541" w:author="Language Editor" w:date="2026-09-27T12:00:00Z">
         <w:r>
           <w:delText xml:space="preserve">rather than</w:delText>
         </w:r>
       </w:del>
-      <w:ins w:id="1543" w:author="Language Editor" w:date="2026-09-27T12:00:00Z">
+      <w:ins w:id="1542" w:author="Language Editor" w:date="2026-09-27T12:00:00Z">
         <w:r>
           <w:t xml:space="preserve">instead of</w:t>
         </w:r>
@@ -6623,12 +6612,12 @@
       <w:r>
         <w:t xml:space="preserve"> an undefined softmax. Attention weights are not </w:t>
       </w:r>
-      <w:del w:id="1544" w:author="Language Editor" w:date="2026-09-27T12:00:00Z">
+      <w:del w:id="1543" w:author="Language Editor" w:date="2026-09-27T12:00:00Z">
         <w:r>
           <w:delText xml:space="preserve">treated</w:delText>
         </w:r>
       </w:del>
-      <w:ins w:id="1545" w:author="Language Editor" w:date="2026-09-27T12:00:00Z">
+      <w:ins w:id="1544" w:author="Language Editor" w:date="2026-09-27T12:00:00Z">
         <w:r>
           <w:t xml:space="preserve">interpreted</w:t>
         </w:r>
@@ -6645,12 +6634,12 @@
       <w:r>
         <w:t xml:space="preserve">The uncompressed spatial features feed two prediction routes. A spatial decoder combines them with multiscale skip features to recover </w:t>
       </w:r>
-      <w:del w:id="1546" w:author="Language Editor" w:date="2026-09-27T12:00:00Z">
+      <w:del w:id="1545" w:author="Language Editor" w:date="2026-09-27T12:00:00Z">
         <w:r>
           <w:delText xml:space="preserve">supported map outputs</w:delText>
         </w:r>
       </w:del>
-      <w:ins w:id="1547" w:author="Language Editor" w:date="2026-09-27T12:00:00Z">
+      <w:ins w:id="1546" w:author="Language Editor" w:date="2026-09-27T12:00:00Z">
         <w:r>
           <w:t xml:space="preserve">map outputs at supported resolutions</w:t>
         </w:r>
@@ -6658,33 +6647,33 @@
       <w:r>
         <w:t xml:space="preserve">. For parcel-level tasks, nonnegative overlap weights pool the features within each parcel</w:t>
       </w:r>
-      <w:del w:id="1548" w:author="Language Editor" w:date="2026-09-27T12:00:00Z">
+      <w:del w:id="1547" w:author="Language Editor" w:date="2026-09-27T12:00:00Z">
         <w:r>
           <w:delText xml:space="preserve"> before</w:delText>
         </w:r>
       </w:del>
+      <w:ins w:id="1548" w:author="Language Editor" w:date="2026-09-27T12:00:00Z">
+        <w:r>
+          <w:t xml:space="preserve">, and</w:t>
+        </w:r>
+      </w:ins>
+      <w:r>
+        <w:t xml:space="preserve"> a prediction head</w:t>
+      </w:r>
       <w:ins w:id="1549" w:author="Language Editor" w:date="2026-09-27T12:00:00Z">
         <w:r>
-          <w:t xml:space="preserve">, and</w:t>
-        </w:r>
-      </w:ins>
-      <w:r>
-        <w:t xml:space="preserve"> a prediction head</w:t>
-      </w:r>
-      <w:ins w:id="1550" w:author="Language Editor" w:date="2026-09-27T12:00:00Z">
-        <w:r>
           <w:t xml:space="preserve"> then</w:t>
         </w:r>
       </w:ins>
       <w:r>
         <w:t xml:space="preserve"> estimates the target attributes. </w:t>
       </w:r>
-      <w:del w:id="1551" w:author="Language Editor" w:date="2026-09-27T12:00:00Z">
+      <w:del w:id="1550" w:author="Language Editor" w:date="2026-09-27T12:00:00Z">
         <w:r>
           <w:delText xml:space="preserve">Empty</w:delText>
         </w:r>
       </w:del>
-      <w:ins w:id="1552" w:author="Language Editor" w:date="2026-09-27T12:00:00Z">
+      <w:ins w:id="1551" w:author="Language Editor" w:date="2026-09-27T12:00:00Z">
         <w:r>
           <w:t xml:space="preserve">Parcels with empty</w:t>
         </w:r>
@@ -6692,12 +6681,12 @@
       <w:r>
         <w:t xml:space="preserve"> or invalid spatial support </w:t>
       </w:r>
-      <w:del w:id="1553" w:author="Language Editor" w:date="2026-09-27T12:00:00Z">
+      <w:del w:id="1552" w:author="Language Editor" w:date="2026-09-27T12:00:00Z">
         <w:r>
           <w:delText xml:space="preserve">is flagged rather than converted to a numerical prediction. Coarse</w:delText>
         </w:r>
       </w:del>
-      <w:ins w:id="1554" w:author="Language Editor" w:date="2026-09-27T12:00:00Z">
+      <w:ins w:id="1553" w:author="Language Editor" w:date="2026-09-27T12:00:00Z">
         <w:r>
           <w:t xml:space="preserve">are flagged and receive no numerical prediction. Because coarse</w:t>
         </w:r>
@@ -6705,12 +6694,12 @@
       <w:r>
         <w:t xml:space="preserve"> features can mix small parcels, </w:t>
       </w:r>
-      <w:del w:id="1555" w:author="Language Editor" w:date="2026-09-27T12:00:00Z">
+      <w:del w:id="1554" w:author="Language Editor" w:date="2026-09-27T12:00:00Z">
         <w:r>
           <w:delText xml:space="preserve">so pooling does not by itself establish fine-scale localization</w:delText>
         </w:r>
       </w:del>
-      <w:ins w:id="1556" w:author="Language Editor" w:date="2026-09-27T12:00:00Z">
+      <w:ins w:id="1555" w:author="Language Editor" w:date="2026-09-27T12:00:00Z">
         <w:r>
           <w:t xml:space="preserve">pooled predictions are interpreted at the resolution that the features support</w:t>
         </w:r>
@@ -6718,12 +6707,12 @@
       <w:r>
         <w:t xml:space="preserve">. Predicted boundaries and attributes </w:t>
       </w:r>
-      <w:del w:id="1557" w:author="Language Editor" w:date="2026-09-27T12:00:00Z">
+      <w:del w:id="1556" w:author="Language Editor" w:date="2026-09-27T12:00:00Z">
         <w:r>
           <w:delText xml:space="preserve">retain their</w:delText>
         </w:r>
       </w:del>
-      <w:ins w:id="1558" w:author="Language Editor" w:date="2026-09-27T12:00:00Z">
+      <w:ins w:id="1557" w:author="Language Editor" w:date="2026-09-27T12:00:00Z">
         <w:r>
           <w:t xml:space="preserve">carry</w:t>
         </w:r>
@@ -6731,12 +6720,12 @@
       <w:r>
         <w:t xml:space="preserve"> model provenance and </w:t>
       </w:r>
-      <w:del w:id="1559" w:author="Language Editor" w:date="2026-09-27T12:00:00Z">
+      <w:del w:id="1558" w:author="Language Editor" w:date="2026-09-27T12:00:00Z">
         <w:r>
           <w:delText xml:space="preserve">must be distinguished</w:delText>
         </w:r>
       </w:del>
-      <w:ins w:id="1560" w:author="Language Editor" w:date="2026-09-27T12:00:00Z">
+      <w:ins w:id="1559" w:author="Language Editor" w:date="2026-09-27T12:00:00Z">
         <w:r>
           <w:t xml:space="preserve">are kept distinct</w:t>
         </w:r>
@@ -6771,7 +6760,7 @@
         </w:rPr>
         <w:t xml:space="preserve">The vision-language branch reuses the shared geospatial front end</w:t>
       </w:r>
-      <w:del w:id="1561" w:author="Language Editor" w:date="2026-09-27T12:00:00Z">
+      <w:del w:id="1560" w:author="Language Editor" w:date="2026-09-27T12:00:00Z">
         <w:r>
           <w:rPr>
             <w:b w:val="0"/>
@@ -6780,7 +6769,7 @@
           <w:delText xml:space="preserve">. It does not introduce an additional</w:delText>
         </w:r>
       </w:del>
-      <w:ins w:id="1562" w:author="Language Editor" w:date="2026-09-27T12:00:00Z">
+      <w:ins w:id="1561" w:author="Language Editor" w:date="2026-09-27T12:00:00Z">
         <w:r>
           <w:rPr>
             <w:b w:val="0"/>
@@ -6796,7 +6785,7 @@
         </w:rPr>
         <w:t xml:space="preserve"> RGB encoder. A set of K learned queries attends to H </w:t>
       </w:r>
-      <w:del w:id="1563" w:author="Language Editor" w:date="2026-09-27T12:00:00Z">
+      <w:del w:id="1562" w:author="Language Editor" w:date="2026-09-27T12:00:00Z">
         <w:r>
           <w:rPr>
             <w:b w:val="0"/>
@@ -6805,7 +6794,7 @@
           <w:delText xml:space="preserve">to produce</w:delText>
         </w:r>
       </w:del>
-      <w:ins w:id="1564" w:author="Language Editor" w:date="2026-09-27T12:00:00Z">
+      <w:ins w:id="1563" w:author="Language Editor" w:date="2026-09-27T12:00:00Z">
         <w:r>
           <w:rPr>
             <w:b w:val="0"/>
@@ -6821,7 +6810,7 @@
         </w:rPr>
         <w:t xml:space="preserve"> K feature vectors of width d_g</w:t>
       </w:r>
-      <w:del w:id="1565" w:author="Language Editor" w:date="2026-09-27T12:00:00Z">
+      <w:del w:id="1564" w:author="Language Editor" w:date="2026-09-27T12:00:00Z">
         <w:r>
           <w:rPr>
             <w:b w:val="0"/>
@@ -6830,7 +6819,7 @@
           <w:delText xml:space="preserve">. A</w:delText>
         </w:r>
       </w:del>
-      <w:ins w:id="1566" w:author="Language Editor" w:date="2026-09-27T12:00:00Z">
+      <w:ins w:id="1565" w:author="Language Editor" w:date="2026-09-27T12:00:00Z">
         <w:r>
           <w:rPr>
             <w:b w:val="0"/>
@@ -6846,7 +6835,7 @@
         </w:rPr>
         <w:t xml:space="preserve"> trainable projector maps </w:t>
       </w:r>
-      <w:del w:id="1567" w:author="Language Editor" w:date="2026-09-27T12:00:00Z">
+      <w:del w:id="1566" w:author="Language Editor" w:date="2026-09-27T12:00:00Z">
         <w:r>
           <w:rPr>
             <w:b w:val="0"/>
@@ -6855,7 +6844,7 @@
           <w:delText xml:space="preserve">these vectors to</w:delText>
         </w:r>
       </w:del>
-      <w:ins w:id="1568" w:author="Language Editor" w:date="2026-09-27T12:00:00Z">
+      <w:ins w:id="1567" w:author="Language Editor" w:date="2026-09-27T12:00:00Z">
         <w:r>
           <w:rPr>
             <w:b w:val="0"/>
@@ -6871,7 +6860,7 @@
         </w:rPr>
         <w:t xml:space="preserve"> language-model width d_l, following </w:t>
       </w:r>
-      <w:del w:id="1569" w:author="Language Editor" w:date="2026-09-27T12:00:00Z">
+      <w:del w:id="1568" w:author="Language Editor" w:date="2026-09-27T12:00:00Z">
         <w:r>
           <w:rPr>
             <w:b w:val="0"/>
@@ -6880,7 +6869,7 @@
           <w:delText xml:space="preserve">the general principle of query-based visual</w:delText>
         </w:r>
       </w:del>
-      <w:ins w:id="1570" w:author="Language Editor" w:date="2026-09-27T12:00:00Z">
+      <w:ins w:id="1569" w:author="Language Editor" w:date="2026-09-27T12:00:00Z">
         <w:r>
           <w:rPr>
             <w:b w:val="0"/>
@@ -6926,7 +6915,7 @@
         </w:rPr>
         <w:t xml:space="preserve">. The </w:t>
       </w:r>
-      <w:del w:id="1571" w:author="Language Editor" w:date="2026-09-27T12:00:00Z">
+      <w:del w:id="1570" w:author="Language Editor" w:date="2026-09-27T12:00:00Z">
         <w:r>
           <w:rPr>
             <w:b w:val="0"/>
@@ -6935,7 +6924,7 @@
           <w:delText xml:space="preserve">proposed interface is therefore</w:delText>
         </w:r>
       </w:del>
-      <w:ins w:id="1572" w:author="Language Editor" w:date="2026-09-27T12:00:00Z">
+      <w:ins w:id="1571" w:author="Language Editor" w:date="2026-09-27T12:00:00Z">
         <w:r>
           <w:rPr>
             <w:b w:val="0"/>
@@ -6951,7 +6940,7 @@
         </w:rPr>
         <w:t xml:space="preserve"> H: N × d_g → Z: K × d_g → V: K × d_l</w:t>
       </w:r>
-      <w:del w:id="1573" w:author="Language Editor" w:date="2026-09-27T12:00:00Z">
+      <w:del w:id="1572" w:author="Language Editor" w:date="2026-09-27T12:00:00Z">
         <w:r>
           <w:rPr>
             <w:b w:val="0"/>
@@ -6960,7 +6949,7 @@
           <w:delText xml:space="preserve">, with the </w:delText>
         </w:r>
       </w:del>
-      <w:ins w:id="1574" w:author="Language Editor" w:date="2026-09-27T12:00:00Z">
+      <w:ins w:id="1573" w:author="Language Editor" w:date="2026-09-27T12:00:00Z">
         <w:r>
           <w:rPr>
             <w:b w:val="0"/>
@@ -6976,7 +6965,7 @@
         </w:rPr>
         <w:t xml:space="preserve">batch axis omitted</w:t>
       </w:r>
-      <w:del w:id="1575" w:author="Language Editor" w:date="2026-09-27T12:00:00Z">
+      <w:del w:id="1574" w:author="Language Editor" w:date="2026-09-27T12:00:00Z">
         <w:r>
           <w:rPr>
             <w:b w:val="0"/>
@@ -6985,7 +6974,7 @@
           <w:delText xml:space="preserve">. K is</w:delText>
         </w:r>
       </w:del>
-      <w:ins w:id="1576" w:author="Language Editor" w:date="2026-09-27T12:00:00Z">
+      <w:ins w:id="1575" w:author="Language Editor" w:date="2026-09-27T12:00:00Z">
         <w:r>
           <w:rPr>
             <w:b w:val="0"/>
@@ -7001,7 +6990,7 @@
         </w:rPr>
         <w:t xml:space="preserve"> a compression budget</w:t>
       </w:r>
-      <w:del w:id="1577" w:author="Language Editor" w:date="2026-09-27T12:00:00Z">
+      <w:del w:id="1576" w:author="Language Editor" w:date="2026-09-27T12:00:00Z">
         <w:r>
           <w:rPr>
             <w:b w:val="0"/>
@@ -7010,7 +6999,7 @@
           <w:delText xml:space="preserve">, not a count</w:delText>
         </w:r>
       </w:del>
-      <w:ins w:id="1578" w:author="Language Editor" w:date="2026-09-27T12:00:00Z">
+      <w:ins w:id="1577" w:author="Language Editor" w:date="2026-09-27T12:00:00Z">
         <w:r>
           <w:rPr>
             <w:b w:val="0"/>
@@ -7026,7 +7015,7 @@
         </w:rPr>
         <w:t xml:space="preserve"> of parcels or agricultural variables. Dense mapping continues to </w:t>
       </w:r>
-      <w:del w:id="1579" w:author="Language Editor" w:date="2026-09-27T12:00:00Z">
+      <w:del w:id="1578" w:author="Language Editor" w:date="2026-09-27T12:00:00Z">
         <w:r>
           <w:rPr>
             <w:b w:val="0"/>
@@ -7035,7 +7024,7 @@
           <w:delText xml:space="preserve">use</w:delText>
         </w:r>
       </w:del>
-      <w:ins w:id="1580" w:author="Language Editor" w:date="2026-09-27T12:00:00Z">
+      <w:ins w:id="1579" w:author="Language Editor" w:date="2026-09-27T12:00:00Z">
         <w:r>
           <w:rPr>
             <w:b w:val="0"/>
@@ -7062,7 +7051,7 @@
           <w:bCs w:val="0"/>
         </w:rPr>
       </w:pPr>
-      <w:del w:id="1581" w:author="Language Editor" w:date="2026-09-27T12:00:00Z">
+      <w:del w:id="1580" w:author="Language Editor" w:date="2026-09-27T12:00:00Z">
         <w:r>
           <w:rPr>
             <w:b w:val="0"/>
@@ -7071,7 +7060,7 @@
           <w:delText xml:space="preserve">Projected features provide continuous spatial context to</w:delText>
         </w:r>
       </w:del>
-      <w:ins w:id="1582" w:author="Language Editor" w:date="2026-09-27T12:00:00Z">
+      <w:ins w:id="1581" w:author="Language Editor" w:date="2026-09-27T12:00:00Z">
         <w:r>
           <w:rPr>
             <w:b w:val="0"/>
@@ -7087,7 +7076,7 @@
         </w:rPr>
         <w:t xml:space="preserve"> a pretrained language decoder</w:t>
       </w:r>
-      <w:ins w:id="1583" w:author="Language Editor" w:date="2026-09-27T12:00:00Z">
+      <w:ins w:id="1582" w:author="Language Editor" w:date="2026-09-27T12:00:00Z">
         <w:r>
           <w:rPr>
             <w:b w:val="0"/>
@@ -7103,7 +7092,7 @@
         </w:rPr>
         <w:t xml:space="preserve">. A separate text path </w:t>
       </w:r>
-      <w:del w:id="1584" w:author="Language Editor" w:date="2026-09-27T12:00:00Z">
+      <w:del w:id="1583" w:author="Language Editor" w:date="2026-09-27T12:00:00Z">
         <w:r>
           <w:rPr>
             <w:b w:val="0"/>
@@ -7112,7 +7101,7 @@
           <w:delText xml:space="preserve">contains</w:delText>
         </w:r>
       </w:del>
-      <w:ins w:id="1585" w:author="Language Editor" w:date="2026-09-27T12:00:00Z">
+      <w:ins w:id="1584" w:author="Language Editor" w:date="2026-09-27T12:00:00Z">
         <w:r>
           <w:rPr>
             <w:b w:val="0"/>
@@ -7128,7 +7117,7 @@
         </w:rPr>
         <w:t xml:space="preserve"> the question, assessment criteria, applicable knowledge and serialized evidence records. After text embedding, its U vectors have width d_l</w:t>
       </w:r>
-      <w:del w:id="1586" w:author="Language Editor" w:date="2026-09-27T12:00:00Z">
+      <w:del w:id="1585" w:author="Language Editor" w:date="2026-09-27T12:00:00Z">
         <w:r>
           <w:rPr>
             <w:b w:val="0"/>
@@ -7137,7 +7126,7 @@
           <w:delText xml:space="preserve">; the proposed prefix has</w:delText>
         </w:r>
       </w:del>
-      <w:ins w:id="1587" w:author="Language Editor" w:date="2026-09-27T12:00:00Z">
+      <w:ins w:id="1586" w:author="Language Editor" w:date="2026-09-27T12:00:00Z">
         <w:r>
           <w:rPr>
             <w:b w:val="0"/>
@@ -7153,7 +7142,7 @@
         </w:rPr>
         <w:t xml:space="preserve"> (K + U) × d_l components before generated tokens are appended. </w:t>
       </w:r>
-      <w:del w:id="1588" w:author="Language Editor" w:date="2026-09-27T12:00:00Z">
+      <w:del w:id="1587" w:author="Language Editor" w:date="2026-09-27T12:00:00Z">
         <w:r>
           <w:rPr>
             <w:b w:val="0"/>
@@ -7162,7 +7151,7 @@
           <w:delText xml:space="preserve">Records preserve</w:delText>
         </w:r>
       </w:del>
-      <w:ins w:id="1589" w:author="Language Editor" w:date="2026-09-27T12:00:00Z">
+      <w:ins w:id="1588" w:author="Language Editor" w:date="2026-09-27T12:00:00Z">
         <w:r>
           <w:rPr>
             <w:b w:val="0"/>
@@ -7178,7 +7167,7 @@
         </w:rPr>
         <w:t xml:space="preserve"> object and time identifiers, values, units, sources, quality and </w:t>
       </w:r>
-      <w:del w:id="1590" w:author="Language Editor" w:date="2026-09-27T12:00:00Z">
+      <w:del w:id="1589" w:author="Language Editor" w:date="2026-09-27T12:00:00Z">
         <w:r>
           <w:rPr>
             <w:b w:val="0"/>
@@ -7187,7 +7176,7 @@
           <w:delText xml:space="preserve">an observed/predicted distinction. The</w:delText>
         </w:r>
       </w:del>
-      <w:ins w:id="1591" w:author="Language Editor" w:date="2026-09-27T12:00:00Z">
+      <w:ins w:id="1590" w:author="Language Editor" w:date="2026-09-27T12:00:00Z">
         <w:r>
           <w:rPr>
             <w:b w:val="0"/>
@@ -7203,7 +7192,7 @@
         </w:rPr>
         <w:t xml:space="preserve"> decoder and adapter </w:t>
       </w:r>
-      <w:del w:id="1592" w:author="Language Editor" w:date="2026-09-27T12:00:00Z">
+      <w:del w:id="1591" w:author="Language Editor" w:date="2026-09-27T12:00:00Z">
         <w:r>
           <w:rPr>
             <w:b w:val="0"/>
@@ -7212,7 +7201,7 @@
           <w:delText xml:space="preserve">require cross-modal training</w:delText>
         </w:r>
       </w:del>
-      <w:ins w:id="1593" w:author="Language Editor" w:date="2026-09-27T12:00:00Z">
+      <w:ins w:id="1592" w:author="Language Editor" w:date="2026-09-27T12:00:00Z">
         <w:r>
           <w:rPr>
             <w:b w:val="0"/>
@@ -7228,7 +7217,7 @@
         </w:rPr>
         <w:t xml:space="preserve"> to use this information</w:t>
       </w:r>
-      <w:del w:id="1594" w:author="Language Editor" w:date="2026-09-27T12:00:00Z">
+      <w:del w:id="1593" w:author="Language Editor" w:date="2026-09-27T12:00:00Z">
         <w:r>
           <w:rPr>
             <w:b w:val="0"/>
@@ -7237,7 +7226,7 @@
           <w:delText xml:space="preserve">. This</w:delText>
         </w:r>
       </w:del>
-      <w:ins w:id="1595" w:author="Language Editor" w:date="2026-09-27T12:00:00Z">
+      <w:ins w:id="1594" w:author="Language Editor" w:date="2026-09-27T12:00:00Z">
         <w:r>
           <w:rPr>
             <w:b w:val="0"/>
@@ -7253,7 +7242,7 @@
         </w:rPr>
         <w:t xml:space="preserve"> shared-encoder arrangement defines the </w:t>
       </w:r>
-      <w:del w:id="1596" w:author="Language Editor" w:date="2026-09-27T12:00:00Z">
+      <w:del w:id="1595" w:author="Language Editor" w:date="2026-09-27T12:00:00Z">
         <w:r>
           <w:rPr>
             <w:b w:val="0"/>
@@ -7262,7 +7251,7 @@
           <w:delText xml:space="preserve">proposed VLM functionality without asserting that an untrained connector already provides agricultural reasoning</w:delText>
         </w:r>
       </w:del>
-      <w:ins w:id="1597" w:author="Language Editor" w:date="2026-09-27T12:00:00Z">
+      <w:ins w:id="1596" w:author="Language Editor" w:date="2026-09-27T12:00:00Z">
         <w:r>
           <w:rPr>
             <w:b w:val="0"/>
@@ -7287,12 +7276,12 @@
       <w:r>
         <w:t xml:space="preserve">A query </w:t>
       </w:r>
-      <w:del w:id="1598" w:author="Language Editor" w:date="2026-09-27T12:00:00Z">
+      <w:del w:id="1597" w:author="Language Editor" w:date="2026-09-27T12:00:00Z">
         <w:r>
           <w:delText xml:space="preserve">defines</w:delText>
         </w:r>
       </w:del>
-      <w:ins w:id="1599" w:author="Language Editor" w:date="2026-09-27T12:00:00Z">
+      <w:ins w:id="1598" w:author="Language Editor" w:date="2026-09-27T12:00:00Z">
         <w:r>
           <w:t xml:space="preserve">specifies</w:t>
         </w:r>
@@ -7300,12 +7289,12 @@
       <w:r>
         <w:t xml:space="preserve"> the object, period, agricultural objective and requested judgment. Spatial decoding produces </w:t>
       </w:r>
-      <w:del w:id="1600" w:author="Language Editor" w:date="2026-09-27T12:00:00Z">
+      <w:del w:id="1599" w:author="Language Editor" w:date="2026-09-27T12:00:00Z">
         <w:r>
           <w:delText xml:space="preserve">supported element maps, while</w:delText>
         </w:r>
       </w:del>
-      <w:ins w:id="1601" w:author="Language Editor" w:date="2026-09-27T12:00:00Z">
+      <w:ins w:id="1600" w:author="Language Editor" w:date="2026-09-27T12:00:00Z">
         <w:r>
           <w:t xml:space="preserve">element maps at supported resolutions, and</w:t>
         </w:r>
@@ -7313,12 +7302,12 @@
       <w:r>
         <w:t xml:space="preserve"> masked parcel pooling </w:t>
       </w:r>
-      <w:del w:id="1602" w:author="Language Editor" w:date="2026-09-27T12:00:00Z">
+      <w:del w:id="1601" w:author="Language Editor" w:date="2026-09-27T12:00:00Z">
         <w:r>
           <w:delText xml:space="preserve">and task heads produce</w:delText>
         </w:r>
       </w:del>
-      <w:ins w:id="1603" w:author="Language Editor" w:date="2026-09-27T12:00:00Z">
+      <w:ins w:id="1602" w:author="Language Editor" w:date="2026-09-27T12:00:00Z">
         <w:r>
           <w:t xml:space="preserve">with task heads produces</w:t>
         </w:r>
@@ -7326,12 +7315,12 @@
       <w:r>
         <w:t xml:space="preserve"> field attributes or numerical estimates</w:t>
       </w:r>
-      <w:del w:id="1604" w:author="Language Editor" w:date="2026-09-27T12:00:00Z">
+      <w:del w:id="1603" w:author="Language Editor" w:date="2026-09-27T12:00:00Z">
         <w:r>
           <w:delText xml:space="preserve">. These outputs</w:delText>
         </w:r>
       </w:del>
-      <w:ins w:id="1605" w:author="Language Editor" w:date="2026-09-27T12:00:00Z">
+      <w:ins w:id="1604" w:author="Language Editor" w:date="2026-09-27T12:00:00Z">
         <w:r>
           <w:t xml:space="preserve">, which</w:t>
         </w:r>
@@ -7339,20 +7328,20 @@
       <w:r>
         <w:t xml:space="preserve"> remain distinct from observations. Assessment combines</w:t>
       </w:r>
+      <w:del w:id="1605" w:author="Language Editor" w:date="2026-09-27T12:00:00Z">
+        <w:r>
+          <w:delText xml:space="preserve"> the</w:delText>
+        </w:r>
+      </w:del>
+      <w:r>
+        <w:t xml:space="preserve"> spatial context with explicit evidence and applicable criteria</w:t>
+      </w:r>
       <w:del w:id="1606" w:author="Language Editor" w:date="2026-09-27T12:00:00Z">
         <w:r>
-          <w:delText xml:space="preserve"> the</w:delText>
-        </w:r>
-      </w:del>
-      <w:r>
-        <w:t xml:space="preserve"> spatial context with explicit evidence and applicable criteria</w:t>
-      </w:r>
-      <w:del w:id="1607" w:author="Language Editor" w:date="2026-09-27T12:00:00Z">
-        <w:r>
           <w:delText xml:space="preserve">;</w:delText>
         </w:r>
       </w:del>
-      <w:ins w:id="1608" w:author="Language Editor" w:date="2026-09-27T12:00:00Z">
+      <w:ins w:id="1607" w:author="Language Editor" w:date="2026-09-27T12:00:00Z">
         <w:r>
           <w:t xml:space="preserve">, and</w:t>
         </w:r>
@@ -7360,12 +7349,12 @@
       <w:r>
         <w:t xml:space="preserve"> management support additionally considers available resources and action constraints. Responses contain structured variables, explanations and</w:t>
       </w:r>
-      <w:del w:id="1609" w:author="Language Editor" w:date="2026-09-27T12:00:00Z">
+      <w:del w:id="1608" w:author="Language Editor" w:date="2026-09-27T12:00:00Z">
         <w:r>
           <w:delText xml:space="preserve"> spatial outputs where justified. Each statement retains</w:delText>
         </w:r>
       </w:del>
-      <w:ins w:id="1610" w:author="Language Editor" w:date="2026-09-27T12:00:00Z">
+      <w:ins w:id="1609" w:author="Language Editor" w:date="2026-09-27T12:00:00Z">
         <w:r>
           <w:t xml:space="preserve">, where justified, spatial outputs, and each statement carries</w:t>
         </w:r>
@@ -7373,12 +7362,12 @@
       <w:r>
         <w:t xml:space="preserve"> its scope and sources. Value, unit and date checks test internal consistency, </w:t>
       </w:r>
-      <w:del w:id="1611" w:author="Language Editor" w:date="2026-09-27T12:00:00Z">
+      <w:del w:id="1610" w:author="Language Editor" w:date="2026-09-27T12:00:00Z">
         <w:r>
           <w:delText xml:space="preserve">while</w:delText>
         </w:r>
       </w:del>
-      <w:ins w:id="1612" w:author="Language Editor" w:date="2026-09-27T12:00:00Z">
+      <w:ins w:id="1611" w:author="Language Editor" w:date="2026-09-27T12:00:00Z">
         <w:r>
           <w:t xml:space="preserve">and</w:t>
         </w:r>
@@ -7386,12 +7375,12 @@
       <w:r>
         <w:t xml:space="preserve"> a separate support check examines whether the cited evidence justifies </w:t>
       </w:r>
-      <w:del w:id="1613" w:author="Language Editor" w:date="2026-09-27T12:00:00Z">
+      <w:del w:id="1612" w:author="Language Editor" w:date="2026-09-27T12:00:00Z">
         <w:r>
           <w:delText xml:space="preserve">the claim. Missing or contradictory evidence leads to a scoped, unassessed judgment and a request for</w:delText>
         </w:r>
       </w:del>
-      <w:ins w:id="1614" w:author="Language Editor" w:date="2026-09-27T12:00:00Z">
+      <w:ins w:id="1613" w:author="Language Editor" w:date="2026-09-27T12:00:00Z">
         <w:r>
           <w:t xml:space="preserve">each claim. When evidence is missing or contradictory, the response marks the judgment as unassessed within its scope and requests</w:t>
         </w:r>
@@ -7408,12 +7397,12 @@
       <w:r>
         <w:t xml:space="preserve">3 Case </w:t>
       </w:r>
-      <w:del w:id="1615" w:author="Language Editor" w:date="2026-09-27T12:00:00Z">
+      <w:del w:id="1614" w:author="Language Editor" w:date="2026-09-27T12:00:00Z">
         <w:r>
           <w:delText xml:space="preserve">designs and illustrative assessments</w:delText>
         </w:r>
       </w:del>
-      <w:ins w:id="1616" w:author="Language Editor" w:date="2026-09-27T12:00:00Z">
+      <w:ins w:id="1615" w:author="Language Editor" w:date="2026-09-27T12:00:00Z">
         <w:r>
           <w:t xml:space="preserve">applications</w:t>
         </w:r>
@@ -7427,7 +7416,7 @@
       <w:r>
         <w:t xml:space="preserve">3.1 Case settings</w:t>
       </w:r>
-      <w:del w:id="1617" w:author="Language Editor" w:date="2026-09-27T12:00:00Z">
+      <w:del w:id="1616" w:author="Language Editor" w:date="2026-09-27T12:00:00Z">
         <w:r>
           <w:delText xml:space="preserve"> and spatial presentation</w:delText>
         </w:r>
@@ -7441,12 +7430,12 @@
       <w:r>
         <w:t xml:space="preserve">Two </w:t>
       </w:r>
-      <w:del w:id="1618" w:author="Language Editor" w:date="2026-09-27T12:00:00Z">
+      <w:del w:id="1617" w:author="Language Editor" w:date="2026-09-27T12:00:00Z">
         <w:r>
           <w:delText xml:space="preserve">case designs illustrate the proposed workflow: soil-</w:delText>
         </w:r>
       </w:del>
-      <w:ins w:id="1619" w:author="Language Editor" w:date="2026-09-27T12:00:00Z">
+      <w:ins w:id="1618" w:author="Language Editor" w:date="2026-09-27T12:00:00Z">
         <w:r>
           <w:t xml:space="preserve">cases show how the workflow applies in practice: soil </w:t>
         </w:r>
@@ -7454,12 +7443,12 @@
       <w:r>
         <w:t xml:space="preserve">acidity assessment in Qiyang</w:t>
       </w:r>
-      <w:del w:id="1620" w:author="Language Editor" w:date="2026-09-27T12:00:00Z">
+      <w:del w:id="1619" w:author="Language Editor" w:date="2026-09-27T12:00:00Z">
         <w:r>
           <w:delText xml:space="preserve">, Hunan, and production-</w:delText>
         </w:r>
       </w:del>
-      <w:ins w:id="1621" w:author="Language Editor" w:date="2026-09-27T12:00:00Z">
+      <w:ins w:id="1620" w:author="Language Editor" w:date="2026-09-27T12:00:00Z">
         <w:r>
           <w:t xml:space="preserve"> County, Hunan Province, and production </w:t>
         </w:r>
@@ -7467,12 +7456,12 @@
       <w:r>
         <w:t xml:space="preserve">capacity assessment in Quzhou</w:t>
       </w:r>
-      <w:del w:id="1622" w:author="Language Editor" w:date="2026-09-27T12:00:00Z">
+      <w:del w:id="1621" w:author="Language Editor" w:date="2026-09-27T12:00:00Z">
         <w:r>
           <w:delText xml:space="preserve">, Hebei</w:delText>
         </w:r>
       </w:del>
-      <w:ins w:id="1623" w:author="Language Editor" w:date="2026-09-27T12:00:00Z">
+      <w:ins w:id="1622" w:author="Language Editor" w:date="2026-09-27T12:00:00Z">
         <w:r>
           <w:t xml:space="preserve"> County, Hebei Province. Qiyang lies in the red-soil region of southern China, where soil acidity constrains crop production, whereas Quzhou lies in the North China Plain, where integrated water and fertilizer management is being used to raise production capacity</w:t>
         </w:r>
@@ -7480,12 +7469,12 @@
       <w:r>
         <w:t xml:space="preserve">. The Qiyang material comprises a regional image, three site images and descriptions of two double-season rice sites and one predominantly maize site. The Quzhou material specifies </w:t>
       </w:r>
-      <w:del w:id="1624" w:author="Language Editor" w:date="2026-09-27T12:00:00Z">
+      <w:del w:id="1623" w:author="Language Editor" w:date="2026-09-27T12:00:00Z">
         <w:r>
           <w:delText xml:space="preserve">an intended</w:delText>
         </w:r>
       </w:del>
-      <w:ins w:id="1625" w:author="Language Editor" w:date="2026-09-27T12:00:00Z">
+      <w:ins w:id="1624" w:author="Language Editor" w:date="2026-09-27T12:00:00Z">
         <w:r>
           <w:t xml:space="preserve">the</w:t>
         </w:r>
@@ -7493,12 +7482,12 @@
       <w:r>
         <w:t xml:space="preserve"> analysis-unit and annotation layout. </w:t>
       </w:r>
-      <w:del w:id="1626" w:author="Language Editor" w:date="2026-09-27T12:00:00Z">
+      <w:del w:id="1625" w:author="Language Editor" w:date="2026-09-27T12:00:00Z">
         <w:r>
           <w:delText xml:space="preserve">The examples</w:delText>
         </w:r>
       </w:del>
-      <w:ins w:id="1627" w:author="Language Editor" w:date="2026-09-27T12:00:00Z">
+      <w:ins w:id="1626" w:author="Language Editor" w:date="2026-09-27T12:00:00Z">
         <w:r>
           <w:t xml:space="preserve">Together, the cases</w:t>
         </w:r>
@@ -7506,12 +7495,12 @@
       <w:r>
         <w:t xml:space="preserve"> show how agricultural questions determine input requirements, assessment scope and evidence </w:t>
       </w:r>
-      <w:del w:id="1628" w:author="Language Editor" w:date="2026-09-27T12:00:00Z">
+      <w:del w:id="1627" w:author="Language Editor" w:date="2026-09-27T12:00:00Z">
         <w:r>
           <w:delText xml:space="preserve">gaps. They are author-developed illustrations rather than outputs from an executed model.</w:delText>
         </w:r>
       </w:del>
-      <w:ins w:id="1629" w:author="Language Editor" w:date="2026-09-27T12:00:00Z">
+      <w:ins w:id="1628" w:author="Language Editor" w:date="2026-09-27T12:00:00Z">
         <w:r>
           <w:t xml:space="preserve">needs.</w:t>
         </w:r>
@@ -7525,12 +7514,12 @@
       <w:r>
         <w:t xml:space="preserve">Figure 4 summarizes the case </w:t>
       </w:r>
-      <w:del w:id="1630" w:author="Language Editor" w:date="2026-09-27T12:00:00Z">
+      <w:del w:id="1629" w:author="Language Editor" w:date="2026-09-27T12:00:00Z">
         <w:r>
           <w:delText xml:space="preserve">designs and available information</w:delText>
         </w:r>
       </w:del>
-      <w:ins w:id="1631" w:author="Language Editor" w:date="2026-09-27T12:00:00Z">
+      <w:ins w:id="1630" w:author="Language Editor" w:date="2026-09-27T12:00:00Z">
         <w:r>
           <w:t xml:space="preserve">locations and analysis-unit layout</w:t>
         </w:r>
@@ -7538,12 +7527,12 @@
       <w:r>
         <w:t xml:space="preserve">. Figure 5 presents the Qiyang site material, and Fig. 6 sets out the </w:t>
       </w:r>
-      <w:del w:id="1632" w:author="Language Editor" w:date="2026-09-27T12:00:00Z">
+      <w:del w:id="1631" w:author="Language Editor" w:date="2026-09-27T12:00:00Z">
         <w:r>
           <w:delText xml:space="preserve">Quzhou assessment logic. The design proposes three</w:delText>
         </w:r>
       </w:del>
-      <w:ins w:id="1633" w:author="Language Editor" w:date="2026-09-27T12:00:00Z">
+      <w:ins w:id="1632" w:author="Language Editor" w:date="2026-09-27T12:00:00Z">
         <w:r>
           <w:t xml:space="preserve">assessment logic for Quzhou. Three</w:t>
         </w:r>
@@ -7551,12 +7540,12 @@
       <w:r>
         <w:t xml:space="preserve"> 500 m × 500 m analysis units </w:t>
       </w:r>
-      <w:del w:id="1634" w:author="Language Editor" w:date="2026-09-27T12:00:00Z">
+      <w:del w:id="1633" w:author="Language Editor" w:date="2026-09-27T12:00:00Z">
         <w:r>
           <w:delText xml:space="preserve">per region. Verified coordinates, acquisition dates and matched observations are required before these can become evaluation samples</w:delText>
         </w:r>
       </w:del>
-      <w:ins w:id="1635" w:author="Language Editor" w:date="2026-09-27T12:00:00Z">
+      <w:ins w:id="1634" w:author="Language Editor" w:date="2026-09-27T12:00:00Z">
         <w:r>
           <w:t xml:space="preserve">are defined in each region</w:t>
         </w:r>
@@ -7564,12 +7553,12 @@
       <w:r>
         <w:t xml:space="preserve">. Section 3.5 </w:t>
       </w:r>
-      <w:del w:id="1636" w:author="Language Editor" w:date="2026-09-27T12:00:00Z">
+      <w:del w:id="1635" w:author="Language Editor" w:date="2026-09-27T12:00:00Z">
         <w:r>
           <w:delText xml:space="preserve">consolidates the limitations of the illustrative evidence</w:delText>
         </w:r>
       </w:del>
-      <w:ins w:id="1637" w:author="Language Editor" w:date="2026-09-27T12:00:00Z">
+      <w:ins w:id="1636" w:author="Language Editor" w:date="2026-09-27T12:00:00Z">
         <w:r>
           <w:t xml:space="preserve">summarizes what the two cases reveal about the framework</w:t>
         </w:r>
@@ -7594,12 +7583,12 @@
       <w:r>
         <w:t xml:space="preserve">Fig. 4</w:t>
       </w:r>
-      <w:del w:id="1638" w:author="Language Editor" w:date="2026-09-27T12:00:00Z">
+      <w:del w:id="1637" w:author="Language Editor" w:date="2026-09-27T12:00:00Z">
         <w:r>
           <w:delText xml:space="preserve">  Case-location and window layout for</w:delText>
         </w:r>
       </w:del>
-      <w:ins w:id="1639" w:author="Language Editor" w:date="2026-09-27T12:00:00Z">
+      <w:ins w:id="1638" w:author="Language Editor" w:date="2026-09-27T12:00:00Z">
         <w:r>
           <w:t xml:space="preserve"> Case locations and analysis-unit layout in</w:t>
         </w:r>
@@ -7625,12 +7614,12 @@
       <w:r>
         <w:t xml:space="preserve">Table 2 organizes the case descriptions by parent material and location, land use and cropping, and field management. </w:t>
       </w:r>
-      <w:del w:id="1640" w:author="Language Editor" w:date="2026-09-27T12:00:00Z">
+      <w:del w:id="1639" w:author="Language Editor" w:date="2026-09-27T12:00:00Z">
         <w:r>
           <w:delText xml:space="preserve">An</w:delText>
         </w:r>
       </w:del>
-      <w:ins w:id="1641" w:author="Language Editor" w:date="2026-09-27T12:00:00Z">
+      <w:ins w:id="1640" w:author="Language Editor" w:date="2026-09-27T12:00:00Z">
         <w:r>
           <w:t xml:space="preserve">Each</w:t>
         </w:r>
@@ -7638,12 +7627,12 @@
       <w:r>
         <w:t xml:space="preserve"> annotation links a statement to the dimensions and reasoning level it addresses</w:t>
       </w:r>
-      <w:del w:id="1642" w:author="Language Editor" w:date="2026-09-27T12:00:00Z">
+      <w:del w:id="1641" w:author="Language Editor" w:date="2026-09-27T12:00:00Z">
         <w:r>
           <w:delText xml:space="preserve">, then</w:delText>
         </w:r>
       </w:del>
-      <w:ins w:id="1643" w:author="Language Editor" w:date="2026-09-27T12:00:00Z">
+      <w:ins w:id="1642" w:author="Language Editor" w:date="2026-09-27T12:00:00Z">
         <w:r>
           <w:t xml:space="preserve"> and</w:t>
         </w:r>
@@ -7651,12 +7640,12 @@
       <w:r>
         <w:t xml:space="preserve"> records its object, period, sources, statement type and evidence status. </w:t>
       </w:r>
-      <w:del w:id="1644" w:author="Language Editor" w:date="2026-09-27T12:00:00Z">
+      <w:del w:id="1643" w:author="Language Editor" w:date="2026-09-27T12:00:00Z">
         <w:r>
           <w:delText xml:space="preserve">This illustrates the intended annotation structure. A complete annotation protocol would additionally specify</w:delText>
         </w:r>
       </w:del>
-      <w:ins w:id="1645" w:author="Language Editor" w:date="2026-09-27T12:00:00Z">
+      <w:ins w:id="1644" w:author="Language Editor" w:date="2026-09-27T12:00:00Z">
         <w:r>
           <w:t xml:space="preserve">A full annotation protocol further specifies</w:t>
         </w:r>
@@ -7664,12 +7653,12 @@
       <w:r>
         <w:t xml:space="preserve"> annotator expertise, independent review, </w:t>
       </w:r>
-      <w:del w:id="1646" w:author="Language Editor" w:date="2026-09-27T12:00:00Z">
+      <w:del w:id="1645" w:author="Language Editor" w:date="2026-09-27T12:00:00Z">
         <w:r>
           <w:delText xml:space="preserve">disagreement handling</w:delText>
         </w:r>
       </w:del>
-      <w:ins w:id="1647" w:author="Language Editor" w:date="2026-09-27T12:00:00Z">
+      <w:ins w:id="1646" w:author="Language Editor" w:date="2026-09-27T12:00:00Z">
         <w:r>
           <w:t xml:space="preserve">handling of disagreement</w:t>
         </w:r>
@@ -7693,7 +7682,7 @@
         </w:rPr>
         <w:t xml:space="preserve">Table 2 Expert reasoning factors and their roles in the two </w:t>
       </w:r>
-      <w:del w:id="1648" w:author="Language Editor" w:date="2026-09-27T12:00:00Z">
+      <w:del w:id="1647" w:author="Language Editor" w:date="2026-09-27T12:00:00Z">
         <w:r>
           <w:rPr>
             <w:b/>
@@ -7704,7 +7693,7 @@
           <w:delText xml:space="preserve">case designs</w:delText>
         </w:r>
       </w:del>
-      <w:ins w:id="1649" w:author="Language Editor" w:date="2026-09-27T12:00:00Z">
+      <w:ins w:id="1648" w:author="Language Editor" w:date="2026-09-27T12:00:00Z">
         <w:r>
           <w:rPr>
             <w:b/>
@@ -8171,12 +8160,12 @@
       <w:r>
         <w:t xml:space="preserve">The</w:t>
       </w:r>
-      <w:del w:id="1650" w:author="Language Editor" w:date="2026-09-27T12:00:00Z">
+      <w:del w:id="1649" w:author="Language Editor" w:date="2026-09-27T12:00:00Z">
         <w:r>
           <w:delText xml:space="preserve"> following assessments illustrate</w:delText>
         </w:r>
       </w:del>
-      <w:ins w:id="1651" w:author="Language Editor" w:date="2026-09-27T12:00:00Z">
+      <w:ins w:id="1650" w:author="Language Editor" w:date="2026-09-27T12:00:00Z">
         <w:r>
           <w:t xml:space="preserve"> assessments below show</w:t>
         </w:r>
@@ -8184,12 +8173,12 @@
       <w:r>
         <w:t xml:space="preserve"> how the case information </w:t>
       </w:r>
-      <w:del w:id="1652" w:author="Language Editor" w:date="2026-09-27T12:00:00Z">
+      <w:del w:id="1651" w:author="Language Editor" w:date="2026-09-27T12:00:00Z">
         <w:r>
           <w:delText xml:space="preserve">would be used. They distinguish</w:delText>
         </w:r>
       </w:del>
-      <w:ins w:id="1653" w:author="Language Editor" w:date="2026-09-27T12:00:00Z">
+      <w:ins w:id="1652" w:author="Language Editor" w:date="2026-09-27T12:00:00Z">
         <w:r>
           <w:t xml:space="preserve">is used within the framework, separating</w:t>
         </w:r>
@@ -8197,12 +8186,12 @@
       <w:r>
         <w:t xml:space="preserve"> descriptive labels from explanations and </w:t>
       </w:r>
-      <w:del w:id="1654" w:author="Language Editor" w:date="2026-09-27T12:00:00Z">
+      <w:del w:id="1653" w:author="Language Editor" w:date="2026-09-27T12:00:00Z">
         <w:r>
           <w:delText xml:space="preserve">scenarios requiring further evidence. Record-level source identifiers and verified spatial and temporal links are not yet available for complete evaluation references.</w:delText>
         </w:r>
       </w:del>
-      <w:ins w:id="1655" w:author="Language Editor" w:date="2026-09-27T12:00:00Z">
+      <w:ins w:id="1654" w:author="Language Editor" w:date="2026-09-27T12:00:00Z">
         <w:r>
           <w:t xml:space="preserve">from scenarios that need further evidence.</w:t>
         </w:r>
@@ -8225,12 +8214,12 @@
       <w:r>
         <w:t xml:space="preserve">The Qiyang descriptions relate land use and fertilizer or amendment practices to soil acidity. Figure 5 </w:t>
       </w:r>
-      <w:del w:id="1656" w:author="Language Editor" w:date="2026-09-27T12:00:00Z">
+      <w:del w:id="1655" w:author="Language Editor" w:date="2026-09-27T12:00:00Z">
         <w:r>
           <w:delText xml:space="preserve">identifies</w:delText>
         </w:r>
       </w:del>
-      <w:ins w:id="1657" w:author="Language Editor" w:date="2026-09-27T12:00:00Z">
+      <w:ins w:id="1656" w:author="Language Editor" w:date="2026-09-27T12:00:00Z">
         <w:r>
           <w:t xml:space="preserve">shows</w:t>
         </w:r>
@@ -8238,12 +8227,12 @@
       <w:r>
         <w:t xml:space="preserve"> paddy use at Shangbaili and Tianlong and a paddy-to-upland </w:t>
       </w:r>
-      <w:del w:id="1658" w:author="Language Editor" w:date="2026-09-27T12:00:00Z">
+      <w:del w:id="1657" w:author="Language Editor" w:date="2026-09-27T12:00:00Z">
         <w:r>
           <w:delText xml:space="preserve">transition with predominantly maize at Simutang. Its labels also describe sandy-</w:delText>
         </w:r>
       </w:del>
-      <w:ins w:id="1659" w:author="Language Editor" w:date="2026-09-27T12:00:00Z">
+      <w:ins w:id="1658" w:author="Language Editor" w:date="2026-09-27T12:00:00Z">
         <w:r>
           <w:t xml:space="preserve">conversion, now mainly under maize, at Simutang. The labels also record sandy </w:t>
         </w:r>
@@ -8251,12 +8240,12 @@
       <w:r>
         <w:t xml:space="preserve">shale parent material and amendment practices. </w:t>
       </w:r>
-      <w:del w:id="1660" w:author="Language Editor" w:date="2026-09-27T12:00:00Z">
+      <w:del w:id="1659" w:author="Language Editor" w:date="2026-09-27T12:00:00Z">
         <w:r>
           <w:delText xml:space="preserve">These observations inform</w:delText>
         </w:r>
       </w:del>
-      <w:ins w:id="1661" w:author="Language Editor" w:date="2026-09-27T12:00:00Z">
+      <w:ins w:id="1660" w:author="Language Editor" w:date="2026-09-27T12:00:00Z">
         <w:r>
           <w:t xml:space="preserve">This information informs</w:t>
         </w:r>
@@ -8264,12 +8253,12 @@
       <w:r>
         <w:t xml:space="preserve"> D1 and D3</w:t>
       </w:r>
-      <w:del w:id="1662" w:author="Language Editor" w:date="2026-09-27T12:00:00Z">
+      <w:del w:id="1661" w:author="Language Editor" w:date="2026-09-27T12:00:00Z">
         <w:r>
           <w:delText xml:space="preserve">. Field</w:delText>
         </w:r>
       </w:del>
-      <w:ins w:id="1663" w:author="Language Editor" w:date="2026-09-27T12:00:00Z">
+      <w:ins w:id="1662" w:author="Language Editor" w:date="2026-09-27T12:00:00Z">
         <w:r>
           <w:t xml:space="preserve">, while field</w:t>
         </w:r>
@@ -8277,12 +8266,12 @@
       <w:r>
         <w:t xml:space="preserve"> infrastructure, crop condition, </w:t>
       </w:r>
-      <w:del w:id="1664" w:author="Language Editor" w:date="2026-09-27T12:00:00Z">
+      <w:del w:id="1663" w:author="Language Editor" w:date="2026-09-27T12:00:00Z">
         <w:r>
           <w:delText xml:space="preserve">yields and capacity require separate</w:delText>
         </w:r>
       </w:del>
-      <w:ins w:id="1665" w:author="Language Editor" w:date="2026-09-27T12:00:00Z">
+      <w:ins w:id="1664" w:author="Language Editor" w:date="2026-09-27T12:00:00Z">
         <w:r>
           <w:t xml:space="preserve">yield and capacity draw on</w:t>
         </w:r>
@@ -8290,12 +8279,12 @@
       <w:r>
         <w:t xml:space="preserve"> evidence under the other dimensions. The stated purpose of an amendment </w:t>
       </w:r>
-      <w:del w:id="1666" w:author="Language Editor" w:date="2026-09-27T12:00:00Z">
+      <w:del w:id="1665" w:author="Language Editor" w:date="2026-09-27T12:00:00Z">
         <w:r>
           <w:delText xml:space="preserve">does not establish its measured effect</w:delText>
         </w:r>
       </w:del>
-      <w:ins w:id="1667" w:author="Language Editor" w:date="2026-09-27T12:00:00Z">
+      <w:ins w:id="1666" w:author="Language Editor" w:date="2026-09-27T12:00:00Z">
         <w:r>
           <w:t xml:space="preserve">is recorded as intent; its effect has to be measured</w:t>
         </w:r>
@@ -8312,12 +8301,12 @@
       <w:r>
         <w:t xml:space="preserve">Illustrative assessment. At L1, the descriptions distinguish two double-season rice sites </w:t>
       </w:r>
-      <w:del w:id="1668" w:author="Language Editor" w:date="2026-09-27T12:00:00Z">
+      <w:del w:id="1667" w:author="Language Editor" w:date="2026-09-27T12:00:00Z">
         <w:r>
           <w:delText xml:space="preserve">and</w:delText>
         </w:r>
       </w:del>
-      <w:ins w:id="1669" w:author="Language Editor" w:date="2026-09-27T12:00:00Z">
+      <w:ins w:id="1668" w:author="Language Editor" w:date="2026-09-27T12:00:00Z">
         <w:r>
           <w:t xml:space="preserve">from</w:t>
         </w:r>
@@ -8325,12 +8314,12 @@
       <w:r>
         <w:t xml:space="preserve"> one predominantly maize site. </w:t>
       </w:r>
-      <w:del w:id="1670" w:author="Language Editor" w:date="2026-09-27T12:00:00Z">
+      <w:del w:id="1669" w:author="Language Editor" w:date="2026-09-27T12:00:00Z">
         <w:r>
           <w:delText xml:space="preserve">They do not include matched pH measurements, sampling depths or dates. A valid pH measurement could describe current acidity;</w:delText>
         </w:r>
       </w:del>
-      <w:ins w:id="1671" w:author="Language Editor" w:date="2026-09-27T12:00:00Z">
+      <w:ins w:id="1670" w:author="Language Editor" w:date="2026-09-27T12:00:00Z">
         <w:r>
           <w:t xml:space="preserve">A pH measurement with known depth and date describes current acidity, whereas an acidification trend requires</w:t>
         </w:r>
@@ -8338,20 +8327,20 @@
       <w:r>
         <w:t xml:space="preserve"> comparable repeated measurements</w:t>
       </w:r>
+      <w:del w:id="1671" w:author="Language Editor" w:date="2026-09-27T12:00:00Z">
+        <w:r>
+          <w:delText xml:space="preserve"> would be needed to assess an acidification trend</w:delText>
+        </w:r>
+      </w:del>
+      <w:r>
+        <w:t xml:space="preserve">. At L2, matched soil, crop and management observations </w:t>
+      </w:r>
       <w:del w:id="1672" w:author="Language Editor" w:date="2026-09-27T12:00:00Z">
         <w:r>
-          <w:delText xml:space="preserve"> would be needed to assess an acidification trend</w:delText>
-        </w:r>
-      </w:del>
-      <w:r>
-        <w:t xml:space="preserve">. At L2, matched soil, crop and management observations </w:t>
-      </w:r>
-      <w:del w:id="1673" w:author="Language Editor" w:date="2026-09-27T12:00:00Z">
-        <w:r>
           <w:delText xml:space="preserve">could support examination of competing explanations</w:delText>
         </w:r>
       </w:del>
-      <w:ins w:id="1674" w:author="Language Editor" w:date="2026-09-27T12:00:00Z">
+      <w:ins w:id="1673" w:author="Language Editor" w:date="2026-09-27T12:00:00Z">
         <w:r>
           <w:t xml:space="preserve">allow competing explanations to be examined</w:t>
         </w:r>
@@ -8359,12 +8348,12 @@
       <w:r>
         <w:t xml:space="preserve">. At L3, management options </w:t>
       </w:r>
-      <w:del w:id="1675" w:author="Language Editor" w:date="2026-09-27T12:00:00Z">
+      <w:del w:id="1674" w:author="Language Editor" w:date="2026-09-27T12:00:00Z">
         <w:r>
           <w:delText xml:space="preserve">would be considered</w:delText>
         </w:r>
       </w:del>
-      <w:ins w:id="1676" w:author="Language Editor" w:date="2026-09-27T12:00:00Z">
+      <w:ins w:id="1675" w:author="Language Editor" w:date="2026-09-27T12:00:00Z">
         <w:r>
           <w:t xml:space="preserve">are weighed</w:t>
         </w:r>
@@ -8372,12 +8361,12 @@
       <w:r>
         <w:t xml:space="preserve"> against crop requirements, site conditions and relevant response evidence. </w:t>
       </w:r>
-      <w:del w:id="1677" w:author="Language Editor" w:date="2026-09-27T12:00:00Z">
+      <w:del w:id="1676" w:author="Language Editor" w:date="2026-09-27T12:00:00Z">
         <w:r>
           <w:delText xml:space="preserve">On the current information, the appropriate response leaves</w:delText>
         </w:r>
       </w:del>
-      <w:ins w:id="1678" w:author="Language Editor" w:date="2026-09-27T12:00:00Z">
+      <w:ins w:id="1677" w:author="Language Editor" w:date="2026-09-27T12:00:00Z">
         <w:r>
           <w:t xml:space="preserve">When matched pH records are absent, CroplandGPT reports</w:t>
         </w:r>
@@ -8385,12 +8374,12 @@
       <w:r>
         <w:t xml:space="preserve"> acidification risk, amendment rates and yield effects </w:t>
       </w:r>
-      <w:del w:id="1679" w:author="Language Editor" w:date="2026-09-27T12:00:00Z">
+      <w:del w:id="1678" w:author="Language Editor" w:date="2026-09-27T12:00:00Z">
         <w:r>
           <w:delText xml:space="preserve">unassessed</w:delText>
         </w:r>
       </w:del>
-      <w:ins w:id="1680" w:author="Language Editor" w:date="2026-09-27T12:00:00Z">
+      <w:ins w:id="1679" w:author="Language Editor" w:date="2026-09-27T12:00:00Z">
         <w:r>
           <w:t xml:space="preserve">as unassessed and lists the observations required to assess them</w:t>
         </w:r>
@@ -8407,12 +8396,12 @@
       <w:r>
         <w:t xml:space="preserve">Fig. 5 </w:t>
       </w:r>
-      <w:del w:id="1681" w:author="Language Editor" w:date="2026-09-27T12:00:00Z">
+      <w:del w:id="1680" w:author="Language Editor" w:date="2026-09-27T12:00:00Z">
         <w:r>
           <w:delText xml:space="preserve">Qiyang overview</w:delText>
         </w:r>
       </w:del>
-      <w:ins w:id="1682" w:author="Language Editor" w:date="2026-09-27T12:00:00Z">
+      <w:ins w:id="1681" w:author="Language Editor" w:date="2026-09-27T12:00:00Z">
         <w:r>
           <w:t xml:space="preserve">Overview of Qiyang</w:t>
         </w:r>
@@ -8420,12 +8409,12 @@
       <w:r>
         <w:t xml:space="preserve"> and site descriptions in Babao Town. </w:t>
       </w:r>
-      <w:del w:id="1683" w:author="Language Editor" w:date="2026-09-27T12:00:00Z">
+      <w:del w:id="1682" w:author="Language Editor" w:date="2026-09-27T12:00:00Z">
         <w:r>
           <w:delText xml:space="preserve">The supplied imagery</w:delText>
         </w:r>
       </w:del>
-      <w:ins w:id="1684" w:author="Language Editor" w:date="2026-09-27T12:00:00Z">
+      <w:ins w:id="1683" w:author="Language Editor" w:date="2026-09-27T12:00:00Z">
         <w:r>
           <w:t xml:space="preserve">Imagery</w:t>
         </w:r>
@@ -8433,12 +8422,12 @@
       <w:r>
         <w:t xml:space="preserve"> and labels describe land use, crops, parent material and management practices</w:t>
       </w:r>
-      <w:del w:id="1685" w:author="Language Editor" w:date="2026-09-27T12:00:00Z">
+      <w:del w:id="1684" w:author="Language Editor" w:date="2026-09-27T12:00:00Z">
         <w:r>
           <w:delText xml:space="preserve">. Amendment descriptions state an intended purpose. Image provenance, acquisition dates, coordinates and correspondence to the proposed analysis units require verification.</w:delText>
         </w:r>
       </w:del>
-      <w:ins w:id="1686" w:author="Language Editor" w:date="2026-09-27T12:00:00Z">
+      <w:ins w:id="1685" w:author="Language Editor" w:date="2026-09-27T12:00:00Z">
         <w:r>
           <w:t xml:space="preserve">; amendment descriptions state the intended purpose of each practice.</w:t>
         </w:r>
@@ -8461,33 +8450,33 @@
       <w:r>
         <w:t xml:space="preserve">The Quzhou case </w:t>
       </w:r>
-      <w:del w:id="1687" w:author="Language Editor" w:date="2026-09-27T12:00:00Z">
+      <w:del w:id="1686" w:author="Language Editor" w:date="2026-09-27T12:00:00Z">
         <w:r>
           <w:delText xml:space="preserve">concerns</w:delText>
         </w:r>
       </w:del>
+      <w:ins w:id="1687" w:author="Language Editor" w:date="2026-09-27T12:00:00Z">
+        <w:r>
+          <w:t xml:space="preserve">examines</w:t>
+        </w:r>
+      </w:ins>
+      <w:r>
+        <w:t xml:space="preserve"> how resource, infrastructure and management conditions relate to production performance and its persistence. D1–D3 describe background conditions and practices, D4 describes crop growth, D5 describes realized yield and </w:t>
+      </w:r>
       <w:ins w:id="1688" w:author="Language Editor" w:date="2026-09-27T12:00:00Z">
         <w:r>
-          <w:t xml:space="preserve">examines</w:t>
-        </w:r>
-      </w:ins>
-      <w:r>
-        <w:t xml:space="preserve"> how resource, infrastructure and management conditions relate to production performance and its persistence. D1–D3 describe background conditions and practices, D4 describes crop growth, D5 describes realized yield and </w:t>
-      </w:r>
-      <w:ins w:id="1689" w:author="Language Editor" w:date="2026-09-27T12:00:00Z">
-        <w:r>
           <w:t xml:space="preserve">its </w:t>
         </w:r>
       </w:ins>
       <w:r>
         <w:t xml:space="preserve">variability, and D6 integrates this evidence </w:t>
       </w:r>
-      <w:del w:id="1690" w:author="Language Editor" w:date="2026-09-27T12:00:00Z">
+      <w:del w:id="1689" w:author="Language Editor" w:date="2026-09-27T12:00:00Z">
         <w:r>
           <w:delText xml:space="preserve">under</w:delText>
         </w:r>
       </w:del>
-      <w:ins w:id="1691" w:author="Language Editor" w:date="2026-09-27T12:00:00Z">
+      <w:ins w:id="1690" w:author="Language Editor" w:date="2026-09-27T12:00:00Z">
         <w:r>
           <w:t xml:space="preserve">for</w:t>
         </w:r>
@@ -8495,12 +8484,12 @@
       <w:r>
         <w:t xml:space="preserve"> a specified cropping system and period. The winter wheat–summer maize </w:t>
       </w:r>
-      <w:del w:id="1692" w:author="Language Editor" w:date="2026-09-27T12:00:00Z">
+      <w:del w:id="1691" w:author="Language Editor" w:date="2026-09-27T12:00:00Z">
         <w:r>
           <w:delText xml:space="preserve">context in the case descriptions must be</w:delText>
         </w:r>
       </w:del>
-      <w:ins w:id="1693" w:author="Language Editor" w:date="2026-09-27T12:00:00Z">
+      <w:ins w:id="1692" w:author="Language Editor" w:date="2026-09-27T12:00:00Z">
         <w:r>
           <w:t xml:space="preserve">rotation is</w:t>
         </w:r>
@@ -8508,12 +8497,12 @@
       <w:r>
         <w:t xml:space="preserve"> confirmed for each analysis object</w:t>
       </w:r>
-      <w:del w:id="1694" w:author="Language Editor" w:date="2026-09-27T12:00:00Z">
+      <w:del w:id="1693" w:author="Language Editor" w:date="2026-09-27T12:00:00Z">
         <w:r>
           <w:delText xml:space="preserve">. Water</w:delText>
         </w:r>
       </w:del>
-      <w:ins w:id="1695" w:author="Language Editor" w:date="2026-09-27T12:00:00Z">
+      <w:ins w:id="1694" w:author="Language Editor" w:date="2026-09-27T12:00:00Z">
         <w:r>
           <w:t xml:space="preserve">, and water</w:t>
         </w:r>
@@ -8521,12 +8510,12 @@
       <w:r>
         <w:t xml:space="preserve"> and fertilizer management </w:t>
       </w:r>
-      <w:del w:id="1696" w:author="Language Editor" w:date="2026-09-27T12:00:00Z">
+      <w:del w:id="1695" w:author="Language Editor" w:date="2026-09-27T12:00:00Z">
         <w:r>
           <w:delText xml:space="preserve">provide</w:delText>
         </w:r>
       </w:del>
-      <w:ins w:id="1697" w:author="Language Editor" w:date="2026-09-27T12:00:00Z">
+      <w:ins w:id="1696" w:author="Language Editor" w:date="2026-09-27T12:00:00Z">
         <w:r>
           <w:t xml:space="preserve">are treated as</w:t>
         </w:r>
@@ -8543,12 +8532,12 @@
       <w:r>
         <w:t xml:space="preserve">Illustrative assessment. L1 organizes field boundaries, cropping systems, facilities, dated management records, crop condition and realized yields. L2 examines their associations </w:t>
       </w:r>
-      <w:del w:id="1698" w:author="Language Editor" w:date="2026-09-27T12:00:00Z">
+      <w:del w:id="1697" w:author="Language Editor" w:date="2026-09-27T12:00:00Z">
         <w:r>
           <w:delText xml:space="preserve">using</w:delText>
         </w:r>
       </w:del>
-      <w:ins w:id="1699" w:author="Language Editor" w:date="2026-09-27T12:00:00Z">
+      <w:ins w:id="1698" w:author="Language Editor" w:date="2026-09-27T12:00:00Z">
         <w:r>
           <w:t xml:space="preserve">across</w:t>
         </w:r>
@@ -8556,12 +8545,12 @@
       <w:r>
         <w:t xml:space="preserve"> comparable seasons and fields</w:t>
       </w:r>
-      <w:del w:id="1700" w:author="Language Editor" w:date="2026-09-27T12:00:00Z">
+      <w:del w:id="1699" w:author="Language Editor" w:date="2026-09-27T12:00:00Z">
         <w:r>
           <w:delText xml:space="preserve">; sustained capacity requires more than</w:delText>
         </w:r>
       </w:del>
-      <w:ins w:id="1701" w:author="Language Editor" w:date="2026-09-27T12:00:00Z">
+      <w:ins w:id="1700" w:author="Language Editor" w:date="2026-09-27T12:00:00Z">
         <w:r>
           <w:t xml:space="preserve">, since sustained capacity cannot be inferred from</w:t>
         </w:r>
@@ -8569,12 +8558,12 @@
       <w:r>
         <w:t xml:space="preserve"> a single high-yield observation. L3 compares feasible options with a specified reference under water, nutrient and other resource constraints. Without matched records or validated response estimates, the </w:t>
       </w:r>
-      <w:del w:id="1702" w:author="Language Editor" w:date="2026-09-27T12:00:00Z">
+      <w:del w:id="1701" w:author="Language Editor" w:date="2026-09-27T12:00:00Z">
         <w:r>
           <w:delText xml:space="preserve">case can identify</w:delText>
         </w:r>
       </w:del>
-      <w:ins w:id="1703" w:author="Language Editor" w:date="2026-09-27T12:00:00Z">
+      <w:ins w:id="1702" w:author="Language Editor" w:date="2026-09-27T12:00:00Z">
         <w:r>
           <w:t xml:space="preserve">framework identifies the</w:t>
         </w:r>
@@ -8582,12 +8571,12 @@
       <w:r>
         <w:t xml:space="preserve"> relevant questions and </w:t>
       </w:r>
-      <w:del w:id="1704" w:author="Language Editor" w:date="2026-09-27T12:00:00Z">
+      <w:del w:id="1703" w:author="Language Editor" w:date="2026-09-27T12:00:00Z">
         <w:r>
           <w:delText xml:space="preserve">missing evidence but cannot quantify a management benefit</w:delText>
         </w:r>
       </w:del>
-      <w:ins w:id="1705" w:author="Language Editor" w:date="2026-09-27T12:00:00Z">
+      <w:ins w:id="1704" w:author="Language Editor" w:date="2026-09-27T12:00:00Z">
         <w:r>
           <w:t xml:space="preserve">the missing evidence and refrains from quantifying management benefits</w:t>
         </w:r>
@@ -8602,7 +8591,7 @@
         <w:spacing w:before="200" w:after="60"/>
         <w:jc w:val="center"/>
       </w:pPr>
-      <w:ins w:id="1883" w:author="Language Editor" w:date="2026-09-27T12:00:00Z">
+      <w:ins w:id="1882" w:author="Language Editor" w:date="2026-09-27T12:00:00Z">
         <w:r>
           <w:drawing xmlns:a="http://schemas.openxmlformats.org/drawingml/2006/main" xmlns:pic="http://schemas.openxmlformats.org/drawingml/2006/picture">
             <wp:inline distT="0" distB="0" distL="0" distR="0">
@@ -8649,12 +8638,12 @@
       <w:r>
         <w:t xml:space="preserve">Fig. 6 </w:t>
       </w:r>
-      <w:del w:id="1706" w:author="Language Editor" w:date="2026-09-27T12:00:00Z">
+      <w:del w:id="1705" w:author="Language Editor" w:date="2026-09-27T12:00:00Z">
         <w:r>
           <w:delText xml:space="preserve">Quzhou assessment</w:delText>
         </w:r>
       </w:del>
-      <w:ins w:id="1707" w:author="Language Editor" w:date="2026-09-27T12:00:00Z">
+      <w:ins w:id="1706" w:author="Language Editor" w:date="2026-09-27T12:00:00Z">
         <w:r>
           <w:t xml:space="preserve">Assessment of production capacity in Quzhou</w:t>
         </w:r>
@@ -8662,12 +8651,12 @@
       <w:r>
         <w:t xml:space="preserve"> across three reasoning levels. State description, cross-dimensional interpretation and conditional scenarios require progressively different evidence. The diagram </w:t>
       </w:r>
-      <w:del w:id="1708" w:author="Language Editor" w:date="2026-09-27T12:00:00Z">
+      <w:del w:id="1707" w:author="Language Editor" w:date="2026-09-27T12:00:00Z">
         <w:r>
           <w:delText xml:space="preserve">specifies</w:delText>
         </w:r>
       </w:del>
-      <w:ins w:id="1709" w:author="Language Editor" w:date="2026-09-27T12:00:00Z">
+      <w:ins w:id="1708" w:author="Language Editor" w:date="2026-09-27T12:00:00Z">
         <w:r>
           <w:t xml:space="preserve">shows</w:t>
         </w:r>
@@ -8675,12 +8664,12 @@
       <w:r>
         <w:t xml:space="preserve"> how production-capacity questions </w:t>
       </w:r>
-      <w:del w:id="1710" w:author="Language Editor" w:date="2026-09-27T12:00:00Z">
+      <w:del w:id="1709" w:author="Language Editor" w:date="2026-09-27T12:00:00Z">
         <w:r>
           <w:delText xml:space="preserve">would be assessed, rather than reporting validated yields or intervention effects</w:delText>
         </w:r>
       </w:del>
-      <w:ins w:id="1711" w:author="Language Editor" w:date="2026-09-27T12:00:00Z">
+      <w:ins w:id="1710" w:author="Language Editor" w:date="2026-09-27T12:00:00Z">
         <w:r>
           <w:t xml:space="preserve">are assessed within the framework</w:t>
         </w:r>
@@ -8697,12 +8686,12 @@
       <w:r>
         <w:t xml:space="preserve">3.5 </w:t>
       </w:r>
-      <w:del w:id="1712" w:author="Language Editor" w:date="2026-09-27T12:00:00Z">
+      <w:del w:id="1711" w:author="Language Editor" w:date="2026-09-27T12:00:00Z">
         <w:r>
           <w:delText xml:space="preserve">Scope of the case illustrations</w:delText>
         </w:r>
       </w:del>
-      <w:ins w:id="1713" w:author="Language Editor" w:date="2026-09-27T12:00:00Z">
+      <w:ins w:id="1712" w:author="Language Editor" w:date="2026-09-27T12:00:00Z">
         <w:r>
           <w:t xml:space="preserve">Transferability across contrasting settings</w:t>
         </w:r>
@@ -8716,12 +8705,12 @@
       <w:r>
         <w:t xml:space="preserve">The </w:t>
       </w:r>
-      <w:del w:id="1714" w:author="Language Editor" w:date="2026-09-27T12:00:00Z">
+      <w:del w:id="1713" w:author="Language Editor" w:date="2026-09-27T12:00:00Z">
         <w:r>
           <w:delText xml:space="preserve">cases demonstrate the organization of contrasting agricultural questions under a common spatial and assessment specification. Neither is accompanied by a complete georeferenced dataset, reviewed annotation corpus, implemented system and independent reference outputs. They therefore support a methodological illustration rather than validation of predictive accuracy, causal attribution, management effectiveness or transfer between regions. The missing source links, sampling metadata and evaluation evidence define the next requirements for empirical work</w:delText>
         </w:r>
       </w:del>
-      <w:ins w:id="1715" w:author="Language Editor" w:date="2026-09-27T12:00:00Z">
+      <w:ins w:id="1714" w:author="Language Editor" w:date="2026-09-27T12:00:00Z">
         <w:r>
           <w:t xml:space="preserve">two cases differ in their dominant constraint, cropping system and assessment objective, yet both fit the same spatial and assessment specification. In Qiyang, the question centers on D1 and D3 and on the distinction between current acidity and acidification. In Quzhou, it centers on D5 and D6 and on the distinction between realized yield and sustained capacity. In both cases, the framework makes explicit which georeferenced observations, sampling metadata and reference outputs an assessment needs, and these requirements define the data program for training and evaluating CroplandGPT</w:t>
         </w:r>
@@ -8756,12 +8745,12 @@
       <w:r>
         <w:t xml:space="preserve">CroplandGPT connects spatial representation, interpretable task outputs and language-based assessment within </w:t>
       </w:r>
-      <w:del w:id="1716" w:author="Language Editor" w:date="2026-09-27T12:00:00Z">
+      <w:del w:id="1715" w:author="Language Editor" w:date="2026-09-27T12:00:00Z">
         <w:r>
           <w:delText xml:space="preserve">one proposed workflow. Its architecture shares the</w:delText>
         </w:r>
       </w:del>
-      <w:ins w:id="1717" w:author="Language Editor" w:date="2026-09-27T12:00:00Z">
+      <w:ins w:id="1716" w:author="Language Editor" w:date="2026-09-27T12:00:00Z">
         <w:r>
           <w:t xml:space="preserve">a single workflow. Its mapping and language branches share one</w:t>
         </w:r>
@@ -8769,12 +8758,12 @@
       <w:r>
         <w:t xml:space="preserve"> geospatial encoding front end</w:t>
       </w:r>
-      <w:del w:id="1718" w:author="Language Editor" w:date="2026-09-27T12:00:00Z">
+      <w:del w:id="1717" w:author="Language Editor" w:date="2026-09-27T12:00:00Z">
         <w:r>
           <w:delText xml:space="preserve"> across mapping and language branches, rather than duplicating</w:delText>
         </w:r>
       </w:del>
-      <w:ins w:id="1719" w:author="Language Editor" w:date="2026-09-27T12:00:00Z">
+      <w:ins w:id="1718" w:author="Language Editor" w:date="2026-09-27T12:00:00Z">
         <w:r>
           <w:t xml:space="preserve">, which avoids duplicated</w:t>
         </w:r>
@@ -8782,12 +8771,12 @@
       <w:r>
         <w:t xml:space="preserve"> image encoding. The continuous path preserves spatial context</w:t>
       </w:r>
-      <w:del w:id="1720" w:author="Language Editor" w:date="2026-09-27T12:00:00Z">
+      <w:del w:id="1719" w:author="Language Editor" w:date="2026-09-27T12:00:00Z">
         <w:r>
           <w:delText xml:space="preserve">;</w:delText>
         </w:r>
       </w:del>
-      <w:ins w:id="1721" w:author="Language Editor" w:date="2026-09-27T12:00:00Z">
+      <w:ins w:id="1720" w:author="Language Editor" w:date="2026-09-27T12:00:00Z">
         <w:r>
           <w:t xml:space="preserve">, and</w:t>
         </w:r>
@@ -8795,12 +8784,12 @@
       <w:r>
         <w:t xml:space="preserve"> the explicit path retains the values and sources needed </w:t>
       </w:r>
-      <w:del w:id="1722" w:author="Language Editor" w:date="2026-09-27T12:00:00Z">
+      <w:del w:id="1721" w:author="Language Editor" w:date="2026-09-27T12:00:00Z">
         <w:r>
           <w:delText xml:space="preserve">for checking</w:delText>
         </w:r>
       </w:del>
-      <w:ins w:id="1723" w:author="Language Editor" w:date="2026-09-27T12:00:00Z">
+      <w:ins w:id="1722" w:author="Language Editor" w:date="2026-09-27T12:00:00Z">
         <w:r>
           <w:t xml:space="preserve">to check</w:t>
         </w:r>
@@ -8808,12 +8797,12 @@
       <w:r>
         <w:t xml:space="preserve"> statements. Query-based </w:t>
       </w:r>
-      <w:del w:id="1724" w:author="Language Editor" w:date="2026-09-27T12:00:00Z">
+      <w:del w:id="1723" w:author="Language Editor" w:date="2026-09-27T12:00:00Z">
         <w:r>
           <w:delText xml:space="preserve">visual-language bridging has established precedents</w:delText>
         </w:r>
       </w:del>
-      <w:ins w:id="1725" w:author="Language Editor" w:date="2026-09-27T12:00:00Z">
+      <w:ins w:id="1724" w:author="Language Editor" w:date="2026-09-27T12:00:00Z">
         <w:r>
           <w:t xml:space="preserve">vision-language bridging is well established</w:t>
         </w:r>
@@ -8839,7 +8828,7 @@
       <w:r>
         <w:t xml:space="preserve">, and existing agricultural agents and embedding-language systems </w:t>
       </w:r>
-      <w:del w:id="1726" w:author="Language Editor" w:date="2026-09-27T12:00:00Z">
+      <w:del w:id="1725" w:author="Language Editor" w:date="2026-09-27T12:00:00Z">
         <w:r>
           <w:delText xml:space="preserve">already </w:delText>
         </w:r>
@@ -8865,12 +8854,12 @@
       <w:r>
         <w:t xml:space="preserve">. </w:t>
       </w:r>
-      <w:del w:id="1727" w:author="Language Editor" w:date="2026-09-27T12:00:00Z">
+      <w:del w:id="1726" w:author="Language Editor" w:date="2026-09-27T12:00:00Z">
         <w:r>
           <w:delText xml:space="preserve">The proposed contribution is their organization</w:delText>
         </w:r>
       </w:del>
-      <w:ins w:id="1728" w:author="Language Editor" w:date="2026-09-27T12:00:00Z">
+      <w:ins w:id="1727" w:author="Language Editor" w:date="2026-09-27T12:00:00Z">
         <w:r>
           <w:t xml:space="preserve">CroplandGPT organizes these elements</w:t>
         </w:r>
@@ -8887,12 +8876,12 @@
       <w:r>
         <w:t xml:space="preserve">The </w:t>
       </w:r>
-      <w:del w:id="1729" w:author="Language Editor" w:date="2026-09-27T12:00:00Z">
+      <w:del w:id="1728" w:author="Language Editor" w:date="2026-09-27T12:00:00Z">
         <w:r>
           <w:delText xml:space="preserve">expected benefits are testable. Shared features may improve consistency across</w:delText>
         </w:r>
       </w:del>
-      <w:ins w:id="1730" w:author="Language Editor" w:date="2026-09-27T12:00:00Z">
+      <w:ins w:id="1729" w:author="Language Editor" w:date="2026-09-27T12:00:00Z">
         <w:r>
           <w:t xml:space="preserve">framework leads to testable expectations. Shared features should improve consistency between</w:t>
         </w:r>
@@ -8900,12 +8889,12 @@
       <w:r>
         <w:t xml:space="preserve"> spatial and language outputs</w:t>
       </w:r>
-      <w:del w:id="1731" w:author="Language Editor" w:date="2026-09-27T12:00:00Z">
+      <w:del w:id="1730" w:author="Language Editor" w:date="2026-09-27T12:00:00Z">
         <w:r>
           <w:delText xml:space="preserve">;</w:delText>
         </w:r>
       </w:del>
-      <w:ins w:id="1732" w:author="Language Editor" w:date="2026-09-27T12:00:00Z">
+      <w:ins w:id="1731" w:author="Language Editor" w:date="2026-09-27T12:00:00Z">
         <w:r>
           <w:t xml:space="preserve">,</w:t>
         </w:r>
@@ -8913,12 +8902,12 @@
       <w:r>
         <w:t xml:space="preserve"> object and period links </w:t>
       </w:r>
-      <w:del w:id="1733" w:author="Language Editor" w:date="2026-09-27T12:00:00Z">
+      <w:del w:id="1732" w:author="Language Editor" w:date="2026-09-27T12:00:00Z">
         <w:r>
           <w:delText xml:space="preserve">may</w:delText>
         </w:r>
       </w:del>
-      <w:ins w:id="1734" w:author="Language Editor" w:date="2026-09-27T12:00:00Z">
+      <w:ins w:id="1733" w:author="Language Editor" w:date="2026-09-27T12:00:00Z">
         <w:r>
           <w:t xml:space="preserve">should</w:t>
         </w:r>
@@ -8926,12 +8915,12 @@
       <w:r>
         <w:t xml:space="preserve"> reduce evidence mismatch</w:t>
       </w:r>
-      <w:del w:id="1735" w:author="Language Editor" w:date="2026-09-27T12:00:00Z">
+      <w:del w:id="1734" w:author="Language Editor" w:date="2026-09-27T12:00:00Z">
         <w:r>
           <w:delText xml:space="preserve">;</w:delText>
         </w:r>
       </w:del>
-      <w:ins w:id="1736" w:author="Language Editor" w:date="2026-09-27T12:00:00Z">
+      <w:ins w:id="1735" w:author="Language Editor" w:date="2026-09-27T12:00:00Z">
         <w:r>
           <w:t xml:space="preserve">,</w:t>
         </w:r>
@@ -8939,12 +8928,12 @@
       <w:r>
         <w:t xml:space="preserve"> and explicit criteria </w:t>
       </w:r>
-      <w:del w:id="1737" w:author="Language Editor" w:date="2026-09-27T12:00:00Z">
+      <w:del w:id="1736" w:author="Language Editor" w:date="2026-09-27T12:00:00Z">
         <w:r>
           <w:delText xml:space="preserve">may improve</w:delText>
         </w:r>
       </w:del>
-      <w:ins w:id="1738" w:author="Language Editor" w:date="2026-09-27T12:00:00Z">
+      <w:ins w:id="1737" w:author="Language Editor" w:date="2026-09-27T12:00:00Z">
         <w:r>
           <w:t xml:space="preserve">should sharpen</w:t>
         </w:r>
@@ -8952,12 +8941,12 @@
       <w:r>
         <w:t xml:space="preserve"> the scope of agricultural judgments. </w:t>
       </w:r>
-      <w:del w:id="1739" w:author="Language Editor" w:date="2026-09-27T12:00:00Z">
+      <w:del w:id="1738" w:author="Language Editor" w:date="2026-09-27T12:00:00Z">
         <w:r>
           <w:delText xml:space="preserve">These effects cannot be inferred from</w:delText>
         </w:r>
       </w:del>
-      <w:ins w:id="1740" w:author="Language Editor" w:date="2026-09-27T12:00:00Z">
+      <w:ins w:id="1739" w:author="Language Editor" w:date="2026-09-27T12:00:00Z">
         <w:r>
           <w:t xml:space="preserve">Testing these expectations requires controlling for</w:t>
         </w:r>
@@ -8965,12 +8954,12 @@
       <w:r>
         <w:t xml:space="preserve"> model size, tokenization </w:t>
       </w:r>
-      <w:del w:id="1741" w:author="Language Editor" w:date="2026-09-27T12:00:00Z">
+      <w:del w:id="1740" w:author="Language Editor" w:date="2026-09-27T12:00:00Z">
         <w:r>
           <w:delText xml:space="preserve">or the</w:delText>
         </w:r>
       </w:del>
-      <w:ins w:id="1742" w:author="Language Editor" w:date="2026-09-27T12:00:00Z">
+      <w:ins w:id="1741" w:author="Language Editor" w:date="2026-09-27T12:00:00Z">
         <w:r>
           <w:t xml:space="preserve">and the mere</w:t>
         </w:r>
@@ -8978,12 +8967,12 @@
       <w:r>
         <w:t xml:space="preserve"> presence of an adapter. Comparisons </w:t>
       </w:r>
-      <w:del w:id="1743" w:author="Language Editor" w:date="2026-09-27T12:00:00Z">
+      <w:del w:id="1742" w:author="Language Editor" w:date="2026-09-27T12:00:00Z">
         <w:r>
           <w:delText xml:space="preserve">must establish whether the proposed mechanisms add value beyond</w:delText>
         </w:r>
       </w:del>
-      <w:ins w:id="1744" w:author="Language Editor" w:date="2026-09-27T12:00:00Z">
+      <w:ins w:id="1743" w:author="Language Editor" w:date="2026-09-27T12:00:00Z">
         <w:r>
           <w:t xml:space="preserve">with</w:t>
         </w:r>
@@ -8991,12 +8980,12 @@
       <w:r>
         <w:t xml:space="preserve"> task-specific predictors, structured retrieval and rule-based assessment </w:t>
       </w:r>
-      <w:del w:id="1745" w:author="Language Editor" w:date="2026-09-27T12:00:00Z">
+      <w:del w:id="1744" w:author="Language Editor" w:date="2026-09-27T12:00:00Z">
         <w:r>
           <w:delText xml:space="preserve">using equivalent observations</w:delText>
         </w:r>
       </w:del>
-      <w:ins w:id="1746" w:author="Language Editor" w:date="2026-09-27T12:00:00Z">
+      <w:ins w:id="1745" w:author="Language Editor" w:date="2026-09-27T12:00:00Z">
         <w:r>
           <w:t xml:space="preserve">on the same observations will quantify the added value of each mechanism</w:t>
         </w:r>
@@ -9022,12 +9011,12 @@
       <w:r>
         <w:t xml:space="preserve">D1–D6 define what is assessed, </w:t>
       </w:r>
-      <w:del w:id="1747" w:author="Language Editor" w:date="2026-09-27T12:00:00Z">
+      <w:del w:id="1746" w:author="Language Editor" w:date="2026-09-27T12:00:00Z">
         <w:r>
           <w:delText xml:space="preserve">while</w:delText>
         </w:r>
       </w:del>
-      <w:ins w:id="1748" w:author="Language Editor" w:date="2026-09-27T12:00:00Z">
+      <w:ins w:id="1747" w:author="Language Editor" w:date="2026-09-27T12:00:00Z">
         <w:r>
           <w:t xml:space="preserve">and</w:t>
         </w:r>
@@ -9035,12 +9024,12 @@
       <w:r>
         <w:t xml:space="preserve"> L1–L3 define the scope and evidence requirements of </w:t>
       </w:r>
-      <w:del w:id="1749" w:author="Language Editor" w:date="2026-09-27T12:00:00Z">
+      <w:del w:id="1748" w:author="Language Editor" w:date="2026-09-27T12:00:00Z">
         <w:r>
           <w:delText xml:space="preserve">the judgment. This distinction</w:delText>
         </w:r>
       </w:del>
-      <w:ins w:id="1750" w:author="Language Editor" w:date="2026-09-27T12:00:00Z">
+      <w:ins w:id="1749" w:author="Language Editor" w:date="2026-09-27T12:00:00Z">
         <w:r>
           <w:t xml:space="preserve">each judgment. Separating the two</w:t>
         </w:r>
@@ -9048,12 +9037,12 @@
       <w:r>
         <w:t xml:space="preserve"> supports consistent annotation without </w:t>
       </w:r>
-      <w:del w:id="1751" w:author="Language Editor" w:date="2026-09-27T12:00:00Z">
+      <w:del w:id="1750" w:author="Language Editor" w:date="2026-09-27T12:00:00Z">
         <w:r>
           <w:delText xml:space="preserve">requiring</w:delText>
         </w:r>
       </w:del>
-      <w:ins w:id="1752" w:author="Language Editor" w:date="2026-09-27T12:00:00Z">
+      <w:ins w:id="1751" w:author="Language Editor" w:date="2026-09-27T12:00:00Z">
         <w:r>
           <w:t xml:space="preserve">imposing</w:t>
         </w:r>
@@ -9061,12 +9050,12 @@
       <w:r>
         <w:t xml:space="preserve"> a fixed reasoning order. Parent material, cropping and management </w:t>
       </w:r>
-      <w:del w:id="1753" w:author="Language Editor" w:date="2026-09-27T12:00:00Z">
+      <w:del w:id="1752" w:author="Language Editor" w:date="2026-09-27T12:00:00Z">
         <w:r>
           <w:delText xml:space="preserve">provide</w:delText>
         </w:r>
       </w:del>
-      <w:ins w:id="1754" w:author="Language Editor" w:date="2026-09-27T12:00:00Z">
+      <w:ins w:id="1753" w:author="Language Editor" w:date="2026-09-27T12:00:00Z">
         <w:r>
           <w:t xml:space="preserve">supply</w:t>
         </w:r>
@@ -9074,12 +9063,12 @@
       <w:r>
         <w:t xml:space="preserve"> explanatory context across the dimensions. The structure </w:t>
       </w:r>
-      <w:del w:id="1755" w:author="Language Editor" w:date="2026-09-27T12:00:00Z">
+      <w:del w:id="1754" w:author="Language Editor" w:date="2026-09-27T12:00:00Z">
         <w:r>
           <w:delText xml:space="preserve">should help an assessor</w:delText>
         </w:r>
       </w:del>
-      <w:ins w:id="1756" w:author="Language Editor" w:date="2026-09-27T12:00:00Z">
+      <w:ins w:id="1755" w:author="Language Editor" w:date="2026-09-27T12:00:00Z">
         <w:r>
           <w:t xml:space="preserve">helps assessors</w:t>
         </w:r>
@@ -9087,12 +9076,12 @@
       <w:r>
         <w:t xml:space="preserve"> distinguish a reported condition from a plausible explanation </w:t>
       </w:r>
-      <w:del w:id="1757" w:author="Language Editor" w:date="2026-09-27T12:00:00Z">
+      <w:del w:id="1756" w:author="Language Editor" w:date="2026-09-27T12:00:00Z">
         <w:r>
           <w:delText xml:space="preserve">or</w:delText>
         </w:r>
       </w:del>
-      <w:ins w:id="1758" w:author="Language Editor" w:date="2026-09-27T12:00:00Z">
+      <w:ins w:id="1757" w:author="Language Editor" w:date="2026-09-27T12:00:00Z">
         <w:r>
           <w:t xml:space="preserve">and from</w:t>
         </w:r>
@@ -9100,12 +9089,12 @@
       <w:r>
         <w:t xml:space="preserve"> a conditional option</w:t>
       </w:r>
-      <w:del w:id="1759" w:author="Language Editor" w:date="2026-09-27T12:00:00Z">
+      <w:del w:id="1758" w:author="Language Editor" w:date="2026-09-27T12:00:00Z">
         <w:r>
           <w:delText xml:space="preserve">. Its usefulness and reproducibility need to</w:delText>
         </w:r>
       </w:del>
-      <w:ins w:id="1760" w:author="Language Editor" w:date="2026-09-27T12:00:00Z">
+      <w:ins w:id="1759" w:author="Language Editor" w:date="2026-09-27T12:00:00Z">
         <w:r>
           <w:t xml:space="preserve">, and its usability and reproducibility can</w:t>
         </w:r>
@@ -9113,12 +9102,12 @@
       <w:r>
         <w:t xml:space="preserve"> be evaluated with annotators and </w:t>
       </w:r>
-      <w:del w:id="1761" w:author="Language Editor" w:date="2026-09-27T12:00:00Z">
+      <w:del w:id="1760" w:author="Language Editor" w:date="2026-09-27T12:00:00Z">
         <w:r>
           <w:delText xml:space="preserve">intended</w:delText>
         </w:r>
       </w:del>
-      <w:ins w:id="1762" w:author="Language Editor" w:date="2026-09-27T12:00:00Z">
+      <w:ins w:id="1761" w:author="Language Editor" w:date="2026-09-27T12:00:00Z">
         <w:r>
           <w:t xml:space="preserve">end</w:t>
         </w:r>
@@ -9135,12 +9124,12 @@
       <w:r>
         <w:t xml:space="preserve">Expert relationships </w:t>
       </w:r>
-      <w:del w:id="1763" w:author="Language Editor" w:date="2026-09-27T12:00:00Z">
+      <w:del w:id="1762" w:author="Language Editor" w:date="2026-09-27T12:00:00Z">
         <w:r>
           <w:delText xml:space="preserve">have limits across</w:delText>
         </w:r>
       </w:del>
-      <w:ins w:id="1764" w:author="Language Editor" w:date="2026-09-27T12:00:00Z">
+      <w:ins w:id="1763" w:author="Language Editor" w:date="2026-09-27T12:00:00Z">
         <w:r>
           <w:t xml:space="preserve">hold only within certain</w:t>
         </w:r>
@@ -9148,12 +9137,12 @@
       <w:r>
         <w:t xml:space="preserve"> crops, soils and management regimes. Annotation protocols should </w:t>
       </w:r>
-      <w:del w:id="1765" w:author="Language Editor" w:date="2026-09-27T12:00:00Z">
+      <w:del w:id="1764" w:author="Language Editor" w:date="2026-09-27T12:00:00Z">
         <w:r>
           <w:delText xml:space="preserve">record relevant</w:delText>
         </w:r>
       </w:del>
-      <w:ins w:id="1766" w:author="Language Editor" w:date="2026-09-27T12:00:00Z">
+      <w:ins w:id="1765" w:author="Language Editor" w:date="2026-09-27T12:00:00Z">
         <w:r>
           <w:t xml:space="preserve">therefore record</w:t>
         </w:r>
@@ -9161,12 +9150,12 @@
       <w:r>
         <w:t xml:space="preserve"> expertise, source material, applicability, alternatives and review decisions. Independent annotation and adjudication </w:t>
       </w:r>
-      <w:del w:id="1767" w:author="Language Editor" w:date="2026-09-27T12:00:00Z">
+      <w:del w:id="1766" w:author="Language Editor" w:date="2026-09-27T12:00:00Z">
         <w:r>
           <w:delText xml:space="preserve">can reveal disagreement, but agreement</w:delText>
         </w:r>
       </w:del>
-      <w:ins w:id="1768" w:author="Language Editor" w:date="2026-09-27T12:00:00Z">
+      <w:ins w:id="1767" w:author="Language Editor" w:date="2026-09-27T12:00:00Z">
         <w:r>
           <w:t xml:space="preserve">expose disagreement, although agreement alone</w:t>
         </w:r>
@@ -9174,20 +9163,20 @@
       <w:r>
         <w:t xml:space="preserve"> does not establish causal validity. </w:t>
       </w:r>
-      <w:del w:id="1769" w:author="Language Editor" w:date="2026-09-27T12:00:00Z">
+      <w:del w:id="1768" w:author="Language Editor" w:date="2026-09-27T12:00:00Z">
         <w:r>
           <w:delText xml:space="preserve">Agricultural decision-support research also emphasizes</w:delText>
         </w:r>
       </w:del>
+      <w:ins w:id="1769" w:author="Language Editor" w:date="2026-09-27T12:00:00Z">
+        <w:r>
+          <w:t xml:space="preserve">Research on agricultural decision support also stresses</w:t>
+        </w:r>
+      </w:ins>
+      <w:r>
+        <w:t xml:space="preserve"> fit with users and</w:t>
+      </w:r>
       <w:ins w:id="1770" w:author="Language Editor" w:date="2026-09-27T12:00:00Z">
-        <w:r>
-          <w:t xml:space="preserve">Research on agricultural decision support also stresses</w:t>
-        </w:r>
-      </w:ins>
-      <w:r>
-        <w:t xml:space="preserve"> fit with users and</w:t>
-      </w:r>
-      <w:ins w:id="1771" w:author="Language Editor" w:date="2026-09-27T12:00:00Z">
         <w:r>
           <w:t xml:space="preserve"> their</w:t>
         </w:r>
@@ -9213,12 +9202,12 @@
       <w:r>
         <w:t xml:space="preserve">. Evaluation should </w:t>
       </w:r>
-      <w:del w:id="1772" w:author="Language Editor" w:date="2026-09-27T12:00:00Z">
+      <w:del w:id="1771" w:author="Language Editor" w:date="2026-09-27T12:00:00Z">
         <w:r>
           <w:delText xml:space="preserve">therefore consider</w:delText>
         </w:r>
       </w:del>
-      <w:ins w:id="1773" w:author="Language Editor" w:date="2026-09-27T12:00:00Z">
+      <w:ins w:id="1772" w:author="Language Editor" w:date="2026-09-27T12:00:00Z">
         <w:r>
           <w:t xml:space="preserve">thus ask</w:t>
         </w:r>
@@ -9226,12 +9215,12 @@
       <w:r>
         <w:t xml:space="preserve"> whether an output supports a real assessment question, </w:t>
       </w:r>
-      <w:del w:id="1774" w:author="Language Editor" w:date="2026-09-27T12:00:00Z">
+      <w:del w:id="1773" w:author="Language Editor" w:date="2026-09-27T12:00:00Z">
         <w:r>
           <w:delText xml:space="preserve">in addition to</w:delText>
         </w:r>
       </w:del>
-      <w:ins w:id="1775" w:author="Language Editor" w:date="2026-09-27T12:00:00Z">
+      <w:ins w:id="1774" w:author="Language Editor" w:date="2026-09-27T12:00:00Z">
         <w:r>
           <w:t xml:space="preserve">and not only</w:t>
         </w:r>
@@ -9257,12 +9246,12 @@
       <w:r>
         <w:t xml:space="preserve">Integrated assessment </w:t>
       </w:r>
-      <w:del w:id="1776" w:author="Language Editor" w:date="2026-09-27T12:00:00Z">
+      <w:del w:id="1775" w:author="Language Editor" w:date="2026-09-27T12:00:00Z">
         <w:r>
           <w:delText xml:space="preserve">requires</w:delText>
         </w:r>
       </w:del>
-      <w:ins w:id="1777" w:author="Language Editor" w:date="2026-09-27T12:00:00Z">
+      <w:ins w:id="1776" w:author="Language Editor" w:date="2026-09-27T12:00:00Z">
         <w:r>
           <w:t xml:space="preserve">depends on</w:t>
         </w:r>
@@ -9270,12 +9259,12 @@
       <w:r>
         <w:t xml:space="preserve"> defensible associations between image patches, fields, samples and infrastructure, </w:t>
       </w:r>
-      <w:del w:id="1778" w:author="Language Editor" w:date="2026-09-27T12:00:00Z">
+      <w:del w:id="1777" w:author="Language Editor" w:date="2026-09-27T12:00:00Z">
         <w:r>
           <w:delText xml:space="preserve">as well as</w:delText>
         </w:r>
       </w:del>
-      <w:ins w:id="1779" w:author="Language Editor" w:date="2026-09-27T12:00:00Z">
+      <w:ins w:id="1778" w:author="Language Editor" w:date="2026-09-27T12:00:00Z">
         <w:r>
           <w:t xml:space="preserve">and</w:t>
         </w:r>
@@ -9283,12 +9272,12 @@
       <w:r>
         <w:t xml:space="preserve"> between observations and management periods. It also </w:t>
       </w:r>
-      <w:del w:id="1780" w:author="Language Editor" w:date="2026-09-27T12:00:00Z">
+      <w:del w:id="1779" w:author="Language Editor" w:date="2026-09-27T12:00:00Z">
         <w:r>
           <w:delText xml:space="preserve">requires</w:delText>
         </w:r>
       </w:del>
-      <w:ins w:id="1781" w:author="Language Editor" w:date="2026-09-27T12:00:00Z">
+      <w:ins w:id="1780" w:author="Language Editor" w:date="2026-09-27T12:00:00Z">
         <w:r>
           <w:t xml:space="preserve">depends on clear</w:t>
         </w:r>
@@ -9296,12 +9285,12 @@
       <w:r>
         <w:t xml:space="preserve"> measurement definitions, including units, depth and spatial support. </w:t>
       </w:r>
-      <w:del w:id="1782" w:author="Language Editor" w:date="2026-09-27T12:00:00Z">
+      <w:del w:id="1781" w:author="Language Editor" w:date="2026-09-27T12:00:00Z">
         <w:r>
           <w:delText xml:space="preserve">These associations can be retained alongside learned features instead of being hidden in an embedding. Resampling does not improve the intrinsic information content of</w:delText>
         </w:r>
       </w:del>
-      <w:ins w:id="1783" w:author="Language Editor" w:date="2026-09-27T12:00:00Z">
+      <w:ins w:id="1782" w:author="Language Editor" w:date="2026-09-27T12:00:00Z">
         <w:r>
           <w:t xml:space="preserve">CroplandGPT keeps these associations alongside the learned features so that they remain inspectable. Resampling cannot add information to</w:t>
         </w:r>
@@ -9309,12 +9298,12 @@
       <w:r>
         <w:t xml:space="preserve"> a raster, and extending a point measurement </w:t>
       </w:r>
-      <w:del w:id="1784" w:author="Language Editor" w:date="2026-09-27T12:00:00Z">
+      <w:del w:id="1783" w:author="Language Editor" w:date="2026-09-27T12:00:00Z">
         <w:r>
           <w:delText xml:space="preserve">over</w:delText>
         </w:r>
       </w:del>
-      <w:ins w:id="1785" w:author="Language Editor" w:date="2026-09-27T12:00:00Z">
+      <w:ins w:id="1784" w:author="Language Editor" w:date="2026-09-27T12:00:00Z">
         <w:r>
           <w:t xml:space="preserve">to</w:t>
         </w:r>
@@ -9331,12 +9320,12 @@
       <w:r>
         <w:t xml:space="preserve">Uncertainty in a crop label, temporal association, soil observation or yield reference </w:t>
       </w:r>
-      <w:del w:id="1786" w:author="Language Editor" w:date="2026-09-27T12:00:00Z">
+      <w:del w:id="1785" w:author="Language Editor" w:date="2026-09-27T12:00:00Z">
         <w:r>
           <w:delText xml:space="preserve">can affect subsequent</w:delText>
         </w:r>
       </w:del>
-      <w:ins w:id="1787" w:author="Language Editor" w:date="2026-09-27T12:00:00Z">
+      <w:ins w:id="1786" w:author="Language Editor" w:date="2026-09-27T12:00:00Z">
         <w:r>
           <w:t xml:space="preserve">propagates into later</w:t>
         </w:r>
@@ -9344,12 +9333,12 @@
       <w:r>
         <w:t xml:space="preserve"> interpretation. An implementation should </w:t>
       </w:r>
-      <w:del w:id="1788" w:author="Language Editor" w:date="2026-09-27T12:00:00Z">
+      <w:del w:id="1787" w:author="Language Editor" w:date="2026-09-27T12:00:00Z">
         <w:r>
           <w:delText xml:space="preserve">retain the relevant quality information, identify</w:delText>
         </w:r>
       </w:del>
-      <w:ins w:id="1789" w:author="Language Editor" w:date="2026-09-27T12:00:00Z">
+      <w:ins w:id="1788" w:author="Language Editor" w:date="2026-09-27T12:00:00Z">
         <w:r>
           <w:t xml:space="preserve">therefore carry quality information forward, flag</w:t>
         </w:r>
@@ -9357,12 +9346,12 @@
       <w:r>
         <w:t xml:space="preserve"> unassessed dimensions and test how upstream errors affect generated statements. </w:t>
       </w:r>
-      <w:del w:id="1790" w:author="Language Editor" w:date="2026-09-27T12:00:00Z">
+      <w:del w:id="1789" w:author="Language Editor" w:date="2026-09-27T12:00:00Z">
         <w:r>
           <w:delText xml:space="preserve">The agreement of a map, table and explanation is useful for consistency checking</w:delText>
         </w:r>
       </w:del>
-      <w:ins w:id="1791" w:author="Language Editor" w:date="2026-09-27T12:00:00Z">
+      <w:ins w:id="1790" w:author="Language Editor" w:date="2026-09-27T12:00:00Z">
         <w:r>
           <w:t xml:space="preserve">Agreement among a map, a table and an explanation helps check consistency</w:t>
         </w:r>
@@ -9370,12 +9359,12 @@
       <w:r>
         <w:t xml:space="preserve">, but all three </w:t>
       </w:r>
-      <w:del w:id="1792" w:author="Language Editor" w:date="2026-09-27T12:00:00Z">
+      <w:del w:id="1791" w:author="Language Editor" w:date="2026-09-27T12:00:00Z">
         <w:r>
           <w:delText xml:space="preserve">can</w:delText>
         </w:r>
       </w:del>
-      <w:ins w:id="1793" w:author="Language Editor" w:date="2026-09-27T12:00:00Z">
+      <w:ins w:id="1792" w:author="Language Editor" w:date="2026-09-27T12:00:00Z">
         <w:r>
           <w:t xml:space="preserve">may</w:t>
         </w:r>
@@ -9383,12 +9372,12 @@
       <w:r>
         <w:t xml:space="preserve"> share the same </w:t>
       </w:r>
-      <w:del w:id="1794" w:author="Language Editor" w:date="2026-09-27T12:00:00Z">
+      <w:del w:id="1793" w:author="Language Editor" w:date="2026-09-27T12:00:00Z">
         <w:r>
           <w:delText xml:space="preserve">mistaken input. Independent evidence remains necessary for accuracy assessment</w:delText>
         </w:r>
       </w:del>
-      <w:ins w:id="1795" w:author="Language Editor" w:date="2026-09-27T12:00:00Z">
+      <w:ins w:id="1794" w:author="Language Editor" w:date="2026-09-27T12:00:00Z">
         <w:r>
           <w:t xml:space="preserve">faulty input, so accuracy assessment requires independent evidence</w:t>
         </w:r>
@@ -9405,12 +9394,12 @@
       <w:r>
         <w:t xml:space="preserve">4.4 Implementation </w:t>
       </w:r>
-      <w:del w:id="1796" w:author="Language Editor" w:date="2026-09-27T12:00:00Z">
+      <w:del w:id="1795" w:author="Language Editor" w:date="2026-09-27T12:00:00Z">
         <w:r>
           <w:delText xml:space="preserve">and evaluation requirements</w:delText>
         </w:r>
       </w:del>
-      <w:ins w:id="1797" w:author="Language Editor" w:date="2026-09-27T12:00:00Z">
+      <w:ins w:id="1796" w:author="Language Editor" w:date="2026-09-27T12:00:00Z">
         <w:r>
           <w:t xml:space="preserve">roadmap and evaluation protocol</w:t>
         </w:r>
@@ -9424,12 +9413,12 @@
       <w:r>
         <w:t xml:space="preserve">Implementation </w:t>
       </w:r>
-      <w:del w:id="1798" w:author="Language Editor" w:date="2026-09-27T12:00:00Z">
+      <w:del w:id="1797" w:author="Language Editor" w:date="2026-09-27T12:00:00Z">
         <w:r>
           <w:delText xml:space="preserve">should begin with explicit</w:delText>
         </w:r>
       </w:del>
-      <w:ins w:id="1799" w:author="Language Editor" w:date="2026-09-27T12:00:00Z">
+      <w:ins w:id="1798" w:author="Language Editor" w:date="2026-09-27T12:00:00Z">
         <w:r>
           <w:t xml:space="preserve">begins by fixing</w:t>
         </w:r>
@@ -9437,20 +9426,20 @@
       <w:r>
         <w:t xml:space="preserve"> input support, token budgets, backbones, prediction targets and adaptation objectives. The </w:t>
       </w:r>
+      <w:del w:id="1799" w:author="Language Editor" w:date="2026-09-27T12:00:00Z">
+        <w:r>
+          <w:delText xml:space="preserve">proposed </w:delText>
+        </w:r>
+      </w:del>
+      <w:r>
+        <w:t xml:space="preserve">query-resampling interface in Section 2.7 </w:t>
+      </w:r>
       <w:del w:id="1800" w:author="Language Editor" w:date="2026-09-27T12:00:00Z">
         <w:r>
-          <w:delText xml:space="preserve">proposed </w:delText>
-        </w:r>
-      </w:del>
-      <w:r>
-        <w:t xml:space="preserve">query-resampling interface in Section 2.7 </w:t>
-      </w:r>
-      <w:del w:id="1801" w:author="Language Editor" w:date="2026-09-27T12:00:00Z">
-        <w:r>
           <w:delText xml:space="preserve">fixes</w:delText>
         </w:r>
       </w:del>
-      <w:ins w:id="1802" w:author="Language Editor" w:date="2026-09-27T12:00:00Z">
+      <w:ins w:id="1801" w:author="Language Editor" w:date="2026-09-27T12:00:00Z">
         <w:r>
           <w:t xml:space="preserve">defines</w:t>
         </w:r>
@@ -9458,12 +9447,12 @@
       <w:r>
         <w:t xml:space="preserve"> the route from spatial features to language input, </w:t>
       </w:r>
-      <w:del w:id="1803" w:author="Language Editor" w:date="2026-09-27T12:00:00Z">
+      <w:del w:id="1802" w:author="Language Editor" w:date="2026-09-27T12:00:00Z">
         <w:r>
           <w:delText xml:space="preserve">but not</w:delText>
         </w:r>
       </w:del>
-      <w:ins w:id="1804" w:author="Language Editor" w:date="2026-09-27T12:00:00Z">
+      <w:ins w:id="1803" w:author="Language Editor" w:date="2026-09-27T12:00:00Z">
         <w:r>
           <w:t xml:space="preserve">while</w:t>
         </w:r>
@@ -9471,12 +9460,12 @@
       <w:r>
         <w:t xml:space="preserve"> the final widths, number of queries </w:t>
       </w:r>
-      <w:del w:id="1805" w:author="Language Editor" w:date="2026-09-27T12:00:00Z">
+      <w:del w:id="1804" w:author="Language Editor" w:date="2026-09-27T12:00:00Z">
         <w:r>
           <w:delText xml:space="preserve">or training schedule</w:delText>
         </w:r>
       </w:del>
-      <w:ins w:id="1806" w:author="Language Editor" w:date="2026-09-27T12:00:00Z">
+      <w:ins w:id="1805" w:author="Language Editor" w:date="2026-09-27T12:00:00Z">
         <w:r>
           <w:t xml:space="preserve">and training schedule are set for each dataset</w:t>
         </w:r>
@@ -9484,41 +9473,41 @@
       <w:r>
         <w:t xml:space="preserve">. A practical sequence </w:t>
       </w:r>
-      <w:del w:id="1807" w:author="Language Editor" w:date="2026-09-27T12:00:00Z">
+      <w:del w:id="1806" w:author="Language Editor" w:date="2026-09-27T12:00:00Z">
         <w:r>
           <w:delText xml:space="preserve">would</w:delText>
         </w:r>
       </w:del>
+      <w:ins w:id="1807" w:author="Language Editor" w:date="2026-09-27T12:00:00Z">
+        <w:r>
+          <w:t xml:space="preserve">is to</w:t>
+        </w:r>
+      </w:ins>
+      <w:r>
+        <w:t xml:space="preserve"> establish data associations and structured evidence reporting</w:t>
+      </w:r>
       <w:ins w:id="1808" w:author="Language Editor" w:date="2026-09-27T12:00:00Z">
         <w:r>
-          <w:t xml:space="preserve">is to</w:t>
-        </w:r>
-      </w:ins>
-      <w:r>
-        <w:t xml:space="preserve"> establish data associations and structured evidence reporting</w:t>
+          <w:t xml:space="preserve"> first</w:t>
+        </w:r>
+      </w:ins>
+      <w:r>
+        <w:t xml:space="preserve">, then train the fusion </w:t>
       </w:r>
       <w:ins w:id="1809" w:author="Language Editor" w:date="2026-09-27T12:00:00Z">
         <w:r>
-          <w:t xml:space="preserve"> first</w:t>
-        </w:r>
-      </w:ins>
-      <w:r>
-        <w:t xml:space="preserve">, then train the fusion </w:t>
-      </w:r>
-      <w:ins w:id="1810" w:author="Language Editor" w:date="2026-09-27T12:00:00Z">
-        <w:r>
           <w:t xml:space="preserve">module </w:t>
         </w:r>
       </w:ins>
       <w:r>
         <w:t xml:space="preserve">and language adapter </w:t>
       </w:r>
-      <w:del w:id="1811" w:author="Language Editor" w:date="2026-09-27T12:00:00Z">
+      <w:del w:id="1810" w:author="Language Editor" w:date="2026-09-27T12:00:00Z">
         <w:r>
           <w:delText xml:space="preserve">with</w:delText>
         </w:r>
       </w:del>
-      <w:ins w:id="1812" w:author="Language Editor" w:date="2026-09-27T12:00:00Z">
+      <w:ins w:id="1811" w:author="Language Editor" w:date="2026-09-27T12:00:00Z">
         <w:r>
           <w:t xml:space="preserve">on</w:t>
         </w:r>
@@ -9526,33 +9515,33 @@
       <w:r>
         <w:t xml:space="preserve"> paired spatial observations and reviewed text, and </w:t>
       </w:r>
-      <w:del w:id="1813" w:author="Language Editor" w:date="2026-09-27T12:00:00Z">
+      <w:del w:id="1812" w:author="Language Editor" w:date="2026-09-27T12:00:00Z">
         <w:r>
           <w:delText xml:space="preserve">subsequently evaluate any language-model adaptation</w:delText>
         </w:r>
       </w:del>
+      <w:ins w:id="1813" w:author="Language Editor" w:date="2026-09-27T12:00:00Z">
+        <w:r>
+          <w:t xml:space="preserve">finally evaluate further adaptation of the language model</w:t>
+        </w:r>
+      </w:ins>
+      <w:r>
+        <w:t xml:space="preserve">. Candidate losses include supervised mapping or regression</w:t>
+      </w:r>
       <w:ins w:id="1814" w:author="Language Editor" w:date="2026-09-27T12:00:00Z">
         <w:r>
-          <w:t xml:space="preserve">finally evaluate further adaptation of the language model</w:t>
-        </w:r>
-      </w:ins>
-      <w:r>
-        <w:t xml:space="preserve">. Candidate losses include supervised mapping or regression</w:t>
-      </w:r>
-      <w:ins w:id="1815" w:author="Language Editor" w:date="2026-09-27T12:00:00Z">
-        <w:r>
           <w:t xml:space="preserve"> losses</w:t>
         </w:r>
       </w:ins>
       <w:r>
         <w:t xml:space="preserve"> and evidence-grounded text generation, with masks for unavailable targets</w:t>
       </w:r>
-      <w:del w:id="1816" w:author="Language Editor" w:date="2026-09-27T12:00:00Z">
+      <w:del w:id="1815" w:author="Language Editor" w:date="2026-09-27T12:00:00Z">
         <w:r>
           <w:delText xml:space="preserve">. Their selection and relative weights require a concrete</w:delText>
         </w:r>
       </w:del>
-      <w:ins w:id="1817" w:author="Language Editor" w:date="2026-09-27T12:00:00Z">
+      <w:ins w:id="1816" w:author="Language Editor" w:date="2026-09-27T12:00:00Z">
         <w:r>
           <w:t xml:space="preserve">; their selection and weighting depend on the</w:t>
         </w:r>
@@ -9560,12 +9549,12 @@
       <w:r>
         <w:t xml:space="preserve"> dataset and validation </w:t>
       </w:r>
-      <w:del w:id="1818" w:author="Language Editor" w:date="2026-09-27T12:00:00Z">
+      <w:del w:id="1817" w:author="Language Editor" w:date="2026-09-27T12:00:00Z">
         <w:r>
           <w:delText xml:space="preserve">procedure</w:delText>
         </w:r>
       </w:del>
-      <w:ins w:id="1819" w:author="Language Editor" w:date="2026-09-27T12:00:00Z">
+      <w:ins w:id="1818" w:author="Language Editor" w:date="2026-09-27T12:00:00Z">
         <w:r>
           <w:t xml:space="preserve">design</w:t>
         </w:r>
@@ -9582,12 +9571,12 @@
       <w:r>
         <w:t xml:space="preserve">Evaluation </w:t>
       </w:r>
-      <w:del w:id="1820" w:author="Language Editor" w:date="2026-09-27T12:00:00Z">
+      <w:del w:id="1819" w:author="Language Editor" w:date="2026-09-27T12:00:00Z">
         <w:r>
           <w:delText xml:space="preserve">should separate</w:delText>
         </w:r>
       </w:del>
-      <w:ins w:id="1821" w:author="Language Editor" w:date="2026-09-27T12:00:00Z">
+      <w:ins w:id="1820" w:author="Language Editor" w:date="2026-09-27T12:00:00Z">
         <w:r>
           <w:t xml:space="preserve">treats</w:t>
         </w:r>
@@ -9595,33 +9584,33 @@
       <w:r>
         <w:t xml:space="preserve"> element prediction, integrated interpretation and management support</w:t>
       </w:r>
-      <w:del w:id="1822" w:author="Language Editor" w:date="2026-09-27T12:00:00Z">
+      <w:del w:id="1821" w:author="Language Editor" w:date="2026-09-27T12:00:00Z">
         <w:r>
           <w:delText xml:space="preserve">. Mapping requires independent labels and target-specific measures</w:delText>
         </w:r>
       </w:del>
+      <w:ins w:id="1822" w:author="Language Editor" w:date="2026-09-27T12:00:00Z">
+        <w:r>
+          <w:t xml:space="preserve"> separately. Mapping is evaluated against independent labels with target-specific metrics</w:t>
+        </w:r>
+      </w:ins>
+      <w:r>
+        <w:t xml:space="preserve"> such as class-wise F1 </w:t>
+      </w:r>
       <w:ins w:id="1823" w:author="Language Editor" w:date="2026-09-27T12:00:00Z">
         <w:r>
-          <w:t xml:space="preserve"> separately. Mapping is evaluated against independent labels with target-specific metrics</w:t>
-        </w:r>
-      </w:ins>
-      <w:r>
-        <w:t xml:space="preserve"> such as class-wise F1 </w:t>
-      </w:r>
-      <w:ins w:id="1824" w:author="Language Editor" w:date="2026-09-27T12:00:00Z">
-        <w:r>
           <w:t xml:space="preserve">score </w:t>
         </w:r>
       </w:ins>
       <w:r>
         <w:t xml:space="preserve">or intersection over union</w:t>
       </w:r>
-      <w:del w:id="1825" w:author="Language Editor" w:date="2026-09-27T12:00:00Z">
+      <w:del w:id="1824" w:author="Language Editor" w:date="2026-09-27T12:00:00Z">
         <w:r>
           <w:delText xml:space="preserve">; numerical estimates require MAE or RMSE with units. Interpretation requires tests of</w:delText>
         </w:r>
       </w:del>
-      <w:ins w:id="1826" w:author="Language Editor" w:date="2026-09-27T12:00:00Z">
+      <w:ins w:id="1825" w:author="Language Editor" w:date="2026-09-27T12:00:00Z">
         <w:r>
           <w:t xml:space="preserve">, and numerical estimates with mean absolute error (MAE) or root mean square error (RMSE) in physical units. Interpretation is tested for</w:t>
         </w:r>
@@ -9629,33 +9618,33 @@
       <w:r>
         <w:t xml:space="preserve"> evidence support, object and period binding, and treatment of alternative explanations. Management support </w:t>
       </w:r>
-      <w:del w:id="1827" w:author="Language Editor" w:date="2026-09-27T12:00:00Z">
+      <w:del w:id="1826" w:author="Language Editor" w:date="2026-09-27T12:00:00Z">
         <w:r>
           <w:delText xml:space="preserve">requires</w:delText>
         </w:r>
       </w:del>
+      <w:ins w:id="1827" w:author="Language Editor" w:date="2026-09-27T12:00:00Z">
+        <w:r>
+          <w:t xml:space="preserve">is evaluated against</w:t>
+        </w:r>
+      </w:ins>
+      <w:r>
+        <w:t xml:space="preserve"> applicable constraints and, for numerical intervention effects, </w:t>
+      </w:r>
       <w:ins w:id="1828" w:author="Language Editor" w:date="2026-09-27T12:00:00Z">
         <w:r>
-          <w:t xml:space="preserve">is evaluated against</w:t>
-        </w:r>
-      </w:ins>
-      <w:r>
-        <w:t xml:space="preserve"> applicable constraints and, for numerical intervention effects, </w:t>
-      </w:r>
-      <w:ins w:id="1829" w:author="Language Editor" w:date="2026-09-27T12:00:00Z">
-        <w:r>
           <w:t xml:space="preserve">against </w:t>
         </w:r>
       </w:ins>
       <w:r>
         <w:t xml:space="preserve">experimental evidence or independently evaluated response models. </w:t>
       </w:r>
-      <w:del w:id="1830" w:author="Language Editor" w:date="2026-09-27T12:00:00Z">
+      <w:del w:id="1829" w:author="Language Editor" w:date="2026-09-27T12:00:00Z">
         <w:r>
           <w:delText xml:space="preserve">Report both</w:delText>
         </w:r>
       </w:del>
-      <w:ins w:id="1831" w:author="Language Editor" w:date="2026-09-27T12:00:00Z">
+      <w:ins w:id="1830" w:author="Language Editor" w:date="2026-09-27T12:00:00Z">
         <w:r>
           <w:t xml:space="preserve">Both</w:t>
         </w:r>
@@ -9663,12 +9652,12 @@
       <w:r>
         <w:t xml:space="preserve"> unsupported recommendations and unnecessary </w:t>
       </w:r>
-      <w:del w:id="1832" w:author="Language Editor" w:date="2026-09-27T12:00:00Z">
+      <w:del w:id="1831" w:author="Language Editor" w:date="2026-09-27T12:00:00Z">
         <w:r>
           <w:delText xml:space="preserve">abstention. A numerical capacity target additionally requires a</w:delText>
         </w:r>
       </w:del>
-      <w:ins w:id="1833" w:author="Language Editor" w:date="2026-09-27T12:00:00Z">
+      <w:ins w:id="1832" w:author="Language Editor" w:date="2026-09-27T12:00:00Z">
         <w:r>
           <w:t xml:space="preserve">abstentions are reported. Numerical capacity targets further require a defined</w:t>
         </w:r>
@@ -9685,12 +9674,12 @@
       <w:r>
         <w:t xml:space="preserve">Comparisons </w:t>
       </w:r>
-      <w:del w:id="1834" w:author="Language Editor" w:date="2026-09-27T12:00:00Z">
+      <w:del w:id="1833" w:author="Language Editor" w:date="2026-09-27T12:00:00Z">
         <w:r>
           <w:delText xml:space="preserve">should separate integration effects from</w:delText>
         </w:r>
       </w:del>
-      <w:ins w:id="1835" w:author="Language Editor" w:date="2026-09-27T12:00:00Z">
+      <w:ins w:id="1834" w:author="Language Editor" w:date="2026-09-27T12:00:00Z">
         <w:r>
           <w:t xml:space="preserve">must separate the effect of integration from that of</w:t>
         </w:r>
@@ -9698,20 +9687,20 @@
       <w:r>
         <w:t xml:space="preserve"> better inputs or larger backbones. Baselines </w:t>
       </w:r>
+      <w:del w:id="1835" w:author="Language Editor" w:date="2026-09-27T12:00:00Z">
+        <w:r>
+          <w:delText xml:space="preserve">should </w:delText>
+        </w:r>
+      </w:del>
+      <w:r>
+        <w:t xml:space="preserve">include task-specific models </w:t>
+      </w:r>
       <w:del w:id="1836" w:author="Language Editor" w:date="2026-09-27T12:00:00Z">
         <w:r>
-          <w:delText xml:space="preserve">should </w:delText>
-        </w:r>
-      </w:del>
-      <w:r>
-        <w:t xml:space="preserve">include task-specific models </w:t>
-      </w:r>
-      <w:del w:id="1837" w:author="Language Editor" w:date="2026-09-27T12:00:00Z">
-        <w:r>
           <w:delText xml:space="preserve">using</w:delText>
         </w:r>
       </w:del>
-      <w:ins w:id="1838" w:author="Language Editor" w:date="2026-09-27T12:00:00Z">
+      <w:ins w:id="1837" w:author="Language Editor" w:date="2026-09-27T12:00:00Z">
         <w:r>
           <w:t xml:space="preserve">trained on</w:t>
         </w:r>
@@ -9719,12 +9708,12 @@
       <w:r>
         <w:t xml:space="preserve"> the same observations and a shared retrieval workflow with explicit assessment rules. A feature-path ablation </w:t>
       </w:r>
-      <w:del w:id="1839" w:author="Language Editor" w:date="2026-09-27T12:00:00Z">
+      <w:del w:id="1838" w:author="Language Editor" w:date="2026-09-27T12:00:00Z">
         <w:r>
           <w:delText xml:space="preserve">should preserve the same</w:delText>
         </w:r>
       </w:del>
-      <w:ins w:id="1840" w:author="Language Editor" w:date="2026-09-27T12:00:00Z">
+      <w:ins w:id="1839" w:author="Language Editor" w:date="2026-09-27T12:00:00Z">
         <w:r>
           <w:t xml:space="preserve">keeps the</w:t>
         </w:r>
@@ -9732,12 +9721,12 @@
       <w:r>
         <w:t xml:space="preserve"> explicit records and retrieved knowledge</w:t>
       </w:r>
-      <w:del w:id="1841" w:author="Language Editor" w:date="2026-09-27T12:00:00Z">
+      <w:del w:id="1840" w:author="Language Editor" w:date="2026-09-27T12:00:00Z">
         <w:r>
           <w:delText xml:space="preserve">. Further ablations should</w:delText>
         </w:r>
       </w:del>
-      <w:ins w:id="1842" w:author="Language Editor" w:date="2026-09-27T12:00:00Z">
+      <w:ins w:id="1841" w:author="Language Editor" w:date="2026-09-27T12:00:00Z">
         <w:r>
           <w:t xml:space="preserve"> unchanged, and further ablations</w:t>
         </w:r>
@@ -9745,20 +9734,20 @@
       <w:r>
         <w:t xml:space="preserve"> remove object or temporal links, support masks</w:t>
       </w:r>
+      <w:del w:id="1842" w:author="Language Editor" w:date="2026-09-27T12:00:00Z">
+        <w:r>
+          <w:delText xml:space="preserve">,</w:delText>
+        </w:r>
+      </w:del>
+      <w:r>
+        <w:t xml:space="preserve"> or retrieved knowledge one at a time. </w:t>
+      </w:r>
       <w:del w:id="1843" w:author="Language Editor" w:date="2026-09-27T12:00:00Z">
         <w:r>
-          <w:delText xml:space="preserve">,</w:delText>
-        </w:r>
-      </w:del>
-      <w:r>
-        <w:t xml:space="preserve"> or retrieved knowledge one at a time. </w:t>
-      </w:r>
-      <w:del w:id="1844" w:author="Language Editor" w:date="2026-09-27T12:00:00Z">
-        <w:r>
           <w:delText xml:space="preserve">Use</w:delText>
         </w:r>
       </w:del>
-      <w:ins w:id="1845" w:author="Language Editor" w:date="2026-09-27T12:00:00Z">
+      <w:ins w:id="1844" w:author="Language Editor" w:date="2026-09-27T12:00:00Z">
         <w:r>
           <w:t xml:space="preserve">Test data consist of</w:t>
         </w:r>
@@ -9790,12 +9779,12 @@
         <w:spacing w:after="160" w:line="300" w:lineRule="auto"/>
         <w:jc w:val="both"/>
       </w:pPr>
-      <w:del w:id="1846" w:author="Language Editor" w:date="2026-09-27T12:00:00Z">
+      <w:del w:id="1845" w:author="Language Editor" w:date="2026-09-27T12:00:00Z">
         <w:r>
           <w:delText xml:space="preserve">Report</w:delText>
         </w:r>
       </w:del>
-      <w:ins w:id="1847" w:author="Language Editor" w:date="2026-09-27T12:00:00Z">
+      <w:ins w:id="1846" w:author="Language Editor" w:date="2026-09-27T12:00:00Z">
         <w:r>
           <w:t xml:space="preserve">Reports should include</w:t>
         </w:r>
@@ -9803,12 +9792,12 @@
       <w:r>
         <w:t xml:space="preserve"> the number of independent sampling units, label coverage, split rules, annotation agreement, uncertainty, computational cost and failure or abstention rates</w:t>
       </w:r>
-      <w:del w:id="1848" w:author="Language Editor" w:date="2026-09-27T12:00:00Z">
+      <w:del w:id="1847" w:author="Language Editor" w:date="2026-09-27T12:00:00Z">
         <w:r>
           <w:delText xml:space="preserve">. Confidence intervals should</w:delText>
         </w:r>
       </w:del>
-      <w:ins w:id="1849" w:author="Language Editor" w:date="2026-09-27T12:00:00Z">
+      <w:ins w:id="1848" w:author="Language Editor" w:date="2026-09-27T12:00:00Z">
         <w:r>
           <w:t xml:space="preserve">, with confidence intervals that</w:t>
         </w:r>
@@ -9816,12 +9805,12 @@
       <w:r>
         <w:t xml:space="preserve"> reflect field or regional clustering. Missing-modality tests, inconsistent-record tests and deliberately mismatched object identifiers can </w:t>
       </w:r>
-      <w:del w:id="1850" w:author="Language Editor" w:date="2026-09-27T12:00:00Z">
+      <w:del w:id="1849" w:author="Language Editor" w:date="2026-09-27T12:00:00Z">
         <w:r>
           <w:delText xml:space="preserve">examine whether</w:delText>
         </w:r>
       </w:del>
-      <w:ins w:id="1851" w:author="Language Editor" w:date="2026-09-27T12:00:00Z">
+      <w:ins w:id="1850" w:author="Language Editor" w:date="2026-09-27T12:00:00Z">
         <w:r>
           <w:t xml:space="preserve">verify that</w:t>
         </w:r>
@@ -9829,12 +9818,12 @@
       <w:r>
         <w:t xml:space="preserve"> the system preserves uncertainty and uses the intended associations. A </w:t>
       </w:r>
-      <w:del w:id="1852" w:author="Language Editor" w:date="2026-09-27T12:00:00Z">
+      <w:del w:id="1851" w:author="Language Editor" w:date="2026-09-27T12:00:00Z">
         <w:r>
           <w:delText xml:space="preserve">proposed six-unit case layout provides neither an adequate foundation-model benchmark nor evidence of cross-region performance</w:delText>
         </w:r>
       </w:del>
-      <w:ins w:id="1853" w:author="Language Editor" w:date="2026-09-27T12:00:00Z">
+      <w:ins w:id="1852" w:author="Language Editor" w:date="2026-09-27T12:00:00Z">
         <w:r>
           <w:t xml:space="preserve">multi-region benchmark built on this protocol, extending well beyond the six case units, is the next step toward training CroplandGPT and assessing its transferability</w:t>
         </w:r>
@@ -9860,12 +9849,12 @@
       <w:r>
         <w:t xml:space="preserve">CroplandGPT </w:t>
       </w:r>
-      <w:del w:id="1854" w:author="Language Editor" w:date="2026-09-27T12:00:00Z">
+      <w:del w:id="1853" w:author="Language Editor" w:date="2026-09-27T12:00:00Z">
         <w:r>
           <w:delText xml:space="preserve">proposes a shared geospatial architecture for</w:delText>
         </w:r>
       </w:del>
-      <w:ins w:id="1855" w:author="Language Editor" w:date="2026-09-27T12:00:00Z">
+      <w:ins w:id="1854" w:author="Language Editor" w:date="2026-09-27T12:00:00Z">
         <w:r>
           <w:t xml:space="preserve">is a multimodal agro-geospatial framework that links</w:t>
         </w:r>
@@ -9873,12 +9862,12 @@
       <w:r>
         <w:t xml:space="preserve"> agricultural feature representation and mapping, integrated cropland assessment and management decision support</w:t>
       </w:r>
-      <w:del w:id="1856" w:author="Language Editor" w:date="2026-09-27T12:00:00Z">
+      <w:del w:id="1855" w:author="Language Editor" w:date="2026-09-27T12:00:00Z">
         <w:r>
           <w:delText xml:space="preserve">. Spatial features feed</w:delText>
         </w:r>
       </w:del>
-      <w:ins w:id="1857" w:author="Language Editor" w:date="2026-09-27T12:00:00Z">
+      <w:ins w:id="1856" w:author="Language Editor" w:date="2026-09-27T12:00:00Z">
         <w:r>
           <w:t xml:space="preserve"> through a shared geospatial architecture. Its spatial features drive</w:t>
         </w:r>
@@ -9886,12 +9875,12 @@
       <w:r>
         <w:t xml:space="preserve"> mapping and parcel-level prediction as well as a trainable vision-language interface</w:t>
       </w:r>
-      <w:del w:id="1858" w:author="Language Editor" w:date="2026-09-27T12:00:00Z">
+      <w:del w:id="1857" w:author="Language Editor" w:date="2026-09-27T12:00:00Z">
         <w:r>
           <w:delText xml:space="preserve">. Explicit</w:delText>
         </w:r>
       </w:del>
-      <w:ins w:id="1859" w:author="Language Editor" w:date="2026-09-27T12:00:00Z">
+      <w:ins w:id="1858" w:author="Language Editor" w:date="2026-09-27T12:00:00Z">
         <w:r>
           <w:t xml:space="preserve">, while explicit</w:t>
         </w:r>
@@ -9899,12 +9888,12 @@
       <w:r>
         <w:t xml:space="preserve"> observations, predictions and applicable knowledge provide the evidence and criteria for the language branch. Cropland analysis units define the common spatial context </w:t>
       </w:r>
-      <w:del w:id="1860" w:author="Language Editor" w:date="2026-09-27T12:00:00Z">
+      <w:del w:id="1859" w:author="Language Editor" w:date="2026-09-27T12:00:00Z">
         <w:r>
           <w:delText xml:space="preserve">while retaining internal fields</w:delText>
         </w:r>
       </w:del>
-      <w:ins w:id="1861" w:author="Language Editor" w:date="2026-09-27T12:00:00Z">
+      <w:ins w:id="1860" w:author="Language Editor" w:date="2026-09-27T12:00:00Z">
         <w:r>
           <w:t xml:space="preserve">and retain the fields within them</w:t>
         </w:r>
@@ -9918,12 +9907,12 @@
         <w:spacing w:after="160" w:line="300" w:lineRule="auto"/>
         <w:jc w:val="both"/>
       </w:pPr>
-      <w:del w:id="1862" w:author="Language Editor" w:date="2026-09-27T12:00:00Z">
+      <w:del w:id="1861" w:author="Language Editor" w:date="2026-09-27T12:00:00Z">
         <w:r>
           <w:delText xml:space="preserve">The six</w:delText>
         </w:r>
       </w:del>
-      <w:ins w:id="1863" w:author="Language Editor" w:date="2026-09-27T12:00:00Z">
+      <w:ins w:id="1862" w:author="Language Editor" w:date="2026-09-27T12:00:00Z">
         <w:r>
           <w:t xml:space="preserve">Six</w:t>
         </w:r>
@@ -9931,12 +9920,12 @@
       <w:r>
         <w:t xml:space="preserve"> assessment dimensions and three reasoning levels </w:t>
       </w:r>
-      <w:del w:id="1864" w:author="Language Editor" w:date="2026-09-27T12:00:00Z">
+      <w:del w:id="1863" w:author="Language Editor" w:date="2026-09-27T12:00:00Z">
         <w:r>
           <w:delText xml:space="preserve">organize annotations and intended outputs.</w:delText>
         </w:r>
       </w:del>
-      <w:ins w:id="1865" w:author="Language Editor" w:date="2026-09-27T12:00:00Z">
+      <w:ins w:id="1864" w:author="Language Editor" w:date="2026-09-27T12:00:00Z">
         <w:r>
           <w:t xml:space="preserve">give annotations and outputs a common structure. The</w:t>
         </w:r>
@@ -9944,12 +9933,12 @@
       <w:r>
         <w:t xml:space="preserve"> Qiyang and Quzhou </w:t>
       </w:r>
-      <w:del w:id="1866" w:author="Language Editor" w:date="2026-09-27T12:00:00Z">
+      <w:del w:id="1865" w:author="Language Editor" w:date="2026-09-27T12:00:00Z">
         <w:r>
           <w:delText xml:space="preserve">illustrate how different agricultural questions require</w:delText>
         </w:r>
       </w:del>
-      <w:ins w:id="1867" w:author="Language Editor" w:date="2026-09-27T12:00:00Z">
+      <w:ins w:id="1866" w:author="Language Editor" w:date="2026-09-27T12:00:00Z">
         <w:r>
           <w:t xml:space="preserve">cases show how contrasting agricultural questions call for</w:t>
         </w:r>
@@ -9957,12 +9946,12 @@
       <w:r>
         <w:t xml:space="preserve"> different evidence within this </w:t>
       </w:r>
-      <w:del w:id="1868" w:author="Language Editor" w:date="2026-09-27T12:00:00Z">
+      <w:del w:id="1867" w:author="Language Editor" w:date="2026-09-27T12:00:00Z">
         <w:r>
           <w:delText xml:space="preserve">common structure. The present contribution is a methodological framework and interface specification; the examples do not establish model accuracy or intervention benefits</w:delText>
         </w:r>
       </w:del>
-      <w:ins w:id="1869" w:author="Language Editor" w:date="2026-09-27T12:00:00Z">
+      <w:ins w:id="1868" w:author="Language Editor" w:date="2026-09-27T12:00:00Z">
         <w:r>
           <w:t xml:space="preserve">structure. The framework thus provides both an architecture and an interface specification for moving from single-task remote sensing products to system-level cropland assessment</w:t>
         </w:r>
@@ -9976,12 +9965,12 @@
         <w:spacing w:after="160" w:line="300" w:lineRule="auto"/>
         <w:jc w:val="both"/>
       </w:pPr>
-      <w:del w:id="1870" w:author="Language Editor" w:date="2026-09-27T12:00:00Z">
+      <w:del w:id="1869" w:author="Language Editor" w:date="2026-09-27T12:00:00Z">
         <w:r>
           <w:delText xml:space="preserve">Implementation and independent evaluation must determine</w:delText>
         </w:r>
       </w:del>
-      <w:ins w:id="1871" w:author="Language Editor" w:date="2026-09-27T12:00:00Z">
+      <w:ins w:id="1870" w:author="Language Editor" w:date="2026-09-27T12:00:00Z">
         <w:r>
           <w:t xml:space="preserve">Future work will build paired multimodal datasets, train the fusion module and language adapter, and test</w:t>
         </w:r>
@@ -9989,12 +9978,12 @@
       <w:r>
         <w:t xml:space="preserve"> whether shared spatial features and explicit evidence improve agricultural assessment </w:t>
       </w:r>
-      <w:del w:id="1872" w:author="Language Editor" w:date="2026-09-27T12:00:00Z">
+      <w:del w:id="1871" w:author="Language Editor" w:date="2026-09-27T12:00:00Z">
         <w:r>
           <w:delText xml:space="preserve">beyond simpler workflows. Evaluation should retain the distinctions between current acidity and</w:delText>
         </w:r>
       </w:del>
-      <w:ins w:id="1873" w:author="Language Editor" w:date="2026-09-27T12:00:00Z">
+      <w:ins w:id="1872" w:author="Language Editor" w:date="2026-09-27T12:00:00Z">
         <w:r>
           <w:t xml:space="preserve">over simpler workflows. Throughout, the framework keeps key agronomic distinctions explicit: current acidity versus</w:t>
         </w:r>
@@ -10002,12 +9991,12 @@
       <w:r>
         <w:t xml:space="preserve"> acidification, realized yield </w:t>
       </w:r>
-      <w:del w:id="1874" w:author="Language Editor" w:date="2026-09-27T12:00:00Z">
+      <w:del w:id="1873" w:author="Language Editor" w:date="2026-09-27T12:00:00Z">
         <w:r>
           <w:delText xml:space="preserve">and</w:delText>
         </w:r>
       </w:del>
-      <w:ins w:id="1875" w:author="Language Editor" w:date="2026-09-27T12:00:00Z">
+      <w:ins w:id="1874" w:author="Language Editor" w:date="2026-09-27T12:00:00Z">
         <w:r>
           <w:t xml:space="preserve">versus</w:t>
         </w:r>
@@ -10015,12 +10004,12 @@
       <w:r>
         <w:t xml:space="preserve"> sustained capacity, and a plausible management option </w:t>
       </w:r>
-      <w:del w:id="1876" w:author="Language Editor" w:date="2026-09-27T12:00:00Z">
+      <w:del w:id="1875" w:author="Language Editor" w:date="2026-09-27T12:00:00Z">
         <w:r>
           <w:delText xml:space="preserve">and</w:delText>
         </w:r>
       </w:del>
-      <w:ins w:id="1877" w:author="Language Editor" w:date="2026-09-27T12:00:00Z">
+      <w:ins w:id="1876" w:author="Language Editor" w:date="2026-09-27T12:00:00Z">
         <w:r>
           <w:t xml:space="preserve">versus</w:t>
         </w:r>
@@ -10028,12 +10017,12 @@
       <w:r>
         <w:t xml:space="preserve"> a quantified response. These distinctions </w:t>
       </w:r>
-      <w:del w:id="1878" w:author="Language Editor" w:date="2026-09-27T12:00:00Z">
+      <w:del w:id="1877" w:author="Language Editor" w:date="2026-09-27T12:00:00Z">
         <w:r>
           <w:delText xml:space="preserve">make the proposed integration assessable without extending its claims beyond the available evidence</w:delText>
         </w:r>
       </w:del>
-      <w:ins w:id="1879" w:author="Language Editor" w:date="2026-09-27T12:00:00Z">
+      <w:ins w:id="1878" w:author="Language Editor" w:date="2026-09-27T12:00:00Z">
         <w:r>
           <w:t xml:space="preserve">keep assessments traceable to evidence as CroplandGPT moves from concept to operational use</w:t>
         </w:r>

</xml_diff>

<commit_message>
Redesign simplified Fig. 3 with swim lanes, refined palette and shapes
Co-authored-by: tuffy1026 <tuffy1026@users.noreply.github.com>
</commit_message>
<xml_diff>
--- a/manuscripts/V18_CroplandGPT_EA_pzm_edit_0927.docx
+++ b/manuscripts/V18_CroplandGPT_EA_pzm_edit_0927.docx
@@ -3868,7 +3868,7 @@
         <w:r>
           <w:drawing xmlns:a="http://schemas.openxmlformats.org/drawingml/2006/main" xmlns:pic="http://schemas.openxmlformats.org/drawingml/2006/picture">
             <wp:inline distT="0" distB="0" distL="0" distR="0">
-              <wp:extent cx="5724000" cy="3110869"/>
+              <wp:extent cx="5724000" cy="2986434"/>
               <wp:docPr id="103" name="Figure 103"/>
               <wp:cNvGraphicFramePr>
                 <a:graphicFrameLocks noChangeAspect="1"/>
@@ -3889,7 +3889,7 @@
                     <pic:spPr>
                       <a:xfrm>
                         <a:off x="0" y="0"/>
-                        <a:ext cx="5724000" cy="3110869"/>
+                        <a:ext cx="5724000" cy="2986434"/>
                       </a:xfrm>
                       <a:prstGeom prst="rect">
                         <a:avLst/>
@@ -3917,7 +3917,7 @@
       </w:del>
       <w:ins w:id="1344" w:author="Language Editor" w:date="2026-09-27T12:00:00Z">
         <w:r>
-          <w:t xml:space="preserve">Remote sensing imagery (S) and auxiliary records (M) are encoded and fused into shared spatial features H by stacked cross-attention, self-attention and feed-forward layers. H feeds a mapping branch that predicts element maps and parcel attributes, and a query adapter that compresses H into visual tokens V for a pretrained language decoder. Observed and predicted values are kept as evidence records and, together with retrieved knowledge, are serialized as text tokens T, so the decoder receives continuous spatial context and explicit evidence in parallel. Outputs are checked against the evidence records and indexed by D1–D6 × L1–L3</w:t>
+          <w:t xml:space="preserve">Upper lane: remote sensing imagery (S) and auxiliary records (M) are encoded and fused into shared spatial features H, which a query adapter compresses into visual tokens V for a pretrained language decoder. Lower lane: a mapping head predicts element maps and parcel attributes from H; observed and predicted values, together with retrieved knowledge, form evidence records that are serialized as text tokens T. The decoder therefore receives continuous spatial context and explicit evidence in parallel, and its outputs are checked against the evidence and indexed by D1–D6 × L1–L3. Layer-level details are given in Supplementary Fig. S1</w:t>
         </w:r>
       </w:ins>
       <w:r>

</xml_diff>